<commit_message>
auto: session 2026-08-10 08:35
Co-Authored-By: Claude Opus 4.8 (1M context) <noreply@anthropic.com>
</commit_message>
<xml_diff>
--- a/10-bang-gia-booking/Bao-Gia-Booking-Bao-PR-DigicomVN-2026-08-10.docx
+++ b/10-bang-gia-booking/Bao-Gia-Booking-Bao-PR-DigicomVN-2026-08-10.docx
@@ -94,9 +94,10 @@
       </w:tblPr>
       <w:tblGrid>
         <w:gridCol w:w="500"/>
-        <w:gridCol w:w="2600"/>
-        <w:gridCol w:w="4600"/>
-        <w:gridCol w:w="1900"/>
+        <w:gridCol w:w="2500"/>
+        <w:gridCol w:w="3300"/>
+        <w:gridCol w:w="1650"/>
+        <w:gridCol w:w="1650"/>
       </w:tblGrid>
       <w:tr>
         <w:trPr>
@@ -108,9 +109,9 @@
             <w:shd w:fill="1C2035" w:val="clear"/>
             <w:tcMar>
               <w:top w:type="dxa" w:w="90"/>
-              <w:left w:type="dxa" w:w="110"/>
-              <w:bottom w:type="dxa" w:w="90"/>
-              <w:right w:type="dxa" w:w="110"/>
+              <w:left w:type="dxa" w:w="100"/>
+              <w:bottom w:type="dxa" w:w="90"/>
+              <w:right w:type="dxa" w:w="100"/>
             </w:tcMar>
             <w:vAlign w:val="center"/>
           </w:tcPr>
@@ -122,6 +123,7 @@
               <w:rPr>
                 <w:b/>
                 <w:bCs/>
+                <w:strike w:val="false"/>
                 <w:color w:val="FFFFFF"/>
                 <w:sz w:val="20"/>
                 <w:szCs w:val="20"/>
@@ -132,13 +134,13 @@
         </w:tc>
         <w:tc>
           <w:tcPr>
-            <w:tcW w:type="dxa" w:w="2600"/>
+            <w:tcW w:type="dxa" w:w="2500"/>
             <w:shd w:fill="1C2035" w:val="clear"/>
             <w:tcMar>
               <w:top w:type="dxa" w:w="90"/>
-              <w:left w:type="dxa" w:w="110"/>
-              <w:bottom w:type="dxa" w:w="90"/>
-              <w:right w:type="dxa" w:w="110"/>
+              <w:left w:type="dxa" w:w="100"/>
+              <w:bottom w:type="dxa" w:w="90"/>
+              <w:right w:type="dxa" w:w="100"/>
             </w:tcMar>
             <w:vAlign w:val="center"/>
           </w:tcPr>
@@ -150,6 +152,7 @@
               <w:rPr>
                 <w:b/>
                 <w:bCs/>
+                <w:strike w:val="false"/>
                 <w:color w:val="FFFFFF"/>
                 <w:sz w:val="20"/>
                 <w:szCs w:val="20"/>
@@ -160,13 +163,13 @@
         </w:tc>
         <w:tc>
           <w:tcPr>
-            <w:tcW w:type="dxa" w:w="4600"/>
+            <w:tcW w:type="dxa" w:w="3300"/>
             <w:shd w:fill="1C2035" w:val="clear"/>
             <w:tcMar>
               <w:top w:type="dxa" w:w="90"/>
-              <w:left w:type="dxa" w:w="110"/>
-              <w:bottom w:type="dxa" w:w="90"/>
-              <w:right w:type="dxa" w:w="110"/>
+              <w:left w:type="dxa" w:w="100"/>
+              <w:bottom w:type="dxa" w:w="90"/>
+              <w:right w:type="dxa" w:w="100"/>
             </w:tcMar>
             <w:vAlign w:val="center"/>
           </w:tcPr>
@@ -178,6 +181,7 @@
               <w:rPr>
                 <w:b/>
                 <w:bCs/>
+                <w:strike w:val="false"/>
                 <w:color w:val="FFFFFF"/>
                 <w:sz w:val="20"/>
                 <w:szCs w:val="20"/>
@@ -188,13 +192,13 @@
         </w:tc>
         <w:tc>
           <w:tcPr>
-            <w:tcW w:type="dxa" w:w="1900"/>
+            <w:tcW w:type="dxa" w:w="1650"/>
             <w:shd w:fill="1C2035" w:val="clear"/>
             <w:tcMar>
               <w:top w:type="dxa" w:w="90"/>
-              <w:left w:type="dxa" w:w="110"/>
-              <w:bottom w:type="dxa" w:w="90"/>
-              <w:right w:type="dxa" w:w="110"/>
+              <w:left w:type="dxa" w:w="100"/>
+              <w:bottom w:type="dxa" w:w="90"/>
+              <w:right w:type="dxa" w:w="100"/>
             </w:tcMar>
             <w:vAlign w:val="center"/>
           </w:tcPr>
@@ -206,11 +210,41 @@
               <w:rPr>
                 <w:b/>
                 <w:bCs/>
+                <w:strike w:val="false"/>
                 <w:color w:val="FFFFFF"/>
                 <w:sz w:val="20"/>
                 <w:szCs w:val="20"/>
               </w:rPr>
-              <w:t xml:space="preserve">Giá (VNĐ)</w:t>
+              <w:t xml:space="preserve">Giá niêm yết</w:t>
+            </w:r>
+          </w:p>
+        </w:tc>
+        <w:tc>
+          <w:tcPr>
+            <w:tcW w:type="dxa" w:w="1650"/>
+            <w:shd w:fill="1C2035" w:val="clear"/>
+            <w:tcMar>
+              <w:top w:type="dxa" w:w="90"/>
+              <w:left w:type="dxa" w:w="100"/>
+              <w:bottom w:type="dxa" w:w="90"/>
+              <w:right w:type="dxa" w:w="100"/>
+            </w:tcMar>
+            <w:vAlign w:val="center"/>
+          </w:tcPr>
+          <w:p>
+            <w:pPr>
+              <w:jc w:val="right"/>
+            </w:pPr>
+            <w:r>
+              <w:rPr>
+                <w:b/>
+                <w:bCs/>
+                <w:strike w:val="false"/>
+                <w:color w:val="FFFFFF"/>
+                <w:sz w:val="20"/>
+                <w:szCs w:val="20"/>
+              </w:rPr>
+              <w:t xml:space="preserve">Giá ưu đãi -5%</w:t>
             </w:r>
           </w:p>
         </w:tc>
@@ -222,9 +256,9 @@
             <w:shd w:fill="FFFFFF" w:val="clear"/>
             <w:tcMar>
               <w:top w:type="dxa" w:w="90"/>
-              <w:left w:type="dxa" w:w="110"/>
-              <w:bottom w:type="dxa" w:w="90"/>
-              <w:right w:type="dxa" w:w="110"/>
+              <w:left w:type="dxa" w:w="100"/>
+              <w:bottom w:type="dxa" w:w="90"/>
+              <w:right w:type="dxa" w:w="100"/>
             </w:tcMar>
             <w:vAlign w:val="center"/>
           </w:tcPr>
@@ -236,6 +270,7 @@
               <w:rPr>
                 <w:b w:val="false"/>
                 <w:bCs w:val="false"/>
+                <w:strike w:val="false"/>
                 <w:color w:val="27343A"/>
                 <w:sz w:val="20"/>
                 <w:szCs w:val="20"/>
@@ -246,13 +281,13 @@
         </w:tc>
         <w:tc>
           <w:tcPr>
-            <w:tcW w:type="dxa" w:w="2600"/>
-            <w:shd w:fill="FFFFFF" w:val="clear"/>
-            <w:tcMar>
-              <w:top w:type="dxa" w:w="90"/>
-              <w:left w:type="dxa" w:w="110"/>
-              <w:bottom w:type="dxa" w:w="90"/>
-              <w:right w:type="dxa" w:w="110"/>
+            <w:tcW w:type="dxa" w:w="2500"/>
+            <w:shd w:fill="FFFFFF" w:val="clear"/>
+            <w:tcMar>
+              <w:top w:type="dxa" w:w="90"/>
+              <w:left w:type="dxa" w:w="100"/>
+              <w:bottom w:type="dxa" w:w="90"/>
+              <w:right w:type="dxa" w:w="100"/>
             </w:tcMar>
             <w:vAlign w:val="center"/>
           </w:tcPr>
@@ -264,6 +299,7 @@
               <w:rPr>
                 <w:b/>
                 <w:bCs/>
+                <w:strike w:val="false"/>
                 <w:color w:val="27343A"/>
                 <w:sz w:val="20"/>
                 <w:szCs w:val="20"/>
@@ -274,13 +310,13 @@
         </w:tc>
         <w:tc>
           <w:tcPr>
-            <w:tcW w:type="dxa" w:w="4600"/>
-            <w:shd w:fill="FFFFFF" w:val="clear"/>
-            <w:tcMar>
-              <w:top w:type="dxa" w:w="90"/>
-              <w:left w:type="dxa" w:w="110"/>
-              <w:bottom w:type="dxa" w:w="90"/>
-              <w:right w:type="dxa" w:w="110"/>
+            <w:tcW w:type="dxa" w:w="3300"/>
+            <w:shd w:fill="FFFFFF" w:val="clear"/>
+            <w:tcMar>
+              <w:top w:type="dxa" w:w="90"/>
+              <w:left w:type="dxa" w:w="100"/>
+              <w:bottom w:type="dxa" w:w="90"/>
+              <w:right w:type="dxa" w:w="100"/>
             </w:tcMar>
             <w:vAlign w:val="center"/>
           </w:tcPr>
@@ -292,6 +328,7 @@
               <w:rPr>
                 <w:b w:val="false"/>
                 <w:bCs w:val="false"/>
+                <w:strike w:val="false"/>
                 <w:color w:val="27343A"/>
                 <w:sz w:val="20"/>
                 <w:szCs w:val="20"/>
@@ -302,13 +339,13 @@
         </w:tc>
         <w:tc>
           <w:tcPr>
-            <w:tcW w:type="dxa" w:w="1900"/>
-            <w:shd w:fill="FFFFFF" w:val="clear"/>
-            <w:tcMar>
-              <w:top w:type="dxa" w:w="90"/>
-              <w:left w:type="dxa" w:w="110"/>
-              <w:bottom w:type="dxa" w:w="90"/>
-              <w:right w:type="dxa" w:w="110"/>
+            <w:tcW w:type="dxa" w:w="1650"/>
+            <w:shd w:fill="FFFFFF" w:val="clear"/>
+            <w:tcMar>
+              <w:top w:type="dxa" w:w="90"/>
+              <w:left w:type="dxa" w:w="100"/>
+              <w:bottom w:type="dxa" w:w="90"/>
+              <w:right w:type="dxa" w:w="100"/>
             </w:tcMar>
             <w:vAlign w:val="center"/>
           </w:tcPr>
@@ -318,13 +355,43 @@
             </w:pPr>
             <w:r>
               <w:rPr>
-                <w:b/>
-                <w:bCs/>
+                <w:b w:val="false"/>
+                <w:bCs w:val="false"/>
+                <w:strike/>
+                <w:color w:val="9AA3AF"/>
+                <w:sz w:val="20"/>
+                <w:szCs w:val="20"/>
+              </w:rPr>
+              <w:t xml:space="preserve">6.000.000 đ</w:t>
+            </w:r>
+          </w:p>
+        </w:tc>
+        <w:tc>
+          <w:tcPr>
+            <w:tcW w:type="dxa" w:w="1650"/>
+            <w:shd w:fill="FFFFFF" w:val="clear"/>
+            <w:tcMar>
+              <w:top w:type="dxa" w:w="90"/>
+              <w:left w:type="dxa" w:w="100"/>
+              <w:bottom w:type="dxa" w:w="90"/>
+              <w:right w:type="dxa" w:w="100"/>
+            </w:tcMar>
+            <w:vAlign w:val="center"/>
+          </w:tcPr>
+          <w:p>
+            <w:pPr>
+              <w:jc w:val="right"/>
+            </w:pPr>
+            <w:r>
+              <w:rPr>
+                <w:b/>
+                <w:bCs/>
+                <w:strike w:val="false"/>
                 <w:color w:val="0E8C7F"/>
                 <w:sz w:val="20"/>
                 <w:szCs w:val="20"/>
               </w:rPr>
-              <w:t xml:space="preserve">6.000.000 đ</w:t>
+              <w:t xml:space="preserve">5.700.000 đ</w:t>
             </w:r>
           </w:p>
         </w:tc>
@@ -336,9 +403,9 @@
             <w:shd w:fill="F5F7FA" w:val="clear"/>
             <w:tcMar>
               <w:top w:type="dxa" w:w="90"/>
-              <w:left w:type="dxa" w:w="110"/>
-              <w:bottom w:type="dxa" w:w="90"/>
-              <w:right w:type="dxa" w:w="110"/>
+              <w:left w:type="dxa" w:w="100"/>
+              <w:bottom w:type="dxa" w:w="90"/>
+              <w:right w:type="dxa" w:w="100"/>
             </w:tcMar>
             <w:vAlign w:val="center"/>
           </w:tcPr>
@@ -350,6 +417,7 @@
               <w:rPr>
                 <w:b w:val="false"/>
                 <w:bCs w:val="false"/>
+                <w:strike w:val="false"/>
                 <w:color w:val="27343A"/>
                 <w:sz w:val="20"/>
                 <w:szCs w:val="20"/>
@@ -360,13 +428,13 @@
         </w:tc>
         <w:tc>
           <w:tcPr>
-            <w:tcW w:type="dxa" w:w="2600"/>
-            <w:shd w:fill="F5F7FA" w:val="clear"/>
-            <w:tcMar>
-              <w:top w:type="dxa" w:w="90"/>
-              <w:left w:type="dxa" w:w="110"/>
-              <w:bottom w:type="dxa" w:w="90"/>
-              <w:right w:type="dxa" w:w="110"/>
+            <w:tcW w:type="dxa" w:w="2500"/>
+            <w:shd w:fill="F5F7FA" w:val="clear"/>
+            <w:tcMar>
+              <w:top w:type="dxa" w:w="90"/>
+              <w:left w:type="dxa" w:w="100"/>
+              <w:bottom w:type="dxa" w:w="90"/>
+              <w:right w:type="dxa" w:w="100"/>
             </w:tcMar>
             <w:vAlign w:val="center"/>
           </w:tcPr>
@@ -378,6 +446,7 @@
               <w:rPr>
                 <w:b/>
                 <w:bCs/>
+                <w:strike w:val="false"/>
                 <w:color w:val="27343A"/>
                 <w:sz w:val="20"/>
                 <w:szCs w:val="20"/>
@@ -388,13 +457,13 @@
         </w:tc>
         <w:tc>
           <w:tcPr>
-            <w:tcW w:type="dxa" w:w="4600"/>
-            <w:shd w:fill="F5F7FA" w:val="clear"/>
-            <w:tcMar>
-              <w:top w:type="dxa" w:w="90"/>
-              <w:left w:type="dxa" w:w="110"/>
-              <w:bottom w:type="dxa" w:w="90"/>
-              <w:right w:type="dxa" w:w="110"/>
+            <w:tcW w:type="dxa" w:w="3300"/>
+            <w:shd w:fill="F5F7FA" w:val="clear"/>
+            <w:tcMar>
+              <w:top w:type="dxa" w:w="90"/>
+              <w:left w:type="dxa" w:w="100"/>
+              <w:bottom w:type="dxa" w:w="90"/>
+              <w:right w:type="dxa" w:w="100"/>
             </w:tcMar>
             <w:vAlign w:val="center"/>
           </w:tcPr>
@@ -406,6 +475,7 @@
               <w:rPr>
                 <w:b w:val="false"/>
                 <w:bCs w:val="false"/>
+                <w:strike w:val="false"/>
                 <w:color w:val="27343A"/>
                 <w:sz w:val="20"/>
                 <w:szCs w:val="20"/>
@@ -416,13 +486,13 @@
         </w:tc>
         <w:tc>
           <w:tcPr>
-            <w:tcW w:type="dxa" w:w="1900"/>
-            <w:shd w:fill="F5F7FA" w:val="clear"/>
-            <w:tcMar>
-              <w:top w:type="dxa" w:w="90"/>
-              <w:left w:type="dxa" w:w="110"/>
-              <w:bottom w:type="dxa" w:w="90"/>
-              <w:right w:type="dxa" w:w="110"/>
+            <w:tcW w:type="dxa" w:w="1650"/>
+            <w:shd w:fill="F5F7FA" w:val="clear"/>
+            <w:tcMar>
+              <w:top w:type="dxa" w:w="90"/>
+              <w:left w:type="dxa" w:w="100"/>
+              <w:bottom w:type="dxa" w:w="90"/>
+              <w:right w:type="dxa" w:w="100"/>
             </w:tcMar>
             <w:vAlign w:val="center"/>
           </w:tcPr>
@@ -432,13 +502,43 @@
             </w:pPr>
             <w:r>
               <w:rPr>
-                <w:b/>
-                <w:bCs/>
+                <w:b w:val="false"/>
+                <w:bCs w:val="false"/>
+                <w:strike/>
+                <w:color w:val="9AA3AF"/>
+                <w:sz w:val="20"/>
+                <w:szCs w:val="20"/>
+              </w:rPr>
+              <w:t xml:space="preserve">4.500.000 đ</w:t>
+            </w:r>
+          </w:p>
+        </w:tc>
+        <w:tc>
+          <w:tcPr>
+            <w:tcW w:type="dxa" w:w="1650"/>
+            <w:shd w:fill="F5F7FA" w:val="clear"/>
+            <w:tcMar>
+              <w:top w:type="dxa" w:w="90"/>
+              <w:left w:type="dxa" w:w="100"/>
+              <w:bottom w:type="dxa" w:w="90"/>
+              <w:right w:type="dxa" w:w="100"/>
+            </w:tcMar>
+            <w:vAlign w:val="center"/>
+          </w:tcPr>
+          <w:p>
+            <w:pPr>
+              <w:jc w:val="right"/>
+            </w:pPr>
+            <w:r>
+              <w:rPr>
+                <w:b/>
+                <w:bCs/>
+                <w:strike w:val="false"/>
                 <w:color w:val="0E8C7F"/>
                 <w:sz w:val="20"/>
                 <w:szCs w:val="20"/>
               </w:rPr>
-              <w:t xml:space="preserve">4.500.000 đ</w:t>
+              <w:t xml:space="preserve">4.275.000 đ</w:t>
             </w:r>
           </w:p>
         </w:tc>
@@ -450,9 +550,9 @@
             <w:shd w:fill="FFFFFF" w:val="clear"/>
             <w:tcMar>
               <w:top w:type="dxa" w:w="90"/>
-              <w:left w:type="dxa" w:w="110"/>
-              <w:bottom w:type="dxa" w:w="90"/>
-              <w:right w:type="dxa" w:w="110"/>
+              <w:left w:type="dxa" w:w="100"/>
+              <w:bottom w:type="dxa" w:w="90"/>
+              <w:right w:type="dxa" w:w="100"/>
             </w:tcMar>
             <w:vAlign w:val="center"/>
           </w:tcPr>
@@ -464,6 +564,7 @@
               <w:rPr>
                 <w:b w:val="false"/>
                 <w:bCs w:val="false"/>
+                <w:strike w:val="false"/>
                 <w:color w:val="27343A"/>
                 <w:sz w:val="20"/>
                 <w:szCs w:val="20"/>
@@ -474,13 +575,13 @@
         </w:tc>
         <w:tc>
           <w:tcPr>
-            <w:tcW w:type="dxa" w:w="2600"/>
-            <w:shd w:fill="FFFFFF" w:val="clear"/>
-            <w:tcMar>
-              <w:top w:type="dxa" w:w="90"/>
-              <w:left w:type="dxa" w:w="110"/>
-              <w:bottom w:type="dxa" w:w="90"/>
-              <w:right w:type="dxa" w:w="110"/>
+            <w:tcW w:type="dxa" w:w="2500"/>
+            <w:shd w:fill="FFFFFF" w:val="clear"/>
+            <w:tcMar>
+              <w:top w:type="dxa" w:w="90"/>
+              <w:left w:type="dxa" w:w="100"/>
+              <w:bottom w:type="dxa" w:w="90"/>
+              <w:right w:type="dxa" w:w="100"/>
             </w:tcMar>
             <w:vAlign w:val="center"/>
           </w:tcPr>
@@ -492,6 +593,7 @@
               <w:rPr>
                 <w:b/>
                 <w:bCs/>
+                <w:strike w:val="false"/>
                 <w:color w:val="27343A"/>
                 <w:sz w:val="20"/>
                 <w:szCs w:val="20"/>
@@ -502,13 +604,13 @@
         </w:tc>
         <w:tc>
           <w:tcPr>
-            <w:tcW w:type="dxa" w:w="4600"/>
-            <w:shd w:fill="FFFFFF" w:val="clear"/>
-            <w:tcMar>
-              <w:top w:type="dxa" w:w="90"/>
-              <w:left w:type="dxa" w:w="110"/>
-              <w:bottom w:type="dxa" w:w="90"/>
-              <w:right w:type="dxa" w:w="110"/>
+            <w:tcW w:type="dxa" w:w="3300"/>
+            <w:shd w:fill="FFFFFF" w:val="clear"/>
+            <w:tcMar>
+              <w:top w:type="dxa" w:w="90"/>
+              <w:left w:type="dxa" w:w="100"/>
+              <w:bottom w:type="dxa" w:w="90"/>
+              <w:right w:type="dxa" w:w="100"/>
             </w:tcMar>
             <w:vAlign w:val="center"/>
           </w:tcPr>
@@ -520,6 +622,7 @@
               <w:rPr>
                 <w:b w:val="false"/>
                 <w:bCs w:val="false"/>
+                <w:strike w:val="false"/>
                 <w:color w:val="27343A"/>
                 <w:sz w:val="20"/>
                 <w:szCs w:val="20"/>
@@ -530,13 +633,13 @@
         </w:tc>
         <w:tc>
           <w:tcPr>
-            <w:tcW w:type="dxa" w:w="1900"/>
-            <w:shd w:fill="FFFFFF" w:val="clear"/>
-            <w:tcMar>
-              <w:top w:type="dxa" w:w="90"/>
-              <w:left w:type="dxa" w:w="110"/>
-              <w:bottom w:type="dxa" w:w="90"/>
-              <w:right w:type="dxa" w:w="110"/>
+            <w:tcW w:type="dxa" w:w="1650"/>
+            <w:shd w:fill="FFFFFF" w:val="clear"/>
+            <w:tcMar>
+              <w:top w:type="dxa" w:w="90"/>
+              <w:left w:type="dxa" w:w="100"/>
+              <w:bottom w:type="dxa" w:w="90"/>
+              <w:right w:type="dxa" w:w="100"/>
             </w:tcMar>
             <w:vAlign w:val="center"/>
           </w:tcPr>
@@ -546,13 +649,43 @@
             </w:pPr>
             <w:r>
               <w:rPr>
-                <w:b/>
-                <w:bCs/>
+                <w:b w:val="false"/>
+                <w:bCs w:val="false"/>
+                <w:strike/>
+                <w:color w:val="9AA3AF"/>
+                <w:sz w:val="20"/>
+                <w:szCs w:val="20"/>
+              </w:rPr>
+              <w:t xml:space="preserve">3.700.000 đ</w:t>
+            </w:r>
+          </w:p>
+        </w:tc>
+        <w:tc>
+          <w:tcPr>
+            <w:tcW w:type="dxa" w:w="1650"/>
+            <w:shd w:fill="FFFFFF" w:val="clear"/>
+            <w:tcMar>
+              <w:top w:type="dxa" w:w="90"/>
+              <w:left w:type="dxa" w:w="100"/>
+              <w:bottom w:type="dxa" w:w="90"/>
+              <w:right w:type="dxa" w:w="100"/>
+            </w:tcMar>
+            <w:vAlign w:val="center"/>
+          </w:tcPr>
+          <w:p>
+            <w:pPr>
+              <w:jc w:val="right"/>
+            </w:pPr>
+            <w:r>
+              <w:rPr>
+                <w:b/>
+                <w:bCs/>
+                <w:strike w:val="false"/>
                 <w:color w:val="0E8C7F"/>
                 <w:sz w:val="20"/>
                 <w:szCs w:val="20"/>
               </w:rPr>
-              <w:t xml:space="preserve">3.700.000 đ</w:t>
+              <w:t xml:space="preserve">3.515.000 đ</w:t>
             </w:r>
           </w:p>
         </w:tc>
@@ -564,9 +697,9 @@
             <w:shd w:fill="F5F7FA" w:val="clear"/>
             <w:tcMar>
               <w:top w:type="dxa" w:w="90"/>
-              <w:left w:type="dxa" w:w="110"/>
-              <w:bottom w:type="dxa" w:w="90"/>
-              <w:right w:type="dxa" w:w="110"/>
+              <w:left w:type="dxa" w:w="100"/>
+              <w:bottom w:type="dxa" w:w="90"/>
+              <w:right w:type="dxa" w:w="100"/>
             </w:tcMar>
             <w:vAlign w:val="center"/>
           </w:tcPr>
@@ -578,6 +711,7 @@
               <w:rPr>
                 <w:b w:val="false"/>
                 <w:bCs w:val="false"/>
+                <w:strike w:val="false"/>
                 <w:color w:val="27343A"/>
                 <w:sz w:val="20"/>
                 <w:szCs w:val="20"/>
@@ -588,13 +722,13 @@
         </w:tc>
         <w:tc>
           <w:tcPr>
-            <w:tcW w:type="dxa" w:w="2600"/>
-            <w:shd w:fill="F5F7FA" w:val="clear"/>
-            <w:tcMar>
-              <w:top w:type="dxa" w:w="90"/>
-              <w:left w:type="dxa" w:w="110"/>
-              <w:bottom w:type="dxa" w:w="90"/>
-              <w:right w:type="dxa" w:w="110"/>
+            <w:tcW w:type="dxa" w:w="2500"/>
+            <w:shd w:fill="F5F7FA" w:val="clear"/>
+            <w:tcMar>
+              <w:top w:type="dxa" w:w="90"/>
+              <w:left w:type="dxa" w:w="100"/>
+              <w:bottom w:type="dxa" w:w="90"/>
+              <w:right w:type="dxa" w:w="100"/>
             </w:tcMar>
             <w:vAlign w:val="center"/>
           </w:tcPr>
@@ -606,6 +740,7 @@
               <w:rPr>
                 <w:b/>
                 <w:bCs/>
+                <w:strike w:val="false"/>
                 <w:color w:val="27343A"/>
                 <w:sz w:val="20"/>
                 <w:szCs w:val="20"/>
@@ -616,13 +751,13 @@
         </w:tc>
         <w:tc>
           <w:tcPr>
-            <w:tcW w:type="dxa" w:w="4600"/>
-            <w:shd w:fill="F5F7FA" w:val="clear"/>
-            <w:tcMar>
-              <w:top w:type="dxa" w:w="90"/>
-              <w:left w:type="dxa" w:w="110"/>
-              <w:bottom w:type="dxa" w:w="90"/>
-              <w:right w:type="dxa" w:w="110"/>
+            <w:tcW w:type="dxa" w:w="3300"/>
+            <w:shd w:fill="F5F7FA" w:val="clear"/>
+            <w:tcMar>
+              <w:top w:type="dxa" w:w="90"/>
+              <w:left w:type="dxa" w:w="100"/>
+              <w:bottom w:type="dxa" w:w="90"/>
+              <w:right w:type="dxa" w:w="100"/>
             </w:tcMar>
             <w:vAlign w:val="center"/>
           </w:tcPr>
@@ -634,6 +769,7 @@
               <w:rPr>
                 <w:b w:val="false"/>
                 <w:bCs w:val="false"/>
+                <w:strike w:val="false"/>
                 <w:color w:val="27343A"/>
                 <w:sz w:val="20"/>
                 <w:szCs w:val="20"/>
@@ -644,13 +780,13 @@
         </w:tc>
         <w:tc>
           <w:tcPr>
-            <w:tcW w:type="dxa" w:w="1900"/>
-            <w:shd w:fill="F5F7FA" w:val="clear"/>
-            <w:tcMar>
-              <w:top w:type="dxa" w:w="90"/>
-              <w:left w:type="dxa" w:w="110"/>
-              <w:bottom w:type="dxa" w:w="90"/>
-              <w:right w:type="dxa" w:w="110"/>
+            <w:tcW w:type="dxa" w:w="1650"/>
+            <w:shd w:fill="F5F7FA" w:val="clear"/>
+            <w:tcMar>
+              <w:top w:type="dxa" w:w="90"/>
+              <w:left w:type="dxa" w:w="100"/>
+              <w:bottom w:type="dxa" w:w="90"/>
+              <w:right w:type="dxa" w:w="100"/>
             </w:tcMar>
             <w:vAlign w:val="center"/>
           </w:tcPr>
@@ -660,13 +796,43 @@
             </w:pPr>
             <w:r>
               <w:rPr>
-                <w:b/>
-                <w:bCs/>
+                <w:b w:val="false"/>
+                <w:bCs w:val="false"/>
+                <w:strike/>
+                <w:color w:val="9AA3AF"/>
+                <w:sz w:val="20"/>
+                <w:szCs w:val="20"/>
+              </w:rPr>
+              <w:t xml:space="preserve">5.400.000 đ</w:t>
+            </w:r>
+          </w:p>
+        </w:tc>
+        <w:tc>
+          <w:tcPr>
+            <w:tcW w:type="dxa" w:w="1650"/>
+            <w:shd w:fill="F5F7FA" w:val="clear"/>
+            <w:tcMar>
+              <w:top w:type="dxa" w:w="90"/>
+              <w:left w:type="dxa" w:w="100"/>
+              <w:bottom w:type="dxa" w:w="90"/>
+              <w:right w:type="dxa" w:w="100"/>
+            </w:tcMar>
+            <w:vAlign w:val="center"/>
+          </w:tcPr>
+          <w:p>
+            <w:pPr>
+              <w:jc w:val="right"/>
+            </w:pPr>
+            <w:r>
+              <w:rPr>
+                <w:b/>
+                <w:bCs/>
+                <w:strike w:val="false"/>
                 <w:color w:val="0E8C7F"/>
                 <w:sz w:val="20"/>
                 <w:szCs w:val="20"/>
               </w:rPr>
-              <w:t xml:space="preserve">5.400.000 đ</w:t>
+              <w:t xml:space="preserve">5.130.000 đ</w:t>
             </w:r>
           </w:p>
         </w:tc>
@@ -678,9 +844,9 @@
             <w:shd w:fill="FFFFFF" w:val="clear"/>
             <w:tcMar>
               <w:top w:type="dxa" w:w="90"/>
-              <w:left w:type="dxa" w:w="110"/>
-              <w:bottom w:type="dxa" w:w="90"/>
-              <w:right w:type="dxa" w:w="110"/>
+              <w:left w:type="dxa" w:w="100"/>
+              <w:bottom w:type="dxa" w:w="90"/>
+              <w:right w:type="dxa" w:w="100"/>
             </w:tcMar>
             <w:vAlign w:val="center"/>
           </w:tcPr>
@@ -692,6 +858,7 @@
               <w:rPr>
                 <w:b w:val="false"/>
                 <w:bCs w:val="false"/>
+                <w:strike w:val="false"/>
                 <w:color w:val="27343A"/>
                 <w:sz w:val="20"/>
                 <w:szCs w:val="20"/>
@@ -702,13 +869,13 @@
         </w:tc>
         <w:tc>
           <w:tcPr>
-            <w:tcW w:type="dxa" w:w="2600"/>
-            <w:shd w:fill="FFFFFF" w:val="clear"/>
-            <w:tcMar>
-              <w:top w:type="dxa" w:w="90"/>
-              <w:left w:type="dxa" w:w="110"/>
-              <w:bottom w:type="dxa" w:w="90"/>
-              <w:right w:type="dxa" w:w="110"/>
+            <w:tcW w:type="dxa" w:w="2500"/>
+            <w:shd w:fill="FFFFFF" w:val="clear"/>
+            <w:tcMar>
+              <w:top w:type="dxa" w:w="90"/>
+              <w:left w:type="dxa" w:w="100"/>
+              <w:bottom w:type="dxa" w:w="90"/>
+              <w:right w:type="dxa" w:w="100"/>
             </w:tcMar>
             <w:vAlign w:val="center"/>
           </w:tcPr>
@@ -720,6 +887,7 @@
               <w:rPr>
                 <w:b/>
                 <w:bCs/>
+                <w:strike w:val="false"/>
                 <w:color w:val="27343A"/>
                 <w:sz w:val="20"/>
                 <w:szCs w:val="20"/>
@@ -730,13 +898,13 @@
         </w:tc>
         <w:tc>
           <w:tcPr>
-            <w:tcW w:type="dxa" w:w="4600"/>
-            <w:shd w:fill="FFFFFF" w:val="clear"/>
-            <w:tcMar>
-              <w:top w:type="dxa" w:w="90"/>
-              <w:left w:type="dxa" w:w="110"/>
-              <w:bottom w:type="dxa" w:w="90"/>
-              <w:right w:type="dxa" w:w="110"/>
+            <w:tcW w:type="dxa" w:w="3300"/>
+            <w:shd w:fill="FFFFFF" w:val="clear"/>
+            <w:tcMar>
+              <w:top w:type="dxa" w:w="90"/>
+              <w:left w:type="dxa" w:w="100"/>
+              <w:bottom w:type="dxa" w:w="90"/>
+              <w:right w:type="dxa" w:w="100"/>
             </w:tcMar>
             <w:vAlign w:val="center"/>
           </w:tcPr>
@@ -748,6 +916,7 @@
               <w:rPr>
                 <w:b w:val="false"/>
                 <w:bCs w:val="false"/>
+                <w:strike w:val="false"/>
                 <w:color w:val="27343A"/>
                 <w:sz w:val="20"/>
                 <w:szCs w:val="20"/>
@@ -758,13 +927,13 @@
         </w:tc>
         <w:tc>
           <w:tcPr>
-            <w:tcW w:type="dxa" w:w="1900"/>
-            <w:shd w:fill="FFFFFF" w:val="clear"/>
-            <w:tcMar>
-              <w:top w:type="dxa" w:w="90"/>
-              <w:left w:type="dxa" w:w="110"/>
-              <w:bottom w:type="dxa" w:w="90"/>
-              <w:right w:type="dxa" w:w="110"/>
+            <w:tcW w:type="dxa" w:w="1650"/>
+            <w:shd w:fill="FFFFFF" w:val="clear"/>
+            <w:tcMar>
+              <w:top w:type="dxa" w:w="90"/>
+              <w:left w:type="dxa" w:w="100"/>
+              <w:bottom w:type="dxa" w:w="90"/>
+              <w:right w:type="dxa" w:w="100"/>
             </w:tcMar>
             <w:vAlign w:val="center"/>
           </w:tcPr>
@@ -774,13 +943,43 @@
             </w:pPr>
             <w:r>
               <w:rPr>
-                <w:b/>
-                <w:bCs/>
+                <w:b w:val="false"/>
+                <w:bCs w:val="false"/>
+                <w:strike/>
+                <w:color w:val="9AA3AF"/>
+                <w:sz w:val="20"/>
+                <w:szCs w:val="20"/>
+              </w:rPr>
+              <w:t xml:space="preserve">4.500.000 đ</w:t>
+            </w:r>
+          </w:p>
+        </w:tc>
+        <w:tc>
+          <w:tcPr>
+            <w:tcW w:type="dxa" w:w="1650"/>
+            <w:shd w:fill="FFFFFF" w:val="clear"/>
+            <w:tcMar>
+              <w:top w:type="dxa" w:w="90"/>
+              <w:left w:type="dxa" w:w="100"/>
+              <w:bottom w:type="dxa" w:w="90"/>
+              <w:right w:type="dxa" w:w="100"/>
+            </w:tcMar>
+            <w:vAlign w:val="center"/>
+          </w:tcPr>
+          <w:p>
+            <w:pPr>
+              <w:jc w:val="right"/>
+            </w:pPr>
+            <w:r>
+              <w:rPr>
+                <w:b/>
+                <w:bCs/>
+                <w:strike w:val="false"/>
                 <w:color w:val="0E8C7F"/>
                 <w:sz w:val="20"/>
                 <w:szCs w:val="20"/>
               </w:rPr>
-              <w:t xml:space="preserve">4.500.000 đ</w:t>
+              <w:t xml:space="preserve">4.275.000 đ</w:t>
             </w:r>
           </w:p>
         </w:tc>
@@ -792,9 +991,9 @@
             <w:shd w:fill="F5F7FA" w:val="clear"/>
             <w:tcMar>
               <w:top w:type="dxa" w:w="90"/>
-              <w:left w:type="dxa" w:w="110"/>
-              <w:bottom w:type="dxa" w:w="90"/>
-              <w:right w:type="dxa" w:w="110"/>
+              <w:left w:type="dxa" w:w="100"/>
+              <w:bottom w:type="dxa" w:w="90"/>
+              <w:right w:type="dxa" w:w="100"/>
             </w:tcMar>
             <w:vAlign w:val="center"/>
           </w:tcPr>
@@ -806,6 +1005,7 @@
               <w:rPr>
                 <w:b w:val="false"/>
                 <w:bCs w:val="false"/>
+                <w:strike w:val="false"/>
                 <w:color w:val="27343A"/>
                 <w:sz w:val="20"/>
                 <w:szCs w:val="20"/>
@@ -816,13 +1016,13 @@
         </w:tc>
         <w:tc>
           <w:tcPr>
-            <w:tcW w:type="dxa" w:w="2600"/>
-            <w:shd w:fill="F5F7FA" w:val="clear"/>
-            <w:tcMar>
-              <w:top w:type="dxa" w:w="90"/>
-              <w:left w:type="dxa" w:w="110"/>
-              <w:bottom w:type="dxa" w:w="90"/>
-              <w:right w:type="dxa" w:w="110"/>
+            <w:tcW w:type="dxa" w:w="2500"/>
+            <w:shd w:fill="F5F7FA" w:val="clear"/>
+            <w:tcMar>
+              <w:top w:type="dxa" w:w="90"/>
+              <w:left w:type="dxa" w:w="100"/>
+              <w:bottom w:type="dxa" w:w="90"/>
+              <w:right w:type="dxa" w:w="100"/>
             </w:tcMar>
             <w:vAlign w:val="center"/>
           </w:tcPr>
@@ -834,6 +1034,7 @@
               <w:rPr>
                 <w:b/>
                 <w:bCs/>
+                <w:strike w:val="false"/>
                 <w:color w:val="27343A"/>
                 <w:sz w:val="20"/>
                 <w:szCs w:val="20"/>
@@ -844,13 +1045,13 @@
         </w:tc>
         <w:tc>
           <w:tcPr>
-            <w:tcW w:type="dxa" w:w="4600"/>
-            <w:shd w:fill="F5F7FA" w:val="clear"/>
-            <w:tcMar>
-              <w:top w:type="dxa" w:w="90"/>
-              <w:left w:type="dxa" w:w="110"/>
-              <w:bottom w:type="dxa" w:w="90"/>
-              <w:right w:type="dxa" w:w="110"/>
+            <w:tcW w:type="dxa" w:w="3300"/>
+            <w:shd w:fill="F5F7FA" w:val="clear"/>
+            <w:tcMar>
+              <w:top w:type="dxa" w:w="90"/>
+              <w:left w:type="dxa" w:w="100"/>
+              <w:bottom w:type="dxa" w:w="90"/>
+              <w:right w:type="dxa" w:w="100"/>
             </w:tcMar>
             <w:vAlign w:val="center"/>
           </w:tcPr>
@@ -862,6 +1063,7 @@
               <w:rPr>
                 <w:b w:val="false"/>
                 <w:bCs w:val="false"/>
+                <w:strike w:val="false"/>
                 <w:color w:val="27343A"/>
                 <w:sz w:val="20"/>
                 <w:szCs w:val="20"/>
@@ -872,13 +1074,13 @@
         </w:tc>
         <w:tc>
           <w:tcPr>
-            <w:tcW w:type="dxa" w:w="1900"/>
-            <w:shd w:fill="F5F7FA" w:val="clear"/>
-            <w:tcMar>
-              <w:top w:type="dxa" w:w="90"/>
-              <w:left w:type="dxa" w:w="110"/>
-              <w:bottom w:type="dxa" w:w="90"/>
-              <w:right w:type="dxa" w:w="110"/>
+            <w:tcW w:type="dxa" w:w="1650"/>
+            <w:shd w:fill="F5F7FA" w:val="clear"/>
+            <w:tcMar>
+              <w:top w:type="dxa" w:w="90"/>
+              <w:left w:type="dxa" w:w="100"/>
+              <w:bottom w:type="dxa" w:w="90"/>
+              <w:right w:type="dxa" w:w="100"/>
             </w:tcMar>
             <w:vAlign w:val="center"/>
           </w:tcPr>
@@ -888,13 +1090,43 @@
             </w:pPr>
             <w:r>
               <w:rPr>
-                <w:b/>
-                <w:bCs/>
+                <w:b w:val="false"/>
+                <w:bCs w:val="false"/>
+                <w:strike/>
+                <w:color w:val="9AA3AF"/>
+                <w:sz w:val="20"/>
+                <w:szCs w:val="20"/>
+              </w:rPr>
+              <w:t xml:space="preserve">4.600.000 đ</w:t>
+            </w:r>
+          </w:p>
+        </w:tc>
+        <w:tc>
+          <w:tcPr>
+            <w:tcW w:type="dxa" w:w="1650"/>
+            <w:shd w:fill="F5F7FA" w:val="clear"/>
+            <w:tcMar>
+              <w:top w:type="dxa" w:w="90"/>
+              <w:left w:type="dxa" w:w="100"/>
+              <w:bottom w:type="dxa" w:w="90"/>
+              <w:right w:type="dxa" w:w="100"/>
+            </w:tcMar>
+            <w:vAlign w:val="center"/>
+          </w:tcPr>
+          <w:p>
+            <w:pPr>
+              <w:jc w:val="right"/>
+            </w:pPr>
+            <w:r>
+              <w:rPr>
+                <w:b/>
+                <w:bCs/>
+                <w:strike w:val="false"/>
                 <w:color w:val="0E8C7F"/>
                 <w:sz w:val="20"/>
                 <w:szCs w:val="20"/>
               </w:rPr>
-              <w:t xml:space="preserve">4.600.000 đ</w:t>
+              <w:t xml:space="preserve">4.370.000 đ</w:t>
             </w:r>
           </w:p>
         </w:tc>
@@ -906,9 +1138,9 @@
             <w:shd w:fill="FFFFFF" w:val="clear"/>
             <w:tcMar>
               <w:top w:type="dxa" w:w="90"/>
-              <w:left w:type="dxa" w:w="110"/>
-              <w:bottom w:type="dxa" w:w="90"/>
-              <w:right w:type="dxa" w:w="110"/>
+              <w:left w:type="dxa" w:w="100"/>
+              <w:bottom w:type="dxa" w:w="90"/>
+              <w:right w:type="dxa" w:w="100"/>
             </w:tcMar>
             <w:vAlign w:val="center"/>
           </w:tcPr>
@@ -920,6 +1152,7 @@
               <w:rPr>
                 <w:b w:val="false"/>
                 <w:bCs w:val="false"/>
+                <w:strike w:val="false"/>
                 <w:color w:val="27343A"/>
                 <w:sz w:val="20"/>
                 <w:szCs w:val="20"/>
@@ -930,13 +1163,13 @@
         </w:tc>
         <w:tc>
           <w:tcPr>
-            <w:tcW w:type="dxa" w:w="2600"/>
-            <w:shd w:fill="FFFFFF" w:val="clear"/>
-            <w:tcMar>
-              <w:top w:type="dxa" w:w="90"/>
-              <w:left w:type="dxa" w:w="110"/>
-              <w:bottom w:type="dxa" w:w="90"/>
-              <w:right w:type="dxa" w:w="110"/>
+            <w:tcW w:type="dxa" w:w="2500"/>
+            <w:shd w:fill="FFFFFF" w:val="clear"/>
+            <w:tcMar>
+              <w:top w:type="dxa" w:w="90"/>
+              <w:left w:type="dxa" w:w="100"/>
+              <w:bottom w:type="dxa" w:w="90"/>
+              <w:right w:type="dxa" w:w="100"/>
             </w:tcMar>
             <w:vAlign w:val="center"/>
           </w:tcPr>
@@ -948,6 +1181,7 @@
               <w:rPr>
                 <w:b/>
                 <w:bCs/>
+                <w:strike w:val="false"/>
                 <w:color w:val="27343A"/>
                 <w:sz w:val="20"/>
                 <w:szCs w:val="20"/>
@@ -958,13 +1192,13 @@
         </w:tc>
         <w:tc>
           <w:tcPr>
-            <w:tcW w:type="dxa" w:w="4600"/>
-            <w:shd w:fill="FFFFFF" w:val="clear"/>
-            <w:tcMar>
-              <w:top w:type="dxa" w:w="90"/>
-              <w:left w:type="dxa" w:w="110"/>
-              <w:bottom w:type="dxa" w:w="90"/>
-              <w:right w:type="dxa" w:w="110"/>
+            <w:tcW w:type="dxa" w:w="3300"/>
+            <w:shd w:fill="FFFFFF" w:val="clear"/>
+            <w:tcMar>
+              <w:top w:type="dxa" w:w="90"/>
+              <w:left w:type="dxa" w:w="100"/>
+              <w:bottom w:type="dxa" w:w="90"/>
+              <w:right w:type="dxa" w:w="100"/>
             </w:tcMar>
             <w:vAlign w:val="center"/>
           </w:tcPr>
@@ -976,6 +1210,7 @@
               <w:rPr>
                 <w:b w:val="false"/>
                 <w:bCs w:val="false"/>
+                <w:strike w:val="false"/>
                 <w:color w:val="27343A"/>
                 <w:sz w:val="20"/>
                 <w:szCs w:val="20"/>
@@ -986,13 +1221,13 @@
         </w:tc>
         <w:tc>
           <w:tcPr>
-            <w:tcW w:type="dxa" w:w="1900"/>
-            <w:shd w:fill="FFFFFF" w:val="clear"/>
-            <w:tcMar>
-              <w:top w:type="dxa" w:w="90"/>
-              <w:left w:type="dxa" w:w="110"/>
-              <w:bottom w:type="dxa" w:w="90"/>
-              <w:right w:type="dxa" w:w="110"/>
+            <w:tcW w:type="dxa" w:w="1650"/>
+            <w:shd w:fill="FFFFFF" w:val="clear"/>
+            <w:tcMar>
+              <w:top w:type="dxa" w:w="90"/>
+              <w:left w:type="dxa" w:w="100"/>
+              <w:bottom w:type="dxa" w:w="90"/>
+              <w:right w:type="dxa" w:w="100"/>
             </w:tcMar>
             <w:vAlign w:val="center"/>
           </w:tcPr>
@@ -1002,13 +1237,43 @@
             </w:pPr>
             <w:r>
               <w:rPr>
-                <w:b/>
-                <w:bCs/>
+                <w:b w:val="false"/>
+                <w:bCs w:val="false"/>
+                <w:strike/>
+                <w:color w:val="9AA3AF"/>
+                <w:sz w:val="20"/>
+                <w:szCs w:val="20"/>
+              </w:rPr>
+              <w:t xml:space="preserve">4.500.000 đ</w:t>
+            </w:r>
+          </w:p>
+        </w:tc>
+        <w:tc>
+          <w:tcPr>
+            <w:tcW w:type="dxa" w:w="1650"/>
+            <w:shd w:fill="FFFFFF" w:val="clear"/>
+            <w:tcMar>
+              <w:top w:type="dxa" w:w="90"/>
+              <w:left w:type="dxa" w:w="100"/>
+              <w:bottom w:type="dxa" w:w="90"/>
+              <w:right w:type="dxa" w:w="100"/>
+            </w:tcMar>
+            <w:vAlign w:val="center"/>
+          </w:tcPr>
+          <w:p>
+            <w:pPr>
+              <w:jc w:val="right"/>
+            </w:pPr>
+            <w:r>
+              <w:rPr>
+                <w:b/>
+                <w:bCs/>
+                <w:strike w:val="false"/>
                 <w:color w:val="0E8C7F"/>
                 <w:sz w:val="20"/>
                 <w:szCs w:val="20"/>
               </w:rPr>
-              <w:t xml:space="preserve">4.500.000 đ</w:t>
+              <w:t xml:space="preserve">4.275.000 đ</w:t>
             </w:r>
           </w:p>
         </w:tc>
@@ -1020,9 +1285,9 @@
             <w:shd w:fill="F5F7FA" w:val="clear"/>
             <w:tcMar>
               <w:top w:type="dxa" w:w="90"/>
-              <w:left w:type="dxa" w:w="110"/>
-              <w:bottom w:type="dxa" w:w="90"/>
-              <w:right w:type="dxa" w:w="110"/>
+              <w:left w:type="dxa" w:w="100"/>
+              <w:bottom w:type="dxa" w:w="90"/>
+              <w:right w:type="dxa" w:w="100"/>
             </w:tcMar>
             <w:vAlign w:val="center"/>
           </w:tcPr>
@@ -1034,6 +1299,7 @@
               <w:rPr>
                 <w:b w:val="false"/>
                 <w:bCs w:val="false"/>
+                <w:strike w:val="false"/>
                 <w:color w:val="27343A"/>
                 <w:sz w:val="20"/>
                 <w:szCs w:val="20"/>
@@ -1044,13 +1310,13 @@
         </w:tc>
         <w:tc>
           <w:tcPr>
-            <w:tcW w:type="dxa" w:w="2600"/>
-            <w:shd w:fill="F5F7FA" w:val="clear"/>
-            <w:tcMar>
-              <w:top w:type="dxa" w:w="90"/>
-              <w:left w:type="dxa" w:w="110"/>
-              <w:bottom w:type="dxa" w:w="90"/>
-              <w:right w:type="dxa" w:w="110"/>
+            <w:tcW w:type="dxa" w:w="2500"/>
+            <w:shd w:fill="F5F7FA" w:val="clear"/>
+            <w:tcMar>
+              <w:top w:type="dxa" w:w="90"/>
+              <w:left w:type="dxa" w:w="100"/>
+              <w:bottom w:type="dxa" w:w="90"/>
+              <w:right w:type="dxa" w:w="100"/>
             </w:tcMar>
             <w:vAlign w:val="center"/>
           </w:tcPr>
@@ -1062,6 +1328,7 @@
               <w:rPr>
                 <w:b/>
                 <w:bCs/>
+                <w:strike w:val="false"/>
                 <w:color w:val="27343A"/>
                 <w:sz w:val="20"/>
                 <w:szCs w:val="20"/>
@@ -1072,13 +1339,13 @@
         </w:tc>
         <w:tc>
           <w:tcPr>
-            <w:tcW w:type="dxa" w:w="4600"/>
-            <w:shd w:fill="F5F7FA" w:val="clear"/>
-            <w:tcMar>
-              <w:top w:type="dxa" w:w="90"/>
-              <w:left w:type="dxa" w:w="110"/>
-              <w:bottom w:type="dxa" w:w="90"/>
-              <w:right w:type="dxa" w:w="110"/>
+            <w:tcW w:type="dxa" w:w="3300"/>
+            <w:shd w:fill="F5F7FA" w:val="clear"/>
+            <w:tcMar>
+              <w:top w:type="dxa" w:w="90"/>
+              <w:left w:type="dxa" w:w="100"/>
+              <w:bottom w:type="dxa" w:w="90"/>
+              <w:right w:type="dxa" w:w="100"/>
             </w:tcMar>
             <w:vAlign w:val="center"/>
           </w:tcPr>
@@ -1090,6 +1357,7 @@
               <w:rPr>
                 <w:b w:val="false"/>
                 <w:bCs w:val="false"/>
+                <w:strike w:val="false"/>
                 <w:color w:val="27343A"/>
                 <w:sz w:val="20"/>
                 <w:szCs w:val="20"/>
@@ -1100,13 +1368,13 @@
         </w:tc>
         <w:tc>
           <w:tcPr>
-            <w:tcW w:type="dxa" w:w="1900"/>
-            <w:shd w:fill="F5F7FA" w:val="clear"/>
-            <w:tcMar>
-              <w:top w:type="dxa" w:w="90"/>
-              <w:left w:type="dxa" w:w="110"/>
-              <w:bottom w:type="dxa" w:w="90"/>
-              <w:right w:type="dxa" w:w="110"/>
+            <w:tcW w:type="dxa" w:w="1650"/>
+            <w:shd w:fill="F5F7FA" w:val="clear"/>
+            <w:tcMar>
+              <w:top w:type="dxa" w:w="90"/>
+              <w:left w:type="dxa" w:w="100"/>
+              <w:bottom w:type="dxa" w:w="90"/>
+              <w:right w:type="dxa" w:w="100"/>
             </w:tcMar>
             <w:vAlign w:val="center"/>
           </w:tcPr>
@@ -1116,13 +1384,43 @@
             </w:pPr>
             <w:r>
               <w:rPr>
-                <w:b/>
-                <w:bCs/>
+                <w:b w:val="false"/>
+                <w:bCs w:val="false"/>
+                <w:strike/>
+                <w:color w:val="9AA3AF"/>
+                <w:sz w:val="20"/>
+                <w:szCs w:val="20"/>
+              </w:rPr>
+              <w:t xml:space="preserve">2.000.000 đ</w:t>
+            </w:r>
+          </w:p>
+        </w:tc>
+        <w:tc>
+          <w:tcPr>
+            <w:tcW w:type="dxa" w:w="1650"/>
+            <w:shd w:fill="F5F7FA" w:val="clear"/>
+            <w:tcMar>
+              <w:top w:type="dxa" w:w="90"/>
+              <w:left w:type="dxa" w:w="100"/>
+              <w:bottom w:type="dxa" w:w="90"/>
+              <w:right w:type="dxa" w:w="100"/>
+            </w:tcMar>
+            <w:vAlign w:val="center"/>
+          </w:tcPr>
+          <w:p>
+            <w:pPr>
+              <w:jc w:val="right"/>
+            </w:pPr>
+            <w:r>
+              <w:rPr>
+                <w:b/>
+                <w:bCs/>
+                <w:strike w:val="false"/>
                 <w:color w:val="0E8C7F"/>
                 <w:sz w:val="20"/>
                 <w:szCs w:val="20"/>
               </w:rPr>
-              <w:t xml:space="preserve">2.000.000 đ</w:t>
+              <w:t xml:space="preserve">1.900.000 đ</w:t>
             </w:r>
           </w:p>
         </w:tc>
@@ -1134,9 +1432,9 @@
             <w:shd w:fill="FFFFFF" w:val="clear"/>
             <w:tcMar>
               <w:top w:type="dxa" w:w="90"/>
-              <w:left w:type="dxa" w:w="110"/>
-              <w:bottom w:type="dxa" w:w="90"/>
-              <w:right w:type="dxa" w:w="110"/>
+              <w:left w:type="dxa" w:w="100"/>
+              <w:bottom w:type="dxa" w:w="90"/>
+              <w:right w:type="dxa" w:w="100"/>
             </w:tcMar>
             <w:vAlign w:val="center"/>
           </w:tcPr>
@@ -1148,6 +1446,7 @@
               <w:rPr>
                 <w:b w:val="false"/>
                 <w:bCs w:val="false"/>
+                <w:strike w:val="false"/>
                 <w:color w:val="27343A"/>
                 <w:sz w:val="20"/>
                 <w:szCs w:val="20"/>
@@ -1158,13 +1457,13 @@
         </w:tc>
         <w:tc>
           <w:tcPr>
-            <w:tcW w:type="dxa" w:w="2600"/>
-            <w:shd w:fill="FFFFFF" w:val="clear"/>
-            <w:tcMar>
-              <w:top w:type="dxa" w:w="90"/>
-              <w:left w:type="dxa" w:w="110"/>
-              <w:bottom w:type="dxa" w:w="90"/>
-              <w:right w:type="dxa" w:w="110"/>
+            <w:tcW w:type="dxa" w:w="2500"/>
+            <w:shd w:fill="FFFFFF" w:val="clear"/>
+            <w:tcMar>
+              <w:top w:type="dxa" w:w="90"/>
+              <w:left w:type="dxa" w:w="100"/>
+              <w:bottom w:type="dxa" w:w="90"/>
+              <w:right w:type="dxa" w:w="100"/>
             </w:tcMar>
             <w:vAlign w:val="center"/>
           </w:tcPr>
@@ -1176,6 +1475,7 @@
               <w:rPr>
                 <w:b/>
                 <w:bCs/>
+                <w:strike w:val="false"/>
                 <w:color w:val="27343A"/>
                 <w:sz w:val="20"/>
                 <w:szCs w:val="20"/>
@@ -1186,13 +1486,13 @@
         </w:tc>
         <w:tc>
           <w:tcPr>
-            <w:tcW w:type="dxa" w:w="4600"/>
-            <w:shd w:fill="FFFFFF" w:val="clear"/>
-            <w:tcMar>
-              <w:top w:type="dxa" w:w="90"/>
-              <w:left w:type="dxa" w:w="110"/>
-              <w:bottom w:type="dxa" w:w="90"/>
-              <w:right w:type="dxa" w:w="110"/>
+            <w:tcW w:type="dxa" w:w="3300"/>
+            <w:shd w:fill="FFFFFF" w:val="clear"/>
+            <w:tcMar>
+              <w:top w:type="dxa" w:w="90"/>
+              <w:left w:type="dxa" w:w="100"/>
+              <w:bottom w:type="dxa" w:w="90"/>
+              <w:right w:type="dxa" w:w="100"/>
             </w:tcMar>
             <w:vAlign w:val="center"/>
           </w:tcPr>
@@ -1204,6 +1504,7 @@
               <w:rPr>
                 <w:b w:val="false"/>
                 <w:bCs w:val="false"/>
+                <w:strike w:val="false"/>
                 <w:color w:val="27343A"/>
                 <w:sz w:val="20"/>
                 <w:szCs w:val="20"/>
@@ -1214,13 +1515,13 @@
         </w:tc>
         <w:tc>
           <w:tcPr>
-            <w:tcW w:type="dxa" w:w="1900"/>
-            <w:shd w:fill="FFFFFF" w:val="clear"/>
-            <w:tcMar>
-              <w:top w:type="dxa" w:w="90"/>
-              <w:left w:type="dxa" w:w="110"/>
-              <w:bottom w:type="dxa" w:w="90"/>
-              <w:right w:type="dxa" w:w="110"/>
+            <w:tcW w:type="dxa" w:w="1650"/>
+            <w:shd w:fill="FFFFFF" w:val="clear"/>
+            <w:tcMar>
+              <w:top w:type="dxa" w:w="90"/>
+              <w:left w:type="dxa" w:w="100"/>
+              <w:bottom w:type="dxa" w:w="90"/>
+              <w:right w:type="dxa" w:w="100"/>
             </w:tcMar>
             <w:vAlign w:val="center"/>
           </w:tcPr>
@@ -1230,13 +1531,43 @@
             </w:pPr>
             <w:r>
               <w:rPr>
-                <w:b/>
-                <w:bCs/>
+                <w:b w:val="false"/>
+                <w:bCs w:val="false"/>
+                <w:strike/>
+                <w:color w:val="9AA3AF"/>
+                <w:sz w:val="20"/>
+                <w:szCs w:val="20"/>
+              </w:rPr>
+              <w:t xml:space="preserve">2.900.000 đ</w:t>
+            </w:r>
+          </w:p>
+        </w:tc>
+        <w:tc>
+          <w:tcPr>
+            <w:tcW w:type="dxa" w:w="1650"/>
+            <w:shd w:fill="FFFFFF" w:val="clear"/>
+            <w:tcMar>
+              <w:top w:type="dxa" w:w="90"/>
+              <w:left w:type="dxa" w:w="100"/>
+              <w:bottom w:type="dxa" w:w="90"/>
+              <w:right w:type="dxa" w:w="100"/>
+            </w:tcMar>
+            <w:vAlign w:val="center"/>
+          </w:tcPr>
+          <w:p>
+            <w:pPr>
+              <w:jc w:val="right"/>
+            </w:pPr>
+            <w:r>
+              <w:rPr>
+                <w:b/>
+                <w:bCs/>
+                <w:strike w:val="false"/>
                 <w:color w:val="0E8C7F"/>
                 <w:sz w:val="20"/>
                 <w:szCs w:val="20"/>
               </w:rPr>
-              <w:t xml:space="preserve">2.900.000 đ</w:t>
+              <w:t xml:space="preserve">2.755.000 đ</w:t>
             </w:r>
           </w:p>
         </w:tc>
@@ -1248,9 +1579,9 @@
             <w:shd w:fill="F5F7FA" w:val="clear"/>
             <w:tcMar>
               <w:top w:type="dxa" w:w="90"/>
-              <w:left w:type="dxa" w:w="110"/>
-              <w:bottom w:type="dxa" w:w="90"/>
-              <w:right w:type="dxa" w:w="110"/>
+              <w:left w:type="dxa" w:w="100"/>
+              <w:bottom w:type="dxa" w:w="90"/>
+              <w:right w:type="dxa" w:w="100"/>
             </w:tcMar>
             <w:vAlign w:val="center"/>
           </w:tcPr>
@@ -1262,6 +1593,7 @@
               <w:rPr>
                 <w:b w:val="false"/>
                 <w:bCs w:val="false"/>
+                <w:strike w:val="false"/>
                 <w:color w:val="27343A"/>
                 <w:sz w:val="20"/>
                 <w:szCs w:val="20"/>
@@ -1272,13 +1604,13 @@
         </w:tc>
         <w:tc>
           <w:tcPr>
-            <w:tcW w:type="dxa" w:w="2600"/>
-            <w:shd w:fill="F5F7FA" w:val="clear"/>
-            <w:tcMar>
-              <w:top w:type="dxa" w:w="90"/>
-              <w:left w:type="dxa" w:w="110"/>
-              <w:bottom w:type="dxa" w:w="90"/>
-              <w:right w:type="dxa" w:w="110"/>
+            <w:tcW w:type="dxa" w:w="2500"/>
+            <w:shd w:fill="F5F7FA" w:val="clear"/>
+            <w:tcMar>
+              <w:top w:type="dxa" w:w="90"/>
+              <w:left w:type="dxa" w:w="100"/>
+              <w:bottom w:type="dxa" w:w="90"/>
+              <w:right w:type="dxa" w:w="100"/>
             </w:tcMar>
             <w:vAlign w:val="center"/>
           </w:tcPr>
@@ -1290,6 +1622,7 @@
               <w:rPr>
                 <w:b/>
                 <w:bCs/>
+                <w:strike w:val="false"/>
                 <w:color w:val="27343A"/>
                 <w:sz w:val="20"/>
                 <w:szCs w:val="20"/>
@@ -1300,13 +1633,13 @@
         </w:tc>
         <w:tc>
           <w:tcPr>
-            <w:tcW w:type="dxa" w:w="4600"/>
-            <w:shd w:fill="F5F7FA" w:val="clear"/>
-            <w:tcMar>
-              <w:top w:type="dxa" w:w="90"/>
-              <w:left w:type="dxa" w:w="110"/>
-              <w:bottom w:type="dxa" w:w="90"/>
-              <w:right w:type="dxa" w:w="110"/>
+            <w:tcW w:type="dxa" w:w="3300"/>
+            <w:shd w:fill="F5F7FA" w:val="clear"/>
+            <w:tcMar>
+              <w:top w:type="dxa" w:w="90"/>
+              <w:left w:type="dxa" w:w="100"/>
+              <w:bottom w:type="dxa" w:w="90"/>
+              <w:right w:type="dxa" w:w="100"/>
             </w:tcMar>
             <w:vAlign w:val="center"/>
           </w:tcPr>
@@ -1318,6 +1651,7 @@
               <w:rPr>
                 <w:b w:val="false"/>
                 <w:bCs w:val="false"/>
+                <w:strike w:val="false"/>
                 <w:color w:val="27343A"/>
                 <w:sz w:val="20"/>
                 <w:szCs w:val="20"/>
@@ -1328,13 +1662,13 @@
         </w:tc>
         <w:tc>
           <w:tcPr>
-            <w:tcW w:type="dxa" w:w="1900"/>
-            <w:shd w:fill="F5F7FA" w:val="clear"/>
-            <w:tcMar>
-              <w:top w:type="dxa" w:w="90"/>
-              <w:left w:type="dxa" w:w="110"/>
-              <w:bottom w:type="dxa" w:w="90"/>
-              <w:right w:type="dxa" w:w="110"/>
+            <w:tcW w:type="dxa" w:w="1650"/>
+            <w:shd w:fill="F5F7FA" w:val="clear"/>
+            <w:tcMar>
+              <w:top w:type="dxa" w:w="90"/>
+              <w:left w:type="dxa" w:w="100"/>
+              <w:bottom w:type="dxa" w:w="90"/>
+              <w:right w:type="dxa" w:w="100"/>
             </w:tcMar>
             <w:vAlign w:val="center"/>
           </w:tcPr>
@@ -1344,13 +1678,43 @@
             </w:pPr>
             <w:r>
               <w:rPr>
-                <w:b/>
-                <w:bCs/>
+                <w:b w:val="false"/>
+                <w:bCs w:val="false"/>
+                <w:strike/>
+                <w:color w:val="9AA3AF"/>
+                <w:sz w:val="20"/>
+                <w:szCs w:val="20"/>
+              </w:rPr>
+              <w:t xml:space="preserve">2.900.000 đ</w:t>
+            </w:r>
+          </w:p>
+        </w:tc>
+        <w:tc>
+          <w:tcPr>
+            <w:tcW w:type="dxa" w:w="1650"/>
+            <w:shd w:fill="F5F7FA" w:val="clear"/>
+            <w:tcMar>
+              <w:top w:type="dxa" w:w="90"/>
+              <w:left w:type="dxa" w:w="100"/>
+              <w:bottom w:type="dxa" w:w="90"/>
+              <w:right w:type="dxa" w:w="100"/>
+            </w:tcMar>
+            <w:vAlign w:val="center"/>
+          </w:tcPr>
+          <w:p>
+            <w:pPr>
+              <w:jc w:val="right"/>
+            </w:pPr>
+            <w:r>
+              <w:rPr>
+                <w:b/>
+                <w:bCs/>
+                <w:strike w:val="false"/>
                 <w:color w:val="0E8C7F"/>
                 <w:sz w:val="20"/>
                 <w:szCs w:val="20"/>
               </w:rPr>
-              <w:t xml:space="preserve">2.900.000 đ</w:t>
+              <w:t xml:space="preserve">2.755.000 đ</w:t>
             </w:r>
           </w:p>
         </w:tc>
@@ -1362,9 +1726,9 @@
             <w:shd w:fill="FFFFFF" w:val="clear"/>
             <w:tcMar>
               <w:top w:type="dxa" w:w="90"/>
-              <w:left w:type="dxa" w:w="110"/>
-              <w:bottom w:type="dxa" w:w="90"/>
-              <w:right w:type="dxa" w:w="110"/>
+              <w:left w:type="dxa" w:w="100"/>
+              <w:bottom w:type="dxa" w:w="90"/>
+              <w:right w:type="dxa" w:w="100"/>
             </w:tcMar>
             <w:vAlign w:val="center"/>
           </w:tcPr>
@@ -1376,6 +1740,7 @@
               <w:rPr>
                 <w:b w:val="false"/>
                 <w:bCs w:val="false"/>
+                <w:strike w:val="false"/>
                 <w:color w:val="27343A"/>
                 <w:sz w:val="20"/>
                 <w:szCs w:val="20"/>
@@ -1386,13 +1751,13 @@
         </w:tc>
         <w:tc>
           <w:tcPr>
-            <w:tcW w:type="dxa" w:w="2600"/>
-            <w:shd w:fill="FFFFFF" w:val="clear"/>
-            <w:tcMar>
-              <w:top w:type="dxa" w:w="90"/>
-              <w:left w:type="dxa" w:w="110"/>
-              <w:bottom w:type="dxa" w:w="90"/>
-              <w:right w:type="dxa" w:w="110"/>
+            <w:tcW w:type="dxa" w:w="2500"/>
+            <w:shd w:fill="FFFFFF" w:val="clear"/>
+            <w:tcMar>
+              <w:top w:type="dxa" w:w="90"/>
+              <w:left w:type="dxa" w:w="100"/>
+              <w:bottom w:type="dxa" w:w="90"/>
+              <w:right w:type="dxa" w:w="100"/>
             </w:tcMar>
             <w:vAlign w:val="center"/>
           </w:tcPr>
@@ -1404,6 +1769,7 @@
               <w:rPr>
                 <w:b/>
                 <w:bCs/>
+                <w:strike w:val="false"/>
                 <w:color w:val="27343A"/>
                 <w:sz w:val="20"/>
                 <w:szCs w:val="20"/>
@@ -1414,13 +1780,13 @@
         </w:tc>
         <w:tc>
           <w:tcPr>
-            <w:tcW w:type="dxa" w:w="4600"/>
-            <w:shd w:fill="FFFFFF" w:val="clear"/>
-            <w:tcMar>
-              <w:top w:type="dxa" w:w="90"/>
-              <w:left w:type="dxa" w:w="110"/>
-              <w:bottom w:type="dxa" w:w="90"/>
-              <w:right w:type="dxa" w:w="110"/>
+            <w:tcW w:type="dxa" w:w="3300"/>
+            <w:shd w:fill="FFFFFF" w:val="clear"/>
+            <w:tcMar>
+              <w:top w:type="dxa" w:w="90"/>
+              <w:left w:type="dxa" w:w="100"/>
+              <w:bottom w:type="dxa" w:w="90"/>
+              <w:right w:type="dxa" w:w="100"/>
             </w:tcMar>
             <w:vAlign w:val="center"/>
           </w:tcPr>
@@ -1432,6 +1798,7 @@
               <w:rPr>
                 <w:b w:val="false"/>
                 <w:bCs w:val="false"/>
+                <w:strike w:val="false"/>
                 <w:color w:val="27343A"/>
                 <w:sz w:val="20"/>
                 <w:szCs w:val="20"/>
@@ -1442,13 +1809,13 @@
         </w:tc>
         <w:tc>
           <w:tcPr>
-            <w:tcW w:type="dxa" w:w="1900"/>
-            <w:shd w:fill="FFFFFF" w:val="clear"/>
-            <w:tcMar>
-              <w:top w:type="dxa" w:w="90"/>
-              <w:left w:type="dxa" w:w="110"/>
-              <w:bottom w:type="dxa" w:w="90"/>
-              <w:right w:type="dxa" w:w="110"/>
+            <w:tcW w:type="dxa" w:w="1650"/>
+            <w:shd w:fill="FFFFFF" w:val="clear"/>
+            <w:tcMar>
+              <w:top w:type="dxa" w:w="90"/>
+              <w:left w:type="dxa" w:w="100"/>
+              <w:bottom w:type="dxa" w:w="90"/>
+              <w:right w:type="dxa" w:w="100"/>
             </w:tcMar>
             <w:vAlign w:val="center"/>
           </w:tcPr>
@@ -1458,13 +1825,43 @@
             </w:pPr>
             <w:r>
               <w:rPr>
-                <w:b/>
-                <w:bCs/>
+                <w:b w:val="false"/>
+                <w:bCs w:val="false"/>
+                <w:strike/>
+                <w:color w:val="9AA3AF"/>
+                <w:sz w:val="20"/>
+                <w:szCs w:val="20"/>
+              </w:rPr>
+              <w:t xml:space="preserve">3.200.000 đ</w:t>
+            </w:r>
+          </w:p>
+        </w:tc>
+        <w:tc>
+          <w:tcPr>
+            <w:tcW w:type="dxa" w:w="1650"/>
+            <w:shd w:fill="FFFFFF" w:val="clear"/>
+            <w:tcMar>
+              <w:top w:type="dxa" w:w="90"/>
+              <w:left w:type="dxa" w:w="100"/>
+              <w:bottom w:type="dxa" w:w="90"/>
+              <w:right w:type="dxa" w:w="100"/>
+            </w:tcMar>
+            <w:vAlign w:val="center"/>
+          </w:tcPr>
+          <w:p>
+            <w:pPr>
+              <w:jc w:val="right"/>
+            </w:pPr>
+            <w:r>
+              <w:rPr>
+                <w:b/>
+                <w:bCs/>
+                <w:strike w:val="false"/>
                 <w:color w:val="0E8C7F"/>
                 <w:sz w:val="20"/>
                 <w:szCs w:val="20"/>
               </w:rPr>
-              <w:t xml:space="preserve">3.200.000 đ</w:t>
+              <w:t xml:space="preserve">3.040.000 đ</w:t>
             </w:r>
           </w:p>
         </w:tc>
@@ -1476,9 +1873,9 @@
             <w:shd w:fill="F5F7FA" w:val="clear"/>
             <w:tcMar>
               <w:top w:type="dxa" w:w="90"/>
-              <w:left w:type="dxa" w:w="110"/>
-              <w:bottom w:type="dxa" w:w="90"/>
-              <w:right w:type="dxa" w:w="110"/>
+              <w:left w:type="dxa" w:w="100"/>
+              <w:bottom w:type="dxa" w:w="90"/>
+              <w:right w:type="dxa" w:w="100"/>
             </w:tcMar>
             <w:vAlign w:val="center"/>
           </w:tcPr>
@@ -1490,6 +1887,7 @@
               <w:rPr>
                 <w:b w:val="false"/>
                 <w:bCs w:val="false"/>
+                <w:strike w:val="false"/>
                 <w:color w:val="27343A"/>
                 <w:sz w:val="20"/>
                 <w:szCs w:val="20"/>
@@ -1500,13 +1898,13 @@
         </w:tc>
         <w:tc>
           <w:tcPr>
-            <w:tcW w:type="dxa" w:w="2600"/>
-            <w:shd w:fill="F5F7FA" w:val="clear"/>
-            <w:tcMar>
-              <w:top w:type="dxa" w:w="90"/>
-              <w:left w:type="dxa" w:w="110"/>
-              <w:bottom w:type="dxa" w:w="90"/>
-              <w:right w:type="dxa" w:w="110"/>
+            <w:tcW w:type="dxa" w:w="2500"/>
+            <w:shd w:fill="F5F7FA" w:val="clear"/>
+            <w:tcMar>
+              <w:top w:type="dxa" w:w="90"/>
+              <w:left w:type="dxa" w:w="100"/>
+              <w:bottom w:type="dxa" w:w="90"/>
+              <w:right w:type="dxa" w:w="100"/>
             </w:tcMar>
             <w:vAlign w:val="center"/>
           </w:tcPr>
@@ -1518,6 +1916,7 @@
               <w:rPr>
                 <w:b/>
                 <w:bCs/>
+                <w:strike w:val="false"/>
                 <w:color w:val="27343A"/>
                 <w:sz w:val="20"/>
                 <w:szCs w:val="20"/>
@@ -1528,13 +1927,13 @@
         </w:tc>
         <w:tc>
           <w:tcPr>
-            <w:tcW w:type="dxa" w:w="4600"/>
-            <w:shd w:fill="F5F7FA" w:val="clear"/>
-            <w:tcMar>
-              <w:top w:type="dxa" w:w="90"/>
-              <w:left w:type="dxa" w:w="110"/>
-              <w:bottom w:type="dxa" w:w="90"/>
-              <w:right w:type="dxa" w:w="110"/>
+            <w:tcW w:type="dxa" w:w="3300"/>
+            <w:shd w:fill="F5F7FA" w:val="clear"/>
+            <w:tcMar>
+              <w:top w:type="dxa" w:w="90"/>
+              <w:left w:type="dxa" w:w="100"/>
+              <w:bottom w:type="dxa" w:w="90"/>
+              <w:right w:type="dxa" w:w="100"/>
             </w:tcMar>
             <w:vAlign w:val="center"/>
           </w:tcPr>
@@ -1546,6 +1945,7 @@
               <w:rPr>
                 <w:b w:val="false"/>
                 <w:bCs w:val="false"/>
+                <w:strike w:val="false"/>
                 <w:color w:val="27343A"/>
                 <w:sz w:val="20"/>
                 <w:szCs w:val="20"/>
@@ -1556,13 +1956,13 @@
         </w:tc>
         <w:tc>
           <w:tcPr>
-            <w:tcW w:type="dxa" w:w="1900"/>
-            <w:shd w:fill="F5F7FA" w:val="clear"/>
-            <w:tcMar>
-              <w:top w:type="dxa" w:w="90"/>
-              <w:left w:type="dxa" w:w="110"/>
-              <w:bottom w:type="dxa" w:w="90"/>
-              <w:right w:type="dxa" w:w="110"/>
+            <w:tcW w:type="dxa" w:w="1650"/>
+            <w:shd w:fill="F5F7FA" w:val="clear"/>
+            <w:tcMar>
+              <w:top w:type="dxa" w:w="90"/>
+              <w:left w:type="dxa" w:w="100"/>
+              <w:bottom w:type="dxa" w:w="90"/>
+              <w:right w:type="dxa" w:w="100"/>
             </w:tcMar>
             <w:vAlign w:val="center"/>
           </w:tcPr>
@@ -1572,13 +1972,43 @@
             </w:pPr>
             <w:r>
               <w:rPr>
-                <w:b/>
-                <w:bCs/>
+                <w:b w:val="false"/>
+                <w:bCs w:val="false"/>
+                <w:strike/>
+                <w:color w:val="9AA3AF"/>
+                <w:sz w:val="20"/>
+                <w:szCs w:val="20"/>
+              </w:rPr>
+              <w:t xml:space="preserve">3.110.000 đ</w:t>
+            </w:r>
+          </w:p>
+        </w:tc>
+        <w:tc>
+          <w:tcPr>
+            <w:tcW w:type="dxa" w:w="1650"/>
+            <w:shd w:fill="F5F7FA" w:val="clear"/>
+            <w:tcMar>
+              <w:top w:type="dxa" w:w="90"/>
+              <w:left w:type="dxa" w:w="100"/>
+              <w:bottom w:type="dxa" w:w="90"/>
+              <w:right w:type="dxa" w:w="100"/>
+            </w:tcMar>
+            <w:vAlign w:val="center"/>
+          </w:tcPr>
+          <w:p>
+            <w:pPr>
+              <w:jc w:val="right"/>
+            </w:pPr>
+            <w:r>
+              <w:rPr>
+                <w:b/>
+                <w:bCs/>
+                <w:strike w:val="false"/>
                 <w:color w:val="0E8C7F"/>
                 <w:sz w:val="20"/>
                 <w:szCs w:val="20"/>
               </w:rPr>
-              <w:t xml:space="preserve">3.110.000 đ</w:t>
+              <w:t xml:space="preserve">2.954.000 đ</w:t>
             </w:r>
           </w:p>
         </w:tc>
@@ -1590,9 +2020,9 @@
             <w:shd w:fill="FFFFFF" w:val="clear"/>
             <w:tcMar>
               <w:top w:type="dxa" w:w="90"/>
-              <w:left w:type="dxa" w:w="110"/>
-              <w:bottom w:type="dxa" w:w="90"/>
-              <w:right w:type="dxa" w:w="110"/>
+              <w:left w:type="dxa" w:w="100"/>
+              <w:bottom w:type="dxa" w:w="90"/>
+              <w:right w:type="dxa" w:w="100"/>
             </w:tcMar>
             <w:vAlign w:val="center"/>
           </w:tcPr>
@@ -1604,6 +2034,7 @@
               <w:rPr>
                 <w:b w:val="false"/>
                 <w:bCs w:val="false"/>
+                <w:strike w:val="false"/>
                 <w:color w:val="27343A"/>
                 <w:sz w:val="20"/>
                 <w:szCs w:val="20"/>
@@ -1614,13 +2045,13 @@
         </w:tc>
         <w:tc>
           <w:tcPr>
-            <w:tcW w:type="dxa" w:w="2600"/>
-            <w:shd w:fill="FFFFFF" w:val="clear"/>
-            <w:tcMar>
-              <w:top w:type="dxa" w:w="90"/>
-              <w:left w:type="dxa" w:w="110"/>
-              <w:bottom w:type="dxa" w:w="90"/>
-              <w:right w:type="dxa" w:w="110"/>
+            <w:tcW w:type="dxa" w:w="2500"/>
+            <w:shd w:fill="FFFFFF" w:val="clear"/>
+            <w:tcMar>
+              <w:top w:type="dxa" w:w="90"/>
+              <w:left w:type="dxa" w:w="100"/>
+              <w:bottom w:type="dxa" w:w="90"/>
+              <w:right w:type="dxa" w:w="100"/>
             </w:tcMar>
             <w:vAlign w:val="center"/>
           </w:tcPr>
@@ -1632,6 +2063,7 @@
               <w:rPr>
                 <w:b/>
                 <w:bCs/>
+                <w:strike w:val="false"/>
                 <w:color w:val="27343A"/>
                 <w:sz w:val="20"/>
                 <w:szCs w:val="20"/>
@@ -1642,13 +2074,13 @@
         </w:tc>
         <w:tc>
           <w:tcPr>
-            <w:tcW w:type="dxa" w:w="4600"/>
-            <w:shd w:fill="FFFFFF" w:val="clear"/>
-            <w:tcMar>
-              <w:top w:type="dxa" w:w="90"/>
-              <w:left w:type="dxa" w:w="110"/>
-              <w:bottom w:type="dxa" w:w="90"/>
-              <w:right w:type="dxa" w:w="110"/>
+            <w:tcW w:type="dxa" w:w="3300"/>
+            <w:shd w:fill="FFFFFF" w:val="clear"/>
+            <w:tcMar>
+              <w:top w:type="dxa" w:w="90"/>
+              <w:left w:type="dxa" w:w="100"/>
+              <w:bottom w:type="dxa" w:w="90"/>
+              <w:right w:type="dxa" w:w="100"/>
             </w:tcMar>
             <w:vAlign w:val="center"/>
           </w:tcPr>
@@ -1660,6 +2092,7 @@
               <w:rPr>
                 <w:b w:val="false"/>
                 <w:bCs w:val="false"/>
+                <w:strike w:val="false"/>
                 <w:color w:val="27343A"/>
                 <w:sz w:val="20"/>
                 <w:szCs w:val="20"/>
@@ -1670,13 +2103,13 @@
         </w:tc>
         <w:tc>
           <w:tcPr>
-            <w:tcW w:type="dxa" w:w="1900"/>
-            <w:shd w:fill="FFFFFF" w:val="clear"/>
-            <w:tcMar>
-              <w:top w:type="dxa" w:w="90"/>
-              <w:left w:type="dxa" w:w="110"/>
-              <w:bottom w:type="dxa" w:w="90"/>
-              <w:right w:type="dxa" w:w="110"/>
+            <w:tcW w:type="dxa" w:w="1650"/>
+            <w:shd w:fill="FFFFFF" w:val="clear"/>
+            <w:tcMar>
+              <w:top w:type="dxa" w:w="90"/>
+              <w:left w:type="dxa" w:w="100"/>
+              <w:bottom w:type="dxa" w:w="90"/>
+              <w:right w:type="dxa" w:w="100"/>
             </w:tcMar>
             <w:vAlign w:val="center"/>
           </w:tcPr>
@@ -1686,13 +2119,43 @@
             </w:pPr>
             <w:r>
               <w:rPr>
-                <w:b/>
-                <w:bCs/>
+                <w:b w:val="false"/>
+                <w:bCs w:val="false"/>
+                <w:strike/>
+                <w:color w:val="9AA3AF"/>
+                <w:sz w:val="20"/>
+                <w:szCs w:val="20"/>
+              </w:rPr>
+              <w:t xml:space="preserve">3.150.000 đ</w:t>
+            </w:r>
+          </w:p>
+        </w:tc>
+        <w:tc>
+          <w:tcPr>
+            <w:tcW w:type="dxa" w:w="1650"/>
+            <w:shd w:fill="FFFFFF" w:val="clear"/>
+            <w:tcMar>
+              <w:top w:type="dxa" w:w="90"/>
+              <w:left w:type="dxa" w:w="100"/>
+              <w:bottom w:type="dxa" w:w="90"/>
+              <w:right w:type="dxa" w:w="100"/>
+            </w:tcMar>
+            <w:vAlign w:val="center"/>
+          </w:tcPr>
+          <w:p>
+            <w:pPr>
+              <w:jc w:val="right"/>
+            </w:pPr>
+            <w:r>
+              <w:rPr>
+                <w:b/>
+                <w:bCs/>
+                <w:strike w:val="false"/>
                 <w:color w:val="0E8C7F"/>
                 <w:sz w:val="20"/>
                 <w:szCs w:val="20"/>
               </w:rPr>
-              <w:t xml:space="preserve">3.150.000 đ</w:t>
+              <w:t xml:space="preserve">2.992.000 đ</w:t>
             </w:r>
           </w:p>
         </w:tc>
@@ -1704,9 +2167,9 @@
             <w:shd w:fill="F5F7FA" w:val="clear"/>
             <w:tcMar>
               <w:top w:type="dxa" w:w="90"/>
-              <w:left w:type="dxa" w:w="110"/>
-              <w:bottom w:type="dxa" w:w="90"/>
-              <w:right w:type="dxa" w:w="110"/>
+              <w:left w:type="dxa" w:w="100"/>
+              <w:bottom w:type="dxa" w:w="90"/>
+              <w:right w:type="dxa" w:w="100"/>
             </w:tcMar>
             <w:vAlign w:val="center"/>
           </w:tcPr>
@@ -1718,6 +2181,7 @@
               <w:rPr>
                 <w:b w:val="false"/>
                 <w:bCs w:val="false"/>
+                <w:strike w:val="false"/>
                 <w:color w:val="27343A"/>
                 <w:sz w:val="20"/>
                 <w:szCs w:val="20"/>
@@ -1728,13 +2192,13 @@
         </w:tc>
         <w:tc>
           <w:tcPr>
-            <w:tcW w:type="dxa" w:w="2600"/>
-            <w:shd w:fill="F5F7FA" w:val="clear"/>
-            <w:tcMar>
-              <w:top w:type="dxa" w:w="90"/>
-              <w:left w:type="dxa" w:w="110"/>
-              <w:bottom w:type="dxa" w:w="90"/>
-              <w:right w:type="dxa" w:w="110"/>
+            <w:tcW w:type="dxa" w:w="2500"/>
+            <w:shd w:fill="F5F7FA" w:val="clear"/>
+            <w:tcMar>
+              <w:top w:type="dxa" w:w="90"/>
+              <w:left w:type="dxa" w:w="100"/>
+              <w:bottom w:type="dxa" w:w="90"/>
+              <w:right w:type="dxa" w:w="100"/>
             </w:tcMar>
             <w:vAlign w:val="center"/>
           </w:tcPr>
@@ -1746,6 +2210,7 @@
               <w:rPr>
                 <w:b/>
                 <w:bCs/>
+                <w:strike w:val="false"/>
                 <w:color w:val="27343A"/>
                 <w:sz w:val="20"/>
                 <w:szCs w:val="20"/>
@@ -1756,13 +2221,13 @@
         </w:tc>
         <w:tc>
           <w:tcPr>
-            <w:tcW w:type="dxa" w:w="4600"/>
-            <w:shd w:fill="F5F7FA" w:val="clear"/>
-            <w:tcMar>
-              <w:top w:type="dxa" w:w="90"/>
-              <w:left w:type="dxa" w:w="110"/>
-              <w:bottom w:type="dxa" w:w="90"/>
-              <w:right w:type="dxa" w:w="110"/>
+            <w:tcW w:type="dxa" w:w="3300"/>
+            <w:shd w:fill="F5F7FA" w:val="clear"/>
+            <w:tcMar>
+              <w:top w:type="dxa" w:w="90"/>
+              <w:left w:type="dxa" w:w="100"/>
+              <w:bottom w:type="dxa" w:w="90"/>
+              <w:right w:type="dxa" w:w="100"/>
             </w:tcMar>
             <w:vAlign w:val="center"/>
           </w:tcPr>
@@ -1774,6 +2239,7 @@
               <w:rPr>
                 <w:b w:val="false"/>
                 <w:bCs w:val="false"/>
+                <w:strike w:val="false"/>
                 <w:color w:val="27343A"/>
                 <w:sz w:val="20"/>
                 <w:szCs w:val="20"/>
@@ -1784,13 +2250,13 @@
         </w:tc>
         <w:tc>
           <w:tcPr>
-            <w:tcW w:type="dxa" w:w="1900"/>
-            <w:shd w:fill="F5F7FA" w:val="clear"/>
-            <w:tcMar>
-              <w:top w:type="dxa" w:w="90"/>
-              <w:left w:type="dxa" w:w="110"/>
-              <w:bottom w:type="dxa" w:w="90"/>
-              <w:right w:type="dxa" w:w="110"/>
+            <w:tcW w:type="dxa" w:w="1650"/>
+            <w:shd w:fill="F5F7FA" w:val="clear"/>
+            <w:tcMar>
+              <w:top w:type="dxa" w:w="90"/>
+              <w:left w:type="dxa" w:w="100"/>
+              <w:bottom w:type="dxa" w:w="90"/>
+              <w:right w:type="dxa" w:w="100"/>
             </w:tcMar>
             <w:vAlign w:val="center"/>
           </w:tcPr>
@@ -1800,13 +2266,43 @@
             </w:pPr>
             <w:r>
               <w:rPr>
-                <w:b/>
-                <w:bCs/>
+                <w:b w:val="false"/>
+                <w:bCs w:val="false"/>
+                <w:strike/>
+                <w:color w:val="9AA3AF"/>
+                <w:sz w:val="20"/>
+                <w:szCs w:val="20"/>
+              </w:rPr>
+              <w:t xml:space="preserve">2.700.000 đ</w:t>
+            </w:r>
+          </w:p>
+        </w:tc>
+        <w:tc>
+          <w:tcPr>
+            <w:tcW w:type="dxa" w:w="1650"/>
+            <w:shd w:fill="F5F7FA" w:val="clear"/>
+            <w:tcMar>
+              <w:top w:type="dxa" w:w="90"/>
+              <w:left w:type="dxa" w:w="100"/>
+              <w:bottom w:type="dxa" w:w="90"/>
+              <w:right w:type="dxa" w:w="100"/>
+            </w:tcMar>
+            <w:vAlign w:val="center"/>
+          </w:tcPr>
+          <w:p>
+            <w:pPr>
+              <w:jc w:val="right"/>
+            </w:pPr>
+            <w:r>
+              <w:rPr>
+                <w:b/>
+                <w:bCs/>
+                <w:strike w:val="false"/>
                 <w:color w:val="0E8C7F"/>
                 <w:sz w:val="20"/>
                 <w:szCs w:val="20"/>
               </w:rPr>
-              <w:t xml:space="preserve">2.700.000 đ</w:t>
+              <w:t xml:space="preserve">2.565.000 đ</w:t>
             </w:r>
           </w:p>
         </w:tc>
@@ -1847,7 +2343,7 @@
           <w:sz w:val="21"/>
           <w:szCs w:val="21"/>
         </w:rPr>
-        <w:t xml:space="preserve">Tặng miễn phí 5 site Guest Post tự chọn (chọn theo danh sách site Guest Post hiện có của Digicom) khi đặt bài theo báo giá này.</w:t>
+        <w:t xml:space="preserve">Giảm thêm 5% trên toàn bộ bảng giá - áp dụng khi đặt trọn gói 14 đầu báo trong báo giá này.</w:t>
       </w:r>
     </w:p>
     <w:p>
@@ -1870,7 +2366,80 @@
           <w:sz w:val="21"/>
           <w:szCs w:val="21"/>
         </w:rPr>
+        <w:t xml:space="preserve">Tặng miễn phí 5 site Guest Post tự chọn (chọn theo danh sách site Guest Post hiện có của Digicom) khi đặt bài theo báo giá này.</w:t>
+      </w:r>
+    </w:p>
+    <w:p>
+      <w:pPr>
+        <w:spacing w:after="80"/>
+      </w:pPr>
+      <w:r>
+        <w:rPr>
+          <w:b/>
+          <w:bCs/>
+          <w:color w:val="0E8C7F"/>
+          <w:sz w:val="21"/>
+          <w:szCs w:val="21"/>
+        </w:rPr>
+        <w:t xml:space="preserve">- </w:t>
+      </w:r>
+      <w:r>
+        <w:rPr>
+          <w:color w:val="27343A"/>
+          <w:sz w:val="21"/>
+          <w:szCs w:val="21"/>
+        </w:rPr>
         <w:t xml:space="preserve">Digicom hỗ trợ tư vấn chọn vị trí đăng và viết bài chuẩn PR miễn phí khi đặt từ 3 đầu báo trở lên.</w:t>
+      </w:r>
+    </w:p>
+    <w:p>
+      <w:pPr>
+        <w:spacing w:after="0" w:before="140"/>
+      </w:pPr>
+      <w:r>
+        <w:rPr>
+          <w:color w:val="27343A"/>
+          <w:sz w:val="20"/>
+          <w:szCs w:val="20"/>
+        </w:rPr>
+        <w:t xml:space="preserve">Tổng giá niêm yết: </w:t>
+      </w:r>
+      <w:r>
+        <w:rPr>
+          <w:strike/>
+          <w:color w:val="9AA3AF"/>
+          <w:sz w:val="20"/>
+          <w:szCs w:val="20"/>
+        </w:rPr>
+        <w:t xml:space="preserve">53.160.000 đ</w:t>
+      </w:r>
+      <w:r>
+        <w:rPr>
+          <w:color w:val="27343A"/>
+          <w:sz w:val="20"/>
+          <w:szCs w:val="20"/>
+        </w:rPr>
+        <w:t xml:space="preserve">   →   Tổng giá ưu đãi: </w:t>
+      </w:r>
+      <w:r>
+        <w:rPr>
+          <w:b/>
+          <w:bCs/>
+          <w:color w:val="0E8C7F"/>
+          <w:sz w:val="22"/>
+          <w:szCs w:val="22"/>
+        </w:rPr>
+        <w:t xml:space="preserve">50.501.000 đ</w:t>
+      </w:r>
+      <w:r>
+        <w:rPr>
+          <w:i/>
+          <w:iCs/>
+          <w:color w:val="5A6472"/>
+          <w:sz w:val="20"/>
+          <w:szCs w:val="20"/>
+        </w:rPr>
+        <w:t xml:space="preserve">   (tiết kiệm 2.659.000 đ)</w:t>
       </w:r>
     </w:p>
     <w:p>

</xml_diff>

<commit_message>
auto: session 2026-08-10 08:38
Co-Authored-By: Claude Opus 4.8 (1M context) <noreply@anthropic.com>
</commit_message>
<xml_diff>
--- a/10-bang-gia-booking/Bao-Gia-Booking-Bao-PR-DigicomVN-2026-08-10.docx
+++ b/10-bang-gia-booking/Bao-Gia-Booking-Bao-PR-DigicomVN-2026-08-10.docx
@@ -94,10 +94,9 @@
       </w:tblPr>
       <w:tblGrid>
         <w:gridCol w:w="500"/>
-        <w:gridCol w:w="2500"/>
-        <w:gridCol w:w="3300"/>
-        <w:gridCol w:w="1650"/>
-        <w:gridCol w:w="1650"/>
+        <w:gridCol w:w="2700"/>
+        <w:gridCol w:w="4400"/>
+        <w:gridCol w:w="2000"/>
       </w:tblGrid>
       <w:tr>
         <w:trPr>
@@ -134,7 +133,7 @@
         </w:tc>
         <w:tc>
           <w:tcPr>
-            <w:tcW w:type="dxa" w:w="2500"/>
+            <w:tcW w:type="dxa" w:w="2700"/>
             <w:shd w:fill="1C2035" w:val="clear"/>
             <w:tcMar>
               <w:top w:type="dxa" w:w="90"/>
@@ -163,7 +162,7 @@
         </w:tc>
         <w:tc>
           <w:tcPr>
-            <w:tcW w:type="dxa" w:w="3300"/>
+            <w:tcW w:type="dxa" w:w="4400"/>
             <w:shd w:fill="1C2035" w:val="clear"/>
             <w:tcMar>
               <w:top w:type="dxa" w:w="90"/>
@@ -192,7 +191,7 @@
         </w:tc>
         <w:tc>
           <w:tcPr>
-            <w:tcW w:type="dxa" w:w="1650"/>
+            <w:tcW w:type="dxa" w:w="2000"/>
             <w:shd w:fill="1C2035" w:val="clear"/>
             <w:tcMar>
               <w:top w:type="dxa" w:w="90"/>
@@ -215,36 +214,7 @@
                 <w:sz w:val="20"/>
                 <w:szCs w:val="20"/>
               </w:rPr>
-              <w:t xml:space="preserve">Giá niêm yết</w:t>
-            </w:r>
-          </w:p>
-        </w:tc>
-        <w:tc>
-          <w:tcPr>
-            <w:tcW w:type="dxa" w:w="1650"/>
-            <w:shd w:fill="1C2035" w:val="clear"/>
-            <w:tcMar>
-              <w:top w:type="dxa" w:w="90"/>
-              <w:left w:type="dxa" w:w="100"/>
-              <w:bottom w:type="dxa" w:w="90"/>
-              <w:right w:type="dxa" w:w="100"/>
-            </w:tcMar>
-            <w:vAlign w:val="center"/>
-          </w:tcPr>
-          <w:p>
-            <w:pPr>
-              <w:jc w:val="right"/>
-            </w:pPr>
-            <w:r>
-              <w:rPr>
-                <w:b/>
-                <w:bCs/>
-                <w:strike w:val="false"/>
-                <w:color w:val="FFFFFF"/>
-                <w:sz w:val="20"/>
-                <w:szCs w:val="20"/>
-              </w:rPr>
-              <w:t xml:space="preserve">Giá ưu đãi -5%</w:t>
+              <w:t xml:space="preserve">Giá niêm yết (VNĐ)</w:t>
             </w:r>
           </w:p>
         </w:tc>
@@ -281,7 +251,7 @@
         </w:tc>
         <w:tc>
           <w:tcPr>
-            <w:tcW w:type="dxa" w:w="2500"/>
+            <w:tcW w:type="dxa" w:w="2700"/>
             <w:shd w:fill="FFFFFF" w:val="clear"/>
             <w:tcMar>
               <w:top w:type="dxa" w:w="90"/>
@@ -310,7 +280,7 @@
         </w:tc>
         <w:tc>
           <w:tcPr>
-            <w:tcW w:type="dxa" w:w="3300"/>
+            <w:tcW w:type="dxa" w:w="4400"/>
             <w:shd w:fill="FFFFFF" w:val="clear"/>
             <w:tcMar>
               <w:top w:type="dxa" w:w="90"/>
@@ -339,7 +309,7 @@
         </w:tc>
         <w:tc>
           <w:tcPr>
-            <w:tcW w:type="dxa" w:w="1650"/>
+            <w:tcW w:type="dxa" w:w="2000"/>
             <w:shd w:fill="FFFFFF" w:val="clear"/>
             <w:tcMar>
               <w:top w:type="dxa" w:w="90"/>
@@ -355,43 +325,14 @@
             </w:pPr>
             <w:r>
               <w:rPr>
-                <w:b w:val="false"/>
-                <w:bCs w:val="false"/>
-                <w:strike/>
-                <w:color w:val="9AA3AF"/>
+                <w:b/>
+                <w:bCs/>
+                <w:strike w:val="false"/>
+                <w:color w:val="0E8C7F"/>
                 <w:sz w:val="20"/>
                 <w:szCs w:val="20"/>
               </w:rPr>
               <w:t xml:space="preserve">6.000.000 đ</w:t>
-            </w:r>
-          </w:p>
-        </w:tc>
-        <w:tc>
-          <w:tcPr>
-            <w:tcW w:type="dxa" w:w="1650"/>
-            <w:shd w:fill="FFFFFF" w:val="clear"/>
-            <w:tcMar>
-              <w:top w:type="dxa" w:w="90"/>
-              <w:left w:type="dxa" w:w="100"/>
-              <w:bottom w:type="dxa" w:w="90"/>
-              <w:right w:type="dxa" w:w="100"/>
-            </w:tcMar>
-            <w:vAlign w:val="center"/>
-          </w:tcPr>
-          <w:p>
-            <w:pPr>
-              <w:jc w:val="right"/>
-            </w:pPr>
-            <w:r>
-              <w:rPr>
-                <w:b/>
-                <w:bCs/>
-                <w:strike w:val="false"/>
-                <w:color w:val="0E8C7F"/>
-                <w:sz w:val="20"/>
-                <w:szCs w:val="20"/>
-              </w:rPr>
-              <w:t xml:space="preserve">5.700.000 đ</w:t>
             </w:r>
           </w:p>
         </w:tc>
@@ -428,7 +369,7 @@
         </w:tc>
         <w:tc>
           <w:tcPr>
-            <w:tcW w:type="dxa" w:w="2500"/>
+            <w:tcW w:type="dxa" w:w="2700"/>
             <w:shd w:fill="F5F7FA" w:val="clear"/>
             <w:tcMar>
               <w:top w:type="dxa" w:w="90"/>
@@ -457,7 +398,7 @@
         </w:tc>
         <w:tc>
           <w:tcPr>
-            <w:tcW w:type="dxa" w:w="3300"/>
+            <w:tcW w:type="dxa" w:w="4400"/>
             <w:shd w:fill="F5F7FA" w:val="clear"/>
             <w:tcMar>
               <w:top w:type="dxa" w:w="90"/>
@@ -486,7 +427,7 @@
         </w:tc>
         <w:tc>
           <w:tcPr>
-            <w:tcW w:type="dxa" w:w="1650"/>
+            <w:tcW w:type="dxa" w:w="2000"/>
             <w:shd w:fill="F5F7FA" w:val="clear"/>
             <w:tcMar>
               <w:top w:type="dxa" w:w="90"/>
@@ -502,43 +443,14 @@
             </w:pPr>
             <w:r>
               <w:rPr>
-                <w:b w:val="false"/>
-                <w:bCs w:val="false"/>
-                <w:strike/>
-                <w:color w:val="9AA3AF"/>
+                <w:b/>
+                <w:bCs/>
+                <w:strike w:val="false"/>
+                <w:color w:val="0E8C7F"/>
                 <w:sz w:val="20"/>
                 <w:szCs w:val="20"/>
               </w:rPr>
               <w:t xml:space="preserve">4.500.000 đ</w:t>
-            </w:r>
-          </w:p>
-        </w:tc>
-        <w:tc>
-          <w:tcPr>
-            <w:tcW w:type="dxa" w:w="1650"/>
-            <w:shd w:fill="F5F7FA" w:val="clear"/>
-            <w:tcMar>
-              <w:top w:type="dxa" w:w="90"/>
-              <w:left w:type="dxa" w:w="100"/>
-              <w:bottom w:type="dxa" w:w="90"/>
-              <w:right w:type="dxa" w:w="100"/>
-            </w:tcMar>
-            <w:vAlign w:val="center"/>
-          </w:tcPr>
-          <w:p>
-            <w:pPr>
-              <w:jc w:val="right"/>
-            </w:pPr>
-            <w:r>
-              <w:rPr>
-                <w:b/>
-                <w:bCs/>
-                <w:strike w:val="false"/>
-                <w:color w:val="0E8C7F"/>
-                <w:sz w:val="20"/>
-                <w:szCs w:val="20"/>
-              </w:rPr>
-              <w:t xml:space="preserve">4.275.000 đ</w:t>
             </w:r>
           </w:p>
         </w:tc>
@@ -575,7 +487,7 @@
         </w:tc>
         <w:tc>
           <w:tcPr>
-            <w:tcW w:type="dxa" w:w="2500"/>
+            <w:tcW w:type="dxa" w:w="2700"/>
             <w:shd w:fill="FFFFFF" w:val="clear"/>
             <w:tcMar>
               <w:top w:type="dxa" w:w="90"/>
@@ -604,7 +516,7 @@
         </w:tc>
         <w:tc>
           <w:tcPr>
-            <w:tcW w:type="dxa" w:w="3300"/>
+            <w:tcW w:type="dxa" w:w="4400"/>
             <w:shd w:fill="FFFFFF" w:val="clear"/>
             <w:tcMar>
               <w:top w:type="dxa" w:w="90"/>
@@ -633,7 +545,7 @@
         </w:tc>
         <w:tc>
           <w:tcPr>
-            <w:tcW w:type="dxa" w:w="1650"/>
+            <w:tcW w:type="dxa" w:w="2000"/>
             <w:shd w:fill="FFFFFF" w:val="clear"/>
             <w:tcMar>
               <w:top w:type="dxa" w:w="90"/>
@@ -649,43 +561,14 @@
             </w:pPr>
             <w:r>
               <w:rPr>
-                <w:b w:val="false"/>
-                <w:bCs w:val="false"/>
-                <w:strike/>
-                <w:color w:val="9AA3AF"/>
+                <w:b/>
+                <w:bCs/>
+                <w:strike w:val="false"/>
+                <w:color w:val="0E8C7F"/>
                 <w:sz w:val="20"/>
                 <w:szCs w:val="20"/>
               </w:rPr>
               <w:t xml:space="preserve">3.700.000 đ</w:t>
-            </w:r>
-          </w:p>
-        </w:tc>
-        <w:tc>
-          <w:tcPr>
-            <w:tcW w:type="dxa" w:w="1650"/>
-            <w:shd w:fill="FFFFFF" w:val="clear"/>
-            <w:tcMar>
-              <w:top w:type="dxa" w:w="90"/>
-              <w:left w:type="dxa" w:w="100"/>
-              <w:bottom w:type="dxa" w:w="90"/>
-              <w:right w:type="dxa" w:w="100"/>
-            </w:tcMar>
-            <w:vAlign w:val="center"/>
-          </w:tcPr>
-          <w:p>
-            <w:pPr>
-              <w:jc w:val="right"/>
-            </w:pPr>
-            <w:r>
-              <w:rPr>
-                <w:b/>
-                <w:bCs/>
-                <w:strike w:val="false"/>
-                <w:color w:val="0E8C7F"/>
-                <w:sz w:val="20"/>
-                <w:szCs w:val="20"/>
-              </w:rPr>
-              <w:t xml:space="preserve">3.515.000 đ</w:t>
             </w:r>
           </w:p>
         </w:tc>
@@ -722,7 +605,7 @@
         </w:tc>
         <w:tc>
           <w:tcPr>
-            <w:tcW w:type="dxa" w:w="2500"/>
+            <w:tcW w:type="dxa" w:w="2700"/>
             <w:shd w:fill="F5F7FA" w:val="clear"/>
             <w:tcMar>
               <w:top w:type="dxa" w:w="90"/>
@@ -751,7 +634,7 @@
         </w:tc>
         <w:tc>
           <w:tcPr>
-            <w:tcW w:type="dxa" w:w="3300"/>
+            <w:tcW w:type="dxa" w:w="4400"/>
             <w:shd w:fill="F5F7FA" w:val="clear"/>
             <w:tcMar>
               <w:top w:type="dxa" w:w="90"/>
@@ -780,7 +663,7 @@
         </w:tc>
         <w:tc>
           <w:tcPr>
-            <w:tcW w:type="dxa" w:w="1650"/>
+            <w:tcW w:type="dxa" w:w="2000"/>
             <w:shd w:fill="F5F7FA" w:val="clear"/>
             <w:tcMar>
               <w:top w:type="dxa" w:w="90"/>
@@ -796,43 +679,14 @@
             </w:pPr>
             <w:r>
               <w:rPr>
-                <w:b w:val="false"/>
-                <w:bCs w:val="false"/>
-                <w:strike/>
-                <w:color w:val="9AA3AF"/>
+                <w:b/>
+                <w:bCs/>
+                <w:strike w:val="false"/>
+                <w:color w:val="0E8C7F"/>
                 <w:sz w:val="20"/>
                 <w:szCs w:val="20"/>
               </w:rPr>
               <w:t xml:space="preserve">5.400.000 đ</w:t>
-            </w:r>
-          </w:p>
-        </w:tc>
-        <w:tc>
-          <w:tcPr>
-            <w:tcW w:type="dxa" w:w="1650"/>
-            <w:shd w:fill="F5F7FA" w:val="clear"/>
-            <w:tcMar>
-              <w:top w:type="dxa" w:w="90"/>
-              <w:left w:type="dxa" w:w="100"/>
-              <w:bottom w:type="dxa" w:w="90"/>
-              <w:right w:type="dxa" w:w="100"/>
-            </w:tcMar>
-            <w:vAlign w:val="center"/>
-          </w:tcPr>
-          <w:p>
-            <w:pPr>
-              <w:jc w:val="right"/>
-            </w:pPr>
-            <w:r>
-              <w:rPr>
-                <w:b/>
-                <w:bCs/>
-                <w:strike w:val="false"/>
-                <w:color w:val="0E8C7F"/>
-                <w:sz w:val="20"/>
-                <w:szCs w:val="20"/>
-              </w:rPr>
-              <w:t xml:space="preserve">5.130.000 đ</w:t>
             </w:r>
           </w:p>
         </w:tc>
@@ -869,7 +723,7 @@
         </w:tc>
         <w:tc>
           <w:tcPr>
-            <w:tcW w:type="dxa" w:w="2500"/>
+            <w:tcW w:type="dxa" w:w="2700"/>
             <w:shd w:fill="FFFFFF" w:val="clear"/>
             <w:tcMar>
               <w:top w:type="dxa" w:w="90"/>
@@ -898,7 +752,7 @@
         </w:tc>
         <w:tc>
           <w:tcPr>
-            <w:tcW w:type="dxa" w:w="3300"/>
+            <w:tcW w:type="dxa" w:w="4400"/>
             <w:shd w:fill="FFFFFF" w:val="clear"/>
             <w:tcMar>
               <w:top w:type="dxa" w:w="90"/>
@@ -927,7 +781,7 @@
         </w:tc>
         <w:tc>
           <w:tcPr>
-            <w:tcW w:type="dxa" w:w="1650"/>
+            <w:tcW w:type="dxa" w:w="2000"/>
             <w:shd w:fill="FFFFFF" w:val="clear"/>
             <w:tcMar>
               <w:top w:type="dxa" w:w="90"/>
@@ -943,43 +797,14 @@
             </w:pPr>
             <w:r>
               <w:rPr>
-                <w:b w:val="false"/>
-                <w:bCs w:val="false"/>
-                <w:strike/>
-                <w:color w:val="9AA3AF"/>
+                <w:b/>
+                <w:bCs/>
+                <w:strike w:val="false"/>
+                <w:color w:val="0E8C7F"/>
                 <w:sz w:val="20"/>
                 <w:szCs w:val="20"/>
               </w:rPr>
               <w:t xml:space="preserve">4.500.000 đ</w:t>
-            </w:r>
-          </w:p>
-        </w:tc>
-        <w:tc>
-          <w:tcPr>
-            <w:tcW w:type="dxa" w:w="1650"/>
-            <w:shd w:fill="FFFFFF" w:val="clear"/>
-            <w:tcMar>
-              <w:top w:type="dxa" w:w="90"/>
-              <w:left w:type="dxa" w:w="100"/>
-              <w:bottom w:type="dxa" w:w="90"/>
-              <w:right w:type="dxa" w:w="100"/>
-            </w:tcMar>
-            <w:vAlign w:val="center"/>
-          </w:tcPr>
-          <w:p>
-            <w:pPr>
-              <w:jc w:val="right"/>
-            </w:pPr>
-            <w:r>
-              <w:rPr>
-                <w:b/>
-                <w:bCs/>
-                <w:strike w:val="false"/>
-                <w:color w:val="0E8C7F"/>
-                <w:sz w:val="20"/>
-                <w:szCs w:val="20"/>
-              </w:rPr>
-              <w:t xml:space="preserve">4.275.000 đ</w:t>
             </w:r>
           </w:p>
         </w:tc>
@@ -1016,7 +841,7 @@
         </w:tc>
         <w:tc>
           <w:tcPr>
-            <w:tcW w:type="dxa" w:w="2500"/>
+            <w:tcW w:type="dxa" w:w="2700"/>
             <w:shd w:fill="F5F7FA" w:val="clear"/>
             <w:tcMar>
               <w:top w:type="dxa" w:w="90"/>
@@ -1045,7 +870,7 @@
         </w:tc>
         <w:tc>
           <w:tcPr>
-            <w:tcW w:type="dxa" w:w="3300"/>
+            <w:tcW w:type="dxa" w:w="4400"/>
             <w:shd w:fill="F5F7FA" w:val="clear"/>
             <w:tcMar>
               <w:top w:type="dxa" w:w="90"/>
@@ -1074,7 +899,7 @@
         </w:tc>
         <w:tc>
           <w:tcPr>
-            <w:tcW w:type="dxa" w:w="1650"/>
+            <w:tcW w:type="dxa" w:w="2000"/>
             <w:shd w:fill="F5F7FA" w:val="clear"/>
             <w:tcMar>
               <w:top w:type="dxa" w:w="90"/>
@@ -1090,43 +915,14 @@
             </w:pPr>
             <w:r>
               <w:rPr>
-                <w:b w:val="false"/>
-                <w:bCs w:val="false"/>
-                <w:strike/>
-                <w:color w:val="9AA3AF"/>
+                <w:b/>
+                <w:bCs/>
+                <w:strike w:val="false"/>
+                <w:color w:val="0E8C7F"/>
                 <w:sz w:val="20"/>
                 <w:szCs w:val="20"/>
               </w:rPr>
               <w:t xml:space="preserve">4.600.000 đ</w:t>
-            </w:r>
-          </w:p>
-        </w:tc>
-        <w:tc>
-          <w:tcPr>
-            <w:tcW w:type="dxa" w:w="1650"/>
-            <w:shd w:fill="F5F7FA" w:val="clear"/>
-            <w:tcMar>
-              <w:top w:type="dxa" w:w="90"/>
-              <w:left w:type="dxa" w:w="100"/>
-              <w:bottom w:type="dxa" w:w="90"/>
-              <w:right w:type="dxa" w:w="100"/>
-            </w:tcMar>
-            <w:vAlign w:val="center"/>
-          </w:tcPr>
-          <w:p>
-            <w:pPr>
-              <w:jc w:val="right"/>
-            </w:pPr>
-            <w:r>
-              <w:rPr>
-                <w:b/>
-                <w:bCs/>
-                <w:strike w:val="false"/>
-                <w:color w:val="0E8C7F"/>
-                <w:sz w:val="20"/>
-                <w:szCs w:val="20"/>
-              </w:rPr>
-              <w:t xml:space="preserve">4.370.000 đ</w:t>
             </w:r>
           </w:p>
         </w:tc>
@@ -1163,7 +959,7 @@
         </w:tc>
         <w:tc>
           <w:tcPr>
-            <w:tcW w:type="dxa" w:w="2500"/>
+            <w:tcW w:type="dxa" w:w="2700"/>
             <w:shd w:fill="FFFFFF" w:val="clear"/>
             <w:tcMar>
               <w:top w:type="dxa" w:w="90"/>
@@ -1192,7 +988,7 @@
         </w:tc>
         <w:tc>
           <w:tcPr>
-            <w:tcW w:type="dxa" w:w="3300"/>
+            <w:tcW w:type="dxa" w:w="4400"/>
             <w:shd w:fill="FFFFFF" w:val="clear"/>
             <w:tcMar>
               <w:top w:type="dxa" w:w="90"/>
@@ -1221,7 +1017,7 @@
         </w:tc>
         <w:tc>
           <w:tcPr>
-            <w:tcW w:type="dxa" w:w="1650"/>
+            <w:tcW w:type="dxa" w:w="2000"/>
             <w:shd w:fill="FFFFFF" w:val="clear"/>
             <w:tcMar>
               <w:top w:type="dxa" w:w="90"/>
@@ -1237,43 +1033,14 @@
             </w:pPr>
             <w:r>
               <w:rPr>
-                <w:b w:val="false"/>
-                <w:bCs w:val="false"/>
-                <w:strike/>
-                <w:color w:val="9AA3AF"/>
+                <w:b/>
+                <w:bCs/>
+                <w:strike w:val="false"/>
+                <w:color w:val="0E8C7F"/>
                 <w:sz w:val="20"/>
                 <w:szCs w:val="20"/>
               </w:rPr>
               <w:t xml:space="preserve">4.500.000 đ</w:t>
-            </w:r>
-          </w:p>
-        </w:tc>
-        <w:tc>
-          <w:tcPr>
-            <w:tcW w:type="dxa" w:w="1650"/>
-            <w:shd w:fill="FFFFFF" w:val="clear"/>
-            <w:tcMar>
-              <w:top w:type="dxa" w:w="90"/>
-              <w:left w:type="dxa" w:w="100"/>
-              <w:bottom w:type="dxa" w:w="90"/>
-              <w:right w:type="dxa" w:w="100"/>
-            </w:tcMar>
-            <w:vAlign w:val="center"/>
-          </w:tcPr>
-          <w:p>
-            <w:pPr>
-              <w:jc w:val="right"/>
-            </w:pPr>
-            <w:r>
-              <w:rPr>
-                <w:b/>
-                <w:bCs/>
-                <w:strike w:val="false"/>
-                <w:color w:val="0E8C7F"/>
-                <w:sz w:val="20"/>
-                <w:szCs w:val="20"/>
-              </w:rPr>
-              <w:t xml:space="preserve">4.275.000 đ</w:t>
             </w:r>
           </w:p>
         </w:tc>
@@ -1310,7 +1077,7 @@
         </w:tc>
         <w:tc>
           <w:tcPr>
-            <w:tcW w:type="dxa" w:w="2500"/>
+            <w:tcW w:type="dxa" w:w="2700"/>
             <w:shd w:fill="F5F7FA" w:val="clear"/>
             <w:tcMar>
               <w:top w:type="dxa" w:w="90"/>
@@ -1339,7 +1106,7 @@
         </w:tc>
         <w:tc>
           <w:tcPr>
-            <w:tcW w:type="dxa" w:w="3300"/>
+            <w:tcW w:type="dxa" w:w="4400"/>
             <w:shd w:fill="F5F7FA" w:val="clear"/>
             <w:tcMar>
               <w:top w:type="dxa" w:w="90"/>
@@ -1368,7 +1135,7 @@
         </w:tc>
         <w:tc>
           <w:tcPr>
-            <w:tcW w:type="dxa" w:w="1650"/>
+            <w:tcW w:type="dxa" w:w="2000"/>
             <w:shd w:fill="F5F7FA" w:val="clear"/>
             <w:tcMar>
               <w:top w:type="dxa" w:w="90"/>
@@ -1384,43 +1151,14 @@
             </w:pPr>
             <w:r>
               <w:rPr>
-                <w:b w:val="false"/>
-                <w:bCs w:val="false"/>
-                <w:strike/>
-                <w:color w:val="9AA3AF"/>
+                <w:b/>
+                <w:bCs/>
+                <w:strike w:val="false"/>
+                <w:color w:val="0E8C7F"/>
                 <w:sz w:val="20"/>
                 <w:szCs w:val="20"/>
               </w:rPr>
               <w:t xml:space="preserve">2.000.000 đ</w:t>
-            </w:r>
-          </w:p>
-        </w:tc>
-        <w:tc>
-          <w:tcPr>
-            <w:tcW w:type="dxa" w:w="1650"/>
-            <w:shd w:fill="F5F7FA" w:val="clear"/>
-            <w:tcMar>
-              <w:top w:type="dxa" w:w="90"/>
-              <w:left w:type="dxa" w:w="100"/>
-              <w:bottom w:type="dxa" w:w="90"/>
-              <w:right w:type="dxa" w:w="100"/>
-            </w:tcMar>
-            <w:vAlign w:val="center"/>
-          </w:tcPr>
-          <w:p>
-            <w:pPr>
-              <w:jc w:val="right"/>
-            </w:pPr>
-            <w:r>
-              <w:rPr>
-                <w:b/>
-                <w:bCs/>
-                <w:strike w:val="false"/>
-                <w:color w:val="0E8C7F"/>
-                <w:sz w:val="20"/>
-                <w:szCs w:val="20"/>
-              </w:rPr>
-              <w:t xml:space="preserve">1.900.000 đ</w:t>
             </w:r>
           </w:p>
         </w:tc>
@@ -1457,7 +1195,7 @@
         </w:tc>
         <w:tc>
           <w:tcPr>
-            <w:tcW w:type="dxa" w:w="2500"/>
+            <w:tcW w:type="dxa" w:w="2700"/>
             <w:shd w:fill="FFFFFF" w:val="clear"/>
             <w:tcMar>
               <w:top w:type="dxa" w:w="90"/>
@@ -1486,7 +1224,7 @@
         </w:tc>
         <w:tc>
           <w:tcPr>
-            <w:tcW w:type="dxa" w:w="3300"/>
+            <w:tcW w:type="dxa" w:w="4400"/>
             <w:shd w:fill="FFFFFF" w:val="clear"/>
             <w:tcMar>
               <w:top w:type="dxa" w:w="90"/>
@@ -1515,7 +1253,7 @@
         </w:tc>
         <w:tc>
           <w:tcPr>
-            <w:tcW w:type="dxa" w:w="1650"/>
+            <w:tcW w:type="dxa" w:w="2000"/>
             <w:shd w:fill="FFFFFF" w:val="clear"/>
             <w:tcMar>
               <w:top w:type="dxa" w:w="90"/>
@@ -1531,43 +1269,14 @@
             </w:pPr>
             <w:r>
               <w:rPr>
-                <w:b w:val="false"/>
-                <w:bCs w:val="false"/>
-                <w:strike/>
-                <w:color w:val="9AA3AF"/>
+                <w:b/>
+                <w:bCs/>
+                <w:strike w:val="false"/>
+                <w:color w:val="0E8C7F"/>
                 <w:sz w:val="20"/>
                 <w:szCs w:val="20"/>
               </w:rPr>
               <w:t xml:space="preserve">2.900.000 đ</w:t>
-            </w:r>
-          </w:p>
-        </w:tc>
-        <w:tc>
-          <w:tcPr>
-            <w:tcW w:type="dxa" w:w="1650"/>
-            <w:shd w:fill="FFFFFF" w:val="clear"/>
-            <w:tcMar>
-              <w:top w:type="dxa" w:w="90"/>
-              <w:left w:type="dxa" w:w="100"/>
-              <w:bottom w:type="dxa" w:w="90"/>
-              <w:right w:type="dxa" w:w="100"/>
-            </w:tcMar>
-            <w:vAlign w:val="center"/>
-          </w:tcPr>
-          <w:p>
-            <w:pPr>
-              <w:jc w:val="right"/>
-            </w:pPr>
-            <w:r>
-              <w:rPr>
-                <w:b/>
-                <w:bCs/>
-                <w:strike w:val="false"/>
-                <w:color w:val="0E8C7F"/>
-                <w:sz w:val="20"/>
-                <w:szCs w:val="20"/>
-              </w:rPr>
-              <w:t xml:space="preserve">2.755.000 đ</w:t>
             </w:r>
           </w:p>
         </w:tc>
@@ -1604,7 +1313,7 @@
         </w:tc>
         <w:tc>
           <w:tcPr>
-            <w:tcW w:type="dxa" w:w="2500"/>
+            <w:tcW w:type="dxa" w:w="2700"/>
             <w:shd w:fill="F5F7FA" w:val="clear"/>
             <w:tcMar>
               <w:top w:type="dxa" w:w="90"/>
@@ -1633,7 +1342,7 @@
         </w:tc>
         <w:tc>
           <w:tcPr>
-            <w:tcW w:type="dxa" w:w="3300"/>
+            <w:tcW w:type="dxa" w:w="4400"/>
             <w:shd w:fill="F5F7FA" w:val="clear"/>
             <w:tcMar>
               <w:top w:type="dxa" w:w="90"/>
@@ -1662,7 +1371,7 @@
         </w:tc>
         <w:tc>
           <w:tcPr>
-            <w:tcW w:type="dxa" w:w="1650"/>
+            <w:tcW w:type="dxa" w:w="2000"/>
             <w:shd w:fill="F5F7FA" w:val="clear"/>
             <w:tcMar>
               <w:top w:type="dxa" w:w="90"/>
@@ -1678,43 +1387,14 @@
             </w:pPr>
             <w:r>
               <w:rPr>
-                <w:b w:val="false"/>
-                <w:bCs w:val="false"/>
-                <w:strike/>
-                <w:color w:val="9AA3AF"/>
+                <w:b/>
+                <w:bCs/>
+                <w:strike w:val="false"/>
+                <w:color w:val="0E8C7F"/>
                 <w:sz w:val="20"/>
                 <w:szCs w:val="20"/>
               </w:rPr>
               <w:t xml:space="preserve">2.900.000 đ</w:t>
-            </w:r>
-          </w:p>
-        </w:tc>
-        <w:tc>
-          <w:tcPr>
-            <w:tcW w:type="dxa" w:w="1650"/>
-            <w:shd w:fill="F5F7FA" w:val="clear"/>
-            <w:tcMar>
-              <w:top w:type="dxa" w:w="90"/>
-              <w:left w:type="dxa" w:w="100"/>
-              <w:bottom w:type="dxa" w:w="90"/>
-              <w:right w:type="dxa" w:w="100"/>
-            </w:tcMar>
-            <w:vAlign w:val="center"/>
-          </w:tcPr>
-          <w:p>
-            <w:pPr>
-              <w:jc w:val="right"/>
-            </w:pPr>
-            <w:r>
-              <w:rPr>
-                <w:b/>
-                <w:bCs/>
-                <w:strike w:val="false"/>
-                <w:color w:val="0E8C7F"/>
-                <w:sz w:val="20"/>
-                <w:szCs w:val="20"/>
-              </w:rPr>
-              <w:t xml:space="preserve">2.755.000 đ</w:t>
             </w:r>
           </w:p>
         </w:tc>
@@ -1751,7 +1431,7 @@
         </w:tc>
         <w:tc>
           <w:tcPr>
-            <w:tcW w:type="dxa" w:w="2500"/>
+            <w:tcW w:type="dxa" w:w="2700"/>
             <w:shd w:fill="FFFFFF" w:val="clear"/>
             <w:tcMar>
               <w:top w:type="dxa" w:w="90"/>
@@ -1780,7 +1460,7 @@
         </w:tc>
         <w:tc>
           <w:tcPr>
-            <w:tcW w:type="dxa" w:w="3300"/>
+            <w:tcW w:type="dxa" w:w="4400"/>
             <w:shd w:fill="FFFFFF" w:val="clear"/>
             <w:tcMar>
               <w:top w:type="dxa" w:w="90"/>
@@ -1809,7 +1489,7 @@
         </w:tc>
         <w:tc>
           <w:tcPr>
-            <w:tcW w:type="dxa" w:w="1650"/>
+            <w:tcW w:type="dxa" w:w="2000"/>
             <w:shd w:fill="FFFFFF" w:val="clear"/>
             <w:tcMar>
               <w:top w:type="dxa" w:w="90"/>
@@ -1825,43 +1505,14 @@
             </w:pPr>
             <w:r>
               <w:rPr>
-                <w:b w:val="false"/>
-                <w:bCs w:val="false"/>
-                <w:strike/>
-                <w:color w:val="9AA3AF"/>
+                <w:b/>
+                <w:bCs/>
+                <w:strike w:val="false"/>
+                <w:color w:val="0E8C7F"/>
                 <w:sz w:val="20"/>
                 <w:szCs w:val="20"/>
               </w:rPr>
               <w:t xml:space="preserve">3.200.000 đ</w:t>
-            </w:r>
-          </w:p>
-        </w:tc>
-        <w:tc>
-          <w:tcPr>
-            <w:tcW w:type="dxa" w:w="1650"/>
-            <w:shd w:fill="FFFFFF" w:val="clear"/>
-            <w:tcMar>
-              <w:top w:type="dxa" w:w="90"/>
-              <w:left w:type="dxa" w:w="100"/>
-              <w:bottom w:type="dxa" w:w="90"/>
-              <w:right w:type="dxa" w:w="100"/>
-            </w:tcMar>
-            <w:vAlign w:val="center"/>
-          </w:tcPr>
-          <w:p>
-            <w:pPr>
-              <w:jc w:val="right"/>
-            </w:pPr>
-            <w:r>
-              <w:rPr>
-                <w:b/>
-                <w:bCs/>
-                <w:strike w:val="false"/>
-                <w:color w:val="0E8C7F"/>
-                <w:sz w:val="20"/>
-                <w:szCs w:val="20"/>
-              </w:rPr>
-              <w:t xml:space="preserve">3.040.000 đ</w:t>
             </w:r>
           </w:p>
         </w:tc>
@@ -1898,7 +1549,7 @@
         </w:tc>
         <w:tc>
           <w:tcPr>
-            <w:tcW w:type="dxa" w:w="2500"/>
+            <w:tcW w:type="dxa" w:w="2700"/>
             <w:shd w:fill="F5F7FA" w:val="clear"/>
             <w:tcMar>
               <w:top w:type="dxa" w:w="90"/>
@@ -1927,7 +1578,7 @@
         </w:tc>
         <w:tc>
           <w:tcPr>
-            <w:tcW w:type="dxa" w:w="3300"/>
+            <w:tcW w:type="dxa" w:w="4400"/>
             <w:shd w:fill="F5F7FA" w:val="clear"/>
             <w:tcMar>
               <w:top w:type="dxa" w:w="90"/>
@@ -1956,7 +1607,7 @@
         </w:tc>
         <w:tc>
           <w:tcPr>
-            <w:tcW w:type="dxa" w:w="1650"/>
+            <w:tcW w:type="dxa" w:w="2000"/>
             <w:shd w:fill="F5F7FA" w:val="clear"/>
             <w:tcMar>
               <w:top w:type="dxa" w:w="90"/>
@@ -1972,43 +1623,14 @@
             </w:pPr>
             <w:r>
               <w:rPr>
-                <w:b w:val="false"/>
-                <w:bCs w:val="false"/>
-                <w:strike/>
-                <w:color w:val="9AA3AF"/>
+                <w:b/>
+                <w:bCs/>
+                <w:strike w:val="false"/>
+                <w:color w:val="0E8C7F"/>
                 <w:sz w:val="20"/>
                 <w:szCs w:val="20"/>
               </w:rPr>
               <w:t xml:space="preserve">3.110.000 đ</w:t>
-            </w:r>
-          </w:p>
-        </w:tc>
-        <w:tc>
-          <w:tcPr>
-            <w:tcW w:type="dxa" w:w="1650"/>
-            <w:shd w:fill="F5F7FA" w:val="clear"/>
-            <w:tcMar>
-              <w:top w:type="dxa" w:w="90"/>
-              <w:left w:type="dxa" w:w="100"/>
-              <w:bottom w:type="dxa" w:w="90"/>
-              <w:right w:type="dxa" w:w="100"/>
-            </w:tcMar>
-            <w:vAlign w:val="center"/>
-          </w:tcPr>
-          <w:p>
-            <w:pPr>
-              <w:jc w:val="right"/>
-            </w:pPr>
-            <w:r>
-              <w:rPr>
-                <w:b/>
-                <w:bCs/>
-                <w:strike w:val="false"/>
-                <w:color w:val="0E8C7F"/>
-                <w:sz w:val="20"/>
-                <w:szCs w:val="20"/>
-              </w:rPr>
-              <w:t xml:space="preserve">2.954.000 đ</w:t>
             </w:r>
           </w:p>
         </w:tc>
@@ -2045,7 +1667,7 @@
         </w:tc>
         <w:tc>
           <w:tcPr>
-            <w:tcW w:type="dxa" w:w="2500"/>
+            <w:tcW w:type="dxa" w:w="2700"/>
             <w:shd w:fill="FFFFFF" w:val="clear"/>
             <w:tcMar>
               <w:top w:type="dxa" w:w="90"/>
@@ -2074,7 +1696,7 @@
         </w:tc>
         <w:tc>
           <w:tcPr>
-            <w:tcW w:type="dxa" w:w="3300"/>
+            <w:tcW w:type="dxa" w:w="4400"/>
             <w:shd w:fill="FFFFFF" w:val="clear"/>
             <w:tcMar>
               <w:top w:type="dxa" w:w="90"/>
@@ -2103,7 +1725,7 @@
         </w:tc>
         <w:tc>
           <w:tcPr>
-            <w:tcW w:type="dxa" w:w="1650"/>
+            <w:tcW w:type="dxa" w:w="2000"/>
             <w:shd w:fill="FFFFFF" w:val="clear"/>
             <w:tcMar>
               <w:top w:type="dxa" w:w="90"/>
@@ -2119,43 +1741,14 @@
             </w:pPr>
             <w:r>
               <w:rPr>
-                <w:b w:val="false"/>
-                <w:bCs w:val="false"/>
-                <w:strike/>
-                <w:color w:val="9AA3AF"/>
+                <w:b/>
+                <w:bCs/>
+                <w:strike w:val="false"/>
+                <w:color w:val="0E8C7F"/>
                 <w:sz w:val="20"/>
                 <w:szCs w:val="20"/>
               </w:rPr>
               <w:t xml:space="preserve">3.150.000 đ</w:t>
-            </w:r>
-          </w:p>
-        </w:tc>
-        <w:tc>
-          <w:tcPr>
-            <w:tcW w:type="dxa" w:w="1650"/>
-            <w:shd w:fill="FFFFFF" w:val="clear"/>
-            <w:tcMar>
-              <w:top w:type="dxa" w:w="90"/>
-              <w:left w:type="dxa" w:w="100"/>
-              <w:bottom w:type="dxa" w:w="90"/>
-              <w:right w:type="dxa" w:w="100"/>
-            </w:tcMar>
-            <w:vAlign w:val="center"/>
-          </w:tcPr>
-          <w:p>
-            <w:pPr>
-              <w:jc w:val="right"/>
-            </w:pPr>
-            <w:r>
-              <w:rPr>
-                <w:b/>
-                <w:bCs/>
-                <w:strike w:val="false"/>
-                <w:color w:val="0E8C7F"/>
-                <w:sz w:val="20"/>
-                <w:szCs w:val="20"/>
-              </w:rPr>
-              <w:t xml:space="preserve">2.992.000 đ</w:t>
             </w:r>
           </w:p>
         </w:tc>
@@ -2192,7 +1785,7 @@
         </w:tc>
         <w:tc>
           <w:tcPr>
-            <w:tcW w:type="dxa" w:w="2500"/>
+            <w:tcW w:type="dxa" w:w="2700"/>
             <w:shd w:fill="F5F7FA" w:val="clear"/>
             <w:tcMar>
               <w:top w:type="dxa" w:w="90"/>
@@ -2221,7 +1814,7 @@
         </w:tc>
         <w:tc>
           <w:tcPr>
-            <w:tcW w:type="dxa" w:w="3300"/>
+            <w:tcW w:type="dxa" w:w="4400"/>
             <w:shd w:fill="F5F7FA" w:val="clear"/>
             <w:tcMar>
               <w:top w:type="dxa" w:w="90"/>
@@ -2250,7 +1843,7 @@
         </w:tc>
         <w:tc>
           <w:tcPr>
-            <w:tcW w:type="dxa" w:w="1650"/>
+            <w:tcW w:type="dxa" w:w="2000"/>
             <w:shd w:fill="F5F7FA" w:val="clear"/>
             <w:tcMar>
               <w:top w:type="dxa" w:w="90"/>
@@ -2266,10 +1859,10 @@
             </w:pPr>
             <w:r>
               <w:rPr>
-                <w:b w:val="false"/>
-                <w:bCs w:val="false"/>
-                <w:strike/>
-                <w:color w:val="9AA3AF"/>
+                <w:b/>
+                <w:bCs/>
+                <w:strike w:val="false"/>
+                <w:color w:val="0E8C7F"/>
                 <w:sz w:val="20"/>
                 <w:szCs w:val="20"/>
               </w:rPr>
@@ -2277,10 +1870,124 @@
             </w:r>
           </w:p>
         </w:tc>
-        <w:tc>
-          <w:tcPr>
-            <w:tcW w:type="dxa" w:w="1650"/>
-            <w:shd w:fill="F5F7FA" w:val="clear"/>
+      </w:tr>
+    </w:tbl>
+    <w:p>
+      <w:pPr>
+        <w:spacing w:after="100" w:before="260"/>
+      </w:pPr>
+      <w:r>
+        <w:rPr>
+          <w:b/>
+          <w:bCs/>
+          <w:color w:val="1C2035"/>
+          <w:sz w:val="23"/>
+          <w:szCs w:val="23"/>
+        </w:rPr>
+        <w:t xml:space="preserve">Chính sách chiết khấu theo số lượng</w:t>
+      </w:r>
+    </w:p>
+    <w:p>
+      <w:pPr>
+        <w:spacing w:after="160" w:before="0"/>
+      </w:pPr>
+      <w:r>
+        <w:rPr>
+          <w:b w:val="false"/>
+          <w:bCs w:val="false"/>
+          <w:i w:val="false"/>
+          <w:iCs w:val="false"/>
+          <w:color w:val="27343A"/>
+          <w:sz w:val="20"/>
+          <w:szCs w:val="20"/>
+        </w:rPr>
+        <w:t xml:space="preserve">Đặt càng nhiều đầu báo trong cùng 1 đơn, chiết khấu càng cao - áp dụng trực tiếp trên tổng giá niêm yết (tổng 53.160.000 đ cho trọn bộ 14 đầu báo).</w:t>
+      </w:r>
+    </w:p>
+    <w:tbl>
+      <w:tblPr>
+        <w:tblW w:type="dxa" w:w="9600"/>
+        <w:tblBorders>
+          <w:top w:val="single" w:color="D9DEE5" w:sz="4"/>
+          <w:left w:val="single" w:color="D9DEE5" w:sz="4"/>
+          <w:bottom w:val="single" w:color="D9DEE5" w:sz="4"/>
+          <w:right w:val="single" w:color="D9DEE5" w:sz="4"/>
+          <w:insideH w:val="single" w:color="D9DEE5" w:sz="4"/>
+          <w:insideV w:val="single" w:color="D9DEE5" w:sz="4"/>
+        </w:tblBorders>
+      </w:tblPr>
+      <w:tblGrid>
+        <w:gridCol w:w="3200"/>
+        <w:gridCol w:w="1500"/>
+        <w:gridCol w:w="2450"/>
+        <w:gridCol w:w="2450"/>
+      </w:tblGrid>
+      <w:tr>
+        <w:trPr>
+          <w:tblHeader/>
+        </w:trPr>
+        <w:tc>
+          <w:tcPr>
+            <w:tcW w:type="dxa" w:w="3200"/>
+            <w:shd w:fill="0E8C7F" w:val="clear"/>
+            <w:tcMar>
+              <w:top w:type="dxa" w:w="90"/>
+              <w:left w:type="dxa" w:w="100"/>
+              <w:bottom w:type="dxa" w:w="90"/>
+              <w:right w:type="dxa" w:w="100"/>
+            </w:tcMar>
+            <w:vAlign w:val="center"/>
+          </w:tcPr>
+          <w:p>
+            <w:pPr>
+              <w:jc w:val="left"/>
+            </w:pPr>
+            <w:r>
+              <w:rPr>
+                <w:b/>
+                <w:bCs/>
+                <w:strike w:val="false"/>
+                <w:color w:val="FFFFFF"/>
+                <w:sz w:val="20"/>
+                <w:szCs w:val="20"/>
+              </w:rPr>
+              <w:t xml:space="preserve">Số lượng đầu báo đặt</w:t>
+            </w:r>
+          </w:p>
+        </w:tc>
+        <w:tc>
+          <w:tcPr>
+            <w:tcW w:type="dxa" w:w="1500"/>
+            <w:shd w:fill="0E8C7F" w:val="clear"/>
+            <w:tcMar>
+              <w:top w:type="dxa" w:w="90"/>
+              <w:left w:type="dxa" w:w="100"/>
+              <w:bottom w:type="dxa" w:w="90"/>
+              <w:right w:type="dxa" w:w="100"/>
+            </w:tcMar>
+            <w:vAlign w:val="center"/>
+          </w:tcPr>
+          <w:p>
+            <w:pPr>
+              <w:jc w:val="center"/>
+            </w:pPr>
+            <w:r>
+              <w:rPr>
+                <w:b/>
+                <w:bCs/>
+                <w:strike w:val="false"/>
+                <w:color w:val="FFFFFF"/>
+                <w:sz w:val="20"/>
+                <w:szCs w:val="20"/>
+              </w:rPr>
+              <w:t xml:space="preserve">Chiết khấu</w:t>
+            </w:r>
+          </w:p>
+        </w:tc>
+        <w:tc>
+          <w:tcPr>
+            <w:tcW w:type="dxa" w:w="2450"/>
+            <w:shd w:fill="0E8C7F" w:val="clear"/>
             <w:tcMar>
               <w:top w:type="dxa" w:w="90"/>
               <w:left w:type="dxa" w:w="100"/>
@@ -2298,11 +2005,394 @@
                 <w:b/>
                 <w:bCs/>
                 <w:strike w:val="false"/>
+                <w:color w:val="FFFFFF"/>
+                <w:sz w:val="20"/>
+                <w:szCs w:val="20"/>
+              </w:rPr>
+              <w:t xml:space="preserve">Giá trị đơn còn lại</w:t>
+            </w:r>
+          </w:p>
+        </w:tc>
+        <w:tc>
+          <w:tcPr>
+            <w:tcW w:type="dxa" w:w="2450"/>
+            <w:shd w:fill="0E8C7F" w:val="clear"/>
+            <w:tcMar>
+              <w:top w:type="dxa" w:w="90"/>
+              <w:left w:type="dxa" w:w="100"/>
+              <w:bottom w:type="dxa" w:w="90"/>
+              <w:right w:type="dxa" w:w="100"/>
+            </w:tcMar>
+            <w:vAlign w:val="center"/>
+          </w:tcPr>
+          <w:p>
+            <w:pPr>
+              <w:jc w:val="right"/>
+            </w:pPr>
+            <w:r>
+              <w:rPr>
+                <w:b/>
+                <w:bCs/>
+                <w:strike w:val="false"/>
+                <w:color w:val="FFFFFF"/>
+                <w:sz w:val="20"/>
+                <w:szCs w:val="20"/>
+              </w:rPr>
+              <w:t xml:space="preserve">Tiết kiệm</w:t>
+            </w:r>
+          </w:p>
+        </w:tc>
+      </w:tr>
+      <w:tr>
+        <w:tc>
+          <w:tcPr>
+            <w:tcW w:type="dxa" w:w="3200"/>
+            <w:shd w:fill="FFFFFF" w:val="clear"/>
+            <w:tcMar>
+              <w:top w:type="dxa" w:w="90"/>
+              <w:left w:type="dxa" w:w="100"/>
+              <w:bottom w:type="dxa" w:w="90"/>
+              <w:right w:type="dxa" w:w="100"/>
+            </w:tcMar>
+            <w:vAlign w:val="center"/>
+          </w:tcPr>
+          <w:p>
+            <w:pPr>
+              <w:jc w:val="left"/>
+            </w:pPr>
+            <w:r>
+              <w:rPr>
+                <w:b/>
+                <w:bCs/>
+                <w:strike w:val="false"/>
+                <w:color w:val="27343A"/>
+                <w:sz w:val="20"/>
+                <w:szCs w:val="20"/>
+              </w:rPr>
+              <w:t xml:space="preserve">5 - 7 đầu báo</w:t>
+            </w:r>
+          </w:p>
+        </w:tc>
+        <w:tc>
+          <w:tcPr>
+            <w:tcW w:type="dxa" w:w="1500"/>
+            <w:shd w:fill="FFFFFF" w:val="clear"/>
+            <w:tcMar>
+              <w:top w:type="dxa" w:w="90"/>
+              <w:left w:type="dxa" w:w="100"/>
+              <w:bottom w:type="dxa" w:w="90"/>
+              <w:right w:type="dxa" w:w="100"/>
+            </w:tcMar>
+            <w:vAlign w:val="center"/>
+          </w:tcPr>
+          <w:p>
+            <w:pPr>
+              <w:jc w:val="center"/>
+            </w:pPr>
+            <w:r>
+              <w:rPr>
+                <w:b/>
+                <w:bCs/>
+                <w:strike w:val="false"/>
                 <w:color w:val="0E8C7F"/>
-                <w:sz w:val="20"/>
-                <w:szCs w:val="20"/>
-              </w:rPr>
-              <w:t xml:space="preserve">2.565.000 đ</w:t>
+                <w:sz w:val="22"/>
+                <w:szCs w:val="22"/>
+              </w:rPr>
+              <w:t xml:space="preserve">20%</w:t>
+            </w:r>
+          </w:p>
+        </w:tc>
+        <w:tc>
+          <w:tcPr>
+            <w:tcW w:type="dxa" w:w="2450"/>
+            <w:shd w:fill="FFFFFF" w:val="clear"/>
+            <w:tcMar>
+              <w:top w:type="dxa" w:w="90"/>
+              <w:left w:type="dxa" w:w="100"/>
+              <w:bottom w:type="dxa" w:w="90"/>
+              <w:right w:type="dxa" w:w="100"/>
+            </w:tcMar>
+            <w:vAlign w:val="center"/>
+          </w:tcPr>
+          <w:p>
+            <w:pPr>
+              <w:jc w:val="right"/>
+            </w:pPr>
+            <w:r>
+              <w:rPr>
+                <w:b w:val="false"/>
+                <w:bCs w:val="false"/>
+                <w:strike w:val="false"/>
+                <w:color w:val="27343A"/>
+                <w:sz w:val="20"/>
+                <w:szCs w:val="20"/>
+              </w:rPr>
+              <w:t xml:space="preserve">42.528.000 đ</w:t>
+            </w:r>
+          </w:p>
+        </w:tc>
+        <w:tc>
+          <w:tcPr>
+            <w:tcW w:type="dxa" w:w="2450"/>
+            <w:shd w:fill="FFFFFF" w:val="clear"/>
+            <w:tcMar>
+              <w:top w:type="dxa" w:w="90"/>
+              <w:left w:type="dxa" w:w="100"/>
+              <w:bottom w:type="dxa" w:w="90"/>
+              <w:right w:type="dxa" w:w="100"/>
+            </w:tcMar>
+            <w:vAlign w:val="center"/>
+          </w:tcPr>
+          <w:p>
+            <w:pPr>
+              <w:jc w:val="right"/>
+            </w:pPr>
+            <w:r>
+              <w:rPr>
+                <w:b w:val="false"/>
+                <w:bCs w:val="false"/>
+                <w:strike w:val="false"/>
+                <w:color w:val="5A6472"/>
+                <w:sz w:val="20"/>
+                <w:szCs w:val="20"/>
+              </w:rPr>
+              <w:t xml:space="preserve">10.632.000 đ</w:t>
+            </w:r>
+          </w:p>
+        </w:tc>
+      </w:tr>
+      <w:tr>
+        <w:tc>
+          <w:tcPr>
+            <w:tcW w:type="dxa" w:w="3200"/>
+            <w:shd w:fill="F5F7FA" w:val="clear"/>
+            <w:tcMar>
+              <w:top w:type="dxa" w:w="90"/>
+              <w:left w:type="dxa" w:w="100"/>
+              <w:bottom w:type="dxa" w:w="90"/>
+              <w:right w:type="dxa" w:w="100"/>
+            </w:tcMar>
+            <w:vAlign w:val="center"/>
+          </w:tcPr>
+          <w:p>
+            <w:pPr>
+              <w:jc w:val="left"/>
+            </w:pPr>
+            <w:r>
+              <w:rPr>
+                <w:b/>
+                <w:bCs/>
+                <w:strike w:val="false"/>
+                <w:color w:val="27343A"/>
+                <w:sz w:val="20"/>
+                <w:szCs w:val="20"/>
+              </w:rPr>
+              <w:t xml:space="preserve">8 - 11 đầu báo</w:t>
+            </w:r>
+          </w:p>
+        </w:tc>
+        <w:tc>
+          <w:tcPr>
+            <w:tcW w:type="dxa" w:w="1500"/>
+            <w:shd w:fill="F5F7FA" w:val="clear"/>
+            <w:tcMar>
+              <w:top w:type="dxa" w:w="90"/>
+              <w:left w:type="dxa" w:w="100"/>
+              <w:bottom w:type="dxa" w:w="90"/>
+              <w:right w:type="dxa" w:w="100"/>
+            </w:tcMar>
+            <w:vAlign w:val="center"/>
+          </w:tcPr>
+          <w:p>
+            <w:pPr>
+              <w:jc w:val="center"/>
+            </w:pPr>
+            <w:r>
+              <w:rPr>
+                <w:b/>
+                <w:bCs/>
+                <w:strike w:val="false"/>
+                <w:color w:val="0E8C7F"/>
+                <w:sz w:val="22"/>
+                <w:szCs w:val="22"/>
+              </w:rPr>
+              <w:t xml:space="preserve">24%</w:t>
+            </w:r>
+          </w:p>
+        </w:tc>
+        <w:tc>
+          <w:tcPr>
+            <w:tcW w:type="dxa" w:w="2450"/>
+            <w:shd w:fill="F5F7FA" w:val="clear"/>
+            <w:tcMar>
+              <w:top w:type="dxa" w:w="90"/>
+              <w:left w:type="dxa" w:w="100"/>
+              <w:bottom w:type="dxa" w:w="90"/>
+              <w:right w:type="dxa" w:w="100"/>
+            </w:tcMar>
+            <w:vAlign w:val="center"/>
+          </w:tcPr>
+          <w:p>
+            <w:pPr>
+              <w:jc w:val="right"/>
+            </w:pPr>
+            <w:r>
+              <w:rPr>
+                <w:b w:val="false"/>
+                <w:bCs w:val="false"/>
+                <w:strike w:val="false"/>
+                <w:color w:val="27343A"/>
+                <w:sz w:val="20"/>
+                <w:szCs w:val="20"/>
+              </w:rPr>
+              <w:t xml:space="preserve">40.402.000 đ</w:t>
+            </w:r>
+          </w:p>
+        </w:tc>
+        <w:tc>
+          <w:tcPr>
+            <w:tcW w:type="dxa" w:w="2450"/>
+            <w:shd w:fill="F5F7FA" w:val="clear"/>
+            <w:tcMar>
+              <w:top w:type="dxa" w:w="90"/>
+              <w:left w:type="dxa" w:w="100"/>
+              <w:bottom w:type="dxa" w:w="90"/>
+              <w:right w:type="dxa" w:w="100"/>
+            </w:tcMar>
+            <w:vAlign w:val="center"/>
+          </w:tcPr>
+          <w:p>
+            <w:pPr>
+              <w:jc w:val="right"/>
+            </w:pPr>
+            <w:r>
+              <w:rPr>
+                <w:b w:val="false"/>
+                <w:bCs w:val="false"/>
+                <w:strike w:val="false"/>
+                <w:color w:val="5A6472"/>
+                <w:sz w:val="20"/>
+                <w:szCs w:val="20"/>
+              </w:rPr>
+              <w:t xml:space="preserve">12.758.000 đ</w:t>
+            </w:r>
+          </w:p>
+        </w:tc>
+      </w:tr>
+      <w:tr>
+        <w:tc>
+          <w:tcPr>
+            <w:tcW w:type="dxa" w:w="3200"/>
+            <w:shd w:fill="FFFFFF" w:val="clear"/>
+            <w:tcMar>
+              <w:top w:type="dxa" w:w="90"/>
+              <w:left w:type="dxa" w:w="100"/>
+              <w:bottom w:type="dxa" w:w="90"/>
+              <w:right w:type="dxa" w:w="100"/>
+            </w:tcMar>
+            <w:vAlign w:val="center"/>
+          </w:tcPr>
+          <w:p>
+            <w:pPr>
+              <w:jc w:val="left"/>
+            </w:pPr>
+            <w:r>
+              <w:rPr>
+                <w:b/>
+                <w:bCs/>
+                <w:strike w:val="false"/>
+                <w:color w:val="27343A"/>
+                <w:sz w:val="20"/>
+                <w:szCs w:val="20"/>
+              </w:rPr>
+              <w:t xml:space="preserve">12 - 14 đầu báo (trọn gói)</w:t>
+            </w:r>
+          </w:p>
+        </w:tc>
+        <w:tc>
+          <w:tcPr>
+            <w:tcW w:type="dxa" w:w="1500"/>
+            <w:shd w:fill="FFFFFF" w:val="clear"/>
+            <w:tcMar>
+              <w:top w:type="dxa" w:w="90"/>
+              <w:left w:type="dxa" w:w="100"/>
+              <w:bottom w:type="dxa" w:w="90"/>
+              <w:right w:type="dxa" w:w="100"/>
+            </w:tcMar>
+            <w:vAlign w:val="center"/>
+          </w:tcPr>
+          <w:p>
+            <w:pPr>
+              <w:jc w:val="center"/>
+            </w:pPr>
+            <w:r>
+              <w:rPr>
+                <w:b/>
+                <w:bCs/>
+                <w:strike w:val="false"/>
+                <w:color w:val="0E8C7F"/>
+                <w:sz w:val="22"/>
+                <w:szCs w:val="22"/>
+              </w:rPr>
+              <w:t xml:space="preserve">29%</w:t>
+            </w:r>
+          </w:p>
+        </w:tc>
+        <w:tc>
+          <w:tcPr>
+            <w:tcW w:type="dxa" w:w="2450"/>
+            <w:shd w:fill="FFFFFF" w:val="clear"/>
+            <w:tcMar>
+              <w:top w:type="dxa" w:w="90"/>
+              <w:left w:type="dxa" w:w="100"/>
+              <w:bottom w:type="dxa" w:w="90"/>
+              <w:right w:type="dxa" w:w="100"/>
+            </w:tcMar>
+            <w:vAlign w:val="center"/>
+          </w:tcPr>
+          <w:p>
+            <w:pPr>
+              <w:jc w:val="right"/>
+            </w:pPr>
+            <w:r>
+              <w:rPr>
+                <w:b w:val="false"/>
+                <w:bCs w:val="false"/>
+                <w:strike w:val="false"/>
+                <w:color w:val="27343A"/>
+                <w:sz w:val="20"/>
+                <w:szCs w:val="20"/>
+              </w:rPr>
+              <w:t xml:space="preserve">37.744.000 đ</w:t>
+            </w:r>
+          </w:p>
+        </w:tc>
+        <w:tc>
+          <w:tcPr>
+            <w:tcW w:type="dxa" w:w="2450"/>
+            <w:shd w:fill="FFFFFF" w:val="clear"/>
+            <w:tcMar>
+              <w:top w:type="dxa" w:w="90"/>
+              <w:left w:type="dxa" w:w="100"/>
+              <w:bottom w:type="dxa" w:w="90"/>
+              <w:right w:type="dxa" w:w="100"/>
+            </w:tcMar>
+            <w:vAlign w:val="center"/>
+          </w:tcPr>
+          <w:p>
+            <w:pPr>
+              <w:jc w:val="right"/>
+            </w:pPr>
+            <w:r>
+              <w:rPr>
+                <w:b w:val="false"/>
+                <w:bCs w:val="false"/>
+                <w:strike w:val="false"/>
+                <w:color w:val="5A6472"/>
+                <w:sz w:val="20"/>
+                <w:szCs w:val="20"/>
+              </w:rPr>
+              <w:t xml:space="preserve">15.416.000 đ</w:t>
             </w:r>
           </w:p>
         </w:tc>
@@ -2343,7 +2433,7 @@
           <w:sz w:val="21"/>
           <w:szCs w:val="21"/>
         </w:rPr>
-        <w:t xml:space="preserve">Giảm thêm 5% trên toàn bộ bảng giá - áp dụng khi đặt trọn gói 14 đầu báo trong báo giá này.</w:t>
+        <w:t xml:space="preserve">Tặng miễn phí 5 site Guest Post tự chọn (chọn theo danh sách site Guest Post hiện có của Digicom) khi đặt bài theo báo giá này.</w:t>
       </w:r>
     </w:p>
     <w:p>
@@ -2366,80 +2456,7 @@
           <w:sz w:val="21"/>
           <w:szCs w:val="21"/>
         </w:rPr>
-        <w:t xml:space="preserve">Tặng miễn phí 5 site Guest Post tự chọn (chọn theo danh sách site Guest Post hiện có của Digicom) khi đặt bài theo báo giá này.</w:t>
-      </w:r>
-    </w:p>
-    <w:p>
-      <w:pPr>
-        <w:spacing w:after="80"/>
-      </w:pPr>
-      <w:r>
-        <w:rPr>
-          <w:b/>
-          <w:bCs/>
-          <w:color w:val="0E8C7F"/>
-          <w:sz w:val="21"/>
-          <w:szCs w:val="21"/>
-        </w:rPr>
-        <w:t xml:space="preserve">- </w:t>
-      </w:r>
-      <w:r>
-        <w:rPr>
-          <w:color w:val="27343A"/>
-          <w:sz w:val="21"/>
-          <w:szCs w:val="21"/>
-        </w:rPr>
         <w:t xml:space="preserve">Digicom hỗ trợ tư vấn chọn vị trí đăng và viết bài chuẩn PR miễn phí khi đặt từ 3 đầu báo trở lên.</w:t>
-      </w:r>
-    </w:p>
-    <w:p>
-      <w:pPr>
-        <w:spacing w:after="0" w:before="140"/>
-      </w:pPr>
-      <w:r>
-        <w:rPr>
-          <w:color w:val="27343A"/>
-          <w:sz w:val="20"/>
-          <w:szCs w:val="20"/>
-        </w:rPr>
-        <w:t xml:space="preserve">Tổng giá niêm yết: </w:t>
-      </w:r>
-      <w:r>
-        <w:rPr>
-          <w:strike/>
-          <w:color w:val="9AA3AF"/>
-          <w:sz w:val="20"/>
-          <w:szCs w:val="20"/>
-        </w:rPr>
-        <w:t xml:space="preserve">53.160.000 đ</w:t>
-      </w:r>
-      <w:r>
-        <w:rPr>
-          <w:color w:val="27343A"/>
-          <w:sz w:val="20"/>
-          <w:szCs w:val="20"/>
-        </w:rPr>
-        <w:t xml:space="preserve">   →   Tổng giá ưu đãi: </w:t>
-      </w:r>
-      <w:r>
-        <w:rPr>
-          <w:b/>
-          <w:bCs/>
-          <w:color w:val="0E8C7F"/>
-          <w:sz w:val="22"/>
-          <w:szCs w:val="22"/>
-        </w:rPr>
-        <w:t xml:space="preserve">50.501.000 đ</w:t>
-      </w:r>
-      <w:r>
-        <w:rPr>
-          <w:i/>
-          <w:iCs/>
-          <w:color w:val="5A6472"/>
-          <w:sz w:val="20"/>
-          <w:szCs w:val="20"/>
-        </w:rPr>
-        <w:t xml:space="preserve">   (tiết kiệm 2.659.000 đ)</w:t>
       </w:r>
     </w:p>
     <w:p>

</xml_diff>

<commit_message>
auto: session 2026-08-10 08:43
Co-Authored-By: Claude Opus 4.8 (1M context) <noreply@anthropic.com>
</commit_message>
<xml_diff>
--- a/10-bang-gia-booking/Bao-Gia-Booking-Bao-PR-DigicomVN-2026-08-10.docx
+++ b/10-bang-gia-booking/Bao-Gia-Booking-Bao-PR-DigicomVN-2026-08-10.docx
@@ -93,10 +93,11 @@
         </w:tblBorders>
       </w:tblPr>
       <w:tblGrid>
-        <w:gridCol w:w="500"/>
-        <w:gridCol w:w="2700"/>
-        <w:gridCol w:w="4400"/>
-        <w:gridCol w:w="2000"/>
+        <w:gridCol w:w="450"/>
+        <w:gridCol w:w="2550"/>
+        <w:gridCol w:w="3000"/>
+        <w:gridCol w:w="1650"/>
+        <w:gridCol w:w="1950"/>
       </w:tblGrid>
       <w:tr>
         <w:trPr>
@@ -104,7 +105,7 @@
         </w:trPr>
         <w:tc>
           <w:tcPr>
-            <w:tcW w:type="dxa" w:w="500"/>
+            <w:tcW w:type="dxa" w:w="450"/>
             <w:shd w:fill="1C2035" w:val="clear"/>
             <w:tcMar>
               <w:top w:type="dxa" w:w="90"/>
@@ -133,7 +134,7 @@
         </w:tc>
         <w:tc>
           <w:tcPr>
-            <w:tcW w:type="dxa" w:w="2700"/>
+            <w:tcW w:type="dxa" w:w="2550"/>
             <w:shd w:fill="1C2035" w:val="clear"/>
             <w:tcMar>
               <w:top w:type="dxa" w:w="90"/>
@@ -162,7 +163,7 @@
         </w:tc>
         <w:tc>
           <w:tcPr>
-            <w:tcW w:type="dxa" w:w="4400"/>
+            <w:tcW w:type="dxa" w:w="3000"/>
             <w:shd w:fill="1C2035" w:val="clear"/>
             <w:tcMar>
               <w:top w:type="dxa" w:w="90"/>
@@ -191,7 +192,7 @@
         </w:tc>
         <w:tc>
           <w:tcPr>
-            <w:tcW w:type="dxa" w:w="2000"/>
+            <w:tcW w:type="dxa" w:w="1650"/>
             <w:shd w:fill="1C2035" w:val="clear"/>
             <w:tcMar>
               <w:top w:type="dxa" w:w="90"/>
@@ -214,7 +215,36 @@
                 <w:sz w:val="20"/>
                 <w:szCs w:val="20"/>
               </w:rPr>
-              <w:t xml:space="preserve">Giá niêm yết (VNĐ)</w:t>
+              <w:t xml:space="preserve">Giá niêm yết</w:t>
+            </w:r>
+          </w:p>
+        </w:tc>
+        <w:tc>
+          <w:tcPr>
+            <w:tcW w:type="dxa" w:w="1950"/>
+            <w:shd w:fill="1C2035" w:val="clear"/>
+            <w:tcMar>
+              <w:top w:type="dxa" w:w="90"/>
+              <w:left w:type="dxa" w:w="100"/>
+              <w:bottom w:type="dxa" w:w="90"/>
+              <w:right w:type="dxa" w:w="100"/>
+            </w:tcMar>
+            <w:vAlign w:val="center"/>
+          </w:tcPr>
+          <w:p>
+            <w:pPr>
+              <w:jc w:val="right"/>
+            </w:pPr>
+            <w:r>
+              <w:rPr>
+                <w:b/>
+                <w:bCs/>
+                <w:strike w:val="false"/>
+                <w:color w:val="FFFFFF"/>
+                <w:sz w:val="20"/>
+                <w:szCs w:val="20"/>
+              </w:rPr>
+              <w:t xml:space="preserve">Giá CK -20%</w:t>
             </w:r>
           </w:p>
         </w:tc>
@@ -222,7 +252,7 @@
       <w:tr>
         <w:tc>
           <w:tcPr>
-            <w:tcW w:type="dxa" w:w="500"/>
+            <w:tcW w:type="dxa" w:w="450"/>
             <w:shd w:fill="FFFFFF" w:val="clear"/>
             <w:tcMar>
               <w:top w:type="dxa" w:w="90"/>
@@ -251,7 +281,7 @@
         </w:tc>
         <w:tc>
           <w:tcPr>
-            <w:tcW w:type="dxa" w:w="2700"/>
+            <w:tcW w:type="dxa" w:w="2550"/>
             <w:shd w:fill="FFFFFF" w:val="clear"/>
             <w:tcMar>
               <w:top w:type="dxa" w:w="90"/>
@@ -280,7 +310,7 @@
         </w:tc>
         <w:tc>
           <w:tcPr>
-            <w:tcW w:type="dxa" w:w="4400"/>
+            <w:tcW w:type="dxa" w:w="3000"/>
             <w:shd w:fill="FFFFFF" w:val="clear"/>
             <w:tcMar>
               <w:top w:type="dxa" w:w="90"/>
@@ -309,7 +339,36 @@
         </w:tc>
         <w:tc>
           <w:tcPr>
-            <w:tcW w:type="dxa" w:w="2000"/>
+            <w:tcW w:type="dxa" w:w="1650"/>
+            <w:shd w:fill="FFFFFF" w:val="clear"/>
+            <w:tcMar>
+              <w:top w:type="dxa" w:w="90"/>
+              <w:left w:type="dxa" w:w="100"/>
+              <w:bottom w:type="dxa" w:w="90"/>
+              <w:right w:type="dxa" w:w="100"/>
+            </w:tcMar>
+            <w:vAlign w:val="center"/>
+          </w:tcPr>
+          <w:p>
+            <w:pPr>
+              <w:jc w:val="right"/>
+            </w:pPr>
+            <w:r>
+              <w:rPr>
+                <w:b w:val="false"/>
+                <w:bCs w:val="false"/>
+                <w:strike/>
+                <w:color w:val="9AA3AF"/>
+                <w:sz w:val="20"/>
+                <w:szCs w:val="20"/>
+              </w:rPr>
+              <w:t xml:space="preserve">6.000.000 đ</w:t>
+            </w:r>
+          </w:p>
+        </w:tc>
+        <w:tc>
+          <w:tcPr>
+            <w:tcW w:type="dxa" w:w="1950"/>
             <w:shd w:fill="FFFFFF" w:val="clear"/>
             <w:tcMar>
               <w:top w:type="dxa" w:w="90"/>
@@ -332,7 +391,7 @@
                 <w:sz w:val="20"/>
                 <w:szCs w:val="20"/>
               </w:rPr>
-              <w:t xml:space="preserve">6.000.000 đ</w:t>
+              <w:t xml:space="preserve">4.800.000 đ</w:t>
             </w:r>
           </w:p>
         </w:tc>
@@ -340,7 +399,7 @@
       <w:tr>
         <w:tc>
           <w:tcPr>
-            <w:tcW w:type="dxa" w:w="500"/>
+            <w:tcW w:type="dxa" w:w="450"/>
             <w:shd w:fill="F5F7FA" w:val="clear"/>
             <w:tcMar>
               <w:top w:type="dxa" w:w="90"/>
@@ -369,7 +428,7 @@
         </w:tc>
         <w:tc>
           <w:tcPr>
-            <w:tcW w:type="dxa" w:w="2700"/>
+            <w:tcW w:type="dxa" w:w="2550"/>
             <w:shd w:fill="F5F7FA" w:val="clear"/>
             <w:tcMar>
               <w:top w:type="dxa" w:w="90"/>
@@ -398,7 +457,7 @@
         </w:tc>
         <w:tc>
           <w:tcPr>
-            <w:tcW w:type="dxa" w:w="4400"/>
+            <w:tcW w:type="dxa" w:w="3000"/>
             <w:shd w:fill="F5F7FA" w:val="clear"/>
             <w:tcMar>
               <w:top w:type="dxa" w:w="90"/>
@@ -427,7 +486,36 @@
         </w:tc>
         <w:tc>
           <w:tcPr>
-            <w:tcW w:type="dxa" w:w="2000"/>
+            <w:tcW w:type="dxa" w:w="1650"/>
+            <w:shd w:fill="F5F7FA" w:val="clear"/>
+            <w:tcMar>
+              <w:top w:type="dxa" w:w="90"/>
+              <w:left w:type="dxa" w:w="100"/>
+              <w:bottom w:type="dxa" w:w="90"/>
+              <w:right w:type="dxa" w:w="100"/>
+            </w:tcMar>
+            <w:vAlign w:val="center"/>
+          </w:tcPr>
+          <w:p>
+            <w:pPr>
+              <w:jc w:val="right"/>
+            </w:pPr>
+            <w:r>
+              <w:rPr>
+                <w:b w:val="false"/>
+                <w:bCs w:val="false"/>
+                <w:strike/>
+                <w:color w:val="9AA3AF"/>
+                <w:sz w:val="20"/>
+                <w:szCs w:val="20"/>
+              </w:rPr>
+              <w:t xml:space="preserve">4.500.000 đ</w:t>
+            </w:r>
+          </w:p>
+        </w:tc>
+        <w:tc>
+          <w:tcPr>
+            <w:tcW w:type="dxa" w:w="1950"/>
             <w:shd w:fill="F5F7FA" w:val="clear"/>
             <w:tcMar>
               <w:top w:type="dxa" w:w="90"/>
@@ -450,7 +538,7 @@
                 <w:sz w:val="20"/>
                 <w:szCs w:val="20"/>
               </w:rPr>
-              <w:t xml:space="preserve">4.500.000 đ</w:t>
+              <w:t xml:space="preserve">3.600.000 đ</w:t>
             </w:r>
           </w:p>
         </w:tc>
@@ -458,7 +546,7 @@
       <w:tr>
         <w:tc>
           <w:tcPr>
-            <w:tcW w:type="dxa" w:w="500"/>
+            <w:tcW w:type="dxa" w:w="450"/>
             <w:shd w:fill="FFFFFF" w:val="clear"/>
             <w:tcMar>
               <w:top w:type="dxa" w:w="90"/>
@@ -487,7 +575,7 @@
         </w:tc>
         <w:tc>
           <w:tcPr>
-            <w:tcW w:type="dxa" w:w="2700"/>
+            <w:tcW w:type="dxa" w:w="2550"/>
             <w:shd w:fill="FFFFFF" w:val="clear"/>
             <w:tcMar>
               <w:top w:type="dxa" w:w="90"/>
@@ -516,7 +604,7 @@
         </w:tc>
         <w:tc>
           <w:tcPr>
-            <w:tcW w:type="dxa" w:w="4400"/>
+            <w:tcW w:type="dxa" w:w="3000"/>
             <w:shd w:fill="FFFFFF" w:val="clear"/>
             <w:tcMar>
               <w:top w:type="dxa" w:w="90"/>
@@ -545,7 +633,36 @@
         </w:tc>
         <w:tc>
           <w:tcPr>
-            <w:tcW w:type="dxa" w:w="2000"/>
+            <w:tcW w:type="dxa" w:w="1650"/>
+            <w:shd w:fill="FFFFFF" w:val="clear"/>
+            <w:tcMar>
+              <w:top w:type="dxa" w:w="90"/>
+              <w:left w:type="dxa" w:w="100"/>
+              <w:bottom w:type="dxa" w:w="90"/>
+              <w:right w:type="dxa" w:w="100"/>
+            </w:tcMar>
+            <w:vAlign w:val="center"/>
+          </w:tcPr>
+          <w:p>
+            <w:pPr>
+              <w:jc w:val="right"/>
+            </w:pPr>
+            <w:r>
+              <w:rPr>
+                <w:b w:val="false"/>
+                <w:bCs w:val="false"/>
+                <w:strike/>
+                <w:color w:val="9AA3AF"/>
+                <w:sz w:val="20"/>
+                <w:szCs w:val="20"/>
+              </w:rPr>
+              <w:t xml:space="preserve">3.700.000 đ</w:t>
+            </w:r>
+          </w:p>
+        </w:tc>
+        <w:tc>
+          <w:tcPr>
+            <w:tcW w:type="dxa" w:w="1950"/>
             <w:shd w:fill="FFFFFF" w:val="clear"/>
             <w:tcMar>
               <w:top w:type="dxa" w:w="90"/>
@@ -568,7 +685,7 @@
                 <w:sz w:val="20"/>
                 <w:szCs w:val="20"/>
               </w:rPr>
-              <w:t xml:space="preserve">3.700.000 đ</w:t>
+              <w:t xml:space="preserve">2.960.000 đ</w:t>
             </w:r>
           </w:p>
         </w:tc>
@@ -576,7 +693,7 @@
       <w:tr>
         <w:tc>
           <w:tcPr>
-            <w:tcW w:type="dxa" w:w="500"/>
+            <w:tcW w:type="dxa" w:w="450"/>
             <w:shd w:fill="F5F7FA" w:val="clear"/>
             <w:tcMar>
               <w:top w:type="dxa" w:w="90"/>
@@ -605,7 +722,7 @@
         </w:tc>
         <w:tc>
           <w:tcPr>
-            <w:tcW w:type="dxa" w:w="2700"/>
+            <w:tcW w:type="dxa" w:w="2550"/>
             <w:shd w:fill="F5F7FA" w:val="clear"/>
             <w:tcMar>
               <w:top w:type="dxa" w:w="90"/>
@@ -634,7 +751,7 @@
         </w:tc>
         <w:tc>
           <w:tcPr>
-            <w:tcW w:type="dxa" w:w="4400"/>
+            <w:tcW w:type="dxa" w:w="3000"/>
             <w:shd w:fill="F5F7FA" w:val="clear"/>
             <w:tcMar>
               <w:top w:type="dxa" w:w="90"/>
@@ -663,7 +780,36 @@
         </w:tc>
         <w:tc>
           <w:tcPr>
-            <w:tcW w:type="dxa" w:w="2000"/>
+            <w:tcW w:type="dxa" w:w="1650"/>
+            <w:shd w:fill="F5F7FA" w:val="clear"/>
+            <w:tcMar>
+              <w:top w:type="dxa" w:w="90"/>
+              <w:left w:type="dxa" w:w="100"/>
+              <w:bottom w:type="dxa" w:w="90"/>
+              <w:right w:type="dxa" w:w="100"/>
+            </w:tcMar>
+            <w:vAlign w:val="center"/>
+          </w:tcPr>
+          <w:p>
+            <w:pPr>
+              <w:jc w:val="right"/>
+            </w:pPr>
+            <w:r>
+              <w:rPr>
+                <w:b w:val="false"/>
+                <w:bCs w:val="false"/>
+                <w:strike/>
+                <w:color w:val="9AA3AF"/>
+                <w:sz w:val="20"/>
+                <w:szCs w:val="20"/>
+              </w:rPr>
+              <w:t xml:space="preserve">5.400.000 đ</w:t>
+            </w:r>
+          </w:p>
+        </w:tc>
+        <w:tc>
+          <w:tcPr>
+            <w:tcW w:type="dxa" w:w="1950"/>
             <w:shd w:fill="F5F7FA" w:val="clear"/>
             <w:tcMar>
               <w:top w:type="dxa" w:w="90"/>
@@ -686,7 +832,7 @@
                 <w:sz w:val="20"/>
                 <w:szCs w:val="20"/>
               </w:rPr>
-              <w:t xml:space="preserve">5.400.000 đ</w:t>
+              <w:t xml:space="preserve">4.320.000 đ</w:t>
             </w:r>
           </w:p>
         </w:tc>
@@ -694,7 +840,7 @@
       <w:tr>
         <w:tc>
           <w:tcPr>
-            <w:tcW w:type="dxa" w:w="500"/>
+            <w:tcW w:type="dxa" w:w="450"/>
             <w:shd w:fill="FFFFFF" w:val="clear"/>
             <w:tcMar>
               <w:top w:type="dxa" w:w="90"/>
@@ -723,7 +869,7 @@
         </w:tc>
         <w:tc>
           <w:tcPr>
-            <w:tcW w:type="dxa" w:w="2700"/>
+            <w:tcW w:type="dxa" w:w="2550"/>
             <w:shd w:fill="FFFFFF" w:val="clear"/>
             <w:tcMar>
               <w:top w:type="dxa" w:w="90"/>
@@ -752,7 +898,7 @@
         </w:tc>
         <w:tc>
           <w:tcPr>
-            <w:tcW w:type="dxa" w:w="4400"/>
+            <w:tcW w:type="dxa" w:w="3000"/>
             <w:shd w:fill="FFFFFF" w:val="clear"/>
             <w:tcMar>
               <w:top w:type="dxa" w:w="90"/>
@@ -781,7 +927,36 @@
         </w:tc>
         <w:tc>
           <w:tcPr>
-            <w:tcW w:type="dxa" w:w="2000"/>
+            <w:tcW w:type="dxa" w:w="1650"/>
+            <w:shd w:fill="FFFFFF" w:val="clear"/>
+            <w:tcMar>
+              <w:top w:type="dxa" w:w="90"/>
+              <w:left w:type="dxa" w:w="100"/>
+              <w:bottom w:type="dxa" w:w="90"/>
+              <w:right w:type="dxa" w:w="100"/>
+            </w:tcMar>
+            <w:vAlign w:val="center"/>
+          </w:tcPr>
+          <w:p>
+            <w:pPr>
+              <w:jc w:val="right"/>
+            </w:pPr>
+            <w:r>
+              <w:rPr>
+                <w:b w:val="false"/>
+                <w:bCs w:val="false"/>
+                <w:strike/>
+                <w:color w:val="9AA3AF"/>
+                <w:sz w:val="20"/>
+                <w:szCs w:val="20"/>
+              </w:rPr>
+              <w:t xml:space="preserve">4.500.000 đ</w:t>
+            </w:r>
+          </w:p>
+        </w:tc>
+        <w:tc>
+          <w:tcPr>
+            <w:tcW w:type="dxa" w:w="1950"/>
             <w:shd w:fill="FFFFFF" w:val="clear"/>
             <w:tcMar>
               <w:top w:type="dxa" w:w="90"/>
@@ -804,7 +979,7 @@
                 <w:sz w:val="20"/>
                 <w:szCs w:val="20"/>
               </w:rPr>
-              <w:t xml:space="preserve">4.500.000 đ</w:t>
+              <w:t xml:space="preserve">3.600.000 đ</w:t>
             </w:r>
           </w:p>
         </w:tc>
@@ -812,7 +987,7 @@
       <w:tr>
         <w:tc>
           <w:tcPr>
-            <w:tcW w:type="dxa" w:w="500"/>
+            <w:tcW w:type="dxa" w:w="450"/>
             <w:shd w:fill="F5F7FA" w:val="clear"/>
             <w:tcMar>
               <w:top w:type="dxa" w:w="90"/>
@@ -841,7 +1016,7 @@
         </w:tc>
         <w:tc>
           <w:tcPr>
-            <w:tcW w:type="dxa" w:w="2700"/>
+            <w:tcW w:type="dxa" w:w="2550"/>
             <w:shd w:fill="F5F7FA" w:val="clear"/>
             <w:tcMar>
               <w:top w:type="dxa" w:w="90"/>
@@ -870,7 +1045,7 @@
         </w:tc>
         <w:tc>
           <w:tcPr>
-            <w:tcW w:type="dxa" w:w="4400"/>
+            <w:tcW w:type="dxa" w:w="3000"/>
             <w:shd w:fill="F5F7FA" w:val="clear"/>
             <w:tcMar>
               <w:top w:type="dxa" w:w="90"/>
@@ -899,7 +1074,36 @@
         </w:tc>
         <w:tc>
           <w:tcPr>
-            <w:tcW w:type="dxa" w:w="2000"/>
+            <w:tcW w:type="dxa" w:w="1650"/>
+            <w:shd w:fill="F5F7FA" w:val="clear"/>
+            <w:tcMar>
+              <w:top w:type="dxa" w:w="90"/>
+              <w:left w:type="dxa" w:w="100"/>
+              <w:bottom w:type="dxa" w:w="90"/>
+              <w:right w:type="dxa" w:w="100"/>
+            </w:tcMar>
+            <w:vAlign w:val="center"/>
+          </w:tcPr>
+          <w:p>
+            <w:pPr>
+              <w:jc w:val="right"/>
+            </w:pPr>
+            <w:r>
+              <w:rPr>
+                <w:b w:val="false"/>
+                <w:bCs w:val="false"/>
+                <w:strike/>
+                <w:color w:val="9AA3AF"/>
+                <w:sz w:val="20"/>
+                <w:szCs w:val="20"/>
+              </w:rPr>
+              <w:t xml:space="preserve">4.600.000 đ</w:t>
+            </w:r>
+          </w:p>
+        </w:tc>
+        <w:tc>
+          <w:tcPr>
+            <w:tcW w:type="dxa" w:w="1950"/>
             <w:shd w:fill="F5F7FA" w:val="clear"/>
             <w:tcMar>
               <w:top w:type="dxa" w:w="90"/>
@@ -922,7 +1126,7 @@
                 <w:sz w:val="20"/>
                 <w:szCs w:val="20"/>
               </w:rPr>
-              <w:t xml:space="preserve">4.600.000 đ</w:t>
+              <w:t xml:space="preserve">3.680.000 đ</w:t>
             </w:r>
           </w:p>
         </w:tc>
@@ -930,7 +1134,7 @@
       <w:tr>
         <w:tc>
           <w:tcPr>
-            <w:tcW w:type="dxa" w:w="500"/>
+            <w:tcW w:type="dxa" w:w="450"/>
             <w:shd w:fill="FFFFFF" w:val="clear"/>
             <w:tcMar>
               <w:top w:type="dxa" w:w="90"/>
@@ -959,7 +1163,7 @@
         </w:tc>
         <w:tc>
           <w:tcPr>
-            <w:tcW w:type="dxa" w:w="2700"/>
+            <w:tcW w:type="dxa" w:w="2550"/>
             <w:shd w:fill="FFFFFF" w:val="clear"/>
             <w:tcMar>
               <w:top w:type="dxa" w:w="90"/>
@@ -988,7 +1192,7 @@
         </w:tc>
         <w:tc>
           <w:tcPr>
-            <w:tcW w:type="dxa" w:w="4400"/>
+            <w:tcW w:type="dxa" w:w="3000"/>
             <w:shd w:fill="FFFFFF" w:val="clear"/>
             <w:tcMar>
               <w:top w:type="dxa" w:w="90"/>
@@ -1017,7 +1221,36 @@
         </w:tc>
         <w:tc>
           <w:tcPr>
-            <w:tcW w:type="dxa" w:w="2000"/>
+            <w:tcW w:type="dxa" w:w="1650"/>
+            <w:shd w:fill="FFFFFF" w:val="clear"/>
+            <w:tcMar>
+              <w:top w:type="dxa" w:w="90"/>
+              <w:left w:type="dxa" w:w="100"/>
+              <w:bottom w:type="dxa" w:w="90"/>
+              <w:right w:type="dxa" w:w="100"/>
+            </w:tcMar>
+            <w:vAlign w:val="center"/>
+          </w:tcPr>
+          <w:p>
+            <w:pPr>
+              <w:jc w:val="right"/>
+            </w:pPr>
+            <w:r>
+              <w:rPr>
+                <w:b w:val="false"/>
+                <w:bCs w:val="false"/>
+                <w:strike/>
+                <w:color w:val="9AA3AF"/>
+                <w:sz w:val="20"/>
+                <w:szCs w:val="20"/>
+              </w:rPr>
+              <w:t xml:space="preserve">4.500.000 đ</w:t>
+            </w:r>
+          </w:p>
+        </w:tc>
+        <w:tc>
+          <w:tcPr>
+            <w:tcW w:type="dxa" w:w="1950"/>
             <w:shd w:fill="FFFFFF" w:val="clear"/>
             <w:tcMar>
               <w:top w:type="dxa" w:w="90"/>
@@ -1040,7 +1273,7 @@
                 <w:sz w:val="20"/>
                 <w:szCs w:val="20"/>
               </w:rPr>
-              <w:t xml:space="preserve">4.500.000 đ</w:t>
+              <w:t xml:space="preserve">3.600.000 đ</w:t>
             </w:r>
           </w:p>
         </w:tc>
@@ -1048,7 +1281,7 @@
       <w:tr>
         <w:tc>
           <w:tcPr>
-            <w:tcW w:type="dxa" w:w="500"/>
+            <w:tcW w:type="dxa" w:w="450"/>
             <w:shd w:fill="F5F7FA" w:val="clear"/>
             <w:tcMar>
               <w:top w:type="dxa" w:w="90"/>
@@ -1077,7 +1310,7 @@
         </w:tc>
         <w:tc>
           <w:tcPr>
-            <w:tcW w:type="dxa" w:w="2700"/>
+            <w:tcW w:type="dxa" w:w="2550"/>
             <w:shd w:fill="F5F7FA" w:val="clear"/>
             <w:tcMar>
               <w:top w:type="dxa" w:w="90"/>
@@ -1106,7 +1339,7 @@
         </w:tc>
         <w:tc>
           <w:tcPr>
-            <w:tcW w:type="dxa" w:w="4400"/>
+            <w:tcW w:type="dxa" w:w="3000"/>
             <w:shd w:fill="F5F7FA" w:val="clear"/>
             <w:tcMar>
               <w:top w:type="dxa" w:w="90"/>
@@ -1135,7 +1368,36 @@
         </w:tc>
         <w:tc>
           <w:tcPr>
-            <w:tcW w:type="dxa" w:w="2000"/>
+            <w:tcW w:type="dxa" w:w="1650"/>
+            <w:shd w:fill="F5F7FA" w:val="clear"/>
+            <w:tcMar>
+              <w:top w:type="dxa" w:w="90"/>
+              <w:left w:type="dxa" w:w="100"/>
+              <w:bottom w:type="dxa" w:w="90"/>
+              <w:right w:type="dxa" w:w="100"/>
+            </w:tcMar>
+            <w:vAlign w:val="center"/>
+          </w:tcPr>
+          <w:p>
+            <w:pPr>
+              <w:jc w:val="right"/>
+            </w:pPr>
+            <w:r>
+              <w:rPr>
+                <w:b w:val="false"/>
+                <w:bCs w:val="false"/>
+                <w:strike/>
+                <w:color w:val="9AA3AF"/>
+                <w:sz w:val="20"/>
+                <w:szCs w:val="20"/>
+              </w:rPr>
+              <w:t xml:space="preserve">2.000.000 đ</w:t>
+            </w:r>
+          </w:p>
+        </w:tc>
+        <w:tc>
+          <w:tcPr>
+            <w:tcW w:type="dxa" w:w="1950"/>
             <w:shd w:fill="F5F7FA" w:val="clear"/>
             <w:tcMar>
               <w:top w:type="dxa" w:w="90"/>
@@ -1158,7 +1420,7 @@
                 <w:sz w:val="20"/>
                 <w:szCs w:val="20"/>
               </w:rPr>
-              <w:t xml:space="preserve">2.000.000 đ</w:t>
+              <w:t xml:space="preserve">1.600.000 đ</w:t>
             </w:r>
           </w:p>
         </w:tc>
@@ -1166,7 +1428,7 @@
       <w:tr>
         <w:tc>
           <w:tcPr>
-            <w:tcW w:type="dxa" w:w="500"/>
+            <w:tcW w:type="dxa" w:w="450"/>
             <w:shd w:fill="FFFFFF" w:val="clear"/>
             <w:tcMar>
               <w:top w:type="dxa" w:w="90"/>
@@ -1195,7 +1457,7 @@
         </w:tc>
         <w:tc>
           <w:tcPr>
-            <w:tcW w:type="dxa" w:w="2700"/>
+            <w:tcW w:type="dxa" w:w="2550"/>
             <w:shd w:fill="FFFFFF" w:val="clear"/>
             <w:tcMar>
               <w:top w:type="dxa" w:w="90"/>
@@ -1224,7 +1486,7 @@
         </w:tc>
         <w:tc>
           <w:tcPr>
-            <w:tcW w:type="dxa" w:w="4400"/>
+            <w:tcW w:type="dxa" w:w="3000"/>
             <w:shd w:fill="FFFFFF" w:val="clear"/>
             <w:tcMar>
               <w:top w:type="dxa" w:w="90"/>
@@ -1253,7 +1515,36 @@
         </w:tc>
         <w:tc>
           <w:tcPr>
-            <w:tcW w:type="dxa" w:w="2000"/>
+            <w:tcW w:type="dxa" w:w="1650"/>
+            <w:shd w:fill="FFFFFF" w:val="clear"/>
+            <w:tcMar>
+              <w:top w:type="dxa" w:w="90"/>
+              <w:left w:type="dxa" w:w="100"/>
+              <w:bottom w:type="dxa" w:w="90"/>
+              <w:right w:type="dxa" w:w="100"/>
+            </w:tcMar>
+            <w:vAlign w:val="center"/>
+          </w:tcPr>
+          <w:p>
+            <w:pPr>
+              <w:jc w:val="right"/>
+            </w:pPr>
+            <w:r>
+              <w:rPr>
+                <w:b w:val="false"/>
+                <w:bCs w:val="false"/>
+                <w:strike/>
+                <w:color w:val="9AA3AF"/>
+                <w:sz w:val="20"/>
+                <w:szCs w:val="20"/>
+              </w:rPr>
+              <w:t xml:space="preserve">2.900.000 đ</w:t>
+            </w:r>
+          </w:p>
+        </w:tc>
+        <w:tc>
+          <w:tcPr>
+            <w:tcW w:type="dxa" w:w="1950"/>
             <w:shd w:fill="FFFFFF" w:val="clear"/>
             <w:tcMar>
               <w:top w:type="dxa" w:w="90"/>
@@ -1276,7 +1567,7 @@
                 <w:sz w:val="20"/>
                 <w:szCs w:val="20"/>
               </w:rPr>
-              <w:t xml:space="preserve">2.900.000 đ</w:t>
+              <w:t xml:space="preserve">2.320.000 đ</w:t>
             </w:r>
           </w:p>
         </w:tc>
@@ -1284,7 +1575,7 @@
       <w:tr>
         <w:tc>
           <w:tcPr>
-            <w:tcW w:type="dxa" w:w="500"/>
+            <w:tcW w:type="dxa" w:w="450"/>
             <w:shd w:fill="F5F7FA" w:val="clear"/>
             <w:tcMar>
               <w:top w:type="dxa" w:w="90"/>
@@ -1313,7 +1604,7 @@
         </w:tc>
         <w:tc>
           <w:tcPr>
-            <w:tcW w:type="dxa" w:w="2700"/>
+            <w:tcW w:type="dxa" w:w="2550"/>
             <w:shd w:fill="F5F7FA" w:val="clear"/>
             <w:tcMar>
               <w:top w:type="dxa" w:w="90"/>
@@ -1342,7 +1633,7 @@
         </w:tc>
         <w:tc>
           <w:tcPr>
-            <w:tcW w:type="dxa" w:w="4400"/>
+            <w:tcW w:type="dxa" w:w="3000"/>
             <w:shd w:fill="F5F7FA" w:val="clear"/>
             <w:tcMar>
               <w:top w:type="dxa" w:w="90"/>
@@ -1371,7 +1662,36 @@
         </w:tc>
         <w:tc>
           <w:tcPr>
-            <w:tcW w:type="dxa" w:w="2000"/>
+            <w:tcW w:type="dxa" w:w="1650"/>
+            <w:shd w:fill="F5F7FA" w:val="clear"/>
+            <w:tcMar>
+              <w:top w:type="dxa" w:w="90"/>
+              <w:left w:type="dxa" w:w="100"/>
+              <w:bottom w:type="dxa" w:w="90"/>
+              <w:right w:type="dxa" w:w="100"/>
+            </w:tcMar>
+            <w:vAlign w:val="center"/>
+          </w:tcPr>
+          <w:p>
+            <w:pPr>
+              <w:jc w:val="right"/>
+            </w:pPr>
+            <w:r>
+              <w:rPr>
+                <w:b w:val="false"/>
+                <w:bCs w:val="false"/>
+                <w:strike/>
+                <w:color w:val="9AA3AF"/>
+                <w:sz w:val="20"/>
+                <w:szCs w:val="20"/>
+              </w:rPr>
+              <w:t xml:space="preserve">2.900.000 đ</w:t>
+            </w:r>
+          </w:p>
+        </w:tc>
+        <w:tc>
+          <w:tcPr>
+            <w:tcW w:type="dxa" w:w="1950"/>
             <w:shd w:fill="F5F7FA" w:val="clear"/>
             <w:tcMar>
               <w:top w:type="dxa" w:w="90"/>
@@ -1394,7 +1714,7 @@
                 <w:sz w:val="20"/>
                 <w:szCs w:val="20"/>
               </w:rPr>
-              <w:t xml:space="preserve">2.900.000 đ</w:t>
+              <w:t xml:space="preserve">2.320.000 đ</w:t>
             </w:r>
           </w:p>
         </w:tc>
@@ -1402,7 +1722,7 @@
       <w:tr>
         <w:tc>
           <w:tcPr>
-            <w:tcW w:type="dxa" w:w="500"/>
+            <w:tcW w:type="dxa" w:w="450"/>
             <w:shd w:fill="FFFFFF" w:val="clear"/>
             <w:tcMar>
               <w:top w:type="dxa" w:w="90"/>
@@ -1431,7 +1751,7 @@
         </w:tc>
         <w:tc>
           <w:tcPr>
-            <w:tcW w:type="dxa" w:w="2700"/>
+            <w:tcW w:type="dxa" w:w="2550"/>
             <w:shd w:fill="FFFFFF" w:val="clear"/>
             <w:tcMar>
               <w:top w:type="dxa" w:w="90"/>
@@ -1460,7 +1780,7 @@
         </w:tc>
         <w:tc>
           <w:tcPr>
-            <w:tcW w:type="dxa" w:w="4400"/>
+            <w:tcW w:type="dxa" w:w="3000"/>
             <w:shd w:fill="FFFFFF" w:val="clear"/>
             <w:tcMar>
               <w:top w:type="dxa" w:w="90"/>
@@ -1489,7 +1809,36 @@
         </w:tc>
         <w:tc>
           <w:tcPr>
-            <w:tcW w:type="dxa" w:w="2000"/>
+            <w:tcW w:type="dxa" w:w="1650"/>
+            <w:shd w:fill="FFFFFF" w:val="clear"/>
+            <w:tcMar>
+              <w:top w:type="dxa" w:w="90"/>
+              <w:left w:type="dxa" w:w="100"/>
+              <w:bottom w:type="dxa" w:w="90"/>
+              <w:right w:type="dxa" w:w="100"/>
+            </w:tcMar>
+            <w:vAlign w:val="center"/>
+          </w:tcPr>
+          <w:p>
+            <w:pPr>
+              <w:jc w:val="right"/>
+            </w:pPr>
+            <w:r>
+              <w:rPr>
+                <w:b w:val="false"/>
+                <w:bCs w:val="false"/>
+                <w:strike/>
+                <w:color w:val="9AA3AF"/>
+                <w:sz w:val="20"/>
+                <w:szCs w:val="20"/>
+              </w:rPr>
+              <w:t xml:space="preserve">3.200.000 đ</w:t>
+            </w:r>
+          </w:p>
+        </w:tc>
+        <w:tc>
+          <w:tcPr>
+            <w:tcW w:type="dxa" w:w="1950"/>
             <w:shd w:fill="FFFFFF" w:val="clear"/>
             <w:tcMar>
               <w:top w:type="dxa" w:w="90"/>
@@ -1512,7 +1861,7 @@
                 <w:sz w:val="20"/>
                 <w:szCs w:val="20"/>
               </w:rPr>
-              <w:t xml:space="preserve">3.200.000 đ</w:t>
+              <w:t xml:space="preserve">2.560.000 đ</w:t>
             </w:r>
           </w:p>
         </w:tc>
@@ -1520,7 +1869,7 @@
       <w:tr>
         <w:tc>
           <w:tcPr>
-            <w:tcW w:type="dxa" w:w="500"/>
+            <w:tcW w:type="dxa" w:w="450"/>
             <w:shd w:fill="F5F7FA" w:val="clear"/>
             <w:tcMar>
               <w:top w:type="dxa" w:w="90"/>
@@ -1549,7 +1898,7 @@
         </w:tc>
         <w:tc>
           <w:tcPr>
-            <w:tcW w:type="dxa" w:w="2700"/>
+            <w:tcW w:type="dxa" w:w="2550"/>
             <w:shd w:fill="F5F7FA" w:val="clear"/>
             <w:tcMar>
               <w:top w:type="dxa" w:w="90"/>
@@ -1578,7 +1927,7 @@
         </w:tc>
         <w:tc>
           <w:tcPr>
-            <w:tcW w:type="dxa" w:w="4400"/>
+            <w:tcW w:type="dxa" w:w="3000"/>
             <w:shd w:fill="F5F7FA" w:val="clear"/>
             <w:tcMar>
               <w:top w:type="dxa" w:w="90"/>
@@ -1607,7 +1956,36 @@
         </w:tc>
         <w:tc>
           <w:tcPr>
-            <w:tcW w:type="dxa" w:w="2000"/>
+            <w:tcW w:type="dxa" w:w="1650"/>
+            <w:shd w:fill="F5F7FA" w:val="clear"/>
+            <w:tcMar>
+              <w:top w:type="dxa" w:w="90"/>
+              <w:left w:type="dxa" w:w="100"/>
+              <w:bottom w:type="dxa" w:w="90"/>
+              <w:right w:type="dxa" w:w="100"/>
+            </w:tcMar>
+            <w:vAlign w:val="center"/>
+          </w:tcPr>
+          <w:p>
+            <w:pPr>
+              <w:jc w:val="right"/>
+            </w:pPr>
+            <w:r>
+              <w:rPr>
+                <w:b w:val="false"/>
+                <w:bCs w:val="false"/>
+                <w:strike/>
+                <w:color w:val="9AA3AF"/>
+                <w:sz w:val="20"/>
+                <w:szCs w:val="20"/>
+              </w:rPr>
+              <w:t xml:space="preserve">3.110.000 đ</w:t>
+            </w:r>
+          </w:p>
+        </w:tc>
+        <w:tc>
+          <w:tcPr>
+            <w:tcW w:type="dxa" w:w="1950"/>
             <w:shd w:fill="F5F7FA" w:val="clear"/>
             <w:tcMar>
               <w:top w:type="dxa" w:w="90"/>
@@ -1630,7 +2008,7 @@
                 <w:sz w:val="20"/>
                 <w:szCs w:val="20"/>
               </w:rPr>
-              <w:t xml:space="preserve">3.110.000 đ</w:t>
+              <w:t xml:space="preserve">2.488.000 đ</w:t>
             </w:r>
           </w:p>
         </w:tc>
@@ -1638,7 +2016,7 @@
       <w:tr>
         <w:tc>
           <w:tcPr>
-            <w:tcW w:type="dxa" w:w="500"/>
+            <w:tcW w:type="dxa" w:w="450"/>
             <w:shd w:fill="FFFFFF" w:val="clear"/>
             <w:tcMar>
               <w:top w:type="dxa" w:w="90"/>
@@ -1667,7 +2045,7 @@
         </w:tc>
         <w:tc>
           <w:tcPr>
-            <w:tcW w:type="dxa" w:w="2700"/>
+            <w:tcW w:type="dxa" w:w="2550"/>
             <w:shd w:fill="FFFFFF" w:val="clear"/>
             <w:tcMar>
               <w:top w:type="dxa" w:w="90"/>
@@ -1696,7 +2074,7 @@
         </w:tc>
         <w:tc>
           <w:tcPr>
-            <w:tcW w:type="dxa" w:w="4400"/>
+            <w:tcW w:type="dxa" w:w="3000"/>
             <w:shd w:fill="FFFFFF" w:val="clear"/>
             <w:tcMar>
               <w:top w:type="dxa" w:w="90"/>
@@ -1725,7 +2103,36 @@
         </w:tc>
         <w:tc>
           <w:tcPr>
-            <w:tcW w:type="dxa" w:w="2000"/>
+            <w:tcW w:type="dxa" w:w="1650"/>
+            <w:shd w:fill="FFFFFF" w:val="clear"/>
+            <w:tcMar>
+              <w:top w:type="dxa" w:w="90"/>
+              <w:left w:type="dxa" w:w="100"/>
+              <w:bottom w:type="dxa" w:w="90"/>
+              <w:right w:type="dxa" w:w="100"/>
+            </w:tcMar>
+            <w:vAlign w:val="center"/>
+          </w:tcPr>
+          <w:p>
+            <w:pPr>
+              <w:jc w:val="right"/>
+            </w:pPr>
+            <w:r>
+              <w:rPr>
+                <w:b w:val="false"/>
+                <w:bCs w:val="false"/>
+                <w:strike/>
+                <w:color w:val="9AA3AF"/>
+                <w:sz w:val="20"/>
+                <w:szCs w:val="20"/>
+              </w:rPr>
+              <w:t xml:space="preserve">3.150.000 đ</w:t>
+            </w:r>
+          </w:p>
+        </w:tc>
+        <w:tc>
+          <w:tcPr>
+            <w:tcW w:type="dxa" w:w="1950"/>
             <w:shd w:fill="FFFFFF" w:val="clear"/>
             <w:tcMar>
               <w:top w:type="dxa" w:w="90"/>
@@ -1748,7 +2155,7 @@
                 <w:sz w:val="20"/>
                 <w:szCs w:val="20"/>
               </w:rPr>
-              <w:t xml:space="preserve">3.150.000 đ</w:t>
+              <w:t xml:space="preserve">2.520.000 đ</w:t>
             </w:r>
           </w:p>
         </w:tc>
@@ -1756,7 +2163,7 @@
       <w:tr>
         <w:tc>
           <w:tcPr>
-            <w:tcW w:type="dxa" w:w="500"/>
+            <w:tcW w:type="dxa" w:w="450"/>
             <w:shd w:fill="F5F7FA" w:val="clear"/>
             <w:tcMar>
               <w:top w:type="dxa" w:w="90"/>
@@ -1785,7 +2192,7 @@
         </w:tc>
         <w:tc>
           <w:tcPr>
-            <w:tcW w:type="dxa" w:w="2700"/>
+            <w:tcW w:type="dxa" w:w="2550"/>
             <w:shd w:fill="F5F7FA" w:val="clear"/>
             <w:tcMar>
               <w:top w:type="dxa" w:w="90"/>
@@ -1814,7 +2221,7 @@
         </w:tc>
         <w:tc>
           <w:tcPr>
-            <w:tcW w:type="dxa" w:w="4400"/>
+            <w:tcW w:type="dxa" w:w="3000"/>
             <w:shd w:fill="F5F7FA" w:val="clear"/>
             <w:tcMar>
               <w:top w:type="dxa" w:w="90"/>
@@ -1843,7 +2250,36 @@
         </w:tc>
         <w:tc>
           <w:tcPr>
-            <w:tcW w:type="dxa" w:w="2000"/>
+            <w:tcW w:type="dxa" w:w="1650"/>
+            <w:shd w:fill="F5F7FA" w:val="clear"/>
+            <w:tcMar>
+              <w:top w:type="dxa" w:w="90"/>
+              <w:left w:type="dxa" w:w="100"/>
+              <w:bottom w:type="dxa" w:w="90"/>
+              <w:right w:type="dxa" w:w="100"/>
+            </w:tcMar>
+            <w:vAlign w:val="center"/>
+          </w:tcPr>
+          <w:p>
+            <w:pPr>
+              <w:jc w:val="right"/>
+            </w:pPr>
+            <w:r>
+              <w:rPr>
+                <w:b w:val="false"/>
+                <w:bCs w:val="false"/>
+                <w:strike/>
+                <w:color w:val="9AA3AF"/>
+                <w:sz w:val="20"/>
+                <w:szCs w:val="20"/>
+              </w:rPr>
+              <w:t xml:space="preserve">2.700.000 đ</w:t>
+            </w:r>
+          </w:p>
+        </w:tc>
+        <w:tc>
+          <w:tcPr>
+            <w:tcW w:type="dxa" w:w="1950"/>
             <w:shd w:fill="F5F7FA" w:val="clear"/>
             <w:tcMar>
               <w:top w:type="dxa" w:w="90"/>
@@ -1866,7 +2302,7 @@
                 <w:sz w:val="20"/>
                 <w:szCs w:val="20"/>
               </w:rPr>
-              <w:t xml:space="preserve">2.700.000 đ</w:t>
+              <w:t xml:space="preserve">2.160.000 đ</w:t>
             </w:r>
           </w:p>
         </w:tc>
@@ -1901,7 +2337,7 @@
           <w:sz w:val="20"/>
           <w:szCs w:val="20"/>
         </w:rPr>
-        <w:t xml:space="preserve">Đặt càng nhiều đầu báo trong cùng 1 đơn, chiết khấu càng cao - áp dụng trực tiếp trên tổng giá niêm yết (tổng 53.160.000 đ cho trọn bộ 14 đầu báo).</w:t>
+        <w:t xml:space="preserve">Giá "CK -20%" trong bảng trên là mức chiết khấu tối thiểu cho mỗi báo lẻ. Đặt càng nhiều đầu báo trong cùng 1 đơn, chiết khấu áp trên TỔNG đơn càng cao (tổng giá niêm yết 53.160.000 đ cho trọn bộ 14 đầu báo):</w:t>
       </w:r>
     </w:p>
     <w:tbl>

</xml_diff>

<commit_message>
auto: session 2026-08-10 08:48
Co-Authored-By: Claude Opus 4.8 (1M context) <noreply@anthropic.com>
</commit_message>
<xml_diff>
--- a/10-bang-gia-booking/Bao-Gia-Booking-Bao-PR-DigicomVN-2026-08-10.docx
+++ b/10-bang-gia-booking/Bao-Gia-Booking-Bao-PR-DigicomVN-2026-08-10.docx
@@ -94,10 +94,11 @@
       </w:tblPr>
       <w:tblGrid>
         <w:gridCol w:w="450"/>
-        <w:gridCol w:w="2550"/>
-        <w:gridCol w:w="3000"/>
-        <w:gridCol w:w="1650"/>
-        <w:gridCol w:w="1950"/>
+        <w:gridCol w:w="2450"/>
+        <w:gridCol w:w="2650"/>
+        <w:gridCol w:w="1550"/>
+        <w:gridCol w:w="700"/>
+        <w:gridCol w:w="1800"/>
       </w:tblGrid>
       <w:tr>
         <w:trPr>
@@ -134,7 +135,7 @@
         </w:tc>
         <w:tc>
           <w:tcPr>
-            <w:tcW w:type="dxa" w:w="2550"/>
+            <w:tcW w:type="dxa" w:w="2450"/>
             <w:shd w:fill="1C2035" w:val="clear"/>
             <w:tcMar>
               <w:top w:type="dxa" w:w="90"/>
@@ -163,7 +164,7 @@
         </w:tc>
         <w:tc>
           <w:tcPr>
-            <w:tcW w:type="dxa" w:w="3000"/>
+            <w:tcW w:type="dxa" w:w="2650"/>
             <w:shd w:fill="1C2035" w:val="clear"/>
             <w:tcMar>
               <w:top w:type="dxa" w:w="90"/>
@@ -192,7 +193,7 @@
         </w:tc>
         <w:tc>
           <w:tcPr>
-            <w:tcW w:type="dxa" w:w="1650"/>
+            <w:tcW w:type="dxa" w:w="1550"/>
             <w:shd w:fill="1C2035" w:val="clear"/>
             <w:tcMar>
               <w:top w:type="dxa" w:w="90"/>
@@ -221,7 +222,7 @@
         </w:tc>
         <w:tc>
           <w:tcPr>
-            <w:tcW w:type="dxa" w:w="1950"/>
+            <w:tcW w:type="dxa" w:w="700"/>
             <w:shd w:fill="1C2035" w:val="clear"/>
             <w:tcMar>
               <w:top w:type="dxa" w:w="90"/>
@@ -233,6 +234,35 @@
           </w:tcPr>
           <w:p>
             <w:pPr>
+              <w:jc w:val="center"/>
+            </w:pPr>
+            <w:r>
+              <w:rPr>
+                <w:b/>
+                <w:bCs/>
+                <w:strike w:val="false"/>
+                <w:color w:val="FFFFFF"/>
+                <w:sz w:val="20"/>
+                <w:szCs w:val="20"/>
+              </w:rPr>
+              <w:t xml:space="preserve">CK</w:t>
+            </w:r>
+          </w:p>
+        </w:tc>
+        <w:tc>
+          <w:tcPr>
+            <w:tcW w:type="dxa" w:w="1800"/>
+            <w:shd w:fill="1C2035" w:val="clear"/>
+            <w:tcMar>
+              <w:top w:type="dxa" w:w="90"/>
+              <w:left w:type="dxa" w:w="100"/>
+              <w:bottom w:type="dxa" w:w="90"/>
+              <w:right w:type="dxa" w:w="100"/>
+            </w:tcMar>
+            <w:vAlign w:val="center"/>
+          </w:tcPr>
+          <w:p>
+            <w:pPr>
               <w:jc w:val="right"/>
             </w:pPr>
             <w:r>
@@ -244,7 +274,7 @@
                 <w:sz w:val="20"/>
                 <w:szCs w:val="20"/>
               </w:rPr>
-              <w:t xml:space="preserve">Giá CK -20%</w:t>
+              <w:t xml:space="preserve">Giá sau CK</w:t>
             </w:r>
           </w:p>
         </w:tc>
@@ -281,7 +311,7 @@
         </w:tc>
         <w:tc>
           <w:tcPr>
-            <w:tcW w:type="dxa" w:w="2550"/>
+            <w:tcW w:type="dxa" w:w="2450"/>
             <w:shd w:fill="FFFFFF" w:val="clear"/>
             <w:tcMar>
               <w:top w:type="dxa" w:w="90"/>
@@ -310,7 +340,7 @@
         </w:tc>
         <w:tc>
           <w:tcPr>
-            <w:tcW w:type="dxa" w:w="3000"/>
+            <w:tcW w:type="dxa" w:w="2650"/>
             <w:shd w:fill="FFFFFF" w:val="clear"/>
             <w:tcMar>
               <w:top w:type="dxa" w:w="90"/>
@@ -339,7 +369,7 @@
         </w:tc>
         <w:tc>
           <w:tcPr>
-            <w:tcW w:type="dxa" w:w="1650"/>
+            <w:tcW w:type="dxa" w:w="1550"/>
             <w:shd w:fill="FFFFFF" w:val="clear"/>
             <w:tcMar>
               <w:top w:type="dxa" w:w="90"/>
@@ -368,7 +398,36 @@
         </w:tc>
         <w:tc>
           <w:tcPr>
-            <w:tcW w:type="dxa" w:w="1950"/>
+            <w:tcW w:type="dxa" w:w="700"/>
+            <w:shd w:fill="FFFFFF" w:val="clear"/>
+            <w:tcMar>
+              <w:top w:type="dxa" w:w="90"/>
+              <w:left w:type="dxa" w:w="100"/>
+              <w:bottom w:type="dxa" w:w="90"/>
+              <w:right w:type="dxa" w:w="100"/>
+            </w:tcMar>
+            <w:vAlign w:val="center"/>
+          </w:tcPr>
+          <w:p>
+            <w:pPr>
+              <w:jc w:val="center"/>
+            </w:pPr>
+            <w:r>
+              <w:rPr>
+                <w:b/>
+                <w:bCs/>
+                <w:strike w:val="false"/>
+                <w:color w:val="C0553A"/>
+                <w:sz w:val="20"/>
+                <w:szCs w:val="20"/>
+              </w:rPr>
+              <w:t xml:space="preserve">-20%</w:t>
+            </w:r>
+          </w:p>
+        </w:tc>
+        <w:tc>
+          <w:tcPr>
+            <w:tcW w:type="dxa" w:w="1800"/>
             <w:shd w:fill="FFFFFF" w:val="clear"/>
             <w:tcMar>
               <w:top w:type="dxa" w:w="90"/>
@@ -428,7 +487,7 @@
         </w:tc>
         <w:tc>
           <w:tcPr>
-            <w:tcW w:type="dxa" w:w="2550"/>
+            <w:tcW w:type="dxa" w:w="2450"/>
             <w:shd w:fill="F5F7FA" w:val="clear"/>
             <w:tcMar>
               <w:top w:type="dxa" w:w="90"/>
@@ -457,7 +516,7 @@
         </w:tc>
         <w:tc>
           <w:tcPr>
-            <w:tcW w:type="dxa" w:w="3000"/>
+            <w:tcW w:type="dxa" w:w="2650"/>
             <w:shd w:fill="F5F7FA" w:val="clear"/>
             <w:tcMar>
               <w:top w:type="dxa" w:w="90"/>
@@ -486,7 +545,7 @@
         </w:tc>
         <w:tc>
           <w:tcPr>
-            <w:tcW w:type="dxa" w:w="1650"/>
+            <w:tcW w:type="dxa" w:w="1550"/>
             <w:shd w:fill="F5F7FA" w:val="clear"/>
             <w:tcMar>
               <w:top w:type="dxa" w:w="90"/>
@@ -515,7 +574,36 @@
         </w:tc>
         <w:tc>
           <w:tcPr>
-            <w:tcW w:type="dxa" w:w="1950"/>
+            <w:tcW w:type="dxa" w:w="700"/>
+            <w:shd w:fill="F5F7FA" w:val="clear"/>
+            <w:tcMar>
+              <w:top w:type="dxa" w:w="90"/>
+              <w:left w:type="dxa" w:w="100"/>
+              <w:bottom w:type="dxa" w:w="90"/>
+              <w:right w:type="dxa" w:w="100"/>
+            </w:tcMar>
+            <w:vAlign w:val="center"/>
+          </w:tcPr>
+          <w:p>
+            <w:pPr>
+              <w:jc w:val="center"/>
+            </w:pPr>
+            <w:r>
+              <w:rPr>
+                <w:b/>
+                <w:bCs/>
+                <w:strike w:val="false"/>
+                <w:color w:val="C0553A"/>
+                <w:sz w:val="20"/>
+                <w:szCs w:val="20"/>
+              </w:rPr>
+              <w:t xml:space="preserve">-22%</w:t>
+            </w:r>
+          </w:p>
+        </w:tc>
+        <w:tc>
+          <w:tcPr>
+            <w:tcW w:type="dxa" w:w="1800"/>
             <w:shd w:fill="F5F7FA" w:val="clear"/>
             <w:tcMar>
               <w:top w:type="dxa" w:w="90"/>
@@ -538,7 +626,7 @@
                 <w:sz w:val="20"/>
                 <w:szCs w:val="20"/>
               </w:rPr>
-              <w:t xml:space="preserve">3.600.000 đ</w:t>
+              <w:t xml:space="preserve">3.510.000 đ</w:t>
             </w:r>
           </w:p>
         </w:tc>
@@ -575,7 +663,7 @@
         </w:tc>
         <w:tc>
           <w:tcPr>
-            <w:tcW w:type="dxa" w:w="2550"/>
+            <w:tcW w:type="dxa" w:w="2450"/>
             <w:shd w:fill="FFFFFF" w:val="clear"/>
             <w:tcMar>
               <w:top w:type="dxa" w:w="90"/>
@@ -604,7 +692,7 @@
         </w:tc>
         <w:tc>
           <w:tcPr>
-            <w:tcW w:type="dxa" w:w="3000"/>
+            <w:tcW w:type="dxa" w:w="2650"/>
             <w:shd w:fill="FFFFFF" w:val="clear"/>
             <w:tcMar>
               <w:top w:type="dxa" w:w="90"/>
@@ -633,7 +721,7 @@
         </w:tc>
         <w:tc>
           <w:tcPr>
-            <w:tcW w:type="dxa" w:w="1650"/>
+            <w:tcW w:type="dxa" w:w="1550"/>
             <w:shd w:fill="FFFFFF" w:val="clear"/>
             <w:tcMar>
               <w:top w:type="dxa" w:w="90"/>
@@ -662,7 +750,36 @@
         </w:tc>
         <w:tc>
           <w:tcPr>
-            <w:tcW w:type="dxa" w:w="1950"/>
+            <w:tcW w:type="dxa" w:w="700"/>
+            <w:shd w:fill="FFFFFF" w:val="clear"/>
+            <w:tcMar>
+              <w:top w:type="dxa" w:w="90"/>
+              <w:left w:type="dxa" w:w="100"/>
+              <w:bottom w:type="dxa" w:w="90"/>
+              <w:right w:type="dxa" w:w="100"/>
+            </w:tcMar>
+            <w:vAlign w:val="center"/>
+          </w:tcPr>
+          <w:p>
+            <w:pPr>
+              <w:jc w:val="center"/>
+            </w:pPr>
+            <w:r>
+              <w:rPr>
+                <w:b/>
+                <w:bCs/>
+                <w:strike w:val="false"/>
+                <w:color w:val="C0553A"/>
+                <w:sz w:val="20"/>
+                <w:szCs w:val="20"/>
+              </w:rPr>
+              <w:t xml:space="preserve">-21%</w:t>
+            </w:r>
+          </w:p>
+        </w:tc>
+        <w:tc>
+          <w:tcPr>
+            <w:tcW w:type="dxa" w:w="1800"/>
             <w:shd w:fill="FFFFFF" w:val="clear"/>
             <w:tcMar>
               <w:top w:type="dxa" w:w="90"/>
@@ -685,7 +802,7 @@
                 <w:sz w:val="20"/>
                 <w:szCs w:val="20"/>
               </w:rPr>
-              <w:t xml:space="preserve">2.960.000 đ</w:t>
+              <w:t xml:space="preserve">2.923.000 đ</w:t>
             </w:r>
           </w:p>
         </w:tc>
@@ -722,7 +839,7 @@
         </w:tc>
         <w:tc>
           <w:tcPr>
-            <w:tcW w:type="dxa" w:w="2550"/>
+            <w:tcW w:type="dxa" w:w="2450"/>
             <w:shd w:fill="F5F7FA" w:val="clear"/>
             <w:tcMar>
               <w:top w:type="dxa" w:w="90"/>
@@ -751,7 +868,7 @@
         </w:tc>
         <w:tc>
           <w:tcPr>
-            <w:tcW w:type="dxa" w:w="3000"/>
+            <w:tcW w:type="dxa" w:w="2650"/>
             <w:shd w:fill="F5F7FA" w:val="clear"/>
             <w:tcMar>
               <w:top w:type="dxa" w:w="90"/>
@@ -780,7 +897,7 @@
         </w:tc>
         <w:tc>
           <w:tcPr>
-            <w:tcW w:type="dxa" w:w="1650"/>
+            <w:tcW w:type="dxa" w:w="1550"/>
             <w:shd w:fill="F5F7FA" w:val="clear"/>
             <w:tcMar>
               <w:top w:type="dxa" w:w="90"/>
@@ -809,7 +926,36 @@
         </w:tc>
         <w:tc>
           <w:tcPr>
-            <w:tcW w:type="dxa" w:w="1950"/>
+            <w:tcW w:type="dxa" w:w="700"/>
+            <w:shd w:fill="F5F7FA" w:val="clear"/>
+            <w:tcMar>
+              <w:top w:type="dxa" w:w="90"/>
+              <w:left w:type="dxa" w:w="100"/>
+              <w:bottom w:type="dxa" w:w="90"/>
+              <w:right w:type="dxa" w:w="100"/>
+            </w:tcMar>
+            <w:vAlign w:val="center"/>
+          </w:tcPr>
+          <w:p>
+            <w:pPr>
+              <w:jc w:val="center"/>
+            </w:pPr>
+            <w:r>
+              <w:rPr>
+                <w:b/>
+                <w:bCs/>
+                <w:strike w:val="false"/>
+                <w:color w:val="C0553A"/>
+                <w:sz w:val="20"/>
+                <w:szCs w:val="20"/>
+              </w:rPr>
+              <w:t xml:space="preserve">-23%</w:t>
+            </w:r>
+          </w:p>
+        </w:tc>
+        <w:tc>
+          <w:tcPr>
+            <w:tcW w:type="dxa" w:w="1800"/>
             <w:shd w:fill="F5F7FA" w:val="clear"/>
             <w:tcMar>
               <w:top w:type="dxa" w:w="90"/>
@@ -832,7 +978,7 @@
                 <w:sz w:val="20"/>
                 <w:szCs w:val="20"/>
               </w:rPr>
-              <w:t xml:space="preserve">4.320.000 đ</w:t>
+              <w:t xml:space="preserve">4.158.000 đ</w:t>
             </w:r>
           </w:p>
         </w:tc>
@@ -869,7 +1015,7 @@
         </w:tc>
         <w:tc>
           <w:tcPr>
-            <w:tcW w:type="dxa" w:w="2550"/>
+            <w:tcW w:type="dxa" w:w="2450"/>
             <w:shd w:fill="FFFFFF" w:val="clear"/>
             <w:tcMar>
               <w:top w:type="dxa" w:w="90"/>
@@ -898,7 +1044,7 @@
         </w:tc>
         <w:tc>
           <w:tcPr>
-            <w:tcW w:type="dxa" w:w="3000"/>
+            <w:tcW w:type="dxa" w:w="2650"/>
             <w:shd w:fill="FFFFFF" w:val="clear"/>
             <w:tcMar>
               <w:top w:type="dxa" w:w="90"/>
@@ -927,7 +1073,7 @@
         </w:tc>
         <w:tc>
           <w:tcPr>
-            <w:tcW w:type="dxa" w:w="1650"/>
+            <w:tcW w:type="dxa" w:w="1550"/>
             <w:shd w:fill="FFFFFF" w:val="clear"/>
             <w:tcMar>
               <w:top w:type="dxa" w:w="90"/>
@@ -956,7 +1102,36 @@
         </w:tc>
         <w:tc>
           <w:tcPr>
-            <w:tcW w:type="dxa" w:w="1950"/>
+            <w:tcW w:type="dxa" w:w="700"/>
+            <w:shd w:fill="FFFFFF" w:val="clear"/>
+            <w:tcMar>
+              <w:top w:type="dxa" w:w="90"/>
+              <w:left w:type="dxa" w:w="100"/>
+              <w:bottom w:type="dxa" w:w="90"/>
+              <w:right w:type="dxa" w:w="100"/>
+            </w:tcMar>
+            <w:vAlign w:val="center"/>
+          </w:tcPr>
+          <w:p>
+            <w:pPr>
+              <w:jc w:val="center"/>
+            </w:pPr>
+            <w:r>
+              <w:rPr>
+                <w:b/>
+                <w:bCs/>
+                <w:strike w:val="false"/>
+                <w:color w:val="C0553A"/>
+                <w:sz w:val="20"/>
+                <w:szCs w:val="20"/>
+              </w:rPr>
+              <w:t xml:space="preserve">-20%</w:t>
+            </w:r>
+          </w:p>
+        </w:tc>
+        <w:tc>
+          <w:tcPr>
+            <w:tcW w:type="dxa" w:w="1800"/>
             <w:shd w:fill="FFFFFF" w:val="clear"/>
             <w:tcMar>
               <w:top w:type="dxa" w:w="90"/>
@@ -1016,7 +1191,7 @@
         </w:tc>
         <w:tc>
           <w:tcPr>
-            <w:tcW w:type="dxa" w:w="2550"/>
+            <w:tcW w:type="dxa" w:w="2450"/>
             <w:shd w:fill="F5F7FA" w:val="clear"/>
             <w:tcMar>
               <w:top w:type="dxa" w:w="90"/>
@@ -1045,7 +1220,7 @@
         </w:tc>
         <w:tc>
           <w:tcPr>
-            <w:tcW w:type="dxa" w:w="3000"/>
+            <w:tcW w:type="dxa" w:w="2650"/>
             <w:shd w:fill="F5F7FA" w:val="clear"/>
             <w:tcMar>
               <w:top w:type="dxa" w:w="90"/>
@@ -1074,7 +1249,7 @@
         </w:tc>
         <w:tc>
           <w:tcPr>
-            <w:tcW w:type="dxa" w:w="1650"/>
+            <w:tcW w:type="dxa" w:w="1550"/>
             <w:shd w:fill="F5F7FA" w:val="clear"/>
             <w:tcMar>
               <w:top w:type="dxa" w:w="90"/>
@@ -1103,7 +1278,36 @@
         </w:tc>
         <w:tc>
           <w:tcPr>
-            <w:tcW w:type="dxa" w:w="1950"/>
+            <w:tcW w:type="dxa" w:w="700"/>
+            <w:shd w:fill="F5F7FA" w:val="clear"/>
+            <w:tcMar>
+              <w:top w:type="dxa" w:w="90"/>
+              <w:left w:type="dxa" w:w="100"/>
+              <w:bottom w:type="dxa" w:w="90"/>
+              <w:right w:type="dxa" w:w="100"/>
+            </w:tcMar>
+            <w:vAlign w:val="center"/>
+          </w:tcPr>
+          <w:p>
+            <w:pPr>
+              <w:jc w:val="center"/>
+            </w:pPr>
+            <w:r>
+              <w:rPr>
+                <w:b/>
+                <w:bCs/>
+                <w:strike w:val="false"/>
+                <w:color w:val="C0553A"/>
+                <w:sz w:val="20"/>
+                <w:szCs w:val="20"/>
+              </w:rPr>
+              <w:t xml:space="preserve">-24%</w:t>
+            </w:r>
+          </w:p>
+        </w:tc>
+        <w:tc>
+          <w:tcPr>
+            <w:tcW w:type="dxa" w:w="1800"/>
             <w:shd w:fill="F5F7FA" w:val="clear"/>
             <w:tcMar>
               <w:top w:type="dxa" w:w="90"/>
@@ -1126,7 +1330,7 @@
                 <w:sz w:val="20"/>
                 <w:szCs w:val="20"/>
               </w:rPr>
-              <w:t xml:space="preserve">3.680.000 đ</w:t>
+              <w:t xml:space="preserve">3.496.000 đ</w:t>
             </w:r>
           </w:p>
         </w:tc>
@@ -1163,7 +1367,7 @@
         </w:tc>
         <w:tc>
           <w:tcPr>
-            <w:tcW w:type="dxa" w:w="2550"/>
+            <w:tcW w:type="dxa" w:w="2450"/>
             <w:shd w:fill="FFFFFF" w:val="clear"/>
             <w:tcMar>
               <w:top w:type="dxa" w:w="90"/>
@@ -1192,7 +1396,7 @@
         </w:tc>
         <w:tc>
           <w:tcPr>
-            <w:tcW w:type="dxa" w:w="3000"/>
+            <w:tcW w:type="dxa" w:w="2650"/>
             <w:shd w:fill="FFFFFF" w:val="clear"/>
             <w:tcMar>
               <w:top w:type="dxa" w:w="90"/>
@@ -1221,7 +1425,7 @@
         </w:tc>
         <w:tc>
           <w:tcPr>
-            <w:tcW w:type="dxa" w:w="1650"/>
+            <w:tcW w:type="dxa" w:w="1550"/>
             <w:shd w:fill="FFFFFF" w:val="clear"/>
             <w:tcMar>
               <w:top w:type="dxa" w:w="90"/>
@@ -1250,7 +1454,36 @@
         </w:tc>
         <w:tc>
           <w:tcPr>
-            <w:tcW w:type="dxa" w:w="1950"/>
+            <w:tcW w:type="dxa" w:w="700"/>
+            <w:shd w:fill="FFFFFF" w:val="clear"/>
+            <w:tcMar>
+              <w:top w:type="dxa" w:w="90"/>
+              <w:left w:type="dxa" w:w="100"/>
+              <w:bottom w:type="dxa" w:w="90"/>
+              <w:right w:type="dxa" w:w="100"/>
+            </w:tcMar>
+            <w:vAlign w:val="center"/>
+          </w:tcPr>
+          <w:p>
+            <w:pPr>
+              <w:jc w:val="center"/>
+            </w:pPr>
+            <w:r>
+              <w:rPr>
+                <w:b/>
+                <w:bCs/>
+                <w:strike w:val="false"/>
+                <w:color w:val="C0553A"/>
+                <w:sz w:val="20"/>
+                <w:szCs w:val="20"/>
+              </w:rPr>
+              <w:t xml:space="preserve">-21%</w:t>
+            </w:r>
+          </w:p>
+        </w:tc>
+        <w:tc>
+          <w:tcPr>
+            <w:tcW w:type="dxa" w:w="1800"/>
             <w:shd w:fill="FFFFFF" w:val="clear"/>
             <w:tcMar>
               <w:top w:type="dxa" w:w="90"/>
@@ -1273,7 +1506,7 @@
                 <w:sz w:val="20"/>
                 <w:szCs w:val="20"/>
               </w:rPr>
-              <w:t xml:space="preserve">3.600.000 đ</w:t>
+              <w:t xml:space="preserve">3.555.000 đ</w:t>
             </w:r>
           </w:p>
         </w:tc>
@@ -1310,7 +1543,7 @@
         </w:tc>
         <w:tc>
           <w:tcPr>
-            <w:tcW w:type="dxa" w:w="2550"/>
+            <w:tcW w:type="dxa" w:w="2450"/>
             <w:shd w:fill="F5F7FA" w:val="clear"/>
             <w:tcMar>
               <w:top w:type="dxa" w:w="90"/>
@@ -1339,7 +1572,7 @@
         </w:tc>
         <w:tc>
           <w:tcPr>
-            <w:tcW w:type="dxa" w:w="3000"/>
+            <w:tcW w:type="dxa" w:w="2650"/>
             <w:shd w:fill="F5F7FA" w:val="clear"/>
             <w:tcMar>
               <w:top w:type="dxa" w:w="90"/>
@@ -1368,7 +1601,7 @@
         </w:tc>
         <w:tc>
           <w:tcPr>
-            <w:tcW w:type="dxa" w:w="1650"/>
+            <w:tcW w:type="dxa" w:w="1550"/>
             <w:shd w:fill="F5F7FA" w:val="clear"/>
             <w:tcMar>
               <w:top w:type="dxa" w:w="90"/>
@@ -1397,7 +1630,36 @@
         </w:tc>
         <w:tc>
           <w:tcPr>
-            <w:tcW w:type="dxa" w:w="1950"/>
+            <w:tcW w:type="dxa" w:w="700"/>
+            <w:shd w:fill="F5F7FA" w:val="clear"/>
+            <w:tcMar>
+              <w:top w:type="dxa" w:w="90"/>
+              <w:left w:type="dxa" w:w="100"/>
+              <w:bottom w:type="dxa" w:w="90"/>
+              <w:right w:type="dxa" w:w="100"/>
+            </w:tcMar>
+            <w:vAlign w:val="center"/>
+          </w:tcPr>
+          <w:p>
+            <w:pPr>
+              <w:jc w:val="center"/>
+            </w:pPr>
+            <w:r>
+              <w:rPr>
+                <w:b/>
+                <w:bCs/>
+                <w:strike w:val="false"/>
+                <w:color w:val="C0553A"/>
+                <w:sz w:val="20"/>
+                <w:szCs w:val="20"/>
+              </w:rPr>
+              <w:t xml:space="preserve">-26%</w:t>
+            </w:r>
+          </w:p>
+        </w:tc>
+        <w:tc>
+          <w:tcPr>
+            <w:tcW w:type="dxa" w:w="1800"/>
             <w:shd w:fill="F5F7FA" w:val="clear"/>
             <w:tcMar>
               <w:top w:type="dxa" w:w="90"/>
@@ -1420,7 +1682,7 @@
                 <w:sz w:val="20"/>
                 <w:szCs w:val="20"/>
               </w:rPr>
-              <w:t xml:space="preserve">1.600.000 đ</w:t>
+              <w:t xml:space="preserve">1.480.000 đ</w:t>
             </w:r>
           </w:p>
         </w:tc>
@@ -1457,7 +1719,7 @@
         </w:tc>
         <w:tc>
           <w:tcPr>
-            <w:tcW w:type="dxa" w:w="2550"/>
+            <w:tcW w:type="dxa" w:w="2450"/>
             <w:shd w:fill="FFFFFF" w:val="clear"/>
             <w:tcMar>
               <w:top w:type="dxa" w:w="90"/>
@@ -1486,7 +1748,7 @@
         </w:tc>
         <w:tc>
           <w:tcPr>
-            <w:tcW w:type="dxa" w:w="3000"/>
+            <w:tcW w:type="dxa" w:w="2650"/>
             <w:shd w:fill="FFFFFF" w:val="clear"/>
             <w:tcMar>
               <w:top w:type="dxa" w:w="90"/>
@@ -1515,7 +1777,7 @@
         </w:tc>
         <w:tc>
           <w:tcPr>
-            <w:tcW w:type="dxa" w:w="1650"/>
+            <w:tcW w:type="dxa" w:w="1550"/>
             <w:shd w:fill="FFFFFF" w:val="clear"/>
             <w:tcMar>
               <w:top w:type="dxa" w:w="90"/>
@@ -1544,7 +1806,36 @@
         </w:tc>
         <w:tc>
           <w:tcPr>
-            <w:tcW w:type="dxa" w:w="1950"/>
+            <w:tcW w:type="dxa" w:w="700"/>
+            <w:shd w:fill="FFFFFF" w:val="clear"/>
+            <w:tcMar>
+              <w:top w:type="dxa" w:w="90"/>
+              <w:left w:type="dxa" w:w="100"/>
+              <w:bottom w:type="dxa" w:w="90"/>
+              <w:right w:type="dxa" w:w="100"/>
+            </w:tcMar>
+            <w:vAlign w:val="center"/>
+          </w:tcPr>
+          <w:p>
+            <w:pPr>
+              <w:jc w:val="center"/>
+            </w:pPr>
+            <w:r>
+              <w:rPr>
+                <w:b/>
+                <w:bCs/>
+                <w:strike w:val="false"/>
+                <w:color w:val="C0553A"/>
+                <w:sz w:val="20"/>
+                <w:szCs w:val="20"/>
+              </w:rPr>
+              <w:t xml:space="preserve">-22%</w:t>
+            </w:r>
+          </w:p>
+        </w:tc>
+        <w:tc>
+          <w:tcPr>
+            <w:tcW w:type="dxa" w:w="1800"/>
             <w:shd w:fill="FFFFFF" w:val="clear"/>
             <w:tcMar>
               <w:top w:type="dxa" w:w="90"/>
@@ -1567,7 +1858,7 @@
                 <w:sz w:val="20"/>
                 <w:szCs w:val="20"/>
               </w:rPr>
-              <w:t xml:space="preserve">2.320.000 đ</w:t>
+              <w:t xml:space="preserve">2.262.000 đ</w:t>
             </w:r>
           </w:p>
         </w:tc>
@@ -1604,7 +1895,7 @@
         </w:tc>
         <w:tc>
           <w:tcPr>
-            <w:tcW w:type="dxa" w:w="2550"/>
+            <w:tcW w:type="dxa" w:w="2450"/>
             <w:shd w:fill="F5F7FA" w:val="clear"/>
             <w:tcMar>
               <w:top w:type="dxa" w:w="90"/>
@@ -1633,7 +1924,7 @@
         </w:tc>
         <w:tc>
           <w:tcPr>
-            <w:tcW w:type="dxa" w:w="3000"/>
+            <w:tcW w:type="dxa" w:w="2650"/>
             <w:shd w:fill="F5F7FA" w:val="clear"/>
             <w:tcMar>
               <w:top w:type="dxa" w:w="90"/>
@@ -1662,7 +1953,7 @@
         </w:tc>
         <w:tc>
           <w:tcPr>
-            <w:tcW w:type="dxa" w:w="1650"/>
+            <w:tcW w:type="dxa" w:w="1550"/>
             <w:shd w:fill="F5F7FA" w:val="clear"/>
             <w:tcMar>
               <w:top w:type="dxa" w:w="90"/>
@@ -1691,7 +1982,36 @@
         </w:tc>
         <w:tc>
           <w:tcPr>
-            <w:tcW w:type="dxa" w:w="1950"/>
+            <w:tcW w:type="dxa" w:w="700"/>
+            <w:shd w:fill="F5F7FA" w:val="clear"/>
+            <w:tcMar>
+              <w:top w:type="dxa" w:w="90"/>
+              <w:left w:type="dxa" w:w="100"/>
+              <w:bottom w:type="dxa" w:w="90"/>
+              <w:right w:type="dxa" w:w="100"/>
+            </w:tcMar>
+            <w:vAlign w:val="center"/>
+          </w:tcPr>
+          <w:p>
+            <w:pPr>
+              <w:jc w:val="center"/>
+            </w:pPr>
+            <w:r>
+              <w:rPr>
+                <w:b/>
+                <w:bCs/>
+                <w:strike w:val="false"/>
+                <w:color w:val="C0553A"/>
+                <w:sz w:val="20"/>
+                <w:szCs w:val="20"/>
+              </w:rPr>
+              <w:t xml:space="preserve">-25%</w:t>
+            </w:r>
+          </w:p>
+        </w:tc>
+        <w:tc>
+          <w:tcPr>
+            <w:tcW w:type="dxa" w:w="1800"/>
             <w:shd w:fill="F5F7FA" w:val="clear"/>
             <w:tcMar>
               <w:top w:type="dxa" w:w="90"/>
@@ -1714,7 +2034,7 @@
                 <w:sz w:val="20"/>
                 <w:szCs w:val="20"/>
               </w:rPr>
-              <w:t xml:space="preserve">2.320.000 đ</w:t>
+              <w:t xml:space="preserve">2.175.000 đ</w:t>
             </w:r>
           </w:p>
         </w:tc>
@@ -1751,7 +2071,7 @@
         </w:tc>
         <w:tc>
           <w:tcPr>
-            <w:tcW w:type="dxa" w:w="2550"/>
+            <w:tcW w:type="dxa" w:w="2450"/>
             <w:shd w:fill="FFFFFF" w:val="clear"/>
             <w:tcMar>
               <w:top w:type="dxa" w:w="90"/>
@@ -1780,7 +2100,7 @@
         </w:tc>
         <w:tc>
           <w:tcPr>
-            <w:tcW w:type="dxa" w:w="3000"/>
+            <w:tcW w:type="dxa" w:w="2650"/>
             <w:shd w:fill="FFFFFF" w:val="clear"/>
             <w:tcMar>
               <w:top w:type="dxa" w:w="90"/>
@@ -1809,7 +2129,7 @@
         </w:tc>
         <w:tc>
           <w:tcPr>
-            <w:tcW w:type="dxa" w:w="1650"/>
+            <w:tcW w:type="dxa" w:w="1550"/>
             <w:shd w:fill="FFFFFF" w:val="clear"/>
             <w:tcMar>
               <w:top w:type="dxa" w:w="90"/>
@@ -1838,7 +2158,36 @@
         </w:tc>
         <w:tc>
           <w:tcPr>
-            <w:tcW w:type="dxa" w:w="1950"/>
+            <w:tcW w:type="dxa" w:w="700"/>
+            <w:shd w:fill="FFFFFF" w:val="clear"/>
+            <w:tcMar>
+              <w:top w:type="dxa" w:w="90"/>
+              <w:left w:type="dxa" w:w="100"/>
+              <w:bottom w:type="dxa" w:w="90"/>
+              <w:right w:type="dxa" w:w="100"/>
+            </w:tcMar>
+            <w:vAlign w:val="center"/>
+          </w:tcPr>
+          <w:p>
+            <w:pPr>
+              <w:jc w:val="center"/>
+            </w:pPr>
+            <w:r>
+              <w:rPr>
+                <w:b/>
+                <w:bCs/>
+                <w:strike w:val="false"/>
+                <w:color w:val="C0553A"/>
+                <w:sz w:val="20"/>
+                <w:szCs w:val="20"/>
+              </w:rPr>
+              <w:t xml:space="preserve">-20%</w:t>
+            </w:r>
+          </w:p>
+        </w:tc>
+        <w:tc>
+          <w:tcPr>
+            <w:tcW w:type="dxa" w:w="1800"/>
             <w:shd w:fill="FFFFFF" w:val="clear"/>
             <w:tcMar>
               <w:top w:type="dxa" w:w="90"/>
@@ -1898,7 +2247,7 @@
         </w:tc>
         <w:tc>
           <w:tcPr>
-            <w:tcW w:type="dxa" w:w="2550"/>
+            <w:tcW w:type="dxa" w:w="2450"/>
             <w:shd w:fill="F5F7FA" w:val="clear"/>
             <w:tcMar>
               <w:top w:type="dxa" w:w="90"/>
@@ -1927,7 +2276,7 @@
         </w:tc>
         <w:tc>
           <w:tcPr>
-            <w:tcW w:type="dxa" w:w="3000"/>
+            <w:tcW w:type="dxa" w:w="2650"/>
             <w:shd w:fill="F5F7FA" w:val="clear"/>
             <w:tcMar>
               <w:top w:type="dxa" w:w="90"/>
@@ -1956,7 +2305,7 @@
         </w:tc>
         <w:tc>
           <w:tcPr>
-            <w:tcW w:type="dxa" w:w="1650"/>
+            <w:tcW w:type="dxa" w:w="1550"/>
             <w:shd w:fill="F5F7FA" w:val="clear"/>
             <w:tcMar>
               <w:top w:type="dxa" w:w="90"/>
@@ -1985,7 +2334,36 @@
         </w:tc>
         <w:tc>
           <w:tcPr>
-            <w:tcW w:type="dxa" w:w="1950"/>
+            <w:tcW w:type="dxa" w:w="700"/>
+            <w:shd w:fill="F5F7FA" w:val="clear"/>
+            <w:tcMar>
+              <w:top w:type="dxa" w:w="90"/>
+              <w:left w:type="dxa" w:w="100"/>
+              <w:bottom w:type="dxa" w:w="90"/>
+              <w:right w:type="dxa" w:w="100"/>
+            </w:tcMar>
+            <w:vAlign w:val="center"/>
+          </w:tcPr>
+          <w:p>
+            <w:pPr>
+              <w:jc w:val="center"/>
+            </w:pPr>
+            <w:r>
+              <w:rPr>
+                <w:b/>
+                <w:bCs/>
+                <w:strike w:val="false"/>
+                <w:color w:val="C0553A"/>
+                <w:sz w:val="20"/>
+                <w:szCs w:val="20"/>
+              </w:rPr>
+              <w:t xml:space="preserve">-23%</w:t>
+            </w:r>
+          </w:p>
+        </w:tc>
+        <w:tc>
+          <w:tcPr>
+            <w:tcW w:type="dxa" w:w="1800"/>
             <w:shd w:fill="F5F7FA" w:val="clear"/>
             <w:tcMar>
               <w:top w:type="dxa" w:w="90"/>
@@ -2008,7 +2386,7 @@
                 <w:sz w:val="20"/>
                 <w:szCs w:val="20"/>
               </w:rPr>
-              <w:t xml:space="preserve">2.488.000 đ</w:t>
+              <w:t xml:space="preserve">2.395.000 đ</w:t>
             </w:r>
           </w:p>
         </w:tc>
@@ -2045,7 +2423,7 @@
         </w:tc>
         <w:tc>
           <w:tcPr>
-            <w:tcW w:type="dxa" w:w="2550"/>
+            <w:tcW w:type="dxa" w:w="2450"/>
             <w:shd w:fill="FFFFFF" w:val="clear"/>
             <w:tcMar>
               <w:top w:type="dxa" w:w="90"/>
@@ -2074,7 +2452,7 @@
         </w:tc>
         <w:tc>
           <w:tcPr>
-            <w:tcW w:type="dxa" w:w="3000"/>
+            <w:tcW w:type="dxa" w:w="2650"/>
             <w:shd w:fill="FFFFFF" w:val="clear"/>
             <w:tcMar>
               <w:top w:type="dxa" w:w="90"/>
@@ -2103,7 +2481,7 @@
         </w:tc>
         <w:tc>
           <w:tcPr>
-            <w:tcW w:type="dxa" w:w="1650"/>
+            <w:tcW w:type="dxa" w:w="1550"/>
             <w:shd w:fill="FFFFFF" w:val="clear"/>
             <w:tcMar>
               <w:top w:type="dxa" w:w="90"/>
@@ -2132,7 +2510,36 @@
         </w:tc>
         <w:tc>
           <w:tcPr>
-            <w:tcW w:type="dxa" w:w="1950"/>
+            <w:tcW w:type="dxa" w:w="700"/>
+            <w:shd w:fill="FFFFFF" w:val="clear"/>
+            <w:tcMar>
+              <w:top w:type="dxa" w:w="90"/>
+              <w:left w:type="dxa" w:w="100"/>
+              <w:bottom w:type="dxa" w:w="90"/>
+              <w:right w:type="dxa" w:w="100"/>
+            </w:tcMar>
+            <w:vAlign w:val="center"/>
+          </w:tcPr>
+          <w:p>
+            <w:pPr>
+              <w:jc w:val="center"/>
+            </w:pPr>
+            <w:r>
+              <w:rPr>
+                <w:b/>
+                <w:bCs/>
+                <w:strike w:val="false"/>
+                <w:color w:val="C0553A"/>
+                <w:sz w:val="20"/>
+                <w:szCs w:val="20"/>
+              </w:rPr>
+              <w:t xml:space="preserve">-21%</w:t>
+            </w:r>
+          </w:p>
+        </w:tc>
+        <w:tc>
+          <w:tcPr>
+            <w:tcW w:type="dxa" w:w="1800"/>
             <w:shd w:fill="FFFFFF" w:val="clear"/>
             <w:tcMar>
               <w:top w:type="dxa" w:w="90"/>
@@ -2155,7 +2562,7 @@
                 <w:sz w:val="20"/>
                 <w:szCs w:val="20"/>
               </w:rPr>
-              <w:t xml:space="preserve">2.520.000 đ</w:t>
+              <w:t xml:space="preserve">2.489.000 đ</w:t>
             </w:r>
           </w:p>
         </w:tc>
@@ -2192,7 +2599,7 @@
         </w:tc>
         <w:tc>
           <w:tcPr>
-            <w:tcW w:type="dxa" w:w="2550"/>
+            <w:tcW w:type="dxa" w:w="2450"/>
             <w:shd w:fill="F5F7FA" w:val="clear"/>
             <w:tcMar>
               <w:top w:type="dxa" w:w="90"/>
@@ -2221,7 +2628,7 @@
         </w:tc>
         <w:tc>
           <w:tcPr>
-            <w:tcW w:type="dxa" w:w="3000"/>
+            <w:tcW w:type="dxa" w:w="2650"/>
             <w:shd w:fill="F5F7FA" w:val="clear"/>
             <w:tcMar>
               <w:top w:type="dxa" w:w="90"/>
@@ -2250,7 +2657,7 @@
         </w:tc>
         <w:tc>
           <w:tcPr>
-            <w:tcW w:type="dxa" w:w="1650"/>
+            <w:tcW w:type="dxa" w:w="1550"/>
             <w:shd w:fill="F5F7FA" w:val="clear"/>
             <w:tcMar>
               <w:top w:type="dxa" w:w="90"/>
@@ -2279,7 +2686,36 @@
         </w:tc>
         <w:tc>
           <w:tcPr>
-            <w:tcW w:type="dxa" w:w="1950"/>
+            <w:tcW w:type="dxa" w:w="700"/>
+            <w:shd w:fill="F5F7FA" w:val="clear"/>
+            <w:tcMar>
+              <w:top w:type="dxa" w:w="90"/>
+              <w:left w:type="dxa" w:w="100"/>
+              <w:bottom w:type="dxa" w:w="90"/>
+              <w:right w:type="dxa" w:w="100"/>
+            </w:tcMar>
+            <w:vAlign w:val="center"/>
+          </w:tcPr>
+          <w:p>
+            <w:pPr>
+              <w:jc w:val="center"/>
+            </w:pPr>
+            <w:r>
+              <w:rPr>
+                <w:b/>
+                <w:bCs/>
+                <w:strike w:val="false"/>
+                <w:color w:val="C0553A"/>
+                <w:sz w:val="20"/>
+                <w:szCs w:val="20"/>
+              </w:rPr>
+              <w:t xml:space="preserve">-27%</w:t>
+            </w:r>
+          </w:p>
+        </w:tc>
+        <w:tc>
+          <w:tcPr>
+            <w:tcW w:type="dxa" w:w="1800"/>
             <w:shd w:fill="F5F7FA" w:val="clear"/>
             <w:tcMar>
               <w:top w:type="dxa" w:w="90"/>
@@ -2302,7 +2738,7 @@
                 <w:sz w:val="20"/>
                 <w:szCs w:val="20"/>
               </w:rPr>
-              <w:t xml:space="preserve">2.160.000 đ</w:t>
+              <w:t xml:space="preserve">1.971.000 đ</w:t>
             </w:r>
           </w:p>
         </w:tc>
@@ -2337,7 +2773,7 @@
           <w:sz w:val="20"/>
           <w:szCs w:val="20"/>
         </w:rPr>
-        <w:t xml:space="preserve">Giá "CK -20%" trong bảng trên là mức chiết khấu tối thiểu cho mỗi báo lẻ. Đặt càng nhiều đầu báo trong cùng 1 đơn, chiết khấu áp trên TỔNG đơn càng cao (tổng giá niêm yết 53.160.000 đ cho trọn bộ 14 đầu báo):</w:t>
+        <w:t xml:space="preserve">Cột "CK" trong bảng trên là mức chiết khấu riêng cho từng báo (tối thiểu 20%, tuỳ đầu báo). Đặt càng nhiều đầu báo trong cùng 1 đơn, chiết khấu áp trên TỔNG đơn càng cao (tổng giá niêm yết 53.160.000 đ cho trọn bộ 14 đầu báo):</w:t>
       </w:r>
     </w:p>
     <w:tbl>

</xml_diff>

<commit_message>
auto: session 2026-08-10 08:52
Co-Authored-By: Claude Opus 4.8 (1M context) <noreply@anthropic.com>
</commit_message>
<xml_diff>
--- a/10-bang-gia-booking/Bao-Gia-Booking-Bao-PR-DigicomVN-2026-08-10.docx
+++ b/10-bang-gia-booking/Bao-Gia-Booking-Bao-PR-DigicomVN-2026-08-10.docx
@@ -19,7 +19,7 @@
     </w:p>
     <w:p>
       <w:pPr>
-        <w:spacing w:after="240"/>
+        <w:spacing w:after="200"/>
       </w:pPr>
       <w:r>
         <w:rPr>
@@ -65,7 +65,7 @@
     </w:p>
     <w:p>
       <w:pPr>
-        <w:spacing w:after="220" w:before="0"/>
+        <w:spacing w:after="200" w:before="0"/>
       </w:pPr>
       <w:r>
         <w:rPr>
@@ -82,7 +82,7 @@
     </w:p>
     <w:tbl>
       <w:tblPr>
-        <w:tblW w:type="dxa" w:w="9600"/>
+        <w:tblW w:type="dxa" w:w="14400"/>
         <w:tblBorders>
           <w:top w:val="single" w:color="D9DEE5" w:sz="4"/>
           <w:left w:val="single" w:color="D9DEE5" w:sz="4"/>
@@ -93,12 +93,14 @@
         </w:tblBorders>
       </w:tblPr>
       <w:tblGrid>
-        <w:gridCol w:w="450"/>
-        <w:gridCol w:w="2450"/>
-        <w:gridCol w:w="2650"/>
-        <w:gridCol w:w="1550"/>
+        <w:gridCol w:w="500"/>
+        <w:gridCol w:w="1900"/>
+        <w:gridCol w:w="2300"/>
+        <w:gridCol w:w="1900"/>
+        <w:gridCol w:w="3500"/>
+        <w:gridCol w:w="1600"/>
         <w:gridCol w:w="700"/>
-        <w:gridCol w:w="1800"/>
+        <w:gridCol w:w="2000"/>
       </w:tblGrid>
       <w:tr>
         <w:trPr>
@@ -106,7 +108,7 @@
         </w:trPr>
         <w:tc>
           <w:tcPr>
-            <w:tcW w:type="dxa" w:w="450"/>
+            <w:tcW w:type="dxa" w:w="500"/>
             <w:shd w:fill="1C2035" w:val="clear"/>
             <w:tcMar>
               <w:top w:type="dxa" w:w="90"/>
@@ -124,10 +126,12 @@
               <w:rPr>
                 <w:b/>
                 <w:bCs/>
+                <w:i w:val="false"/>
+                <w:iCs w:val="false"/>
                 <w:strike w:val="false"/>
                 <w:color w:val="FFFFFF"/>
-                <w:sz w:val="20"/>
-                <w:szCs w:val="20"/>
+                <w:sz w:val="18"/>
+                <w:szCs w:val="18"/>
               </w:rPr>
               <w:t xml:space="preserve">STT</w:t>
             </w:r>
@@ -135,7 +139,7 @@
         </w:tc>
         <w:tc>
           <w:tcPr>
-            <w:tcW w:type="dxa" w:w="2450"/>
+            <w:tcW w:type="dxa" w:w="1900"/>
             <w:shd w:fill="1C2035" w:val="clear"/>
             <w:tcMar>
               <w:top w:type="dxa" w:w="90"/>
@@ -153,10 +157,12 @@
               <w:rPr>
                 <w:b/>
                 <w:bCs/>
+                <w:i w:val="false"/>
+                <w:iCs w:val="false"/>
                 <w:strike w:val="false"/>
                 <w:color w:val="FFFFFF"/>
-                <w:sz w:val="20"/>
-                <w:szCs w:val="20"/>
+                <w:sz w:val="18"/>
+                <w:szCs w:val="18"/>
               </w:rPr>
               <w:t xml:space="preserve">Báo đăng bài</w:t>
             </w:r>
@@ -164,7 +170,7 @@
         </w:tc>
         <w:tc>
           <w:tcPr>
-            <w:tcW w:type="dxa" w:w="2650"/>
+            <w:tcW w:type="dxa" w:w="2300"/>
             <w:shd w:fill="1C2035" w:val="clear"/>
             <w:tcMar>
               <w:top w:type="dxa" w:w="90"/>
@@ -182,18 +188,20 @@
               <w:rPr>
                 <w:b/>
                 <w:bCs/>
+                <w:i w:val="false"/>
+                <w:iCs w:val="false"/>
                 <w:strike w:val="false"/>
                 <w:color w:val="FFFFFF"/>
-                <w:sz w:val="20"/>
-                <w:szCs w:val="20"/>
-              </w:rPr>
-              <w:t xml:space="preserve">Chi tiết bài viết</w:t>
-            </w:r>
-          </w:p>
-        </w:tc>
-        <w:tc>
-          <w:tcPr>
-            <w:tcW w:type="dxa" w:w="1550"/>
+                <w:sz w:val="18"/>
+                <w:szCs w:val="18"/>
+              </w:rPr>
+              <w:t xml:space="preserve">Vị trí đăng</w:t>
+            </w:r>
+          </w:p>
+        </w:tc>
+        <w:tc>
+          <w:tcPr>
+            <w:tcW w:type="dxa" w:w="1900"/>
             <w:shd w:fill="1C2035" w:val="clear"/>
             <w:tcMar>
               <w:top w:type="dxa" w:w="90"/>
@@ -205,16 +213,80 @@
           </w:tcPr>
           <w:p>
             <w:pPr>
+              <w:jc w:val="left"/>
+            </w:pPr>
+            <w:r>
+              <w:rPr>
+                <w:b/>
+                <w:bCs/>
+                <w:i w:val="false"/>
+                <w:iCs w:val="false"/>
+                <w:strike w:val="false"/>
+                <w:color w:val="FFFFFF"/>
+                <w:sz w:val="18"/>
+                <w:szCs w:val="18"/>
+              </w:rPr>
+              <w:t xml:space="preserve">Quy cách bài</w:t>
+            </w:r>
+          </w:p>
+        </w:tc>
+        <w:tc>
+          <w:tcPr>
+            <w:tcW w:type="dxa" w:w="3500"/>
+            <w:shd w:fill="1C2035" w:val="clear"/>
+            <w:tcMar>
+              <w:top w:type="dxa" w:w="90"/>
+              <w:left w:type="dxa" w:w="100"/>
+              <w:bottom w:type="dxa" w:w="90"/>
+              <w:right w:type="dxa" w:w="100"/>
+            </w:tcMar>
+            <w:vAlign w:val="center"/>
+          </w:tcPr>
+          <w:p>
+            <w:pPr>
+              <w:jc w:val="left"/>
+            </w:pPr>
+            <w:r>
+              <w:rPr>
+                <w:b/>
+                <w:bCs/>
+                <w:i w:val="false"/>
+                <w:iCs w:val="false"/>
+                <w:strike w:val="false"/>
+                <w:color w:val="FFFFFF"/>
+                <w:sz w:val="18"/>
+                <w:szCs w:val="18"/>
+              </w:rPr>
+              <w:t xml:space="preserve">Loại link</w:t>
+            </w:r>
+          </w:p>
+        </w:tc>
+        <w:tc>
+          <w:tcPr>
+            <w:tcW w:type="dxa" w:w="1600"/>
+            <w:shd w:fill="1C2035" w:val="clear"/>
+            <w:tcMar>
+              <w:top w:type="dxa" w:w="90"/>
+              <w:left w:type="dxa" w:w="100"/>
+              <w:bottom w:type="dxa" w:w="90"/>
+              <w:right w:type="dxa" w:w="100"/>
+            </w:tcMar>
+            <w:vAlign w:val="center"/>
+          </w:tcPr>
+          <w:p>
+            <w:pPr>
               <w:jc w:val="right"/>
             </w:pPr>
             <w:r>
               <w:rPr>
                 <w:b/>
                 <w:bCs/>
+                <w:i w:val="false"/>
+                <w:iCs w:val="false"/>
                 <w:strike w:val="false"/>
                 <w:color w:val="FFFFFF"/>
-                <w:sz w:val="20"/>
-                <w:szCs w:val="20"/>
+                <w:sz w:val="18"/>
+                <w:szCs w:val="18"/>
               </w:rPr>
               <w:t xml:space="preserve">Giá niêm yết</w:t>
             </w:r>
@@ -240,10 +312,12 @@
               <w:rPr>
                 <w:b/>
                 <w:bCs/>
+                <w:i w:val="false"/>
+                <w:iCs w:val="false"/>
                 <w:strike w:val="false"/>
                 <w:color w:val="FFFFFF"/>
-                <w:sz w:val="20"/>
-                <w:szCs w:val="20"/>
+                <w:sz w:val="18"/>
+                <w:szCs w:val="18"/>
               </w:rPr>
               <w:t xml:space="preserve">CK</w:t>
             </w:r>
@@ -251,7 +325,7 @@
         </w:tc>
         <w:tc>
           <w:tcPr>
-            <w:tcW w:type="dxa" w:w="1800"/>
+            <w:tcW w:type="dxa" w:w="2000"/>
             <w:shd w:fill="1C2035" w:val="clear"/>
             <w:tcMar>
               <w:top w:type="dxa" w:w="90"/>
@@ -269,10 +343,12 @@
               <w:rPr>
                 <w:b/>
                 <w:bCs/>
+                <w:i w:val="false"/>
+                <w:iCs w:val="false"/>
                 <w:strike w:val="false"/>
                 <w:color w:val="FFFFFF"/>
-                <w:sz w:val="20"/>
-                <w:szCs w:val="20"/>
+                <w:sz w:val="18"/>
+                <w:szCs w:val="18"/>
               </w:rPr>
               <w:t xml:space="preserve">Giá sau CK</w:t>
             </w:r>
@@ -282,7 +358,7 @@
       <w:tr>
         <w:tc>
           <w:tcPr>
-            <w:tcW w:type="dxa" w:w="450"/>
+            <w:tcW w:type="dxa" w:w="500"/>
             <w:shd w:fill="FFFFFF" w:val="clear"/>
             <w:tcMar>
               <w:top w:type="dxa" w:w="90"/>
@@ -300,10 +376,12 @@
               <w:rPr>
                 <w:b w:val="false"/>
                 <w:bCs w:val="false"/>
-                <w:strike w:val="false"/>
-                <w:color w:val="27343A"/>
-                <w:sz w:val="20"/>
-                <w:szCs w:val="20"/>
+                <w:i w:val="false"/>
+                <w:iCs w:val="false"/>
+                <w:strike w:val="false"/>
+                <w:color w:val="27343A"/>
+                <w:sz w:val="18"/>
+                <w:szCs w:val="18"/>
               </w:rPr>
               <w:t xml:space="preserve">1</w:t>
             </w:r>
@@ -311,65 +389,144 @@
         </w:tc>
         <w:tc>
           <w:tcPr>
-            <w:tcW w:type="dxa" w:w="2450"/>
-            <w:shd w:fill="FFFFFF" w:val="clear"/>
-            <w:tcMar>
-              <w:top w:type="dxa" w:w="90"/>
-              <w:left w:type="dxa" w:w="100"/>
-              <w:bottom w:type="dxa" w:w="90"/>
-              <w:right w:type="dxa" w:w="100"/>
-            </w:tcMar>
-            <w:vAlign w:val="center"/>
-          </w:tcPr>
-          <w:p>
-            <w:pPr>
-              <w:jc w:val="left"/>
-            </w:pPr>
-            <w:r>
-              <w:rPr>
-                <w:b/>
-                <w:bCs/>
-                <w:strike w:val="false"/>
-                <w:color w:val="27343A"/>
-                <w:sz w:val="20"/>
-                <w:szCs w:val="20"/>
-              </w:rPr>
-              <w:t xml:space="preserve">VTV (vtv.vn)</w:t>
-            </w:r>
-          </w:p>
-        </w:tc>
-        <w:tc>
-          <w:tcPr>
-            <w:tcW w:type="dxa" w:w="2650"/>
-            <w:shd w:fill="FFFFFF" w:val="clear"/>
-            <w:tcMar>
-              <w:top w:type="dxa" w:w="90"/>
-              <w:left w:type="dxa" w:w="100"/>
-              <w:bottom w:type="dxa" w:w="90"/>
-              <w:right w:type="dxa" w:w="100"/>
-            </w:tcMar>
-            <w:vAlign w:val="center"/>
-          </w:tcPr>
-          <w:p>
-            <w:pPr>
-              <w:jc w:val="left"/>
-            </w:pPr>
-            <w:r>
-              <w:rPr>
-                <w:b w:val="false"/>
-                <w:bCs w:val="false"/>
-                <w:strike w:val="false"/>
-                <w:color w:val="27343A"/>
-                <w:sz w:val="20"/>
-                <w:szCs w:val="20"/>
-              </w:rPr>
-              <w:t xml:space="preserve">1.000 từ + 3 ảnh + mua link riêng 3.000.000đ/1 link</w:t>
-            </w:r>
-          </w:p>
-        </w:tc>
-        <w:tc>
-          <w:tcPr>
-            <w:tcW w:type="dxa" w:w="1550"/>
+            <w:tcW w:type="dxa" w:w="1900"/>
+            <w:shd w:fill="FFFFFF" w:val="clear"/>
+            <w:tcMar>
+              <w:top w:type="dxa" w:w="90"/>
+              <w:left w:type="dxa" w:w="100"/>
+              <w:bottom w:type="dxa" w:w="90"/>
+              <w:right w:type="dxa" w:w="100"/>
+            </w:tcMar>
+            <w:vAlign w:val="center"/>
+          </w:tcPr>
+          <w:p>
+            <w:pPr>
+              <w:jc w:val="left"/>
+            </w:pPr>
+            <w:r>
+              <w:rPr>
+                <w:b/>
+                <w:bCs/>
+                <w:i w:val="false"/>
+                <w:iCs w:val="false"/>
+                <w:strike w:val="false"/>
+                <w:color w:val="27343A"/>
+                <w:sz w:val="18"/>
+                <w:szCs w:val="18"/>
+              </w:rPr>
+              <w:t xml:space="preserve">VTV</w:t>
+            </w:r>
+            <w:r>
+              <w:rPr>
+                <w:b w:val="false"/>
+                <w:bCs w:val="false"/>
+                <w:i w:val="false"/>
+                <w:iCs w:val="false"/>
+                <w:strike w:val="false"/>
+                <w:color w:val="8A93A0"/>
+                <w:sz w:val="15"/>
+                <w:szCs w:val="15"/>
+              </w:rPr>
+              <w:t xml:space="preserve"> (vtv.vn)</w:t>
+            </w:r>
+          </w:p>
+        </w:tc>
+        <w:tc>
+          <w:tcPr>
+            <w:tcW w:type="dxa" w:w="2300"/>
+            <w:shd w:fill="FFFFFF" w:val="clear"/>
+            <w:tcMar>
+              <w:top w:type="dxa" w:w="90"/>
+              <w:left w:type="dxa" w:w="100"/>
+              <w:bottom w:type="dxa" w:w="90"/>
+              <w:right w:type="dxa" w:w="100"/>
+            </w:tcMar>
+            <w:vAlign w:val="center"/>
+          </w:tcPr>
+          <w:p>
+            <w:pPr>
+              <w:jc w:val="left"/>
+            </w:pPr>
+            <w:r>
+              <w:rPr>
+                <w:b w:val="false"/>
+                <w:bCs w:val="false"/>
+                <w:i w:val="false"/>
+                <w:iCs w:val="false"/>
+                <w:strike w:val="false"/>
+                <w:color w:val="27343A"/>
+                <w:sz w:val="18"/>
+                <w:szCs w:val="18"/>
+              </w:rPr>
+              <w:t xml:space="preserve">Mục phù hợp</w:t>
+            </w:r>
+          </w:p>
+        </w:tc>
+        <w:tc>
+          <w:tcPr>
+            <w:tcW w:type="dxa" w:w="1900"/>
+            <w:shd w:fill="FFFFFF" w:val="clear"/>
+            <w:tcMar>
+              <w:top w:type="dxa" w:w="90"/>
+              <w:left w:type="dxa" w:w="100"/>
+              <w:bottom w:type="dxa" w:w="90"/>
+              <w:right w:type="dxa" w:w="100"/>
+            </w:tcMar>
+            <w:vAlign w:val="center"/>
+          </w:tcPr>
+          <w:p>
+            <w:pPr>
+              <w:jc w:val="left"/>
+            </w:pPr>
+            <w:r>
+              <w:rPr>
+                <w:b w:val="false"/>
+                <w:bCs w:val="false"/>
+                <w:i w:val="false"/>
+                <w:iCs w:val="false"/>
+                <w:strike w:val="false"/>
+                <w:color w:val="27343A"/>
+                <w:sz w:val="18"/>
+                <w:szCs w:val="18"/>
+              </w:rPr>
+              <w:t xml:space="preserve">Dưới 1.000 từ, dưới 3 ảnh</w:t>
+            </w:r>
+          </w:p>
+        </w:tc>
+        <w:tc>
+          <w:tcPr>
+            <w:tcW w:type="dxa" w:w="3500"/>
+            <w:shd w:fill="FFFFFF" w:val="clear"/>
+            <w:tcMar>
+              <w:top w:type="dxa" w:w="90"/>
+              <w:left w:type="dxa" w:w="100"/>
+              <w:bottom w:type="dxa" w:w="90"/>
+              <w:right w:type="dxa" w:w="100"/>
+            </w:tcMar>
+            <w:vAlign w:val="center"/>
+          </w:tcPr>
+          <w:p>
+            <w:pPr>
+              <w:jc w:val="left"/>
+            </w:pPr>
+            <w:r>
+              <w:rPr>
+                <w:b w:val="false"/>
+                <w:bCs w:val="false"/>
+                <w:i w:val="false"/>
+                <w:iCs w:val="false"/>
+                <w:strike w:val="false"/>
+                <w:color w:val="27343A"/>
+                <w:sz w:val="18"/>
+                <w:szCs w:val="18"/>
+              </w:rPr>
+              <w:t xml:space="preserve">Không chèn link mặc định - mua thêm 1 link riêng 3.000.000đ/link</w:t>
+            </w:r>
+          </w:p>
+        </w:tc>
+        <w:tc>
+          <w:tcPr>
+            <w:tcW w:type="dxa" w:w="1600"/>
             <w:shd w:fill="FFFFFF" w:val="clear"/>
             <w:tcMar>
               <w:top w:type="dxa" w:w="90"/>
@@ -387,10 +544,12 @@
               <w:rPr>
                 <w:b w:val="false"/>
                 <w:bCs w:val="false"/>
+                <w:i w:val="false"/>
+                <w:iCs w:val="false"/>
                 <w:strike/>
                 <w:color w:val="9AA3AF"/>
-                <w:sz w:val="20"/>
-                <w:szCs w:val="20"/>
+                <w:sz w:val="18"/>
+                <w:szCs w:val="18"/>
               </w:rPr>
               <w:t xml:space="preserve">6.000.000 đ</w:t>
             </w:r>
@@ -416,10 +575,12 @@
               <w:rPr>
                 <w:b/>
                 <w:bCs/>
+                <w:i w:val="false"/>
+                <w:iCs w:val="false"/>
                 <w:strike w:val="false"/>
                 <w:color w:val="C0553A"/>
-                <w:sz w:val="20"/>
-                <w:szCs w:val="20"/>
+                <w:sz w:val="18"/>
+                <w:szCs w:val="18"/>
               </w:rPr>
               <w:t xml:space="preserve">-20%</w:t>
             </w:r>
@@ -427,7 +588,7 @@
         </w:tc>
         <w:tc>
           <w:tcPr>
-            <w:tcW w:type="dxa" w:w="1800"/>
+            <w:tcW w:type="dxa" w:w="2000"/>
             <w:shd w:fill="FFFFFF" w:val="clear"/>
             <w:tcMar>
               <w:top w:type="dxa" w:w="90"/>
@@ -445,10 +606,12 @@
               <w:rPr>
                 <w:b/>
                 <w:bCs/>
+                <w:i w:val="false"/>
+                <w:iCs w:val="false"/>
                 <w:strike w:val="false"/>
                 <w:color w:val="0E8C7F"/>
-                <w:sz w:val="20"/>
-                <w:szCs w:val="20"/>
+                <w:sz w:val="18"/>
+                <w:szCs w:val="18"/>
               </w:rPr>
               <w:t xml:space="preserve">4.800.000 đ</w:t>
             </w:r>
@@ -458,7 +621,7 @@
       <w:tr>
         <w:tc>
           <w:tcPr>
-            <w:tcW w:type="dxa" w:w="450"/>
+            <w:tcW w:type="dxa" w:w="500"/>
             <w:shd w:fill="F5F7FA" w:val="clear"/>
             <w:tcMar>
               <w:top w:type="dxa" w:w="90"/>
@@ -476,10 +639,12 @@
               <w:rPr>
                 <w:b w:val="false"/>
                 <w:bCs w:val="false"/>
-                <w:strike w:val="false"/>
-                <w:color w:val="27343A"/>
-                <w:sz w:val="20"/>
-                <w:szCs w:val="20"/>
+                <w:i w:val="false"/>
+                <w:iCs w:val="false"/>
+                <w:strike w:val="false"/>
+                <w:color w:val="27343A"/>
+                <w:sz w:val="18"/>
+                <w:szCs w:val="18"/>
               </w:rPr>
               <w:t xml:space="preserve">2</w:t>
             </w:r>
@@ -487,65 +652,144 @@
         </w:tc>
         <w:tc>
           <w:tcPr>
-            <w:tcW w:type="dxa" w:w="2450"/>
-            <w:shd w:fill="F5F7FA" w:val="clear"/>
-            <w:tcMar>
-              <w:top w:type="dxa" w:w="90"/>
-              <w:left w:type="dxa" w:w="100"/>
-              <w:bottom w:type="dxa" w:w="90"/>
-              <w:right w:type="dxa" w:w="100"/>
-            </w:tcMar>
-            <w:vAlign w:val="center"/>
-          </w:tcPr>
-          <w:p>
-            <w:pPr>
-              <w:jc w:val="left"/>
-            </w:pPr>
-            <w:r>
-              <w:rPr>
-                <w:b/>
-                <w:bCs/>
-                <w:strike w:val="false"/>
-                <w:color w:val="27343A"/>
-                <w:sz w:val="20"/>
-                <w:szCs w:val="20"/>
-              </w:rPr>
-              <w:t xml:space="preserve">24h (24h.com.vn)</w:t>
-            </w:r>
-          </w:p>
-        </w:tc>
-        <w:tc>
-          <w:tcPr>
-            <w:tcW w:type="dxa" w:w="2650"/>
-            <w:shd w:fill="F5F7FA" w:val="clear"/>
-            <w:tcMar>
-              <w:top w:type="dxa" w:w="90"/>
-              <w:left w:type="dxa" w:w="100"/>
-              <w:bottom w:type="dxa" w:w="90"/>
-              <w:right w:type="dxa" w:w="100"/>
-            </w:tcMar>
-            <w:vAlign w:val="center"/>
-          </w:tcPr>
-          <w:p>
-            <w:pPr>
-              <w:jc w:val="left"/>
-            </w:pPr>
-            <w:r>
-              <w:rPr>
-                <w:b w:val="false"/>
-                <w:bCs w:val="false"/>
-                <w:strike w:val="false"/>
-                <w:color w:val="27343A"/>
-                <w:sz w:val="20"/>
-                <w:szCs w:val="20"/>
-              </w:rPr>
-              <w:t xml:space="preserve">1.000 từ + 5 ảnh + 3 link</w:t>
-            </w:r>
-          </w:p>
-        </w:tc>
-        <w:tc>
-          <w:tcPr>
-            <w:tcW w:type="dxa" w:w="1550"/>
+            <w:tcW w:type="dxa" w:w="1900"/>
+            <w:shd w:fill="F5F7FA" w:val="clear"/>
+            <w:tcMar>
+              <w:top w:type="dxa" w:w="90"/>
+              <w:left w:type="dxa" w:w="100"/>
+              <w:bottom w:type="dxa" w:w="90"/>
+              <w:right w:type="dxa" w:w="100"/>
+            </w:tcMar>
+            <w:vAlign w:val="center"/>
+          </w:tcPr>
+          <w:p>
+            <w:pPr>
+              <w:jc w:val="left"/>
+            </w:pPr>
+            <w:r>
+              <w:rPr>
+                <w:b/>
+                <w:bCs/>
+                <w:i w:val="false"/>
+                <w:iCs w:val="false"/>
+                <w:strike w:val="false"/>
+                <w:color w:val="27343A"/>
+                <w:sz w:val="18"/>
+                <w:szCs w:val="18"/>
+              </w:rPr>
+              <w:t xml:space="preserve">24h</w:t>
+            </w:r>
+            <w:r>
+              <w:rPr>
+                <w:b w:val="false"/>
+                <w:bCs w:val="false"/>
+                <w:i w:val="false"/>
+                <w:iCs w:val="false"/>
+                <w:strike w:val="false"/>
+                <w:color w:val="8A93A0"/>
+                <w:sz w:val="15"/>
+                <w:szCs w:val="15"/>
+              </w:rPr>
+              <w:t xml:space="preserve"> (24h.com.vn)</w:t>
+            </w:r>
+          </w:p>
+        </w:tc>
+        <w:tc>
+          <w:tcPr>
+            <w:tcW w:type="dxa" w:w="2300"/>
+            <w:shd w:fill="F5F7FA" w:val="clear"/>
+            <w:tcMar>
+              <w:top w:type="dxa" w:w="90"/>
+              <w:left w:type="dxa" w:w="100"/>
+              <w:bottom w:type="dxa" w:w="90"/>
+              <w:right w:type="dxa" w:w="100"/>
+            </w:tcMar>
+            <w:vAlign w:val="center"/>
+          </w:tcPr>
+          <w:p>
+            <w:pPr>
+              <w:jc w:val="left"/>
+            </w:pPr>
+            <w:r>
+              <w:rPr>
+                <w:b w:val="false"/>
+                <w:bCs w:val="false"/>
+                <w:i w:val="false"/>
+                <w:iCs w:val="false"/>
+                <w:strike w:val="false"/>
+                <w:color w:val="27343A"/>
+                <w:sz w:val="18"/>
+                <w:szCs w:val="18"/>
+              </w:rPr>
+              <w:t xml:space="preserve">PR loại 2 (Kinh doanh - Thị trường tiêu dùng)</w:t>
+            </w:r>
+          </w:p>
+        </w:tc>
+        <w:tc>
+          <w:tcPr>
+            <w:tcW w:type="dxa" w:w="1900"/>
+            <w:shd w:fill="F5F7FA" w:val="clear"/>
+            <w:tcMar>
+              <w:top w:type="dxa" w:w="90"/>
+              <w:left w:type="dxa" w:w="100"/>
+              <w:bottom w:type="dxa" w:w="90"/>
+              <w:right w:type="dxa" w:w="100"/>
+            </w:tcMar>
+            <w:vAlign w:val="center"/>
+          </w:tcPr>
+          <w:p>
+            <w:pPr>
+              <w:jc w:val="left"/>
+            </w:pPr>
+            <w:r>
+              <w:rPr>
+                <w:b w:val="false"/>
+                <w:bCs w:val="false"/>
+                <w:i w:val="false"/>
+                <w:iCs w:val="false"/>
+                <w:strike w:val="false"/>
+                <w:color w:val="27343A"/>
+                <w:sz w:val="18"/>
+                <w:szCs w:val="18"/>
+              </w:rPr>
+              <w:t xml:space="preserve">Dưới 1.000 từ, dưới 5 ảnh</w:t>
+            </w:r>
+          </w:p>
+        </w:tc>
+        <w:tc>
+          <w:tcPr>
+            <w:tcW w:type="dxa" w:w="3500"/>
+            <w:shd w:fill="F5F7FA" w:val="clear"/>
+            <w:tcMar>
+              <w:top w:type="dxa" w:w="90"/>
+              <w:left w:type="dxa" w:w="100"/>
+              <w:bottom w:type="dxa" w:w="90"/>
+              <w:right w:type="dxa" w:w="100"/>
+            </w:tcMar>
+            <w:vAlign w:val="center"/>
+          </w:tcPr>
+          <w:p>
+            <w:pPr>
+              <w:jc w:val="left"/>
+            </w:pPr>
+            <w:r>
+              <w:rPr>
+                <w:b w:val="false"/>
+                <w:bCs w:val="false"/>
+                <w:i w:val="false"/>
+                <w:iCs w:val="false"/>
+                <w:strike w:val="false"/>
+                <w:color w:val="27343A"/>
+                <w:sz w:val="18"/>
+                <w:szCs w:val="18"/>
+              </w:rPr>
+              <w:t xml:space="preserve">3 link nofollow</w:t>
+            </w:r>
+          </w:p>
+        </w:tc>
+        <w:tc>
+          <w:tcPr>
+            <w:tcW w:type="dxa" w:w="1600"/>
             <w:shd w:fill="F5F7FA" w:val="clear"/>
             <w:tcMar>
               <w:top w:type="dxa" w:w="90"/>
@@ -563,10 +807,12 @@
               <w:rPr>
                 <w:b w:val="false"/>
                 <w:bCs w:val="false"/>
+                <w:i w:val="false"/>
+                <w:iCs w:val="false"/>
                 <w:strike/>
                 <w:color w:val="9AA3AF"/>
-                <w:sz w:val="20"/>
-                <w:szCs w:val="20"/>
+                <w:sz w:val="18"/>
+                <w:szCs w:val="18"/>
               </w:rPr>
               <w:t xml:space="preserve">4.500.000 đ</w:t>
             </w:r>
@@ -592,10 +838,12 @@
               <w:rPr>
                 <w:b/>
                 <w:bCs/>
+                <w:i w:val="false"/>
+                <w:iCs w:val="false"/>
                 <w:strike w:val="false"/>
                 <w:color w:val="C0553A"/>
-                <w:sz w:val="20"/>
-                <w:szCs w:val="20"/>
+                <w:sz w:val="18"/>
+                <w:szCs w:val="18"/>
               </w:rPr>
               <w:t xml:space="preserve">-22%</w:t>
             </w:r>
@@ -603,7 +851,7 @@
         </w:tc>
         <w:tc>
           <w:tcPr>
-            <w:tcW w:type="dxa" w:w="1800"/>
+            <w:tcW w:type="dxa" w:w="2000"/>
             <w:shd w:fill="F5F7FA" w:val="clear"/>
             <w:tcMar>
               <w:top w:type="dxa" w:w="90"/>
@@ -621,10 +869,12 @@
               <w:rPr>
                 <w:b/>
                 <w:bCs/>
+                <w:i w:val="false"/>
+                <w:iCs w:val="false"/>
                 <w:strike w:val="false"/>
                 <w:color w:val="0E8C7F"/>
-                <w:sz w:val="20"/>
-                <w:szCs w:val="20"/>
+                <w:sz w:val="18"/>
+                <w:szCs w:val="18"/>
               </w:rPr>
               <w:t xml:space="preserve">3.510.000 đ</w:t>
             </w:r>
@@ -634,7 +884,7 @@
       <w:tr>
         <w:tc>
           <w:tcPr>
-            <w:tcW w:type="dxa" w:w="450"/>
+            <w:tcW w:type="dxa" w:w="500"/>
             <w:shd w:fill="FFFFFF" w:val="clear"/>
             <w:tcMar>
               <w:top w:type="dxa" w:w="90"/>
@@ -652,10 +902,12 @@
               <w:rPr>
                 <w:b w:val="false"/>
                 <w:bCs w:val="false"/>
-                <w:strike w:val="false"/>
-                <w:color w:val="27343A"/>
-                <w:sz w:val="20"/>
-                <w:szCs w:val="20"/>
+                <w:i w:val="false"/>
+                <w:iCs w:val="false"/>
+                <w:strike w:val="false"/>
+                <w:color w:val="27343A"/>
+                <w:sz w:val="18"/>
+                <w:szCs w:val="18"/>
               </w:rPr>
               <w:t xml:space="preserve">3</w:t>
             </w:r>
@@ -663,65 +915,144 @@
         </w:tc>
         <w:tc>
           <w:tcPr>
-            <w:tcW w:type="dxa" w:w="2450"/>
-            <w:shd w:fill="FFFFFF" w:val="clear"/>
-            <w:tcMar>
-              <w:top w:type="dxa" w:w="90"/>
-              <w:left w:type="dxa" w:w="100"/>
-              <w:bottom w:type="dxa" w:w="90"/>
-              <w:right w:type="dxa" w:w="100"/>
-            </w:tcMar>
-            <w:vAlign w:val="center"/>
-          </w:tcPr>
-          <w:p>
-            <w:pPr>
-              <w:jc w:val="left"/>
-            </w:pPr>
-            <w:r>
-              <w:rPr>
-                <w:b/>
-                <w:bCs/>
-                <w:strike w:val="false"/>
-                <w:color w:val="27343A"/>
-                <w:sz w:val="20"/>
-                <w:szCs w:val="20"/>
-              </w:rPr>
-              <w:t xml:space="preserve">Thanh Niên (thanhnien.vn)</w:t>
-            </w:r>
-          </w:p>
-        </w:tc>
-        <w:tc>
-          <w:tcPr>
-            <w:tcW w:type="dxa" w:w="2650"/>
-            <w:shd w:fill="FFFFFF" w:val="clear"/>
-            <w:tcMar>
-              <w:top w:type="dxa" w:w="90"/>
-              <w:left w:type="dxa" w:w="100"/>
-              <w:bottom w:type="dxa" w:w="90"/>
-              <w:right w:type="dxa" w:w="100"/>
-            </w:tcMar>
-            <w:vAlign w:val="center"/>
-          </w:tcPr>
-          <w:p>
-            <w:pPr>
-              <w:jc w:val="left"/>
-            </w:pPr>
-            <w:r>
-              <w:rPr>
-                <w:b w:val="false"/>
-                <w:bCs w:val="false"/>
-                <w:strike w:val="false"/>
-                <w:color w:val="27343A"/>
-                <w:sz w:val="20"/>
-                <w:szCs w:val="20"/>
-              </w:rPr>
-              <w:t xml:space="preserve">300 từ + 1 ảnh + 1 link</w:t>
-            </w:r>
-          </w:p>
-        </w:tc>
-        <w:tc>
-          <w:tcPr>
-            <w:tcW w:type="dxa" w:w="1550"/>
+            <w:tcW w:type="dxa" w:w="1900"/>
+            <w:shd w:fill="FFFFFF" w:val="clear"/>
+            <w:tcMar>
+              <w:top w:type="dxa" w:w="90"/>
+              <w:left w:type="dxa" w:w="100"/>
+              <w:bottom w:type="dxa" w:w="90"/>
+              <w:right w:type="dxa" w:w="100"/>
+            </w:tcMar>
+            <w:vAlign w:val="center"/>
+          </w:tcPr>
+          <w:p>
+            <w:pPr>
+              <w:jc w:val="left"/>
+            </w:pPr>
+            <w:r>
+              <w:rPr>
+                <w:b/>
+                <w:bCs/>
+                <w:i w:val="false"/>
+                <w:iCs w:val="false"/>
+                <w:strike w:val="false"/>
+                <w:color w:val="27343A"/>
+                <w:sz w:val="18"/>
+                <w:szCs w:val="18"/>
+              </w:rPr>
+              <w:t xml:space="preserve">Thanh Niên</w:t>
+            </w:r>
+            <w:r>
+              <w:rPr>
+                <w:b w:val="false"/>
+                <w:bCs w:val="false"/>
+                <w:i w:val="false"/>
+                <w:iCs w:val="false"/>
+                <w:strike w:val="false"/>
+                <w:color w:val="8A93A0"/>
+                <w:sz w:val="15"/>
+                <w:szCs w:val="15"/>
+              </w:rPr>
+              <w:t xml:space="preserve"> (thanhnien.vn)</w:t>
+            </w:r>
+          </w:p>
+        </w:tc>
+        <w:tc>
+          <w:tcPr>
+            <w:tcW w:type="dxa" w:w="2300"/>
+            <w:shd w:fill="FFFFFF" w:val="clear"/>
+            <w:tcMar>
+              <w:top w:type="dxa" w:w="90"/>
+              <w:left w:type="dxa" w:w="100"/>
+              <w:bottom w:type="dxa" w:w="90"/>
+              <w:right w:type="dxa" w:w="100"/>
+            </w:tcMar>
+            <w:vAlign w:val="center"/>
+          </w:tcPr>
+          <w:p>
+            <w:pPr>
+              <w:jc w:val="left"/>
+            </w:pPr>
+            <w:r>
+              <w:rPr>
+                <w:b w:val="false"/>
+                <w:bCs w:val="false"/>
+                <w:i w:val="false"/>
+                <w:iCs w:val="false"/>
+                <w:strike w:val="false"/>
+                <w:color w:val="27343A"/>
+                <w:sz w:val="18"/>
+                <w:szCs w:val="18"/>
+              </w:rPr>
+              <w:t xml:space="preserve">PR Cần biết</w:t>
+            </w:r>
+          </w:p>
+        </w:tc>
+        <w:tc>
+          <w:tcPr>
+            <w:tcW w:type="dxa" w:w="1900"/>
+            <w:shd w:fill="FFFFFF" w:val="clear"/>
+            <w:tcMar>
+              <w:top w:type="dxa" w:w="90"/>
+              <w:left w:type="dxa" w:w="100"/>
+              <w:bottom w:type="dxa" w:w="90"/>
+              <w:right w:type="dxa" w:w="100"/>
+            </w:tcMar>
+            <w:vAlign w:val="center"/>
+          </w:tcPr>
+          <w:p>
+            <w:pPr>
+              <w:jc w:val="left"/>
+            </w:pPr>
+            <w:r>
+              <w:rPr>
+                <w:b w:val="false"/>
+                <w:bCs w:val="false"/>
+                <w:i w:val="false"/>
+                <w:iCs w:val="false"/>
+                <w:strike w:val="false"/>
+                <w:color w:val="27343A"/>
+                <w:sz w:val="18"/>
+                <w:szCs w:val="18"/>
+              </w:rPr>
+              <w:t xml:space="preserve">300 từ, 1 ảnh</w:t>
+            </w:r>
+          </w:p>
+        </w:tc>
+        <w:tc>
+          <w:tcPr>
+            <w:tcW w:type="dxa" w:w="3500"/>
+            <w:shd w:fill="FFFFFF" w:val="clear"/>
+            <w:tcMar>
+              <w:top w:type="dxa" w:w="90"/>
+              <w:left w:type="dxa" w:w="100"/>
+              <w:bottom w:type="dxa" w:w="90"/>
+              <w:right w:type="dxa" w:w="100"/>
+            </w:tcMar>
+            <w:vAlign w:val="center"/>
+          </w:tcPr>
+          <w:p>
+            <w:pPr>
+              <w:jc w:val="left"/>
+            </w:pPr>
+            <w:r>
+              <w:rPr>
+                <w:b w:val="false"/>
+                <w:bCs w:val="false"/>
+                <w:i w:val="false"/>
+                <w:iCs w:val="false"/>
+                <w:strike w:val="false"/>
+                <w:color w:val="27343A"/>
+                <w:sz w:val="18"/>
+                <w:szCs w:val="18"/>
+              </w:rPr>
+              <w:t xml:space="preserve">1 link nofollow (thêm link +600.000đ)</w:t>
+            </w:r>
+          </w:p>
+        </w:tc>
+        <w:tc>
+          <w:tcPr>
+            <w:tcW w:type="dxa" w:w="1600"/>
             <w:shd w:fill="FFFFFF" w:val="clear"/>
             <w:tcMar>
               <w:top w:type="dxa" w:w="90"/>
@@ -739,10 +1070,12 @@
               <w:rPr>
                 <w:b w:val="false"/>
                 <w:bCs w:val="false"/>
+                <w:i w:val="false"/>
+                <w:iCs w:val="false"/>
                 <w:strike/>
                 <w:color w:val="9AA3AF"/>
-                <w:sz w:val="20"/>
-                <w:szCs w:val="20"/>
+                <w:sz w:val="18"/>
+                <w:szCs w:val="18"/>
               </w:rPr>
               <w:t xml:space="preserve">3.700.000 đ</w:t>
             </w:r>
@@ -768,10 +1101,12 @@
               <w:rPr>
                 <w:b/>
                 <w:bCs/>
+                <w:i w:val="false"/>
+                <w:iCs w:val="false"/>
                 <w:strike w:val="false"/>
                 <w:color w:val="C0553A"/>
-                <w:sz w:val="20"/>
-                <w:szCs w:val="20"/>
+                <w:sz w:val="18"/>
+                <w:szCs w:val="18"/>
               </w:rPr>
               <w:t xml:space="preserve">-21%</w:t>
             </w:r>
@@ -779,7 +1114,7 @@
         </w:tc>
         <w:tc>
           <w:tcPr>
-            <w:tcW w:type="dxa" w:w="1800"/>
+            <w:tcW w:type="dxa" w:w="2000"/>
             <w:shd w:fill="FFFFFF" w:val="clear"/>
             <w:tcMar>
               <w:top w:type="dxa" w:w="90"/>
@@ -797,10 +1132,12 @@
               <w:rPr>
                 <w:b/>
                 <w:bCs/>
+                <w:i w:val="false"/>
+                <w:iCs w:val="false"/>
                 <w:strike w:val="false"/>
                 <w:color w:val="0E8C7F"/>
-                <w:sz w:val="20"/>
-                <w:szCs w:val="20"/>
+                <w:sz w:val="18"/>
+                <w:szCs w:val="18"/>
               </w:rPr>
               <w:t xml:space="preserve">2.923.000 đ</w:t>
             </w:r>
@@ -810,7 +1147,7 @@
       <w:tr>
         <w:tc>
           <w:tcPr>
-            <w:tcW w:type="dxa" w:w="450"/>
+            <w:tcW w:type="dxa" w:w="500"/>
             <w:shd w:fill="F5F7FA" w:val="clear"/>
             <w:tcMar>
               <w:top w:type="dxa" w:w="90"/>
@@ -828,10 +1165,12 @@
               <w:rPr>
                 <w:b w:val="false"/>
                 <w:bCs w:val="false"/>
-                <w:strike w:val="false"/>
-                <w:color w:val="27343A"/>
-                <w:sz w:val="20"/>
-                <w:szCs w:val="20"/>
+                <w:i w:val="false"/>
+                <w:iCs w:val="false"/>
+                <w:strike w:val="false"/>
+                <w:color w:val="27343A"/>
+                <w:sz w:val="18"/>
+                <w:szCs w:val="18"/>
               </w:rPr>
               <w:t xml:space="preserve">4</w:t>
             </w:r>
@@ -839,65 +1178,144 @@
         </w:tc>
         <w:tc>
           <w:tcPr>
-            <w:tcW w:type="dxa" w:w="2450"/>
-            <w:shd w:fill="F5F7FA" w:val="clear"/>
-            <w:tcMar>
-              <w:top w:type="dxa" w:w="90"/>
-              <w:left w:type="dxa" w:w="100"/>
-              <w:bottom w:type="dxa" w:w="90"/>
-              <w:right w:type="dxa" w:w="100"/>
-            </w:tcMar>
-            <w:vAlign w:val="center"/>
-          </w:tcPr>
-          <w:p>
-            <w:pPr>
-              <w:jc w:val="left"/>
-            </w:pPr>
-            <w:r>
-              <w:rPr>
-                <w:b/>
-                <w:bCs/>
-                <w:strike w:val="false"/>
-                <w:color w:val="27343A"/>
-                <w:sz w:val="20"/>
-                <w:szCs w:val="20"/>
-              </w:rPr>
-              <w:t xml:space="preserve">CafeF (cafef.vn)</w:t>
-            </w:r>
-          </w:p>
-        </w:tc>
-        <w:tc>
-          <w:tcPr>
-            <w:tcW w:type="dxa" w:w="2650"/>
-            <w:shd w:fill="F5F7FA" w:val="clear"/>
-            <w:tcMar>
-              <w:top w:type="dxa" w:w="90"/>
-              <w:left w:type="dxa" w:w="100"/>
-              <w:bottom w:type="dxa" w:w="90"/>
-              <w:right w:type="dxa" w:w="100"/>
-            </w:tcMar>
-            <w:vAlign w:val="center"/>
-          </w:tcPr>
-          <w:p>
-            <w:pPr>
-              <w:jc w:val="left"/>
-            </w:pPr>
-            <w:r>
-              <w:rPr>
-                <w:b w:val="false"/>
-                <w:bCs w:val="false"/>
-                <w:strike w:val="false"/>
-                <w:color w:val="27343A"/>
-                <w:sz w:val="20"/>
-                <w:szCs w:val="20"/>
-              </w:rPr>
-              <w:t xml:space="preserve">1.000 từ + 5 ảnh + 1 link</w:t>
-            </w:r>
-          </w:p>
-        </w:tc>
-        <w:tc>
-          <w:tcPr>
-            <w:tcW w:type="dxa" w:w="1550"/>
+            <w:tcW w:type="dxa" w:w="1900"/>
+            <w:shd w:fill="F5F7FA" w:val="clear"/>
+            <w:tcMar>
+              <w:top w:type="dxa" w:w="90"/>
+              <w:left w:type="dxa" w:w="100"/>
+              <w:bottom w:type="dxa" w:w="90"/>
+              <w:right w:type="dxa" w:w="100"/>
+            </w:tcMar>
+            <w:vAlign w:val="center"/>
+          </w:tcPr>
+          <w:p>
+            <w:pPr>
+              <w:jc w:val="left"/>
+            </w:pPr>
+            <w:r>
+              <w:rPr>
+                <w:b/>
+                <w:bCs/>
+                <w:i w:val="false"/>
+                <w:iCs w:val="false"/>
+                <w:strike w:val="false"/>
+                <w:color w:val="27343A"/>
+                <w:sz w:val="18"/>
+                <w:szCs w:val="18"/>
+              </w:rPr>
+              <w:t xml:space="preserve">CafeF</w:t>
+            </w:r>
+            <w:r>
+              <w:rPr>
+                <w:b w:val="false"/>
+                <w:bCs w:val="false"/>
+                <w:i w:val="false"/>
+                <w:iCs w:val="false"/>
+                <w:strike w:val="false"/>
+                <w:color w:val="8A93A0"/>
+                <w:sz w:val="15"/>
+                <w:szCs w:val="15"/>
+              </w:rPr>
+              <w:t xml:space="preserve"> (cafef.vn)</w:t>
+            </w:r>
+          </w:p>
+        </w:tc>
+        <w:tc>
+          <w:tcPr>
+            <w:tcW w:type="dxa" w:w="2300"/>
+            <w:shd w:fill="F5F7FA" w:val="clear"/>
+            <w:tcMar>
+              <w:top w:type="dxa" w:w="90"/>
+              <w:left w:type="dxa" w:w="100"/>
+              <w:bottom w:type="dxa" w:w="90"/>
+              <w:right w:type="dxa" w:w="100"/>
+            </w:tcMar>
+            <w:vAlign w:val="center"/>
+          </w:tcPr>
+          <w:p>
+            <w:pPr>
+              <w:jc w:val="left"/>
+            </w:pPr>
+            <w:r>
+              <w:rPr>
+                <w:b w:val="false"/>
+                <w:bCs w:val="false"/>
+                <w:i w:val="false"/>
+                <w:iCs w:val="false"/>
+                <w:strike w:val="false"/>
+                <w:color w:val="27343A"/>
+                <w:sz w:val="18"/>
+                <w:szCs w:val="18"/>
+              </w:rPr>
+              <w:t xml:space="preserve">Box Thông cáo báo chí (trang chủ 1 ngày)</w:t>
+            </w:r>
+          </w:p>
+        </w:tc>
+        <w:tc>
+          <w:tcPr>
+            <w:tcW w:type="dxa" w:w="1900"/>
+            <w:shd w:fill="F5F7FA" w:val="clear"/>
+            <w:tcMar>
+              <w:top w:type="dxa" w:w="90"/>
+              <w:left w:type="dxa" w:w="100"/>
+              <w:bottom w:type="dxa" w:w="90"/>
+              <w:right w:type="dxa" w:w="100"/>
+            </w:tcMar>
+            <w:vAlign w:val="center"/>
+          </w:tcPr>
+          <w:p>
+            <w:pPr>
+              <w:jc w:val="left"/>
+            </w:pPr>
+            <w:r>
+              <w:rPr>
+                <w:b w:val="false"/>
+                <w:bCs w:val="false"/>
+                <w:i w:val="false"/>
+                <w:iCs w:val="false"/>
+                <w:strike w:val="false"/>
+                <w:color w:val="27343A"/>
+                <w:sz w:val="18"/>
+                <w:szCs w:val="18"/>
+              </w:rPr>
+              <w:t xml:space="preserve">Dưới 1.000 từ, dưới 5 ảnh</w:t>
+            </w:r>
+          </w:p>
+        </w:tc>
+        <w:tc>
+          <w:tcPr>
+            <w:tcW w:type="dxa" w:w="3500"/>
+            <w:shd w:fill="F5F7FA" w:val="clear"/>
+            <w:tcMar>
+              <w:top w:type="dxa" w:w="90"/>
+              <w:left w:type="dxa" w:w="100"/>
+              <w:bottom w:type="dxa" w:w="90"/>
+              <w:right w:type="dxa" w:w="100"/>
+            </w:tcMar>
+            <w:vAlign w:val="center"/>
+          </w:tcPr>
+          <w:p>
+            <w:pPr>
+              <w:jc w:val="left"/>
+            </w:pPr>
+            <w:r>
+              <w:rPr>
+                <w:b w:val="false"/>
+                <w:bCs w:val="false"/>
+                <w:i w:val="false"/>
+                <w:iCs w:val="false"/>
+                <w:strike w:val="false"/>
+                <w:color w:val="27343A"/>
+                <w:sz w:val="18"/>
+                <w:szCs w:val="18"/>
+              </w:rPr>
+              <w:t xml:space="preserve">1 link nofollow (thêm link +500.000đ)</w:t>
+            </w:r>
+          </w:p>
+        </w:tc>
+        <w:tc>
+          <w:tcPr>
+            <w:tcW w:type="dxa" w:w="1600"/>
             <w:shd w:fill="F5F7FA" w:val="clear"/>
             <w:tcMar>
               <w:top w:type="dxa" w:w="90"/>
@@ -915,10 +1333,12 @@
               <w:rPr>
                 <w:b w:val="false"/>
                 <w:bCs w:val="false"/>
+                <w:i w:val="false"/>
+                <w:iCs w:val="false"/>
                 <w:strike/>
                 <w:color w:val="9AA3AF"/>
-                <w:sz w:val="20"/>
-                <w:szCs w:val="20"/>
+                <w:sz w:val="18"/>
+                <w:szCs w:val="18"/>
               </w:rPr>
               <w:t xml:space="preserve">5.400.000 đ</w:t>
             </w:r>
@@ -944,10 +1364,12 @@
               <w:rPr>
                 <w:b/>
                 <w:bCs/>
+                <w:i w:val="false"/>
+                <w:iCs w:val="false"/>
                 <w:strike w:val="false"/>
                 <w:color w:val="C0553A"/>
-                <w:sz w:val="20"/>
-                <w:szCs w:val="20"/>
+                <w:sz w:val="18"/>
+                <w:szCs w:val="18"/>
               </w:rPr>
               <w:t xml:space="preserve">-23%</w:t>
             </w:r>
@@ -955,7 +1377,7 @@
         </w:tc>
         <w:tc>
           <w:tcPr>
-            <w:tcW w:type="dxa" w:w="1800"/>
+            <w:tcW w:type="dxa" w:w="2000"/>
             <w:shd w:fill="F5F7FA" w:val="clear"/>
             <w:tcMar>
               <w:top w:type="dxa" w:w="90"/>
@@ -973,10 +1395,12 @@
               <w:rPr>
                 <w:b/>
                 <w:bCs/>
+                <w:i w:val="false"/>
+                <w:iCs w:val="false"/>
                 <w:strike w:val="false"/>
                 <w:color w:val="0E8C7F"/>
-                <w:sz w:val="20"/>
-                <w:szCs w:val="20"/>
+                <w:sz w:val="18"/>
+                <w:szCs w:val="18"/>
               </w:rPr>
               <w:t xml:space="preserve">4.158.000 đ</w:t>
             </w:r>
@@ -986,7 +1410,7 @@
       <w:tr>
         <w:tc>
           <w:tcPr>
-            <w:tcW w:type="dxa" w:w="450"/>
+            <w:tcW w:type="dxa" w:w="500"/>
             <w:shd w:fill="FFFFFF" w:val="clear"/>
             <w:tcMar>
               <w:top w:type="dxa" w:w="90"/>
@@ -1004,10 +1428,12 @@
               <w:rPr>
                 <w:b w:val="false"/>
                 <w:bCs w:val="false"/>
-                <w:strike w:val="false"/>
-                <w:color w:val="27343A"/>
-                <w:sz w:val="20"/>
-                <w:szCs w:val="20"/>
+                <w:i w:val="false"/>
+                <w:iCs w:val="false"/>
+                <w:strike w:val="false"/>
+                <w:color w:val="27343A"/>
+                <w:sz w:val="18"/>
+                <w:szCs w:val="18"/>
               </w:rPr>
               <w:t xml:space="preserve">5</w:t>
             </w:r>
@@ -1015,65 +1441,144 @@
         </w:tc>
         <w:tc>
           <w:tcPr>
-            <w:tcW w:type="dxa" w:w="2450"/>
-            <w:shd w:fill="FFFFFF" w:val="clear"/>
-            <w:tcMar>
-              <w:top w:type="dxa" w:w="90"/>
-              <w:left w:type="dxa" w:w="100"/>
-              <w:bottom w:type="dxa" w:w="90"/>
-              <w:right w:type="dxa" w:w="100"/>
-            </w:tcMar>
-            <w:vAlign w:val="center"/>
-          </w:tcPr>
-          <w:p>
-            <w:pPr>
-              <w:jc w:val="left"/>
-            </w:pPr>
-            <w:r>
-              <w:rPr>
-                <w:b/>
-                <w:bCs/>
-                <w:strike w:val="false"/>
-                <w:color w:val="27343A"/>
-                <w:sz w:val="20"/>
-                <w:szCs w:val="20"/>
-              </w:rPr>
-              <w:t xml:space="preserve">CafeBiz (cafebiz.vn)</w:t>
-            </w:r>
-          </w:p>
-        </w:tc>
-        <w:tc>
-          <w:tcPr>
-            <w:tcW w:type="dxa" w:w="2650"/>
-            <w:shd w:fill="FFFFFF" w:val="clear"/>
-            <w:tcMar>
-              <w:top w:type="dxa" w:w="90"/>
-              <w:left w:type="dxa" w:w="100"/>
-              <w:bottom w:type="dxa" w:w="90"/>
-              <w:right w:type="dxa" w:w="100"/>
-            </w:tcMar>
-            <w:vAlign w:val="center"/>
-          </w:tcPr>
-          <w:p>
-            <w:pPr>
-              <w:jc w:val="left"/>
-            </w:pPr>
-            <w:r>
-              <w:rPr>
-                <w:b w:val="false"/>
-                <w:bCs w:val="false"/>
-                <w:strike w:val="false"/>
-                <w:color w:val="27343A"/>
-                <w:sz w:val="20"/>
-                <w:szCs w:val="20"/>
-              </w:rPr>
-              <w:t xml:space="preserve">1.000 từ + 3 ảnh + 1 link</w:t>
-            </w:r>
-          </w:p>
-        </w:tc>
-        <w:tc>
-          <w:tcPr>
-            <w:tcW w:type="dxa" w:w="1550"/>
+            <w:tcW w:type="dxa" w:w="1900"/>
+            <w:shd w:fill="FFFFFF" w:val="clear"/>
+            <w:tcMar>
+              <w:top w:type="dxa" w:w="90"/>
+              <w:left w:type="dxa" w:w="100"/>
+              <w:bottom w:type="dxa" w:w="90"/>
+              <w:right w:type="dxa" w:w="100"/>
+            </w:tcMar>
+            <w:vAlign w:val="center"/>
+          </w:tcPr>
+          <w:p>
+            <w:pPr>
+              <w:jc w:val="left"/>
+            </w:pPr>
+            <w:r>
+              <w:rPr>
+                <w:b/>
+                <w:bCs/>
+                <w:i w:val="false"/>
+                <w:iCs w:val="false"/>
+                <w:strike w:val="false"/>
+                <w:color w:val="27343A"/>
+                <w:sz w:val="18"/>
+                <w:szCs w:val="18"/>
+              </w:rPr>
+              <w:t xml:space="preserve">CafeBiz</w:t>
+            </w:r>
+            <w:r>
+              <w:rPr>
+                <w:b w:val="false"/>
+                <w:bCs w:val="false"/>
+                <w:i w:val="false"/>
+                <w:iCs w:val="false"/>
+                <w:strike w:val="false"/>
+                <w:color w:val="8A93A0"/>
+                <w:sz w:val="15"/>
+                <w:szCs w:val="15"/>
+              </w:rPr>
+              <w:t xml:space="preserve"> (cafebiz.vn)</w:t>
+            </w:r>
+          </w:p>
+        </w:tc>
+        <w:tc>
+          <w:tcPr>
+            <w:tcW w:type="dxa" w:w="2300"/>
+            <w:shd w:fill="FFFFFF" w:val="clear"/>
+            <w:tcMar>
+              <w:top w:type="dxa" w:w="90"/>
+              <w:left w:type="dxa" w:w="100"/>
+              <w:bottom w:type="dxa" w:w="90"/>
+              <w:right w:type="dxa" w:w="100"/>
+            </w:tcMar>
+            <w:vAlign w:val="center"/>
+          </w:tcPr>
+          <w:p>
+            <w:pPr>
+              <w:jc w:val="left"/>
+            </w:pPr>
+            <w:r>
+              <w:rPr>
+                <w:b w:val="false"/>
+                <w:bCs w:val="false"/>
+                <w:i w:val="false"/>
+                <w:iCs w:val="false"/>
+                <w:strike w:val="false"/>
+                <w:color w:val="27343A"/>
+                <w:sz w:val="18"/>
+                <w:szCs w:val="18"/>
+              </w:rPr>
+              <w:t xml:space="preserve">Chuyên mục</w:t>
+            </w:r>
+          </w:p>
+        </w:tc>
+        <w:tc>
+          <w:tcPr>
+            <w:tcW w:type="dxa" w:w="1900"/>
+            <w:shd w:fill="FFFFFF" w:val="clear"/>
+            <w:tcMar>
+              <w:top w:type="dxa" w:w="90"/>
+              <w:left w:type="dxa" w:w="100"/>
+              <w:bottom w:type="dxa" w:w="90"/>
+              <w:right w:type="dxa" w:w="100"/>
+            </w:tcMar>
+            <w:vAlign w:val="center"/>
+          </w:tcPr>
+          <w:p>
+            <w:pPr>
+              <w:jc w:val="left"/>
+            </w:pPr>
+            <w:r>
+              <w:rPr>
+                <w:b w:val="false"/>
+                <w:bCs w:val="false"/>
+                <w:i w:val="false"/>
+                <w:iCs w:val="false"/>
+                <w:strike w:val="false"/>
+                <w:color w:val="27343A"/>
+                <w:sz w:val="18"/>
+                <w:szCs w:val="18"/>
+              </w:rPr>
+              <w:t xml:space="preserve">Dưới 1.000 từ, dưới 3 ảnh</w:t>
+            </w:r>
+          </w:p>
+        </w:tc>
+        <w:tc>
+          <w:tcPr>
+            <w:tcW w:type="dxa" w:w="3500"/>
+            <w:shd w:fill="FFFFFF" w:val="clear"/>
+            <w:tcMar>
+              <w:top w:type="dxa" w:w="90"/>
+              <w:left w:type="dxa" w:w="100"/>
+              <w:bottom w:type="dxa" w:w="90"/>
+              <w:right w:type="dxa" w:w="100"/>
+            </w:tcMar>
+            <w:vAlign w:val="center"/>
+          </w:tcPr>
+          <w:p>
+            <w:pPr>
+              <w:jc w:val="left"/>
+            </w:pPr>
+            <w:r>
+              <w:rPr>
+                <w:b w:val="false"/>
+                <w:bCs w:val="false"/>
+                <w:i w:val="false"/>
+                <w:iCs w:val="false"/>
+                <w:strike w:val="false"/>
+                <w:color w:val="27343A"/>
+                <w:sz w:val="18"/>
+                <w:szCs w:val="18"/>
+              </w:rPr>
+              <w:t xml:space="preserve">1 link nofollow (thêm link +500.000đ)</w:t>
+            </w:r>
+          </w:p>
+        </w:tc>
+        <w:tc>
+          <w:tcPr>
+            <w:tcW w:type="dxa" w:w="1600"/>
             <w:shd w:fill="FFFFFF" w:val="clear"/>
             <w:tcMar>
               <w:top w:type="dxa" w:w="90"/>
@@ -1091,10 +1596,12 @@
               <w:rPr>
                 <w:b w:val="false"/>
                 <w:bCs w:val="false"/>
+                <w:i w:val="false"/>
+                <w:iCs w:val="false"/>
                 <w:strike/>
                 <w:color w:val="9AA3AF"/>
-                <w:sz w:val="20"/>
-                <w:szCs w:val="20"/>
+                <w:sz w:val="18"/>
+                <w:szCs w:val="18"/>
               </w:rPr>
               <w:t xml:space="preserve">4.500.000 đ</w:t>
             </w:r>
@@ -1120,10 +1627,12 @@
               <w:rPr>
                 <w:b/>
                 <w:bCs/>
+                <w:i w:val="false"/>
+                <w:iCs w:val="false"/>
                 <w:strike w:val="false"/>
                 <w:color w:val="C0553A"/>
-                <w:sz w:val="20"/>
-                <w:szCs w:val="20"/>
+                <w:sz w:val="18"/>
+                <w:szCs w:val="18"/>
               </w:rPr>
               <w:t xml:space="preserve">-20%</w:t>
             </w:r>
@@ -1131,7 +1640,7 @@
         </w:tc>
         <w:tc>
           <w:tcPr>
-            <w:tcW w:type="dxa" w:w="1800"/>
+            <w:tcW w:type="dxa" w:w="2000"/>
             <w:shd w:fill="FFFFFF" w:val="clear"/>
             <w:tcMar>
               <w:top w:type="dxa" w:w="90"/>
@@ -1149,10 +1658,12 @@
               <w:rPr>
                 <w:b/>
                 <w:bCs/>
+                <w:i w:val="false"/>
+                <w:iCs w:val="false"/>
                 <w:strike w:val="false"/>
                 <w:color w:val="0E8C7F"/>
-                <w:sz w:val="20"/>
-                <w:szCs w:val="20"/>
+                <w:sz w:val="18"/>
+                <w:szCs w:val="18"/>
               </w:rPr>
               <w:t xml:space="preserve">3.600.000 đ</w:t>
             </w:r>
@@ -1162,7 +1673,7 @@
       <w:tr>
         <w:tc>
           <w:tcPr>
-            <w:tcW w:type="dxa" w:w="450"/>
+            <w:tcW w:type="dxa" w:w="500"/>
             <w:shd w:fill="F5F7FA" w:val="clear"/>
             <w:tcMar>
               <w:top w:type="dxa" w:w="90"/>
@@ -1180,10 +1691,12 @@
               <w:rPr>
                 <w:b w:val="false"/>
                 <w:bCs w:val="false"/>
-                <w:strike w:val="false"/>
-                <w:color w:val="27343A"/>
-                <w:sz w:val="20"/>
-                <w:szCs w:val="20"/>
+                <w:i w:val="false"/>
+                <w:iCs w:val="false"/>
+                <w:strike w:val="false"/>
+                <w:color w:val="27343A"/>
+                <w:sz w:val="18"/>
+                <w:szCs w:val="18"/>
               </w:rPr>
               <w:t xml:space="preserve">6</w:t>
             </w:r>
@@ -1191,65 +1704,144 @@
         </w:tc>
         <w:tc>
           <w:tcPr>
-            <w:tcW w:type="dxa" w:w="2450"/>
-            <w:shd w:fill="F5F7FA" w:val="clear"/>
-            <w:tcMar>
-              <w:top w:type="dxa" w:w="90"/>
-              <w:left w:type="dxa" w:w="100"/>
-              <w:bottom w:type="dxa" w:w="90"/>
-              <w:right w:type="dxa" w:w="100"/>
-            </w:tcMar>
-            <w:vAlign w:val="center"/>
-          </w:tcPr>
-          <w:p>
-            <w:pPr>
-              <w:jc w:val="left"/>
-            </w:pPr>
-            <w:r>
-              <w:rPr>
-                <w:b/>
-                <w:bCs/>
-                <w:strike w:val="false"/>
-                <w:color w:val="27343A"/>
-                <w:sz w:val="20"/>
-                <w:szCs w:val="20"/>
-              </w:rPr>
-              <w:t xml:space="preserve">Soha (soha.vn)</w:t>
-            </w:r>
-          </w:p>
-        </w:tc>
-        <w:tc>
-          <w:tcPr>
-            <w:tcW w:type="dxa" w:w="2650"/>
-            <w:shd w:fill="F5F7FA" w:val="clear"/>
-            <w:tcMar>
-              <w:top w:type="dxa" w:w="90"/>
-              <w:left w:type="dxa" w:w="100"/>
-              <w:bottom w:type="dxa" w:w="90"/>
-              <w:right w:type="dxa" w:w="100"/>
-            </w:tcMar>
-            <w:vAlign w:val="center"/>
-          </w:tcPr>
-          <w:p>
-            <w:pPr>
-              <w:jc w:val="left"/>
-            </w:pPr>
-            <w:r>
-              <w:rPr>
-                <w:b w:val="false"/>
-                <w:bCs w:val="false"/>
-                <w:strike w:val="false"/>
-                <w:color w:val="27343A"/>
-                <w:sz w:val="20"/>
-                <w:szCs w:val="20"/>
-              </w:rPr>
-              <w:t xml:space="preserve">1.000 từ + 5 ảnh + 1 link</w:t>
-            </w:r>
-          </w:p>
-        </w:tc>
-        <w:tc>
-          <w:tcPr>
-            <w:tcW w:type="dxa" w:w="1550"/>
+            <w:tcW w:type="dxa" w:w="1900"/>
+            <w:shd w:fill="F5F7FA" w:val="clear"/>
+            <w:tcMar>
+              <w:top w:type="dxa" w:w="90"/>
+              <w:left w:type="dxa" w:w="100"/>
+              <w:bottom w:type="dxa" w:w="90"/>
+              <w:right w:type="dxa" w:w="100"/>
+            </w:tcMar>
+            <w:vAlign w:val="center"/>
+          </w:tcPr>
+          <w:p>
+            <w:pPr>
+              <w:jc w:val="left"/>
+            </w:pPr>
+            <w:r>
+              <w:rPr>
+                <w:b/>
+                <w:bCs/>
+                <w:i w:val="false"/>
+                <w:iCs w:val="false"/>
+                <w:strike w:val="false"/>
+                <w:color w:val="27343A"/>
+                <w:sz w:val="18"/>
+                <w:szCs w:val="18"/>
+              </w:rPr>
+              <w:t xml:space="preserve">Soha</w:t>
+            </w:r>
+            <w:r>
+              <w:rPr>
+                <w:b w:val="false"/>
+                <w:bCs w:val="false"/>
+                <w:i w:val="false"/>
+                <w:iCs w:val="false"/>
+                <w:strike w:val="false"/>
+                <w:color w:val="8A93A0"/>
+                <w:sz w:val="15"/>
+                <w:szCs w:val="15"/>
+              </w:rPr>
+              <w:t xml:space="preserve"> (soha.vn)</w:t>
+            </w:r>
+          </w:p>
+        </w:tc>
+        <w:tc>
+          <w:tcPr>
+            <w:tcW w:type="dxa" w:w="2300"/>
+            <w:shd w:fill="F5F7FA" w:val="clear"/>
+            <w:tcMar>
+              <w:top w:type="dxa" w:w="90"/>
+              <w:left w:type="dxa" w:w="100"/>
+              <w:bottom w:type="dxa" w:w="90"/>
+              <w:right w:type="dxa" w:w="100"/>
+            </w:tcMar>
+            <w:vAlign w:val="center"/>
+          </w:tcPr>
+          <w:p>
+            <w:pPr>
+              <w:jc w:val="left"/>
+            </w:pPr>
+            <w:r>
+              <w:rPr>
+                <w:b w:val="false"/>
+                <w:bCs w:val="false"/>
+                <w:i w:val="false"/>
+                <w:iCs w:val="false"/>
+                <w:strike w:val="false"/>
+                <w:color w:val="27343A"/>
+                <w:sz w:val="18"/>
+                <w:szCs w:val="18"/>
+              </w:rPr>
+              <w:t xml:space="preserve">Bài stream trang chủ</w:t>
+            </w:r>
+          </w:p>
+        </w:tc>
+        <w:tc>
+          <w:tcPr>
+            <w:tcW w:type="dxa" w:w="1900"/>
+            <w:shd w:fill="F5F7FA" w:val="clear"/>
+            <w:tcMar>
+              <w:top w:type="dxa" w:w="90"/>
+              <w:left w:type="dxa" w:w="100"/>
+              <w:bottom w:type="dxa" w:w="90"/>
+              <w:right w:type="dxa" w:w="100"/>
+            </w:tcMar>
+            <w:vAlign w:val="center"/>
+          </w:tcPr>
+          <w:p>
+            <w:pPr>
+              <w:jc w:val="left"/>
+            </w:pPr>
+            <w:r>
+              <w:rPr>
+                <w:b w:val="false"/>
+                <w:bCs w:val="false"/>
+                <w:i w:val="false"/>
+                <w:iCs w:val="false"/>
+                <w:strike w:val="false"/>
+                <w:color w:val="27343A"/>
+                <w:sz w:val="18"/>
+                <w:szCs w:val="18"/>
+              </w:rPr>
+              <w:t xml:space="preserve">Dưới 1.000 từ, dưới 5 ảnh</w:t>
+            </w:r>
+          </w:p>
+        </w:tc>
+        <w:tc>
+          <w:tcPr>
+            <w:tcW w:type="dxa" w:w="3500"/>
+            <w:shd w:fill="F5F7FA" w:val="clear"/>
+            <w:tcMar>
+              <w:top w:type="dxa" w:w="90"/>
+              <w:left w:type="dxa" w:w="100"/>
+              <w:bottom w:type="dxa" w:w="90"/>
+              <w:right w:type="dxa" w:w="100"/>
+            </w:tcMar>
+            <w:vAlign w:val="center"/>
+          </w:tcPr>
+          <w:p>
+            <w:pPr>
+              <w:jc w:val="left"/>
+            </w:pPr>
+            <w:r>
+              <w:rPr>
+                <w:b w:val="false"/>
+                <w:bCs w:val="false"/>
+                <w:i w:val="false"/>
+                <w:iCs w:val="false"/>
+                <w:strike w:val="false"/>
+                <w:color w:val="27343A"/>
+                <w:sz w:val="18"/>
+                <w:szCs w:val="18"/>
+              </w:rPr>
+              <w:t xml:space="preserve">1 link nofollow</w:t>
+            </w:r>
+          </w:p>
+        </w:tc>
+        <w:tc>
+          <w:tcPr>
+            <w:tcW w:type="dxa" w:w="1600"/>
             <w:shd w:fill="F5F7FA" w:val="clear"/>
             <w:tcMar>
               <w:top w:type="dxa" w:w="90"/>
@@ -1267,10 +1859,12 @@
               <w:rPr>
                 <w:b w:val="false"/>
                 <w:bCs w:val="false"/>
+                <w:i w:val="false"/>
+                <w:iCs w:val="false"/>
                 <w:strike/>
                 <w:color w:val="9AA3AF"/>
-                <w:sz w:val="20"/>
-                <w:szCs w:val="20"/>
+                <w:sz w:val="18"/>
+                <w:szCs w:val="18"/>
               </w:rPr>
               <w:t xml:space="preserve">4.600.000 đ</w:t>
             </w:r>
@@ -1296,10 +1890,12 @@
               <w:rPr>
                 <w:b/>
                 <w:bCs/>
+                <w:i w:val="false"/>
+                <w:iCs w:val="false"/>
                 <w:strike w:val="false"/>
                 <w:color w:val="C0553A"/>
-                <w:sz w:val="20"/>
-                <w:szCs w:val="20"/>
+                <w:sz w:val="18"/>
+                <w:szCs w:val="18"/>
               </w:rPr>
               <w:t xml:space="preserve">-24%</w:t>
             </w:r>
@@ -1307,7 +1903,7 @@
         </w:tc>
         <w:tc>
           <w:tcPr>
-            <w:tcW w:type="dxa" w:w="1800"/>
+            <w:tcW w:type="dxa" w:w="2000"/>
             <w:shd w:fill="F5F7FA" w:val="clear"/>
             <w:tcMar>
               <w:top w:type="dxa" w:w="90"/>
@@ -1325,10 +1921,12 @@
               <w:rPr>
                 <w:b/>
                 <w:bCs/>
+                <w:i w:val="false"/>
+                <w:iCs w:val="false"/>
                 <w:strike w:val="false"/>
                 <w:color w:val="0E8C7F"/>
-                <w:sz w:val="20"/>
-                <w:szCs w:val="20"/>
+                <w:sz w:val="18"/>
+                <w:szCs w:val="18"/>
               </w:rPr>
               <w:t xml:space="preserve">3.496.000 đ</w:t>
             </w:r>
@@ -1338,7 +1936,7 @@
       <w:tr>
         <w:tc>
           <w:tcPr>
-            <w:tcW w:type="dxa" w:w="450"/>
+            <w:tcW w:type="dxa" w:w="500"/>
             <w:shd w:fill="FFFFFF" w:val="clear"/>
             <w:tcMar>
               <w:top w:type="dxa" w:w="90"/>
@@ -1356,10 +1954,12 @@
               <w:rPr>
                 <w:b w:val="false"/>
                 <w:bCs w:val="false"/>
-                <w:strike w:val="false"/>
-                <w:color w:val="27343A"/>
-                <w:sz w:val="20"/>
-                <w:szCs w:val="20"/>
+                <w:i w:val="false"/>
+                <w:iCs w:val="false"/>
+                <w:strike w:val="false"/>
+                <w:color w:val="27343A"/>
+                <w:sz w:val="18"/>
+                <w:szCs w:val="18"/>
               </w:rPr>
               <w:t xml:space="preserve">7</w:t>
             </w:r>
@@ -1367,65 +1967,144 @@
         </w:tc>
         <w:tc>
           <w:tcPr>
-            <w:tcW w:type="dxa" w:w="2450"/>
-            <w:shd w:fill="FFFFFF" w:val="clear"/>
-            <w:tcMar>
-              <w:top w:type="dxa" w:w="90"/>
-              <w:left w:type="dxa" w:w="100"/>
-              <w:bottom w:type="dxa" w:w="90"/>
-              <w:right w:type="dxa" w:w="100"/>
-            </w:tcMar>
-            <w:vAlign w:val="center"/>
-          </w:tcPr>
-          <w:p>
-            <w:pPr>
-              <w:jc w:val="left"/>
-            </w:pPr>
-            <w:r>
-              <w:rPr>
-                <w:b/>
-                <w:bCs/>
-                <w:strike w:val="false"/>
-                <w:color w:val="27343A"/>
-                <w:sz w:val="20"/>
-                <w:szCs w:val="20"/>
-              </w:rPr>
-              <w:t xml:space="preserve">Yan (yan.vn)</w:t>
-            </w:r>
-          </w:p>
-        </w:tc>
-        <w:tc>
-          <w:tcPr>
-            <w:tcW w:type="dxa" w:w="2650"/>
-            <w:shd w:fill="FFFFFF" w:val="clear"/>
-            <w:tcMar>
-              <w:top w:type="dxa" w:w="90"/>
-              <w:left w:type="dxa" w:w="100"/>
-              <w:bottom w:type="dxa" w:w="90"/>
-              <w:right w:type="dxa" w:w="100"/>
-            </w:tcMar>
-            <w:vAlign w:val="center"/>
-          </w:tcPr>
-          <w:p>
-            <w:pPr>
-              <w:jc w:val="left"/>
-            </w:pPr>
-            <w:r>
-              <w:rPr>
-                <w:b w:val="false"/>
-                <w:bCs w:val="false"/>
-                <w:strike w:val="false"/>
-                <w:color w:val="27343A"/>
-                <w:sz w:val="20"/>
-                <w:szCs w:val="20"/>
-              </w:rPr>
-              <w:t xml:space="preserve">1.000 từ + 3 ảnh + không chèn link</w:t>
-            </w:r>
-          </w:p>
-        </w:tc>
-        <w:tc>
-          <w:tcPr>
-            <w:tcW w:type="dxa" w:w="1550"/>
+            <w:tcW w:type="dxa" w:w="1900"/>
+            <w:shd w:fill="FFFFFF" w:val="clear"/>
+            <w:tcMar>
+              <w:top w:type="dxa" w:w="90"/>
+              <w:left w:type="dxa" w:w="100"/>
+              <w:bottom w:type="dxa" w:w="90"/>
+              <w:right w:type="dxa" w:w="100"/>
+            </w:tcMar>
+            <w:vAlign w:val="center"/>
+          </w:tcPr>
+          <w:p>
+            <w:pPr>
+              <w:jc w:val="left"/>
+            </w:pPr>
+            <w:r>
+              <w:rPr>
+                <w:b/>
+                <w:bCs/>
+                <w:i w:val="false"/>
+                <w:iCs w:val="false"/>
+                <w:strike w:val="false"/>
+                <w:color w:val="27343A"/>
+                <w:sz w:val="18"/>
+                <w:szCs w:val="18"/>
+              </w:rPr>
+              <w:t xml:space="preserve">Yan</w:t>
+            </w:r>
+            <w:r>
+              <w:rPr>
+                <w:b w:val="false"/>
+                <w:bCs w:val="false"/>
+                <w:i w:val="false"/>
+                <w:iCs w:val="false"/>
+                <w:strike w:val="false"/>
+                <w:color w:val="8A93A0"/>
+                <w:sz w:val="15"/>
+                <w:szCs w:val="15"/>
+              </w:rPr>
+              <w:t xml:space="preserve"> (yan.vn)</w:t>
+            </w:r>
+          </w:p>
+        </w:tc>
+        <w:tc>
+          <w:tcPr>
+            <w:tcW w:type="dxa" w:w="2300"/>
+            <w:shd w:fill="FFFFFF" w:val="clear"/>
+            <w:tcMar>
+              <w:top w:type="dxa" w:w="90"/>
+              <w:left w:type="dxa" w:w="100"/>
+              <w:bottom w:type="dxa" w:w="90"/>
+              <w:right w:type="dxa" w:w="100"/>
+            </w:tcMar>
+            <w:vAlign w:val="center"/>
+          </w:tcPr>
+          <w:p>
+            <w:pPr>
+              <w:jc w:val="left"/>
+            </w:pPr>
+            <w:r>
+              <w:rPr>
+                <w:b w:val="false"/>
+                <w:bCs w:val="false"/>
+                <w:i w:val="false"/>
+                <w:iCs w:val="false"/>
+                <w:strike w:val="false"/>
+                <w:color w:val="27343A"/>
+                <w:sz w:val="18"/>
+                <w:szCs w:val="18"/>
+              </w:rPr>
+              <w:t xml:space="preserve">Mục phù hợp</w:t>
+            </w:r>
+          </w:p>
+        </w:tc>
+        <w:tc>
+          <w:tcPr>
+            <w:tcW w:type="dxa" w:w="1900"/>
+            <w:shd w:fill="FFFFFF" w:val="clear"/>
+            <w:tcMar>
+              <w:top w:type="dxa" w:w="90"/>
+              <w:left w:type="dxa" w:w="100"/>
+              <w:bottom w:type="dxa" w:w="90"/>
+              <w:right w:type="dxa" w:w="100"/>
+            </w:tcMar>
+            <w:vAlign w:val="center"/>
+          </w:tcPr>
+          <w:p>
+            <w:pPr>
+              <w:jc w:val="left"/>
+            </w:pPr>
+            <w:r>
+              <w:rPr>
+                <w:b w:val="false"/>
+                <w:bCs w:val="false"/>
+                <w:i w:val="false"/>
+                <w:iCs w:val="false"/>
+                <w:strike w:val="false"/>
+                <w:color w:val="27343A"/>
+                <w:sz w:val="18"/>
+                <w:szCs w:val="18"/>
+              </w:rPr>
+              <w:t xml:space="preserve">Dưới 1.000 từ, dưới 3 ảnh</w:t>
+            </w:r>
+          </w:p>
+        </w:tc>
+        <w:tc>
+          <w:tcPr>
+            <w:tcW w:type="dxa" w:w="3500"/>
+            <w:shd w:fill="FFFFFF" w:val="clear"/>
+            <w:tcMar>
+              <w:top w:type="dxa" w:w="90"/>
+              <w:left w:type="dxa" w:w="100"/>
+              <w:bottom w:type="dxa" w:w="90"/>
+              <w:right w:type="dxa" w:w="100"/>
+            </w:tcMar>
+            <w:vAlign w:val="center"/>
+          </w:tcPr>
+          <w:p>
+            <w:pPr>
+              <w:jc w:val="left"/>
+            </w:pPr>
+            <w:r>
+              <w:rPr>
+                <w:b w:val="false"/>
+                <w:bCs w:val="false"/>
+                <w:i w:val="false"/>
+                <w:iCs w:val="false"/>
+                <w:strike w:val="false"/>
+                <w:color w:val="27343A"/>
+                <w:sz w:val="18"/>
+                <w:szCs w:val="18"/>
+              </w:rPr>
+              <w:t xml:space="preserve">Không chèn link</w:t>
+            </w:r>
+          </w:p>
+        </w:tc>
+        <w:tc>
+          <w:tcPr>
+            <w:tcW w:type="dxa" w:w="1600"/>
             <w:shd w:fill="FFFFFF" w:val="clear"/>
             <w:tcMar>
               <w:top w:type="dxa" w:w="90"/>
@@ -1443,10 +2122,12 @@
               <w:rPr>
                 <w:b w:val="false"/>
                 <w:bCs w:val="false"/>
+                <w:i w:val="false"/>
+                <w:iCs w:val="false"/>
                 <w:strike/>
                 <w:color w:val="9AA3AF"/>
-                <w:sz w:val="20"/>
-                <w:szCs w:val="20"/>
+                <w:sz w:val="18"/>
+                <w:szCs w:val="18"/>
               </w:rPr>
               <w:t xml:space="preserve">4.500.000 đ</w:t>
             </w:r>
@@ -1472,10 +2153,12 @@
               <w:rPr>
                 <w:b/>
                 <w:bCs/>
+                <w:i w:val="false"/>
+                <w:iCs w:val="false"/>
                 <w:strike w:val="false"/>
                 <w:color w:val="C0553A"/>
-                <w:sz w:val="20"/>
-                <w:szCs w:val="20"/>
+                <w:sz w:val="18"/>
+                <w:szCs w:val="18"/>
               </w:rPr>
               <w:t xml:space="preserve">-21%</w:t>
             </w:r>
@@ -1483,7 +2166,7 @@
         </w:tc>
         <w:tc>
           <w:tcPr>
-            <w:tcW w:type="dxa" w:w="1800"/>
+            <w:tcW w:type="dxa" w:w="2000"/>
             <w:shd w:fill="FFFFFF" w:val="clear"/>
             <w:tcMar>
               <w:top w:type="dxa" w:w="90"/>
@@ -1501,10 +2184,12 @@
               <w:rPr>
                 <w:b/>
                 <w:bCs/>
+                <w:i w:val="false"/>
+                <w:iCs w:val="false"/>
                 <w:strike w:val="false"/>
                 <w:color w:val="0E8C7F"/>
-                <w:sz w:val="20"/>
-                <w:szCs w:val="20"/>
+                <w:sz w:val="18"/>
+                <w:szCs w:val="18"/>
               </w:rPr>
               <w:t xml:space="preserve">3.555.000 đ</w:t>
             </w:r>
@@ -1514,7 +2199,7 @@
       <w:tr>
         <w:tc>
           <w:tcPr>
-            <w:tcW w:type="dxa" w:w="450"/>
+            <w:tcW w:type="dxa" w:w="500"/>
             <w:shd w:fill="F5F7FA" w:val="clear"/>
             <w:tcMar>
               <w:top w:type="dxa" w:w="90"/>
@@ -1532,10 +2217,12 @@
               <w:rPr>
                 <w:b w:val="false"/>
                 <w:bCs w:val="false"/>
-                <w:strike w:val="false"/>
-                <w:color w:val="27343A"/>
-                <w:sz w:val="20"/>
-                <w:szCs w:val="20"/>
+                <w:i w:val="false"/>
+                <w:iCs w:val="false"/>
+                <w:strike w:val="false"/>
+                <w:color w:val="27343A"/>
+                <w:sz w:val="18"/>
+                <w:szCs w:val="18"/>
               </w:rPr>
               <w:t xml:space="preserve">8</w:t>
             </w:r>
@@ -1543,65 +2230,144 @@
         </w:tc>
         <w:tc>
           <w:tcPr>
-            <w:tcW w:type="dxa" w:w="2450"/>
-            <w:shd w:fill="F5F7FA" w:val="clear"/>
-            <w:tcMar>
-              <w:top w:type="dxa" w:w="90"/>
-              <w:left w:type="dxa" w:w="100"/>
-              <w:bottom w:type="dxa" w:w="90"/>
-              <w:right w:type="dxa" w:w="100"/>
-            </w:tcMar>
-            <w:vAlign w:val="center"/>
-          </w:tcPr>
-          <w:p>
-            <w:pPr>
-              <w:jc w:val="left"/>
-            </w:pPr>
-            <w:r>
-              <w:rPr>
-                <w:b/>
-                <w:bCs/>
-                <w:strike w:val="false"/>
-                <w:color w:val="27343A"/>
-                <w:sz w:val="20"/>
-                <w:szCs w:val="20"/>
-              </w:rPr>
-              <w:t xml:space="preserve">TechZ (techz.vn)</w:t>
-            </w:r>
-          </w:p>
-        </w:tc>
-        <w:tc>
-          <w:tcPr>
-            <w:tcW w:type="dxa" w:w="2650"/>
-            <w:shd w:fill="F5F7FA" w:val="clear"/>
-            <w:tcMar>
-              <w:top w:type="dxa" w:w="90"/>
-              <w:left w:type="dxa" w:w="100"/>
-              <w:bottom w:type="dxa" w:w="90"/>
-              <w:right w:type="dxa" w:w="100"/>
-            </w:tcMar>
-            <w:vAlign w:val="center"/>
-          </w:tcPr>
-          <w:p>
-            <w:pPr>
-              <w:jc w:val="left"/>
-            </w:pPr>
-            <w:r>
-              <w:rPr>
-                <w:b w:val="false"/>
-                <w:bCs w:val="false"/>
-                <w:strike w:val="false"/>
-                <w:color w:val="27343A"/>
-                <w:sz w:val="20"/>
-                <w:szCs w:val="20"/>
-              </w:rPr>
-              <w:t xml:space="preserve">1.000 từ + 3 ảnh + 1 link</w:t>
-            </w:r>
-          </w:p>
-        </w:tc>
-        <w:tc>
-          <w:tcPr>
-            <w:tcW w:type="dxa" w:w="1550"/>
+            <w:tcW w:type="dxa" w:w="1900"/>
+            <w:shd w:fill="F5F7FA" w:val="clear"/>
+            <w:tcMar>
+              <w:top w:type="dxa" w:w="90"/>
+              <w:left w:type="dxa" w:w="100"/>
+              <w:bottom w:type="dxa" w:w="90"/>
+              <w:right w:type="dxa" w:w="100"/>
+            </w:tcMar>
+            <w:vAlign w:val="center"/>
+          </w:tcPr>
+          <w:p>
+            <w:pPr>
+              <w:jc w:val="left"/>
+            </w:pPr>
+            <w:r>
+              <w:rPr>
+                <w:b/>
+                <w:bCs/>
+                <w:i w:val="false"/>
+                <w:iCs w:val="false"/>
+                <w:strike w:val="false"/>
+                <w:color w:val="27343A"/>
+                <w:sz w:val="18"/>
+                <w:szCs w:val="18"/>
+              </w:rPr>
+              <w:t xml:space="preserve">TechZ</w:t>
+            </w:r>
+            <w:r>
+              <w:rPr>
+                <w:b w:val="false"/>
+                <w:bCs w:val="false"/>
+                <w:i w:val="false"/>
+                <w:iCs w:val="false"/>
+                <w:strike w:val="false"/>
+                <w:color w:val="8A93A0"/>
+                <w:sz w:val="15"/>
+                <w:szCs w:val="15"/>
+              </w:rPr>
+              <w:t xml:space="preserve"> (techz.vn)</w:t>
+            </w:r>
+          </w:p>
+        </w:tc>
+        <w:tc>
+          <w:tcPr>
+            <w:tcW w:type="dxa" w:w="2300"/>
+            <w:shd w:fill="F5F7FA" w:val="clear"/>
+            <w:tcMar>
+              <w:top w:type="dxa" w:w="90"/>
+              <w:left w:type="dxa" w:w="100"/>
+              <w:bottom w:type="dxa" w:w="90"/>
+              <w:right w:type="dxa" w:w="100"/>
+            </w:tcMar>
+            <w:vAlign w:val="center"/>
+          </w:tcPr>
+          <w:p>
+            <w:pPr>
+              <w:jc w:val="left"/>
+            </w:pPr>
+            <w:r>
+              <w:rPr>
+                <w:b w:val="false"/>
+                <w:bCs w:val="false"/>
+                <w:i w:val="false"/>
+                <w:iCs w:val="false"/>
+                <w:strike w:val="false"/>
+                <w:color w:val="27343A"/>
+                <w:sz w:val="18"/>
+                <w:szCs w:val="18"/>
+              </w:rPr>
+              <w:t xml:space="preserve">Mục phù hợp</w:t>
+            </w:r>
+          </w:p>
+        </w:tc>
+        <w:tc>
+          <w:tcPr>
+            <w:tcW w:type="dxa" w:w="1900"/>
+            <w:shd w:fill="F5F7FA" w:val="clear"/>
+            <w:tcMar>
+              <w:top w:type="dxa" w:w="90"/>
+              <w:left w:type="dxa" w:w="100"/>
+              <w:bottom w:type="dxa" w:w="90"/>
+              <w:right w:type="dxa" w:w="100"/>
+            </w:tcMar>
+            <w:vAlign w:val="center"/>
+          </w:tcPr>
+          <w:p>
+            <w:pPr>
+              <w:jc w:val="left"/>
+            </w:pPr>
+            <w:r>
+              <w:rPr>
+                <w:b w:val="false"/>
+                <w:bCs w:val="false"/>
+                <w:i w:val="false"/>
+                <w:iCs w:val="false"/>
+                <w:strike w:val="false"/>
+                <w:color w:val="27343A"/>
+                <w:sz w:val="18"/>
+                <w:szCs w:val="18"/>
+              </w:rPr>
+              <w:t xml:space="preserve">Dưới 1.000 từ, dưới 3 ảnh</w:t>
+            </w:r>
+          </w:p>
+        </w:tc>
+        <w:tc>
+          <w:tcPr>
+            <w:tcW w:type="dxa" w:w="3500"/>
+            <w:shd w:fill="F5F7FA" w:val="clear"/>
+            <w:tcMar>
+              <w:top w:type="dxa" w:w="90"/>
+              <w:left w:type="dxa" w:w="100"/>
+              <w:bottom w:type="dxa" w:w="90"/>
+              <w:right w:type="dxa" w:w="100"/>
+            </w:tcMar>
+            <w:vAlign w:val="center"/>
+          </w:tcPr>
+          <w:p>
+            <w:pPr>
+              <w:jc w:val="left"/>
+            </w:pPr>
+            <w:r>
+              <w:rPr>
+                <w:b w:val="false"/>
+                <w:bCs w:val="false"/>
+                <w:i w:val="false"/>
+                <w:iCs w:val="false"/>
+                <w:strike w:val="false"/>
+                <w:color w:val="27343A"/>
+                <w:sz w:val="18"/>
+                <w:szCs w:val="18"/>
+              </w:rPr>
+              <w:t xml:space="preserve">1 link nofollow</w:t>
+            </w:r>
+          </w:p>
+        </w:tc>
+        <w:tc>
+          <w:tcPr>
+            <w:tcW w:type="dxa" w:w="1600"/>
             <w:shd w:fill="F5F7FA" w:val="clear"/>
             <w:tcMar>
               <w:top w:type="dxa" w:w="90"/>
@@ -1619,10 +2385,12 @@
               <w:rPr>
                 <w:b w:val="false"/>
                 <w:bCs w:val="false"/>
+                <w:i w:val="false"/>
+                <w:iCs w:val="false"/>
                 <w:strike/>
                 <w:color w:val="9AA3AF"/>
-                <w:sz w:val="20"/>
-                <w:szCs w:val="20"/>
+                <w:sz w:val="18"/>
+                <w:szCs w:val="18"/>
               </w:rPr>
               <w:t xml:space="preserve">2.000.000 đ</w:t>
             </w:r>
@@ -1648,10 +2416,12 @@
               <w:rPr>
                 <w:b/>
                 <w:bCs/>
+                <w:i w:val="false"/>
+                <w:iCs w:val="false"/>
                 <w:strike w:val="false"/>
                 <w:color w:val="C0553A"/>
-                <w:sz w:val="20"/>
-                <w:szCs w:val="20"/>
+                <w:sz w:val="18"/>
+                <w:szCs w:val="18"/>
               </w:rPr>
               <w:t xml:space="preserve">-26%</w:t>
             </w:r>
@@ -1659,7 +2429,7 @@
         </w:tc>
         <w:tc>
           <w:tcPr>
-            <w:tcW w:type="dxa" w:w="1800"/>
+            <w:tcW w:type="dxa" w:w="2000"/>
             <w:shd w:fill="F5F7FA" w:val="clear"/>
             <w:tcMar>
               <w:top w:type="dxa" w:w="90"/>
@@ -1677,10 +2447,12 @@
               <w:rPr>
                 <w:b/>
                 <w:bCs/>
+                <w:i w:val="false"/>
+                <w:iCs w:val="false"/>
                 <w:strike w:val="false"/>
                 <w:color w:val="0E8C7F"/>
-                <w:sz w:val="20"/>
-                <w:szCs w:val="20"/>
+                <w:sz w:val="18"/>
+                <w:szCs w:val="18"/>
               </w:rPr>
               <w:t xml:space="preserve">1.480.000 đ</w:t>
             </w:r>
@@ -1690,7 +2462,7 @@
       <w:tr>
         <w:tc>
           <w:tcPr>
-            <w:tcW w:type="dxa" w:w="450"/>
+            <w:tcW w:type="dxa" w:w="500"/>
             <w:shd w:fill="FFFFFF" w:val="clear"/>
             <w:tcMar>
               <w:top w:type="dxa" w:w="90"/>
@@ -1708,10 +2480,12 @@
               <w:rPr>
                 <w:b w:val="false"/>
                 <w:bCs w:val="false"/>
-                <w:strike w:val="false"/>
-                <w:color w:val="27343A"/>
-                <w:sz w:val="20"/>
-                <w:szCs w:val="20"/>
+                <w:i w:val="false"/>
+                <w:iCs w:val="false"/>
+                <w:strike w:val="false"/>
+                <w:color w:val="27343A"/>
+                <w:sz w:val="18"/>
+                <w:szCs w:val="18"/>
               </w:rPr>
               <w:t xml:space="preserve">9</w:t>
             </w:r>
@@ -1719,65 +2493,144 @@
         </w:tc>
         <w:tc>
           <w:tcPr>
-            <w:tcW w:type="dxa" w:w="2450"/>
-            <w:shd w:fill="FFFFFF" w:val="clear"/>
-            <w:tcMar>
-              <w:top w:type="dxa" w:w="90"/>
-              <w:left w:type="dxa" w:w="100"/>
-              <w:bottom w:type="dxa" w:w="90"/>
-              <w:right w:type="dxa" w:w="100"/>
-            </w:tcMar>
-            <w:vAlign w:val="center"/>
-          </w:tcPr>
-          <w:p>
-            <w:pPr>
-              <w:jc w:val="left"/>
-            </w:pPr>
-            <w:r>
-              <w:rPr>
-                <w:b/>
-                <w:bCs/>
-                <w:strike w:val="false"/>
-                <w:color w:val="27343A"/>
-                <w:sz w:val="20"/>
-                <w:szCs w:val="20"/>
-              </w:rPr>
-              <w:t xml:space="preserve">Ngôi Sao (ngoisao.vn)</w:t>
-            </w:r>
-          </w:p>
-        </w:tc>
-        <w:tc>
-          <w:tcPr>
-            <w:tcW w:type="dxa" w:w="2650"/>
-            <w:shd w:fill="FFFFFF" w:val="clear"/>
-            <w:tcMar>
-              <w:top w:type="dxa" w:w="90"/>
-              <w:left w:type="dxa" w:w="100"/>
-              <w:bottom w:type="dxa" w:w="90"/>
-              <w:right w:type="dxa" w:w="100"/>
-            </w:tcMar>
-            <w:vAlign w:val="center"/>
-          </w:tcPr>
-          <w:p>
-            <w:pPr>
-              <w:jc w:val="left"/>
-            </w:pPr>
-            <w:r>
-              <w:rPr>
-                <w:b w:val="false"/>
-                <w:bCs w:val="false"/>
-                <w:strike w:val="false"/>
-                <w:color w:val="27343A"/>
-                <w:sz w:val="20"/>
-                <w:szCs w:val="20"/>
-              </w:rPr>
-              <w:t xml:space="preserve">1.000 từ + 3 ảnh + 2 link</w:t>
-            </w:r>
-          </w:p>
-        </w:tc>
-        <w:tc>
-          <w:tcPr>
-            <w:tcW w:type="dxa" w:w="1550"/>
+            <w:tcW w:type="dxa" w:w="1900"/>
+            <w:shd w:fill="FFFFFF" w:val="clear"/>
+            <w:tcMar>
+              <w:top w:type="dxa" w:w="90"/>
+              <w:left w:type="dxa" w:w="100"/>
+              <w:bottom w:type="dxa" w:w="90"/>
+              <w:right w:type="dxa" w:w="100"/>
+            </w:tcMar>
+            <w:vAlign w:val="center"/>
+          </w:tcPr>
+          <w:p>
+            <w:pPr>
+              <w:jc w:val="left"/>
+            </w:pPr>
+            <w:r>
+              <w:rPr>
+                <w:b/>
+                <w:bCs/>
+                <w:i w:val="false"/>
+                <w:iCs w:val="false"/>
+                <w:strike w:val="false"/>
+                <w:color w:val="27343A"/>
+                <w:sz w:val="18"/>
+                <w:szCs w:val="18"/>
+              </w:rPr>
+              <w:t xml:space="preserve">Ngôi Sao</w:t>
+            </w:r>
+            <w:r>
+              <w:rPr>
+                <w:b w:val="false"/>
+                <w:bCs w:val="false"/>
+                <w:i w:val="false"/>
+                <w:iCs w:val="false"/>
+                <w:strike w:val="false"/>
+                <w:color w:val="8A93A0"/>
+                <w:sz w:val="15"/>
+                <w:szCs w:val="15"/>
+              </w:rPr>
+              <w:t xml:space="preserve"> (ngoisao.vn)</w:t>
+            </w:r>
+          </w:p>
+        </w:tc>
+        <w:tc>
+          <w:tcPr>
+            <w:tcW w:type="dxa" w:w="2300"/>
+            <w:shd w:fill="FFFFFF" w:val="clear"/>
+            <w:tcMar>
+              <w:top w:type="dxa" w:w="90"/>
+              <w:left w:type="dxa" w:w="100"/>
+              <w:bottom w:type="dxa" w:w="90"/>
+              <w:right w:type="dxa" w:w="100"/>
+            </w:tcMar>
+            <w:vAlign w:val="center"/>
+          </w:tcPr>
+          <w:p>
+            <w:pPr>
+              <w:jc w:val="left"/>
+            </w:pPr>
+            <w:r>
+              <w:rPr>
+                <w:b w:val="false"/>
+                <w:bCs w:val="false"/>
+                <w:i w:val="false"/>
+                <w:iCs w:val="false"/>
+                <w:strike w:val="false"/>
+                <w:color w:val="27343A"/>
+                <w:sz w:val="18"/>
+                <w:szCs w:val="18"/>
+              </w:rPr>
+              <w:t xml:space="preserve">Chuyên mục phù hợp</w:t>
+            </w:r>
+          </w:p>
+        </w:tc>
+        <w:tc>
+          <w:tcPr>
+            <w:tcW w:type="dxa" w:w="1900"/>
+            <w:shd w:fill="FFFFFF" w:val="clear"/>
+            <w:tcMar>
+              <w:top w:type="dxa" w:w="90"/>
+              <w:left w:type="dxa" w:w="100"/>
+              <w:bottom w:type="dxa" w:w="90"/>
+              <w:right w:type="dxa" w:w="100"/>
+            </w:tcMar>
+            <w:vAlign w:val="center"/>
+          </w:tcPr>
+          <w:p>
+            <w:pPr>
+              <w:jc w:val="left"/>
+            </w:pPr>
+            <w:r>
+              <w:rPr>
+                <w:b w:val="false"/>
+                <w:bCs w:val="false"/>
+                <w:i w:val="false"/>
+                <w:iCs w:val="false"/>
+                <w:strike w:val="false"/>
+                <w:color w:val="27343A"/>
+                <w:sz w:val="18"/>
+                <w:szCs w:val="18"/>
+              </w:rPr>
+              <w:t xml:space="preserve">Dưới 1.000 từ, dưới 3 ảnh</w:t>
+            </w:r>
+          </w:p>
+        </w:tc>
+        <w:tc>
+          <w:tcPr>
+            <w:tcW w:type="dxa" w:w="3500"/>
+            <w:shd w:fill="FFFFFF" w:val="clear"/>
+            <w:tcMar>
+              <w:top w:type="dxa" w:w="90"/>
+              <w:left w:type="dxa" w:w="100"/>
+              <w:bottom w:type="dxa" w:w="90"/>
+              <w:right w:type="dxa" w:w="100"/>
+            </w:tcMar>
+            <w:vAlign w:val="center"/>
+          </w:tcPr>
+          <w:p>
+            <w:pPr>
+              <w:jc w:val="left"/>
+            </w:pPr>
+            <w:r>
+              <w:rPr>
+                <w:b w:val="false"/>
+                <w:bCs w:val="false"/>
+                <w:i w:val="false"/>
+                <w:iCs w:val="false"/>
+                <w:strike w:val="false"/>
+                <w:color w:val="27343A"/>
+                <w:sz w:val="18"/>
+                <w:szCs w:val="18"/>
+              </w:rPr>
+              <w:t xml:space="preserve">2 link nofollow</w:t>
+            </w:r>
+          </w:p>
+        </w:tc>
+        <w:tc>
+          <w:tcPr>
+            <w:tcW w:type="dxa" w:w="1600"/>
             <w:shd w:fill="FFFFFF" w:val="clear"/>
             <w:tcMar>
               <w:top w:type="dxa" w:w="90"/>
@@ -1795,10 +2648,12 @@
               <w:rPr>
                 <w:b w:val="false"/>
                 <w:bCs w:val="false"/>
+                <w:i w:val="false"/>
+                <w:iCs w:val="false"/>
                 <w:strike/>
                 <w:color w:val="9AA3AF"/>
-                <w:sz w:val="20"/>
-                <w:szCs w:val="20"/>
+                <w:sz w:val="18"/>
+                <w:szCs w:val="18"/>
               </w:rPr>
               <w:t xml:space="preserve">2.900.000 đ</w:t>
             </w:r>
@@ -1824,10 +2679,12 @@
               <w:rPr>
                 <w:b/>
                 <w:bCs/>
+                <w:i w:val="false"/>
+                <w:iCs w:val="false"/>
                 <w:strike w:val="false"/>
                 <w:color w:val="C0553A"/>
-                <w:sz w:val="20"/>
-                <w:szCs w:val="20"/>
+                <w:sz w:val="18"/>
+                <w:szCs w:val="18"/>
               </w:rPr>
               <w:t xml:space="preserve">-22%</w:t>
             </w:r>
@@ -1835,7 +2692,7 @@
         </w:tc>
         <w:tc>
           <w:tcPr>
-            <w:tcW w:type="dxa" w:w="1800"/>
+            <w:tcW w:type="dxa" w:w="2000"/>
             <w:shd w:fill="FFFFFF" w:val="clear"/>
             <w:tcMar>
               <w:top w:type="dxa" w:w="90"/>
@@ -1853,10 +2710,12 @@
               <w:rPr>
                 <w:b/>
                 <w:bCs/>
+                <w:i w:val="false"/>
+                <w:iCs w:val="false"/>
                 <w:strike w:val="false"/>
                 <w:color w:val="0E8C7F"/>
-                <w:sz w:val="20"/>
-                <w:szCs w:val="20"/>
+                <w:sz w:val="18"/>
+                <w:szCs w:val="18"/>
               </w:rPr>
               <w:t xml:space="preserve">2.262.000 đ</w:t>
             </w:r>
@@ -1866,7 +2725,7 @@
       <w:tr>
         <w:tc>
           <w:tcPr>
-            <w:tcW w:type="dxa" w:w="450"/>
+            <w:tcW w:type="dxa" w:w="500"/>
             <w:shd w:fill="F5F7FA" w:val="clear"/>
             <w:tcMar>
               <w:top w:type="dxa" w:w="90"/>
@@ -1884,10 +2743,12 @@
               <w:rPr>
                 <w:b w:val="false"/>
                 <w:bCs w:val="false"/>
-                <w:strike w:val="false"/>
-                <w:color w:val="27343A"/>
-                <w:sz w:val="20"/>
-                <w:szCs w:val="20"/>
+                <w:i w:val="false"/>
+                <w:iCs w:val="false"/>
+                <w:strike w:val="false"/>
+                <w:color w:val="27343A"/>
+                <w:sz w:val="18"/>
+                <w:szCs w:val="18"/>
               </w:rPr>
               <w:t xml:space="preserve">10</w:t>
             </w:r>
@@ -1895,65 +2756,144 @@
         </w:tc>
         <w:tc>
           <w:tcPr>
-            <w:tcW w:type="dxa" w:w="2450"/>
-            <w:shd w:fill="F5F7FA" w:val="clear"/>
-            <w:tcMar>
-              <w:top w:type="dxa" w:w="90"/>
-              <w:left w:type="dxa" w:w="100"/>
-              <w:bottom w:type="dxa" w:w="90"/>
-              <w:right w:type="dxa" w:w="100"/>
-            </w:tcMar>
-            <w:vAlign w:val="center"/>
-          </w:tcPr>
-          <w:p>
-            <w:pPr>
-              <w:jc w:val="left"/>
-            </w:pPr>
-            <w:r>
-              <w:rPr>
-                <w:b/>
-                <w:bCs/>
-                <w:strike w:val="false"/>
-                <w:color w:val="27343A"/>
-                <w:sz w:val="20"/>
-                <w:szCs w:val="20"/>
-              </w:rPr>
-              <w:t xml:space="preserve">GenK (genk.vn)</w:t>
-            </w:r>
-          </w:p>
-        </w:tc>
-        <w:tc>
-          <w:tcPr>
-            <w:tcW w:type="dxa" w:w="2650"/>
-            <w:shd w:fill="F5F7FA" w:val="clear"/>
-            <w:tcMar>
-              <w:top w:type="dxa" w:w="90"/>
-              <w:left w:type="dxa" w:w="100"/>
-              <w:bottom w:type="dxa" w:w="90"/>
-              <w:right w:type="dxa" w:w="100"/>
-            </w:tcMar>
-            <w:vAlign w:val="center"/>
-          </w:tcPr>
-          <w:p>
-            <w:pPr>
-              <w:jc w:val="left"/>
-            </w:pPr>
-            <w:r>
-              <w:rPr>
-                <w:b w:val="false"/>
-                <w:bCs w:val="false"/>
-                <w:strike w:val="false"/>
-                <w:color w:val="27343A"/>
-                <w:sz w:val="20"/>
-                <w:szCs w:val="20"/>
-              </w:rPr>
-              <w:t xml:space="preserve">1.000 từ + 5 ảnh + 1 link</w:t>
-            </w:r>
-          </w:p>
-        </w:tc>
-        <w:tc>
-          <w:tcPr>
-            <w:tcW w:type="dxa" w:w="1550"/>
+            <w:tcW w:type="dxa" w:w="1900"/>
+            <w:shd w:fill="F5F7FA" w:val="clear"/>
+            <w:tcMar>
+              <w:top w:type="dxa" w:w="90"/>
+              <w:left w:type="dxa" w:w="100"/>
+              <w:bottom w:type="dxa" w:w="90"/>
+              <w:right w:type="dxa" w:w="100"/>
+            </w:tcMar>
+            <w:vAlign w:val="center"/>
+          </w:tcPr>
+          <w:p>
+            <w:pPr>
+              <w:jc w:val="left"/>
+            </w:pPr>
+            <w:r>
+              <w:rPr>
+                <w:b/>
+                <w:bCs/>
+                <w:i w:val="false"/>
+                <w:iCs w:val="false"/>
+                <w:strike w:val="false"/>
+                <w:color w:val="27343A"/>
+                <w:sz w:val="18"/>
+                <w:szCs w:val="18"/>
+              </w:rPr>
+              <w:t xml:space="preserve">GenK</w:t>
+            </w:r>
+            <w:r>
+              <w:rPr>
+                <w:b w:val="false"/>
+                <w:bCs w:val="false"/>
+                <w:i w:val="false"/>
+                <w:iCs w:val="false"/>
+                <w:strike w:val="false"/>
+                <w:color w:val="8A93A0"/>
+                <w:sz w:val="15"/>
+                <w:szCs w:val="15"/>
+              </w:rPr>
+              <w:t xml:space="preserve"> (genk.vn)</w:t>
+            </w:r>
+          </w:p>
+        </w:tc>
+        <w:tc>
+          <w:tcPr>
+            <w:tcW w:type="dxa" w:w="2300"/>
+            <w:shd w:fill="F5F7FA" w:val="clear"/>
+            <w:tcMar>
+              <w:top w:type="dxa" w:w="90"/>
+              <w:left w:type="dxa" w:w="100"/>
+              <w:bottom w:type="dxa" w:w="90"/>
+              <w:right w:type="dxa" w:w="100"/>
+            </w:tcMar>
+            <w:vAlign w:val="center"/>
+          </w:tcPr>
+          <w:p>
+            <w:pPr>
+              <w:jc w:val="left"/>
+            </w:pPr>
+            <w:r>
+              <w:rPr>
+                <w:b w:val="false"/>
+                <w:bCs w:val="false"/>
+                <w:i w:val="false"/>
+                <w:iCs w:val="false"/>
+                <w:strike w:val="false"/>
+                <w:color w:val="27343A"/>
+                <w:sz w:val="18"/>
+                <w:szCs w:val="18"/>
+              </w:rPr>
+              <w:t xml:space="preserve">Tiểu mục</w:t>
+            </w:r>
+          </w:p>
+        </w:tc>
+        <w:tc>
+          <w:tcPr>
+            <w:tcW w:type="dxa" w:w="1900"/>
+            <w:shd w:fill="F5F7FA" w:val="clear"/>
+            <w:tcMar>
+              <w:top w:type="dxa" w:w="90"/>
+              <w:left w:type="dxa" w:w="100"/>
+              <w:bottom w:type="dxa" w:w="90"/>
+              <w:right w:type="dxa" w:w="100"/>
+            </w:tcMar>
+            <w:vAlign w:val="center"/>
+          </w:tcPr>
+          <w:p>
+            <w:pPr>
+              <w:jc w:val="left"/>
+            </w:pPr>
+            <w:r>
+              <w:rPr>
+                <w:b w:val="false"/>
+                <w:bCs w:val="false"/>
+                <w:i w:val="false"/>
+                <w:iCs w:val="false"/>
+                <w:strike w:val="false"/>
+                <w:color w:val="27343A"/>
+                <w:sz w:val="18"/>
+                <w:szCs w:val="18"/>
+              </w:rPr>
+              <w:t xml:space="preserve">Dưới 1.000 từ, dưới 5 ảnh</w:t>
+            </w:r>
+          </w:p>
+        </w:tc>
+        <w:tc>
+          <w:tcPr>
+            <w:tcW w:type="dxa" w:w="3500"/>
+            <w:shd w:fill="F5F7FA" w:val="clear"/>
+            <w:tcMar>
+              <w:top w:type="dxa" w:w="90"/>
+              <w:left w:type="dxa" w:w="100"/>
+              <w:bottom w:type="dxa" w:w="90"/>
+              <w:right w:type="dxa" w:w="100"/>
+            </w:tcMar>
+            <w:vAlign w:val="center"/>
+          </w:tcPr>
+          <w:p>
+            <w:pPr>
+              <w:jc w:val="left"/>
+            </w:pPr>
+            <w:r>
+              <w:rPr>
+                <w:b w:val="false"/>
+                <w:bCs w:val="false"/>
+                <w:i w:val="false"/>
+                <w:iCs w:val="false"/>
+                <w:strike w:val="false"/>
+                <w:color w:val="27343A"/>
+                <w:sz w:val="18"/>
+                <w:szCs w:val="18"/>
+              </w:rPr>
+              <w:t xml:space="preserve">1 link nofollow</w:t>
+            </w:r>
+          </w:p>
+        </w:tc>
+        <w:tc>
+          <w:tcPr>
+            <w:tcW w:type="dxa" w:w="1600"/>
             <w:shd w:fill="F5F7FA" w:val="clear"/>
             <w:tcMar>
               <w:top w:type="dxa" w:w="90"/>
@@ -1971,10 +2911,12 @@
               <w:rPr>
                 <w:b w:val="false"/>
                 <w:bCs w:val="false"/>
+                <w:i w:val="false"/>
+                <w:iCs w:val="false"/>
                 <w:strike/>
                 <w:color w:val="9AA3AF"/>
-                <w:sz w:val="20"/>
-                <w:szCs w:val="20"/>
+                <w:sz w:val="18"/>
+                <w:szCs w:val="18"/>
               </w:rPr>
               <w:t xml:space="preserve">2.900.000 đ</w:t>
             </w:r>
@@ -2000,10 +2942,12 @@
               <w:rPr>
                 <w:b/>
                 <w:bCs/>
+                <w:i w:val="false"/>
+                <w:iCs w:val="false"/>
                 <w:strike w:val="false"/>
                 <w:color w:val="C0553A"/>
-                <w:sz w:val="20"/>
-                <w:szCs w:val="20"/>
+                <w:sz w:val="18"/>
+                <w:szCs w:val="18"/>
               </w:rPr>
               <w:t xml:space="preserve">-25%</w:t>
             </w:r>
@@ -2011,7 +2955,7 @@
         </w:tc>
         <w:tc>
           <w:tcPr>
-            <w:tcW w:type="dxa" w:w="1800"/>
+            <w:tcW w:type="dxa" w:w="2000"/>
             <w:shd w:fill="F5F7FA" w:val="clear"/>
             <w:tcMar>
               <w:top w:type="dxa" w:w="90"/>
@@ -2029,10 +2973,12 @@
               <w:rPr>
                 <w:b/>
                 <w:bCs/>
+                <w:i w:val="false"/>
+                <w:iCs w:val="false"/>
                 <w:strike w:val="false"/>
                 <w:color w:val="0E8C7F"/>
-                <w:sz w:val="20"/>
-                <w:szCs w:val="20"/>
+                <w:sz w:val="18"/>
+                <w:szCs w:val="18"/>
               </w:rPr>
               <w:t xml:space="preserve">2.175.000 đ</w:t>
             </w:r>
@@ -2042,7 +2988,7 @@
       <w:tr>
         <w:tc>
           <w:tcPr>
-            <w:tcW w:type="dxa" w:w="450"/>
+            <w:tcW w:type="dxa" w:w="500"/>
             <w:shd w:fill="FFFFFF" w:val="clear"/>
             <w:tcMar>
               <w:top w:type="dxa" w:w="90"/>
@@ -2060,10 +3006,12 @@
               <w:rPr>
                 <w:b w:val="false"/>
                 <w:bCs w:val="false"/>
-                <w:strike w:val="false"/>
-                <w:color w:val="27343A"/>
-                <w:sz w:val="20"/>
-                <w:szCs w:val="20"/>
+                <w:i w:val="false"/>
+                <w:iCs w:val="false"/>
+                <w:strike w:val="false"/>
+                <w:color w:val="27343A"/>
+                <w:sz w:val="18"/>
+                <w:szCs w:val="18"/>
               </w:rPr>
               <w:t xml:space="preserve">11</w:t>
             </w:r>
@@ -2071,65 +3019,144 @@
         </w:tc>
         <w:tc>
           <w:tcPr>
-            <w:tcW w:type="dxa" w:w="2450"/>
-            <w:shd w:fill="FFFFFF" w:val="clear"/>
-            <w:tcMar>
-              <w:top w:type="dxa" w:w="90"/>
-              <w:left w:type="dxa" w:w="100"/>
-              <w:bottom w:type="dxa" w:w="90"/>
-              <w:right w:type="dxa" w:w="100"/>
-            </w:tcMar>
-            <w:vAlign w:val="center"/>
-          </w:tcPr>
-          <w:p>
-            <w:pPr>
-              <w:jc w:val="left"/>
-            </w:pPr>
-            <w:r>
-              <w:rPr>
-                <w:b/>
-                <w:bCs/>
-                <w:strike w:val="false"/>
-                <w:color w:val="27343A"/>
-                <w:sz w:val="20"/>
-                <w:szCs w:val="20"/>
-              </w:rPr>
-              <w:t xml:space="preserve">Saostar (saostar.vn)</w:t>
-            </w:r>
-          </w:p>
-        </w:tc>
-        <w:tc>
-          <w:tcPr>
-            <w:tcW w:type="dxa" w:w="2650"/>
-            <w:shd w:fill="FFFFFF" w:val="clear"/>
-            <w:tcMar>
-              <w:top w:type="dxa" w:w="90"/>
-              <w:left w:type="dxa" w:w="100"/>
-              <w:bottom w:type="dxa" w:w="90"/>
-              <w:right w:type="dxa" w:w="100"/>
-            </w:tcMar>
-            <w:vAlign w:val="center"/>
-          </w:tcPr>
-          <w:p>
-            <w:pPr>
-              <w:jc w:val="left"/>
-            </w:pPr>
-            <w:r>
-              <w:rPr>
-                <w:b w:val="false"/>
-                <w:bCs w:val="false"/>
-                <w:strike w:val="false"/>
-                <w:color w:val="27343A"/>
-                <w:sz w:val="20"/>
-                <w:szCs w:val="20"/>
-              </w:rPr>
-              <w:t xml:space="preserve">1.000 từ + 3 ảnh + 2 link</w:t>
-            </w:r>
-          </w:p>
-        </w:tc>
-        <w:tc>
-          <w:tcPr>
-            <w:tcW w:type="dxa" w:w="1550"/>
+            <w:tcW w:type="dxa" w:w="1900"/>
+            <w:shd w:fill="FFFFFF" w:val="clear"/>
+            <w:tcMar>
+              <w:top w:type="dxa" w:w="90"/>
+              <w:left w:type="dxa" w:w="100"/>
+              <w:bottom w:type="dxa" w:w="90"/>
+              <w:right w:type="dxa" w:w="100"/>
+            </w:tcMar>
+            <w:vAlign w:val="center"/>
+          </w:tcPr>
+          <w:p>
+            <w:pPr>
+              <w:jc w:val="left"/>
+            </w:pPr>
+            <w:r>
+              <w:rPr>
+                <w:b/>
+                <w:bCs/>
+                <w:i w:val="false"/>
+                <w:iCs w:val="false"/>
+                <w:strike w:val="false"/>
+                <w:color w:val="27343A"/>
+                <w:sz w:val="18"/>
+                <w:szCs w:val="18"/>
+              </w:rPr>
+              <w:t xml:space="preserve">Saostar</w:t>
+            </w:r>
+            <w:r>
+              <w:rPr>
+                <w:b w:val="false"/>
+                <w:bCs w:val="false"/>
+                <w:i w:val="false"/>
+                <w:iCs w:val="false"/>
+                <w:strike w:val="false"/>
+                <w:color w:val="8A93A0"/>
+                <w:sz w:val="15"/>
+                <w:szCs w:val="15"/>
+              </w:rPr>
+              <w:t xml:space="preserve"> (saostar.vn)</w:t>
+            </w:r>
+          </w:p>
+        </w:tc>
+        <w:tc>
+          <w:tcPr>
+            <w:tcW w:type="dxa" w:w="2300"/>
+            <w:shd w:fill="FFFFFF" w:val="clear"/>
+            <w:tcMar>
+              <w:top w:type="dxa" w:w="90"/>
+              <w:left w:type="dxa" w:w="100"/>
+              <w:bottom w:type="dxa" w:w="90"/>
+              <w:right w:type="dxa" w:w="100"/>
+            </w:tcMar>
+            <w:vAlign w:val="center"/>
+          </w:tcPr>
+          <w:p>
+            <w:pPr>
+              <w:jc w:val="left"/>
+            </w:pPr>
+            <w:r>
+              <w:rPr>
+                <w:b w:val="false"/>
+                <w:bCs w:val="false"/>
+                <w:i w:val="false"/>
+                <w:iCs w:val="false"/>
+                <w:strike w:val="false"/>
+                <w:color w:val="27343A"/>
+                <w:sz w:val="18"/>
+                <w:szCs w:val="18"/>
+              </w:rPr>
+              <w:t xml:space="preserve">Mục phù hợp</w:t>
+            </w:r>
+          </w:p>
+        </w:tc>
+        <w:tc>
+          <w:tcPr>
+            <w:tcW w:type="dxa" w:w="1900"/>
+            <w:shd w:fill="FFFFFF" w:val="clear"/>
+            <w:tcMar>
+              <w:top w:type="dxa" w:w="90"/>
+              <w:left w:type="dxa" w:w="100"/>
+              <w:bottom w:type="dxa" w:w="90"/>
+              <w:right w:type="dxa" w:w="100"/>
+            </w:tcMar>
+            <w:vAlign w:val="center"/>
+          </w:tcPr>
+          <w:p>
+            <w:pPr>
+              <w:jc w:val="left"/>
+            </w:pPr>
+            <w:r>
+              <w:rPr>
+                <w:b w:val="false"/>
+                <w:bCs w:val="false"/>
+                <w:i w:val="false"/>
+                <w:iCs w:val="false"/>
+                <w:strike w:val="false"/>
+                <w:color w:val="27343A"/>
+                <w:sz w:val="18"/>
+                <w:szCs w:val="18"/>
+              </w:rPr>
+              <w:t xml:space="preserve">Dưới 1.000 từ, dưới 3 ảnh</w:t>
+            </w:r>
+          </w:p>
+        </w:tc>
+        <w:tc>
+          <w:tcPr>
+            <w:tcW w:type="dxa" w:w="3500"/>
+            <w:shd w:fill="FFFFFF" w:val="clear"/>
+            <w:tcMar>
+              <w:top w:type="dxa" w:w="90"/>
+              <w:left w:type="dxa" w:w="100"/>
+              <w:bottom w:type="dxa" w:w="90"/>
+              <w:right w:type="dxa" w:w="100"/>
+            </w:tcMar>
+            <w:vAlign w:val="center"/>
+          </w:tcPr>
+          <w:p>
+            <w:pPr>
+              <w:jc w:val="left"/>
+            </w:pPr>
+            <w:r>
+              <w:rPr>
+                <w:b w:val="false"/>
+                <w:bCs w:val="false"/>
+                <w:i w:val="false"/>
+                <w:iCs w:val="false"/>
+                <w:strike w:val="false"/>
+                <w:color w:val="27343A"/>
+                <w:sz w:val="18"/>
+                <w:szCs w:val="18"/>
+              </w:rPr>
+              <w:t xml:space="preserve">2 link nofollow</w:t>
+            </w:r>
+          </w:p>
+        </w:tc>
+        <w:tc>
+          <w:tcPr>
+            <w:tcW w:type="dxa" w:w="1600"/>
             <w:shd w:fill="FFFFFF" w:val="clear"/>
             <w:tcMar>
               <w:top w:type="dxa" w:w="90"/>
@@ -2147,10 +3174,12 @@
               <w:rPr>
                 <w:b w:val="false"/>
                 <w:bCs w:val="false"/>
+                <w:i w:val="false"/>
+                <w:iCs w:val="false"/>
                 <w:strike/>
                 <w:color w:val="9AA3AF"/>
-                <w:sz w:val="20"/>
-                <w:szCs w:val="20"/>
+                <w:sz w:val="18"/>
+                <w:szCs w:val="18"/>
               </w:rPr>
               <w:t xml:space="preserve">3.200.000 đ</w:t>
             </w:r>
@@ -2176,10 +3205,12 @@
               <w:rPr>
                 <w:b/>
                 <w:bCs/>
+                <w:i w:val="false"/>
+                <w:iCs w:val="false"/>
                 <w:strike w:val="false"/>
                 <w:color w:val="C0553A"/>
-                <w:sz w:val="20"/>
-                <w:szCs w:val="20"/>
+                <w:sz w:val="18"/>
+                <w:szCs w:val="18"/>
               </w:rPr>
               <w:t xml:space="preserve">-20%</w:t>
             </w:r>
@@ -2187,7 +3218,7 @@
         </w:tc>
         <w:tc>
           <w:tcPr>
-            <w:tcW w:type="dxa" w:w="1800"/>
+            <w:tcW w:type="dxa" w:w="2000"/>
             <w:shd w:fill="FFFFFF" w:val="clear"/>
             <w:tcMar>
               <w:top w:type="dxa" w:w="90"/>
@@ -2205,10 +3236,12 @@
               <w:rPr>
                 <w:b/>
                 <w:bCs/>
+                <w:i w:val="false"/>
+                <w:iCs w:val="false"/>
                 <w:strike w:val="false"/>
                 <w:color w:val="0E8C7F"/>
-                <w:sz w:val="20"/>
-                <w:szCs w:val="20"/>
+                <w:sz w:val="18"/>
+                <w:szCs w:val="18"/>
               </w:rPr>
               <w:t xml:space="preserve">2.560.000 đ</w:t>
             </w:r>
@@ -2218,7 +3251,7 @@
       <w:tr>
         <w:tc>
           <w:tcPr>
-            <w:tcW w:type="dxa" w:w="450"/>
+            <w:tcW w:type="dxa" w:w="500"/>
             <w:shd w:fill="F5F7FA" w:val="clear"/>
             <w:tcMar>
               <w:top w:type="dxa" w:w="90"/>
@@ -2236,10 +3269,12 @@
               <w:rPr>
                 <w:b w:val="false"/>
                 <w:bCs w:val="false"/>
-                <w:strike w:val="false"/>
-                <w:color w:val="27343A"/>
-                <w:sz w:val="20"/>
-                <w:szCs w:val="20"/>
+                <w:i w:val="false"/>
+                <w:iCs w:val="false"/>
+                <w:strike w:val="false"/>
+                <w:color w:val="27343A"/>
+                <w:sz w:val="18"/>
+                <w:szCs w:val="18"/>
               </w:rPr>
               <w:t xml:space="preserve">12</w:t>
             </w:r>
@@ -2247,65 +3282,144 @@
         </w:tc>
         <w:tc>
           <w:tcPr>
-            <w:tcW w:type="dxa" w:w="2450"/>
-            <w:shd w:fill="F5F7FA" w:val="clear"/>
-            <w:tcMar>
-              <w:top w:type="dxa" w:w="90"/>
-              <w:left w:type="dxa" w:w="100"/>
-              <w:bottom w:type="dxa" w:w="90"/>
-              <w:right w:type="dxa" w:w="100"/>
-            </w:tcMar>
-            <w:vAlign w:val="center"/>
-          </w:tcPr>
-          <w:p>
-            <w:pPr>
-              <w:jc w:val="left"/>
-            </w:pPr>
-            <w:r>
-              <w:rPr>
-                <w:b/>
-                <w:bCs/>
-                <w:strike w:val="false"/>
-                <w:color w:val="27343A"/>
-                <w:sz w:val="20"/>
-                <w:szCs w:val="20"/>
-              </w:rPr>
-              <w:t xml:space="preserve">Doanh Nhân Sài Gòn (HTV) (htv.vn/doanhnhansaigon)</w:t>
-            </w:r>
-          </w:p>
-        </w:tc>
-        <w:tc>
-          <w:tcPr>
-            <w:tcW w:type="dxa" w:w="2650"/>
-            <w:shd w:fill="F5F7FA" w:val="clear"/>
-            <w:tcMar>
-              <w:top w:type="dxa" w:w="90"/>
-              <w:left w:type="dxa" w:w="100"/>
-              <w:bottom w:type="dxa" w:w="90"/>
-              <w:right w:type="dxa" w:w="100"/>
-            </w:tcMar>
-            <w:vAlign w:val="center"/>
-          </w:tcPr>
-          <w:p>
-            <w:pPr>
-              <w:jc w:val="left"/>
-            </w:pPr>
-            <w:r>
-              <w:rPr>
-                <w:b w:val="false"/>
-                <w:bCs w:val="false"/>
-                <w:strike w:val="false"/>
-                <w:color w:val="27343A"/>
-                <w:sz w:val="20"/>
-                <w:szCs w:val="20"/>
-              </w:rPr>
-              <w:t xml:space="preserve">400 từ + 2 ảnh</w:t>
-            </w:r>
-          </w:p>
-        </w:tc>
-        <w:tc>
-          <w:tcPr>
-            <w:tcW w:type="dxa" w:w="1550"/>
+            <w:tcW w:type="dxa" w:w="1900"/>
+            <w:shd w:fill="F5F7FA" w:val="clear"/>
+            <w:tcMar>
+              <w:top w:type="dxa" w:w="90"/>
+              <w:left w:type="dxa" w:w="100"/>
+              <w:bottom w:type="dxa" w:w="90"/>
+              <w:right w:type="dxa" w:w="100"/>
+            </w:tcMar>
+            <w:vAlign w:val="center"/>
+          </w:tcPr>
+          <w:p>
+            <w:pPr>
+              <w:jc w:val="left"/>
+            </w:pPr>
+            <w:r>
+              <w:rPr>
+                <w:b/>
+                <w:bCs/>
+                <w:i w:val="false"/>
+                <w:iCs w:val="false"/>
+                <w:strike w:val="false"/>
+                <w:color w:val="27343A"/>
+                <w:sz w:val="18"/>
+                <w:szCs w:val="18"/>
+              </w:rPr>
+              <w:t xml:space="preserve">Doanh Nhân Sài Gòn (HTV)</w:t>
+            </w:r>
+            <w:r>
+              <w:rPr>
+                <w:b w:val="false"/>
+                <w:bCs w:val="false"/>
+                <w:i w:val="false"/>
+                <w:iCs w:val="false"/>
+                <w:strike w:val="false"/>
+                <w:color w:val="8A93A0"/>
+                <w:sz w:val="15"/>
+                <w:szCs w:val="15"/>
+              </w:rPr>
+              <w:t xml:space="preserve"> (doanhnhansaigon.vn)</w:t>
+            </w:r>
+          </w:p>
+        </w:tc>
+        <w:tc>
+          <w:tcPr>
+            <w:tcW w:type="dxa" w:w="2300"/>
+            <w:shd w:fill="F5F7FA" w:val="clear"/>
+            <w:tcMar>
+              <w:top w:type="dxa" w:w="90"/>
+              <w:left w:type="dxa" w:w="100"/>
+              <w:bottom w:type="dxa" w:w="90"/>
+              <w:right w:type="dxa" w:w="100"/>
+            </w:tcMar>
+            <w:vAlign w:val="center"/>
+          </w:tcPr>
+          <w:p>
+            <w:pPr>
+              <w:jc w:val="left"/>
+            </w:pPr>
+            <w:r>
+              <w:rPr>
+                <w:b w:val="false"/>
+                <w:bCs w:val="false"/>
+                <w:i w:val="false"/>
+                <w:iCs w:val="false"/>
+                <w:strike w:val="false"/>
+                <w:color w:val="27343A"/>
+                <w:sz w:val="18"/>
+                <w:szCs w:val="18"/>
+              </w:rPr>
+              <w:t xml:space="preserve">Tin ngắn</w:t>
+            </w:r>
+          </w:p>
+        </w:tc>
+        <w:tc>
+          <w:tcPr>
+            <w:tcW w:type="dxa" w:w="1900"/>
+            <w:shd w:fill="F5F7FA" w:val="clear"/>
+            <w:tcMar>
+              <w:top w:type="dxa" w:w="90"/>
+              <w:left w:type="dxa" w:w="100"/>
+              <w:bottom w:type="dxa" w:w="90"/>
+              <w:right w:type="dxa" w:w="100"/>
+            </w:tcMar>
+            <w:vAlign w:val="center"/>
+          </w:tcPr>
+          <w:p>
+            <w:pPr>
+              <w:jc w:val="left"/>
+            </w:pPr>
+            <w:r>
+              <w:rPr>
+                <w:b w:val="false"/>
+                <w:bCs w:val="false"/>
+                <w:i w:val="false"/>
+                <w:iCs w:val="false"/>
+                <w:strike w:val="false"/>
+                <w:color w:val="27343A"/>
+                <w:sz w:val="18"/>
+                <w:szCs w:val="18"/>
+              </w:rPr>
+              <w:t xml:space="preserve">400 từ, 2 ảnh</w:t>
+            </w:r>
+          </w:p>
+        </w:tc>
+        <w:tc>
+          <w:tcPr>
+            <w:tcW w:type="dxa" w:w="3500"/>
+            <w:shd w:fill="F5F7FA" w:val="clear"/>
+            <w:tcMar>
+              <w:top w:type="dxa" w:w="90"/>
+              <w:left w:type="dxa" w:w="100"/>
+              <w:bottom w:type="dxa" w:w="90"/>
+              <w:right w:type="dxa" w:w="100"/>
+            </w:tcMar>
+            <w:vAlign w:val="center"/>
+          </w:tcPr>
+          <w:p>
+            <w:pPr>
+              <w:jc w:val="left"/>
+            </w:pPr>
+            <w:r>
+              <w:rPr>
+                <w:b w:val="false"/>
+                <w:bCs w:val="false"/>
+                <w:i w:val="false"/>
+                <w:iCs w:val="false"/>
+                <w:strike w:val="false"/>
+                <w:color w:val="27343A"/>
+                <w:sz w:val="18"/>
+                <w:szCs w:val="18"/>
+              </w:rPr>
+              <w:t xml:space="preserve">1 link (theo chính sách toà soạn)</w:t>
+            </w:r>
+          </w:p>
+        </w:tc>
+        <w:tc>
+          <w:tcPr>
+            <w:tcW w:type="dxa" w:w="1600"/>
             <w:shd w:fill="F5F7FA" w:val="clear"/>
             <w:tcMar>
               <w:top w:type="dxa" w:w="90"/>
@@ -2323,10 +3437,12 @@
               <w:rPr>
                 <w:b w:val="false"/>
                 <w:bCs w:val="false"/>
+                <w:i w:val="false"/>
+                <w:iCs w:val="false"/>
                 <w:strike/>
                 <w:color w:val="9AA3AF"/>
-                <w:sz w:val="20"/>
-                <w:szCs w:val="20"/>
+                <w:sz w:val="18"/>
+                <w:szCs w:val="18"/>
               </w:rPr>
               <w:t xml:space="preserve">3.110.000 đ</w:t>
             </w:r>
@@ -2352,10 +3468,12 @@
               <w:rPr>
                 <w:b/>
                 <w:bCs/>
+                <w:i w:val="false"/>
+                <w:iCs w:val="false"/>
                 <w:strike w:val="false"/>
                 <w:color w:val="C0553A"/>
-                <w:sz w:val="20"/>
-                <w:szCs w:val="20"/>
+                <w:sz w:val="18"/>
+                <w:szCs w:val="18"/>
               </w:rPr>
               <w:t xml:space="preserve">-23%</w:t>
             </w:r>
@@ -2363,7 +3481,7 @@
         </w:tc>
         <w:tc>
           <w:tcPr>
-            <w:tcW w:type="dxa" w:w="1800"/>
+            <w:tcW w:type="dxa" w:w="2000"/>
             <w:shd w:fill="F5F7FA" w:val="clear"/>
             <w:tcMar>
               <w:top w:type="dxa" w:w="90"/>
@@ -2381,10 +3499,12 @@
               <w:rPr>
                 <w:b/>
                 <w:bCs/>
+                <w:i w:val="false"/>
+                <w:iCs w:val="false"/>
                 <w:strike w:val="false"/>
                 <w:color w:val="0E8C7F"/>
-                <w:sz w:val="20"/>
-                <w:szCs w:val="20"/>
+                <w:sz w:val="18"/>
+                <w:szCs w:val="18"/>
               </w:rPr>
               <w:t xml:space="preserve">2.395.000 đ</w:t>
             </w:r>
@@ -2394,7 +3514,7 @@
       <w:tr>
         <w:tc>
           <w:tcPr>
-            <w:tcW w:type="dxa" w:w="450"/>
+            <w:tcW w:type="dxa" w:w="500"/>
             <w:shd w:fill="FFFFFF" w:val="clear"/>
             <w:tcMar>
               <w:top w:type="dxa" w:w="90"/>
@@ -2412,10 +3532,12 @@
               <w:rPr>
                 <w:b w:val="false"/>
                 <w:bCs w:val="false"/>
-                <w:strike w:val="false"/>
-                <w:color w:val="27343A"/>
-                <w:sz w:val="20"/>
-                <w:szCs w:val="20"/>
+                <w:i w:val="false"/>
+                <w:iCs w:val="false"/>
+                <w:strike w:val="false"/>
+                <w:color w:val="27343A"/>
+                <w:sz w:val="18"/>
+                <w:szCs w:val="18"/>
               </w:rPr>
               <w:t xml:space="preserve">13</w:t>
             </w:r>
@@ -2423,65 +3545,144 @@
         </w:tc>
         <w:tc>
           <w:tcPr>
-            <w:tcW w:type="dxa" w:w="2450"/>
-            <w:shd w:fill="FFFFFF" w:val="clear"/>
-            <w:tcMar>
-              <w:top w:type="dxa" w:w="90"/>
-              <w:left w:type="dxa" w:w="100"/>
-              <w:bottom w:type="dxa" w:w="90"/>
-              <w:right w:type="dxa" w:w="100"/>
-            </w:tcMar>
-            <w:vAlign w:val="center"/>
-          </w:tcPr>
-          <w:p>
-            <w:pPr>
-              <w:jc w:val="left"/>
-            </w:pPr>
-            <w:r>
-              <w:rPr>
-                <w:b/>
-                <w:bCs/>
-                <w:strike w:val="false"/>
-                <w:color w:val="27343A"/>
-                <w:sz w:val="20"/>
-                <w:szCs w:val="20"/>
-              </w:rPr>
-              <w:t xml:space="preserve">Doanh Nghiệp Việt Nam (doanhnghiepvn.vn)</w:t>
-            </w:r>
-          </w:p>
-        </w:tc>
-        <w:tc>
-          <w:tcPr>
-            <w:tcW w:type="dxa" w:w="2650"/>
-            <w:shd w:fill="FFFFFF" w:val="clear"/>
-            <w:tcMar>
-              <w:top w:type="dxa" w:w="90"/>
-              <w:left w:type="dxa" w:w="100"/>
-              <w:bottom w:type="dxa" w:w="90"/>
-              <w:right w:type="dxa" w:w="100"/>
-            </w:tcMar>
-            <w:vAlign w:val="center"/>
-          </w:tcPr>
-          <w:p>
-            <w:pPr>
-              <w:jc w:val="left"/>
-            </w:pPr>
-            <w:r>
-              <w:rPr>
-                <w:b w:val="false"/>
-                <w:bCs w:val="false"/>
-                <w:strike w:val="false"/>
-                <w:color w:val="27343A"/>
-                <w:sz w:val="20"/>
-                <w:szCs w:val="20"/>
-              </w:rPr>
-              <w:t xml:space="preserve">1.000 từ + 3 ảnh + 2 link</w:t>
-            </w:r>
-          </w:p>
-        </w:tc>
-        <w:tc>
-          <w:tcPr>
-            <w:tcW w:type="dxa" w:w="1550"/>
+            <w:tcW w:type="dxa" w:w="1900"/>
+            <w:shd w:fill="FFFFFF" w:val="clear"/>
+            <w:tcMar>
+              <w:top w:type="dxa" w:w="90"/>
+              <w:left w:type="dxa" w:w="100"/>
+              <w:bottom w:type="dxa" w:w="90"/>
+              <w:right w:type="dxa" w:w="100"/>
+            </w:tcMar>
+            <w:vAlign w:val="center"/>
+          </w:tcPr>
+          <w:p>
+            <w:pPr>
+              <w:jc w:val="left"/>
+            </w:pPr>
+            <w:r>
+              <w:rPr>
+                <w:b/>
+                <w:bCs/>
+                <w:i w:val="false"/>
+                <w:iCs w:val="false"/>
+                <w:strike w:val="false"/>
+                <w:color w:val="27343A"/>
+                <w:sz w:val="18"/>
+                <w:szCs w:val="18"/>
+              </w:rPr>
+              <w:t xml:space="preserve">Doanh Nghiệp Việt Nam</w:t>
+            </w:r>
+            <w:r>
+              <w:rPr>
+                <w:b w:val="false"/>
+                <w:bCs w:val="false"/>
+                <w:i w:val="false"/>
+                <w:iCs w:val="false"/>
+                <w:strike w:val="false"/>
+                <w:color w:val="8A93A0"/>
+                <w:sz w:val="15"/>
+                <w:szCs w:val="15"/>
+              </w:rPr>
+              <w:t xml:space="preserve"> (doanhnghiepvn.vn)</w:t>
+            </w:r>
+          </w:p>
+        </w:tc>
+        <w:tc>
+          <w:tcPr>
+            <w:tcW w:type="dxa" w:w="2300"/>
+            <w:shd w:fill="FFFFFF" w:val="clear"/>
+            <w:tcMar>
+              <w:top w:type="dxa" w:w="90"/>
+              <w:left w:type="dxa" w:w="100"/>
+              <w:bottom w:type="dxa" w:w="90"/>
+              <w:right w:type="dxa" w:w="100"/>
+            </w:tcMar>
+            <w:vAlign w:val="center"/>
+          </w:tcPr>
+          <w:p>
+            <w:pPr>
+              <w:jc w:val="left"/>
+            </w:pPr>
+            <w:r>
+              <w:rPr>
+                <w:b w:val="false"/>
+                <w:bCs w:val="false"/>
+                <w:i w:val="false"/>
+                <w:iCs w:val="false"/>
+                <w:strike w:val="false"/>
+                <w:color w:val="27343A"/>
+                <w:sz w:val="18"/>
+                <w:szCs w:val="18"/>
+              </w:rPr>
+              <w:t xml:space="preserve">Bài đi lấy link</w:t>
+            </w:r>
+          </w:p>
+        </w:tc>
+        <w:tc>
+          <w:tcPr>
+            <w:tcW w:type="dxa" w:w="1900"/>
+            <w:shd w:fill="FFFFFF" w:val="clear"/>
+            <w:tcMar>
+              <w:top w:type="dxa" w:w="90"/>
+              <w:left w:type="dxa" w:w="100"/>
+              <w:bottom w:type="dxa" w:w="90"/>
+              <w:right w:type="dxa" w:w="100"/>
+            </w:tcMar>
+            <w:vAlign w:val="center"/>
+          </w:tcPr>
+          <w:p>
+            <w:pPr>
+              <w:jc w:val="left"/>
+            </w:pPr>
+            <w:r>
+              <w:rPr>
+                <w:b w:val="false"/>
+                <w:bCs w:val="false"/>
+                <w:i w:val="false"/>
+                <w:iCs w:val="false"/>
+                <w:strike w:val="false"/>
+                <w:color w:val="27343A"/>
+                <w:sz w:val="18"/>
+                <w:szCs w:val="18"/>
+              </w:rPr>
+              <w:t xml:space="preserve">Dưới 1.000 từ, dưới 3 ảnh</w:t>
+            </w:r>
+          </w:p>
+        </w:tc>
+        <w:tc>
+          <w:tcPr>
+            <w:tcW w:type="dxa" w:w="3500"/>
+            <w:shd w:fill="FFFFFF" w:val="clear"/>
+            <w:tcMar>
+              <w:top w:type="dxa" w:w="90"/>
+              <w:left w:type="dxa" w:w="100"/>
+              <w:bottom w:type="dxa" w:w="90"/>
+              <w:right w:type="dxa" w:w="100"/>
+            </w:tcMar>
+            <w:vAlign w:val="center"/>
+          </w:tcPr>
+          <w:p>
+            <w:pPr>
+              <w:jc w:val="left"/>
+            </w:pPr>
+            <w:r>
+              <w:rPr>
+                <w:b w:val="false"/>
+                <w:bCs w:val="false"/>
+                <w:i w:val="false"/>
+                <w:iCs w:val="false"/>
+                <w:strike w:val="false"/>
+                <w:color w:val="27343A"/>
+                <w:sz w:val="18"/>
+                <w:szCs w:val="18"/>
+              </w:rPr>
+              <w:t xml:space="preserve">1 link dofollow (thêm link +300.000đ) - DR 69</w:t>
+            </w:r>
+          </w:p>
+        </w:tc>
+        <w:tc>
+          <w:tcPr>
+            <w:tcW w:type="dxa" w:w="1600"/>
             <w:shd w:fill="FFFFFF" w:val="clear"/>
             <w:tcMar>
               <w:top w:type="dxa" w:w="90"/>
@@ -2499,10 +3700,12 @@
               <w:rPr>
                 <w:b w:val="false"/>
                 <w:bCs w:val="false"/>
+                <w:i w:val="false"/>
+                <w:iCs w:val="false"/>
                 <w:strike/>
                 <w:color w:val="9AA3AF"/>
-                <w:sz w:val="20"/>
-                <w:szCs w:val="20"/>
+                <w:sz w:val="18"/>
+                <w:szCs w:val="18"/>
               </w:rPr>
               <w:t xml:space="preserve">3.150.000 đ</w:t>
             </w:r>
@@ -2528,10 +3731,12 @@
               <w:rPr>
                 <w:b/>
                 <w:bCs/>
+                <w:i w:val="false"/>
+                <w:iCs w:val="false"/>
                 <w:strike w:val="false"/>
                 <w:color w:val="C0553A"/>
-                <w:sz w:val="20"/>
-                <w:szCs w:val="20"/>
+                <w:sz w:val="18"/>
+                <w:szCs w:val="18"/>
               </w:rPr>
               <w:t xml:space="preserve">-21%</w:t>
             </w:r>
@@ -2539,7 +3744,7 @@
         </w:tc>
         <w:tc>
           <w:tcPr>
-            <w:tcW w:type="dxa" w:w="1800"/>
+            <w:tcW w:type="dxa" w:w="2000"/>
             <w:shd w:fill="FFFFFF" w:val="clear"/>
             <w:tcMar>
               <w:top w:type="dxa" w:w="90"/>
@@ -2557,10 +3762,12 @@
               <w:rPr>
                 <w:b/>
                 <w:bCs/>
+                <w:i w:val="false"/>
+                <w:iCs w:val="false"/>
                 <w:strike w:val="false"/>
                 <w:color w:val="0E8C7F"/>
-                <w:sz w:val="20"/>
-                <w:szCs w:val="20"/>
+                <w:sz w:val="18"/>
+                <w:szCs w:val="18"/>
               </w:rPr>
               <w:t xml:space="preserve">2.489.000 đ</w:t>
             </w:r>
@@ -2570,7 +3777,7 @@
       <w:tr>
         <w:tc>
           <w:tcPr>
-            <w:tcW w:type="dxa" w:w="450"/>
+            <w:tcW w:type="dxa" w:w="500"/>
             <w:shd w:fill="F5F7FA" w:val="clear"/>
             <w:tcMar>
               <w:top w:type="dxa" w:w="90"/>
@@ -2588,10 +3795,12 @@
               <w:rPr>
                 <w:b w:val="false"/>
                 <w:bCs w:val="false"/>
-                <w:strike w:val="false"/>
-                <w:color w:val="27343A"/>
-                <w:sz w:val="20"/>
-                <w:szCs w:val="20"/>
+                <w:i w:val="false"/>
+                <w:iCs w:val="false"/>
+                <w:strike w:val="false"/>
+                <w:color w:val="27343A"/>
+                <w:sz w:val="18"/>
+                <w:szCs w:val="18"/>
               </w:rPr>
               <w:t xml:space="preserve">14</w:t>
             </w:r>
@@ -2599,65 +3808,144 @@
         </w:tc>
         <w:tc>
           <w:tcPr>
-            <w:tcW w:type="dxa" w:w="2450"/>
-            <w:shd w:fill="F5F7FA" w:val="clear"/>
-            <w:tcMar>
-              <w:top w:type="dxa" w:w="90"/>
-              <w:left w:type="dxa" w:w="100"/>
-              <w:bottom w:type="dxa" w:w="90"/>
-              <w:right w:type="dxa" w:w="100"/>
-            </w:tcMar>
-            <w:vAlign w:val="center"/>
-          </w:tcPr>
-          <w:p>
-            <w:pPr>
-              <w:jc w:val="left"/>
-            </w:pPr>
-            <w:r>
-              <w:rPr>
-                <w:b/>
-                <w:bCs/>
-                <w:strike w:val="false"/>
-                <w:color w:val="27343A"/>
-                <w:sz w:val="20"/>
-                <w:szCs w:val="20"/>
-              </w:rPr>
-              <w:t xml:space="preserve">Diễn Đàn Doanh Nghiệp (diendandoanhnghiep.vn)</w:t>
-            </w:r>
-          </w:p>
-        </w:tc>
-        <w:tc>
-          <w:tcPr>
-            <w:tcW w:type="dxa" w:w="2650"/>
-            <w:shd w:fill="F5F7FA" w:val="clear"/>
-            <w:tcMar>
-              <w:top w:type="dxa" w:w="90"/>
-              <w:left w:type="dxa" w:w="100"/>
-              <w:bottom w:type="dxa" w:w="90"/>
-              <w:right w:type="dxa" w:w="100"/>
-            </w:tcMar>
-            <w:vAlign w:val="center"/>
-          </w:tcPr>
-          <w:p>
-            <w:pPr>
-              <w:jc w:val="left"/>
-            </w:pPr>
-            <w:r>
-              <w:rPr>
-                <w:b w:val="false"/>
-                <w:bCs w:val="false"/>
-                <w:strike w:val="false"/>
-                <w:color w:val="27343A"/>
-                <w:sz w:val="20"/>
-                <w:szCs w:val="20"/>
-              </w:rPr>
-              <w:t xml:space="preserve">700 từ + 3 ảnh + 2 link</w:t>
-            </w:r>
-          </w:p>
-        </w:tc>
-        <w:tc>
-          <w:tcPr>
-            <w:tcW w:type="dxa" w:w="1550"/>
+            <w:tcW w:type="dxa" w:w="1900"/>
+            <w:shd w:fill="F5F7FA" w:val="clear"/>
+            <w:tcMar>
+              <w:top w:type="dxa" w:w="90"/>
+              <w:left w:type="dxa" w:w="100"/>
+              <w:bottom w:type="dxa" w:w="90"/>
+              <w:right w:type="dxa" w:w="100"/>
+            </w:tcMar>
+            <w:vAlign w:val="center"/>
+          </w:tcPr>
+          <w:p>
+            <w:pPr>
+              <w:jc w:val="left"/>
+            </w:pPr>
+            <w:r>
+              <w:rPr>
+                <w:b/>
+                <w:bCs/>
+                <w:i w:val="false"/>
+                <w:iCs w:val="false"/>
+                <w:strike w:val="false"/>
+                <w:color w:val="27343A"/>
+                <w:sz w:val="18"/>
+                <w:szCs w:val="18"/>
+              </w:rPr>
+              <w:t xml:space="preserve">Diễn Đàn Doanh Nghiệp</w:t>
+            </w:r>
+            <w:r>
+              <w:rPr>
+                <w:b w:val="false"/>
+                <w:bCs w:val="false"/>
+                <w:i w:val="false"/>
+                <w:iCs w:val="false"/>
+                <w:strike w:val="false"/>
+                <w:color w:val="8A93A0"/>
+                <w:sz w:val="15"/>
+                <w:szCs w:val="15"/>
+              </w:rPr>
+              <w:t xml:space="preserve"> (diendandoanhnghiep.vn)</w:t>
+            </w:r>
+          </w:p>
+        </w:tc>
+        <w:tc>
+          <w:tcPr>
+            <w:tcW w:type="dxa" w:w="2300"/>
+            <w:shd w:fill="F5F7FA" w:val="clear"/>
+            <w:tcMar>
+              <w:top w:type="dxa" w:w="90"/>
+              <w:left w:type="dxa" w:w="100"/>
+              <w:bottom w:type="dxa" w:w="90"/>
+              <w:right w:type="dxa" w:w="100"/>
+            </w:tcMar>
+            <w:vAlign w:val="center"/>
+          </w:tcPr>
+          <w:p>
+            <w:pPr>
+              <w:jc w:val="left"/>
+            </w:pPr>
+            <w:r>
+              <w:rPr>
+                <w:b w:val="false"/>
+                <w:bCs w:val="false"/>
+                <w:i w:val="false"/>
+                <w:iCs w:val="false"/>
+                <w:strike w:val="false"/>
+                <w:color w:val="27343A"/>
+                <w:sz w:val="18"/>
+                <w:szCs w:val="18"/>
+              </w:rPr>
+              <w:t xml:space="preserve">Mục phù hợp</w:t>
+            </w:r>
+          </w:p>
+        </w:tc>
+        <w:tc>
+          <w:tcPr>
+            <w:tcW w:type="dxa" w:w="1900"/>
+            <w:shd w:fill="F5F7FA" w:val="clear"/>
+            <w:tcMar>
+              <w:top w:type="dxa" w:w="90"/>
+              <w:left w:type="dxa" w:w="100"/>
+              <w:bottom w:type="dxa" w:w="90"/>
+              <w:right w:type="dxa" w:w="100"/>
+            </w:tcMar>
+            <w:vAlign w:val="center"/>
+          </w:tcPr>
+          <w:p>
+            <w:pPr>
+              <w:jc w:val="left"/>
+            </w:pPr>
+            <w:r>
+              <w:rPr>
+                <w:b w:val="false"/>
+                <w:bCs w:val="false"/>
+                <w:i w:val="false"/>
+                <w:iCs w:val="false"/>
+                <w:strike w:val="false"/>
+                <w:color w:val="27343A"/>
+                <w:sz w:val="18"/>
+                <w:szCs w:val="18"/>
+              </w:rPr>
+              <w:t xml:space="preserve">700 từ, 3 ảnh</w:t>
+            </w:r>
+          </w:p>
+        </w:tc>
+        <w:tc>
+          <w:tcPr>
+            <w:tcW w:type="dxa" w:w="3500"/>
+            <w:shd w:fill="F5F7FA" w:val="clear"/>
+            <w:tcMar>
+              <w:top w:type="dxa" w:w="90"/>
+              <w:left w:type="dxa" w:w="100"/>
+              <w:bottom w:type="dxa" w:w="90"/>
+              <w:right w:type="dxa" w:w="100"/>
+            </w:tcMar>
+            <w:vAlign w:val="center"/>
+          </w:tcPr>
+          <w:p>
+            <w:pPr>
+              <w:jc w:val="left"/>
+            </w:pPr>
+            <w:r>
+              <w:rPr>
+                <w:b w:val="false"/>
+                <w:bCs w:val="false"/>
+                <w:i w:val="false"/>
+                <w:iCs w:val="false"/>
+                <w:strike w:val="false"/>
+                <w:color w:val="27343A"/>
+                <w:sz w:val="18"/>
+                <w:szCs w:val="18"/>
+              </w:rPr>
+              <w:t xml:space="preserve">2 link dofollow - DR 74</w:t>
+            </w:r>
+          </w:p>
+        </w:tc>
+        <w:tc>
+          <w:tcPr>
+            <w:tcW w:type="dxa" w:w="1600"/>
             <w:shd w:fill="F5F7FA" w:val="clear"/>
             <w:tcMar>
               <w:top w:type="dxa" w:w="90"/>
@@ -2675,10 +3963,12 @@
               <w:rPr>
                 <w:b w:val="false"/>
                 <w:bCs w:val="false"/>
+                <w:i w:val="false"/>
+                <w:iCs w:val="false"/>
                 <w:strike/>
                 <w:color w:val="9AA3AF"/>
-                <w:sz w:val="20"/>
-                <w:szCs w:val="20"/>
+                <w:sz w:val="18"/>
+                <w:szCs w:val="18"/>
               </w:rPr>
               <w:t xml:space="preserve">2.700.000 đ</w:t>
             </w:r>
@@ -2704,10 +3994,12 @@
               <w:rPr>
                 <w:b/>
                 <w:bCs/>
+                <w:i w:val="false"/>
+                <w:iCs w:val="false"/>
                 <w:strike w:val="false"/>
                 <w:color w:val="C0553A"/>
-                <w:sz w:val="20"/>
-                <w:szCs w:val="20"/>
+                <w:sz w:val="18"/>
+                <w:szCs w:val="18"/>
               </w:rPr>
               <w:t xml:space="preserve">-27%</w:t>
             </w:r>
@@ -2715,7 +4007,7 @@
         </w:tc>
         <w:tc>
           <w:tcPr>
-            <w:tcW w:type="dxa" w:w="1800"/>
+            <w:tcW w:type="dxa" w:w="2000"/>
             <w:shd w:fill="F5F7FA" w:val="clear"/>
             <w:tcMar>
               <w:top w:type="dxa" w:w="90"/>
@@ -2733,10 +4025,12 @@
               <w:rPr>
                 <w:b/>
                 <w:bCs/>
+                <w:i w:val="false"/>
+                <w:iCs w:val="false"/>
                 <w:strike w:val="false"/>
                 <w:color w:val="0E8C7F"/>
-                <w:sz w:val="20"/>
-                <w:szCs w:val="20"/>
+                <w:sz w:val="18"/>
+                <w:szCs w:val="18"/>
               </w:rPr>
               <w:t xml:space="preserve">1.971.000 đ</w:t>
             </w:r>
@@ -2778,7 +4072,7 @@
     </w:p>
     <w:tbl>
       <w:tblPr>
-        <w:tblW w:type="dxa" w:w="9600"/>
+        <w:tblW w:type="dxa" w:w="14400"/>
         <w:tblBorders>
           <w:top w:val="single" w:color="D9DEE5" w:sz="4"/>
           <w:left w:val="single" w:color="D9DEE5" w:sz="4"/>
@@ -2789,10 +4083,10 @@
         </w:tblBorders>
       </w:tblPr>
       <w:tblGrid>
-        <w:gridCol w:w="3200"/>
-        <w:gridCol w:w="1500"/>
-        <w:gridCol w:w="2450"/>
-        <w:gridCol w:w="2450"/>
+        <w:gridCol w:w="4800"/>
+        <w:gridCol w:w="2200"/>
+        <w:gridCol w:w="3700"/>
+        <w:gridCol w:w="3700"/>
       </w:tblGrid>
       <w:tr>
         <w:trPr>
@@ -2800,7 +4094,7 @@
         </w:trPr>
         <w:tc>
           <w:tcPr>
-            <w:tcW w:type="dxa" w:w="3200"/>
+            <w:tcW w:type="dxa" w:w="4800"/>
             <w:shd w:fill="0E8C7F" w:val="clear"/>
             <w:tcMar>
               <w:top w:type="dxa" w:w="90"/>
@@ -2818,6 +4112,8 @@
               <w:rPr>
                 <w:b/>
                 <w:bCs/>
+                <w:i w:val="false"/>
+                <w:iCs w:val="false"/>
                 <w:strike w:val="false"/>
                 <w:color w:val="FFFFFF"/>
                 <w:sz w:val="20"/>
@@ -2829,7 +4125,7 @@
         </w:tc>
         <w:tc>
           <w:tcPr>
-            <w:tcW w:type="dxa" w:w="1500"/>
+            <w:tcW w:type="dxa" w:w="2200"/>
             <w:shd w:fill="0E8C7F" w:val="clear"/>
             <w:tcMar>
               <w:top w:type="dxa" w:w="90"/>
@@ -2847,6 +4143,8 @@
               <w:rPr>
                 <w:b/>
                 <w:bCs/>
+                <w:i w:val="false"/>
+                <w:iCs w:val="false"/>
                 <w:strike w:val="false"/>
                 <w:color w:val="FFFFFF"/>
                 <w:sz w:val="20"/>
@@ -2858,7 +4156,7 @@
         </w:tc>
         <w:tc>
           <w:tcPr>
-            <w:tcW w:type="dxa" w:w="2450"/>
+            <w:tcW w:type="dxa" w:w="3700"/>
             <w:shd w:fill="0E8C7F" w:val="clear"/>
             <w:tcMar>
               <w:top w:type="dxa" w:w="90"/>
@@ -2876,6 +4174,8 @@
               <w:rPr>
                 <w:b/>
                 <w:bCs/>
+                <w:i w:val="false"/>
+                <w:iCs w:val="false"/>
                 <w:strike w:val="false"/>
                 <w:color w:val="FFFFFF"/>
                 <w:sz w:val="20"/>
@@ -2887,7 +4187,7 @@
         </w:tc>
         <w:tc>
           <w:tcPr>
-            <w:tcW w:type="dxa" w:w="2450"/>
+            <w:tcW w:type="dxa" w:w="3700"/>
             <w:shd w:fill="0E8C7F" w:val="clear"/>
             <w:tcMar>
               <w:top w:type="dxa" w:w="90"/>
@@ -2905,6 +4205,8 @@
               <w:rPr>
                 <w:b/>
                 <w:bCs/>
+                <w:i w:val="false"/>
+                <w:iCs w:val="false"/>
                 <w:strike w:val="false"/>
                 <w:color w:val="FFFFFF"/>
                 <w:sz w:val="20"/>
@@ -2918,24 +4220,26 @@
       <w:tr>
         <w:tc>
           <w:tcPr>
-            <w:tcW w:type="dxa" w:w="3200"/>
-            <w:shd w:fill="FFFFFF" w:val="clear"/>
-            <w:tcMar>
-              <w:top w:type="dxa" w:w="90"/>
-              <w:left w:type="dxa" w:w="100"/>
-              <w:bottom w:type="dxa" w:w="90"/>
-              <w:right w:type="dxa" w:w="100"/>
-            </w:tcMar>
-            <w:vAlign w:val="center"/>
-          </w:tcPr>
-          <w:p>
-            <w:pPr>
-              <w:jc w:val="left"/>
-            </w:pPr>
-            <w:r>
-              <w:rPr>
-                <w:b/>
-                <w:bCs/>
+            <w:tcW w:type="dxa" w:w="4800"/>
+            <w:shd w:fill="FFFFFF" w:val="clear"/>
+            <w:tcMar>
+              <w:top w:type="dxa" w:w="90"/>
+              <w:left w:type="dxa" w:w="100"/>
+              <w:bottom w:type="dxa" w:w="90"/>
+              <w:right w:type="dxa" w:w="100"/>
+            </w:tcMar>
+            <w:vAlign w:val="center"/>
+          </w:tcPr>
+          <w:p>
+            <w:pPr>
+              <w:jc w:val="left"/>
+            </w:pPr>
+            <w:r>
+              <w:rPr>
+                <w:b/>
+                <w:bCs/>
+                <w:i w:val="false"/>
+                <w:iCs w:val="false"/>
                 <w:strike w:val="false"/>
                 <w:color w:val="27343A"/>
                 <w:sz w:val="20"/>
@@ -2947,7 +4251,7 @@
         </w:tc>
         <w:tc>
           <w:tcPr>
-            <w:tcW w:type="dxa" w:w="1500"/>
+            <w:tcW w:type="dxa" w:w="2200"/>
             <w:shd w:fill="FFFFFF" w:val="clear"/>
             <w:tcMar>
               <w:top w:type="dxa" w:w="90"/>
@@ -2965,6 +4269,8 @@
               <w:rPr>
                 <w:b/>
                 <w:bCs/>
+                <w:i w:val="false"/>
+                <w:iCs w:val="false"/>
                 <w:strike w:val="false"/>
                 <w:color w:val="0E8C7F"/>
                 <w:sz w:val="22"/>
@@ -2976,7 +4282,7 @@
         </w:tc>
         <w:tc>
           <w:tcPr>
-            <w:tcW w:type="dxa" w:w="2450"/>
+            <w:tcW w:type="dxa" w:w="3700"/>
             <w:shd w:fill="FFFFFF" w:val="clear"/>
             <w:tcMar>
               <w:top w:type="dxa" w:w="90"/>
@@ -2994,6 +4300,8 @@
               <w:rPr>
                 <w:b w:val="false"/>
                 <w:bCs w:val="false"/>
+                <w:i w:val="false"/>
+                <w:iCs w:val="false"/>
                 <w:strike w:val="false"/>
                 <w:color w:val="27343A"/>
                 <w:sz w:val="20"/>
@@ -3005,7 +4313,7 @@
         </w:tc>
         <w:tc>
           <w:tcPr>
-            <w:tcW w:type="dxa" w:w="2450"/>
+            <w:tcW w:type="dxa" w:w="3700"/>
             <w:shd w:fill="FFFFFF" w:val="clear"/>
             <w:tcMar>
               <w:top w:type="dxa" w:w="90"/>
@@ -3023,6 +4331,8 @@
               <w:rPr>
                 <w:b w:val="false"/>
                 <w:bCs w:val="false"/>
+                <w:i w:val="false"/>
+                <w:iCs w:val="false"/>
                 <w:strike w:val="false"/>
                 <w:color w:val="5A6472"/>
                 <w:sz w:val="20"/>
@@ -3036,24 +4346,26 @@
       <w:tr>
         <w:tc>
           <w:tcPr>
-            <w:tcW w:type="dxa" w:w="3200"/>
-            <w:shd w:fill="F5F7FA" w:val="clear"/>
-            <w:tcMar>
-              <w:top w:type="dxa" w:w="90"/>
-              <w:left w:type="dxa" w:w="100"/>
-              <w:bottom w:type="dxa" w:w="90"/>
-              <w:right w:type="dxa" w:w="100"/>
-            </w:tcMar>
-            <w:vAlign w:val="center"/>
-          </w:tcPr>
-          <w:p>
-            <w:pPr>
-              <w:jc w:val="left"/>
-            </w:pPr>
-            <w:r>
-              <w:rPr>
-                <w:b/>
-                <w:bCs/>
+            <w:tcW w:type="dxa" w:w="4800"/>
+            <w:shd w:fill="F5F7FA" w:val="clear"/>
+            <w:tcMar>
+              <w:top w:type="dxa" w:w="90"/>
+              <w:left w:type="dxa" w:w="100"/>
+              <w:bottom w:type="dxa" w:w="90"/>
+              <w:right w:type="dxa" w:w="100"/>
+            </w:tcMar>
+            <w:vAlign w:val="center"/>
+          </w:tcPr>
+          <w:p>
+            <w:pPr>
+              <w:jc w:val="left"/>
+            </w:pPr>
+            <w:r>
+              <w:rPr>
+                <w:b/>
+                <w:bCs/>
+                <w:i w:val="false"/>
+                <w:iCs w:val="false"/>
                 <w:strike w:val="false"/>
                 <w:color w:val="27343A"/>
                 <w:sz w:val="20"/>
@@ -3065,7 +4377,7 @@
         </w:tc>
         <w:tc>
           <w:tcPr>
-            <w:tcW w:type="dxa" w:w="1500"/>
+            <w:tcW w:type="dxa" w:w="2200"/>
             <w:shd w:fill="F5F7FA" w:val="clear"/>
             <w:tcMar>
               <w:top w:type="dxa" w:w="90"/>
@@ -3083,6 +4395,8 @@
               <w:rPr>
                 <w:b/>
                 <w:bCs/>
+                <w:i w:val="false"/>
+                <w:iCs w:val="false"/>
                 <w:strike w:val="false"/>
                 <w:color w:val="0E8C7F"/>
                 <w:sz w:val="22"/>
@@ -3094,7 +4408,7 @@
         </w:tc>
         <w:tc>
           <w:tcPr>
-            <w:tcW w:type="dxa" w:w="2450"/>
+            <w:tcW w:type="dxa" w:w="3700"/>
             <w:shd w:fill="F5F7FA" w:val="clear"/>
             <w:tcMar>
               <w:top w:type="dxa" w:w="90"/>
@@ -3112,6 +4426,8 @@
               <w:rPr>
                 <w:b w:val="false"/>
                 <w:bCs w:val="false"/>
+                <w:i w:val="false"/>
+                <w:iCs w:val="false"/>
                 <w:strike w:val="false"/>
                 <w:color w:val="27343A"/>
                 <w:sz w:val="20"/>
@@ -3123,7 +4439,7 @@
         </w:tc>
         <w:tc>
           <w:tcPr>
-            <w:tcW w:type="dxa" w:w="2450"/>
+            <w:tcW w:type="dxa" w:w="3700"/>
             <w:shd w:fill="F5F7FA" w:val="clear"/>
             <w:tcMar>
               <w:top w:type="dxa" w:w="90"/>
@@ -3141,6 +4457,8 @@
               <w:rPr>
                 <w:b w:val="false"/>
                 <w:bCs w:val="false"/>
+                <w:i w:val="false"/>
+                <w:iCs w:val="false"/>
                 <w:strike w:val="false"/>
                 <w:color w:val="5A6472"/>
                 <w:sz w:val="20"/>
@@ -3154,24 +4472,26 @@
       <w:tr>
         <w:tc>
           <w:tcPr>
-            <w:tcW w:type="dxa" w:w="3200"/>
-            <w:shd w:fill="FFFFFF" w:val="clear"/>
-            <w:tcMar>
-              <w:top w:type="dxa" w:w="90"/>
-              <w:left w:type="dxa" w:w="100"/>
-              <w:bottom w:type="dxa" w:w="90"/>
-              <w:right w:type="dxa" w:w="100"/>
-            </w:tcMar>
-            <w:vAlign w:val="center"/>
-          </w:tcPr>
-          <w:p>
-            <w:pPr>
-              <w:jc w:val="left"/>
-            </w:pPr>
-            <w:r>
-              <w:rPr>
-                <w:b/>
-                <w:bCs/>
+            <w:tcW w:type="dxa" w:w="4800"/>
+            <w:shd w:fill="FFFFFF" w:val="clear"/>
+            <w:tcMar>
+              <w:top w:type="dxa" w:w="90"/>
+              <w:left w:type="dxa" w:w="100"/>
+              <w:bottom w:type="dxa" w:w="90"/>
+              <w:right w:type="dxa" w:w="100"/>
+            </w:tcMar>
+            <w:vAlign w:val="center"/>
+          </w:tcPr>
+          <w:p>
+            <w:pPr>
+              <w:jc w:val="left"/>
+            </w:pPr>
+            <w:r>
+              <w:rPr>
+                <w:b/>
+                <w:bCs/>
+                <w:i w:val="false"/>
+                <w:iCs w:val="false"/>
                 <w:strike w:val="false"/>
                 <w:color w:val="27343A"/>
                 <w:sz w:val="20"/>
@@ -3183,7 +4503,7 @@
         </w:tc>
         <w:tc>
           <w:tcPr>
-            <w:tcW w:type="dxa" w:w="1500"/>
+            <w:tcW w:type="dxa" w:w="2200"/>
             <w:shd w:fill="FFFFFF" w:val="clear"/>
             <w:tcMar>
               <w:top w:type="dxa" w:w="90"/>
@@ -3201,6 +4521,8 @@
               <w:rPr>
                 <w:b/>
                 <w:bCs/>
+                <w:i w:val="false"/>
+                <w:iCs w:val="false"/>
                 <w:strike w:val="false"/>
                 <w:color w:val="0E8C7F"/>
                 <w:sz w:val="22"/>
@@ -3212,7 +4534,7 @@
         </w:tc>
         <w:tc>
           <w:tcPr>
-            <w:tcW w:type="dxa" w:w="2450"/>
+            <w:tcW w:type="dxa" w:w="3700"/>
             <w:shd w:fill="FFFFFF" w:val="clear"/>
             <w:tcMar>
               <w:top w:type="dxa" w:w="90"/>
@@ -3230,6 +4552,8 @@
               <w:rPr>
                 <w:b w:val="false"/>
                 <w:bCs w:val="false"/>
+                <w:i w:val="false"/>
+                <w:iCs w:val="false"/>
                 <w:strike w:val="false"/>
                 <w:color w:val="27343A"/>
                 <w:sz w:val="20"/>
@@ -3241,7 +4565,7 @@
         </w:tc>
         <w:tc>
           <w:tcPr>
-            <w:tcW w:type="dxa" w:w="2450"/>
+            <w:tcW w:type="dxa" w:w="3700"/>
             <w:shd w:fill="FFFFFF" w:val="clear"/>
             <w:tcMar>
               <w:top w:type="dxa" w:w="90"/>
@@ -3259,6 +4583,8 @@
               <w:rPr>
                 <w:b w:val="false"/>
                 <w:bCs w:val="false"/>
+                <w:i w:val="false"/>
+                <w:iCs w:val="false"/>
                 <w:strike w:val="false"/>
                 <w:color w:val="5A6472"/>
                 <w:sz w:val="20"/>
@@ -3412,6 +4738,29 @@
           <w:sz w:val="21"/>
           <w:szCs w:val="21"/>
         </w:rPr>
+        <w:t xml:space="preserve">Loại link "nofollow"/"dofollow" theo đúng chính sách hiện hành của từng toà soạn - có thể thay đổi nếu toà soạn cập nhật chính sách.</w:t>
+      </w:r>
+    </w:p>
+    <w:p>
+      <w:pPr>
+        <w:spacing w:after="80"/>
+      </w:pPr>
+      <w:r>
+        <w:rPr>
+          <w:b/>
+          <w:bCs/>
+          <w:color w:val="0E8C7F"/>
+          <w:sz w:val="21"/>
+          <w:szCs w:val="21"/>
+        </w:rPr>
+        <w:t xml:space="preserve">- </w:t>
+      </w:r>
+      <w:r>
+        <w:rPr>
+          <w:color w:val="27343A"/>
+          <w:sz w:val="21"/>
+          <w:szCs w:val="21"/>
+        </w:rPr>
         <w:t xml:space="preserve">Đơn giá VTV chưa bao gồm chi phí mua link riêng (3.000.000đ/1 link) - áp dụng nếu khách hàng có nhu cầu chèn thêm link ngoài link mặc định.</w:t>
       </w:r>
     </w:p>
@@ -3489,7 +4838,7 @@
     </w:p>
     <w:p>
       <w:pPr>
-        <w:spacing w:after="280" w:before="0"/>
+        <w:spacing w:after="260" w:before="0"/>
       </w:pPr>
       <w:r>
         <w:rPr>
@@ -3523,8 +4872,8 @@
       </w:r>
     </w:p>
     <w:sectPr>
-      <w:pgSz w:w="11906" w:h="16838" w:orient="portrait"/>
-      <w:pgMar w:top="900" w:right="1000" w:bottom="900" w:left="1000" w:header="708" w:footer="708" w:gutter="0"/>
+      <w:pgSz w:w="16838" w:h="11906" w:orient="portrait"/>
+      <w:pgMar w:top="700" w:right="800" w:bottom="700" w:left="800" w:header="708" w:footer="708" w:gutter="0"/>
       <w:pgNumType/>
       <w:docGrid w:linePitch="360"/>
     </w:sectPr>

</xml_diff>